<commit_message>
feat: land the derivative corpora and take the test summary from the snapshot
B's archive verified end to end before anything moved: 80,208,714 bytes, SHA-256 98bd19c5...961674a, 139 manifest entries checked with zero mismatches, and both main databases hashed against the recorded values.  The suite no longer skips: 698 passed, 0 skipped, where the three relation/reeval modules went from 42 passed / 4 skipped to 46 passed / 0 skipped.

The report generator still hard-coded the previous test figure in two places; both now read the shared snapshot, and the summary is passed in at refresh time so it cannot silently blank.  The baseline document's paragraph about the four skipped tests is rewritten to the state that now holds.
</commit_message>
<xml_diff>
--- a/docs/report/AI安全知识情报系统技术报告.docx
+++ b/docs/report/AI安全知识情报系统技术报告.docx
@@ -367,7 +367,7 @@
           </w:tcPr>
           <w:p>
             <w:r>
-              <w:t>691 通过 / 4 跳过</w:t>
+              <w:t>698 passed, 0 skipped, 0 failed</w:t>
             </w:r>
           </w:p>
         </w:tc>
@@ -377,7 +377,7 @@
           </w:tcPr>
           <w:p>
             <w:r>
-              <w:t>交付机全量 pytest（提交前重跑）</w:t>
+              <w:t>交付机全量 pytest（快照 2026-10-14）</w:t>
             </w:r>
           </w:p>
         </w:tc>
@@ -2291,7 +2291,7 @@
           </w:tcPr>
           <w:p>
             <w:r>
-              <w:t>691 通过 / 4 跳过 / 0 失败</w:t>
+              <w:t>698 passed, 0 skipped, 0 failed</w:t>
             </w:r>
           </w:p>
         </w:tc>
@@ -2301,7 +2301,7 @@
           </w:tcPr>
           <w:p>
             <w:r>
-              <w:t>4 条跳过需要两份未交付的衍生语料副本</w:t>
+              <w:t>交付机全量 pytest；语料与衍生副本均已交付核验</w:t>
             </w:r>
           </w:p>
         </w:tc>

</xml_diff>

<commit_message>
fix: finish wiring the report's remaining figures to the snapshot
B's number audit listed three figures that were still hard-coded and would go stale as the demo database grew: the enrichment coverage denominators, the mixed timeliness row, and a fixed day count in the rubric mapping.  Reviewing it also turned up a fourth the audit had missed: appendix A still said the dictionary had 14 terms, which was the count before B extended the seed list to 26.

Enrichment coverage now comes from the snapshot (refreshed from the scorecard's own dimension report), and the dictionary line is built from the dictionary itself.  The rubric mapping no longer restates latency or day counts at all: it keeps the method and points at the baseline snapshot, which is where those numbers move.

The guard test now covers the enrichment and dictionary literals as well.

Suite: 702 passed, 0 skipped.
</commit_message>
<xml_diff>
--- a/docs/report/AI安全知识情报系统技术报告.docx
+++ b/docs/report/AI安全知识情报系统技术报告.docx
@@ -175,7 +175,7 @@
           </w:tcPr>
           <w:p>
             <w:r>
-              <w:t>637 个事件 / 637 个富化样本</w:t>
+              <w:t>638 个事件 / 638 个富化样本</w:t>
             </w:r>
           </w:p>
         </w:tc>
@@ -239,7 +239,7 @@
           </w:tcPr>
           <w:p>
             <w:r>
-              <w:t>p50 = 15.69 小时；6 小时内 31.8%</w:t>
+              <w:t>p50 = 15.58 小时；6 小时内 32.0%</w:t>
             </w:r>
           </w:p>
         </w:tc>
@@ -249,7 +249,7 @@
           </w:tcPr>
           <w:p>
             <w:r>
-              <w:t>296 个有效样本，已排除监测前历史回填</w:t>
+              <w:t>297 个有效样本，已排除监测前历史回填</w:t>
             </w:r>
           </w:p>
         </w:tc>
@@ -426,7 +426,7 @@
     </w:p>
     <w:p>
       <w:r>
-        <w:t>为避免把缺口说成能力，以下五项在正文中同样保留：没有实时监测（全部来源 realtime=false）；监测时效性 p50 为 15.69 小时，只达到赛题合格档；跨文档路径 10/21，缺 52 条文档间边；POC 与资产两个维度在评测语料中无数据；**连续运行目标在当前窗口未达成**：计划任务窗口 2026-10-11 到期后 10-12 无计划运行，连续天数已重新起算，需恢复运行后重新累积 7 天。关系维度的 1.0 / 0.734 只代表抽样范围，不外推为全语料指标。</w:t>
+        <w:t>为避免把缺口说成能力，以下五项在正文中同样保留：没有实时监测（全部来源 realtime=false）；监测时效性 p50 为 15.58 小时，只达到赛题合格档；跨文档路径 10/21，缺 52 条文档间边；POC 与资产两个维度在评测语料中无数据；**连续运行目标在当前窗口未达成**：计划任务窗口 2026-10-11 到期后 10-12 无计划运行，连续天数已重新起算，需恢复运行后重新累积 7 天。关系维度的 1.0 / 0.734 只代表抽样范围，不外推为全语料指标。术语可达 29/31 属检索覆盖，与 10/21 是两个口径，正文中分列、不合并。</w:t>
       </w:r>
     </w:p>
     <w:p>
@@ -1053,7 +1053,7 @@
     </w:p>
     <w:p>
       <w:r>
-        <w:t>富化对采集到的事件做多维扩展。六个维度在演示机上都有数据：CVSS 覆盖 388 个事件、论文关联 150 个、修复版本 101 个、POC 引用 74 个、资产研判 48 个、带证据关系 26 个。每个字段都保存来源标识，可以逐条回读原始快照。</w:t>
+        <w:t>富化对采集到的事件做多维扩展。六个维度在演示机上都有数据：CVSS 评分 427 个事件、论文关联 150 个事件、修复版本 107 个事件、POC 引用 82 个事件、资产研判 48 个事件、带证据关系 26 个事件。每个字段都保存来源标识，可以逐条回读原始快照。这里的覆盖数来自同一份快照，分母随事件总量变化，不再手写。</w:t>
       </w:r>
     </w:p>
     <w:p>
@@ -1126,7 +1126,7 @@
           </w:tcPr>
           <w:p>
             <w:r>
-              <w:t>388 / 596 事件</w:t>
+              <w:t>427 / 638 事件</w:t>
             </w:r>
           </w:p>
         </w:tc>
@@ -1158,7 +1158,7 @@
           </w:tcPr>
           <w:p>
             <w:r>
-              <w:t>150 / 596 事件</w:t>
+              <w:t>150 / 638 事件</w:t>
             </w:r>
           </w:p>
         </w:tc>
@@ -1190,7 +1190,7 @@
           </w:tcPr>
           <w:p>
             <w:r>
-              <w:t>101 / 596 事件</w:t>
+              <w:t>107 / 638 事件</w:t>
             </w:r>
           </w:p>
         </w:tc>
@@ -1222,7 +1222,7 @@
           </w:tcPr>
           <w:p>
             <w:r>
-              <w:t>74 / 596 事件</w:t>
+              <w:t>82 / 638 事件</w:t>
             </w:r>
           </w:p>
         </w:tc>
@@ -1254,7 +1254,7 @@
           </w:tcPr>
           <w:p>
             <w:r>
-              <w:t>48 / 596 事件</w:t>
+              <w:t>48 / 638 事件</w:t>
             </w:r>
           </w:p>
         </w:tc>
@@ -1286,7 +1286,7 @@
           </w:tcPr>
           <w:p>
             <w:r>
-              <w:t>26 / 596 事件</w:t>
+              <w:t>26 / 638 事件</w:t>
             </w:r>
           </w:p>
         </w:tc>
@@ -1328,7 +1328,7 @@
     </w:p>
     <w:p>
       <w:r>
-        <w:t>跨文档能力需要区分两个层次：在评测集上，跨文档题能答对，因为期望文档确实存在于语料中；但在知识图谱层面，跨文档路径只通过 10/21，仍缺 52 条文档间引用边。因此本模块的定位是跨文档检索与聚合，不是完整跨文档推理。</w:t>
+        <w:t>跨文档能力需要区分两个层次：在评测集上，跨文档题能答对，因为期望文档确实存在于语料中；但在知识图谱层面，跨文档路径只通过 10/21，仍缺 52 条文档间引用边。另有一项独立的检索覆盖指标：术语可达 29/31，衡量的是“给定术语能否在语料中被检索到”，它不对应任何推理链，因此单独报告，不替换也不抬高 10/21。因此本模块的定位是跨文档检索与聚合，不是完整跨文档推理。</w:t>
       </w:r>
     </w:p>
     <w:p>
@@ -2084,7 +2084,7 @@
           </w:tcPr>
           <w:p>
             <w:r>
-              <w:t>知识图谱页：14 张术语卡，已覆盖的标出关联文档数并给出语料原文定义句（带 chunk id 与字符偏移），未覆盖的如实标注而不是编造释义</w:t>
+              <w:t>知识图谱页：26 张术语卡，其中 18 条语料已覆盖、共关联 82 份文档；已覆盖的标出关联文档数并给出语料原文定义句（带 chunk id 与字符偏移），未覆盖的如实标注、不给释义</w:t>
             </w:r>
           </w:p>
         </w:tc>
@@ -2398,7 +2398,7 @@
           </w:tcPr>
           <w:p>
             <w:r>
-              <w:t>p50 = 15.69 小时；6 小时内 31.8%</w:t>
+              <w:t>p50 = 15.58 小时；6 小时内 32.0%</w:t>
             </w:r>
           </w:p>
         </w:tc>
@@ -2408,7 +2408,7 @@
           </w:tcPr>
           <w:p>
             <w:r>
-              <w:t>296 个有效样本；赛题合格档为 ≤24 小时</w:t>
+              <w:t>297 个有效样本；赛题合格档为 ≤24 小时</w:t>
             </w:r>
           </w:p>
         </w:tc>
@@ -2440,7 +2440,7 @@
           </w:tcPr>
           <w:p>
             <w:r>
-              <w:t>赛题问的是漏洞信息从发布到采集的延迟，故按来源类别分列；样本 69 / 146，与附录 B 同一份快照（2026-10-14）</w:t>
+              <w:t>赛题问的是漏洞信息从发布到采集的延迟，故按来源类别分列；样本 69 / 147，与附录 B 同一份快照（2026-10-14）</w:t>
             </w:r>
           </w:p>
         </w:tc>
@@ -2494,7 +2494,7 @@
           </w:tcPr>
           <w:p>
             <w:r>
-              <w:t>分位数按批次独立统计</w:t>
+              <w:t>p50 = 449.9 ms / p95 = 627.9 ms</w:t>
             </w:r>
           </w:p>
         </w:tc>
@@ -2504,7 +2504,7 @@
           </w:tcPr>
           <w:p>
             <w:r>
-              <w:t>赛题目标单题 5 秒内</w:t>
+              <w:t>50 题同一批次实测（formal_qa_results_20261012.json）；赛题目标单题 5 秒内</w:t>
             </w:r>
           </w:p>
         </w:tc>
@@ -2660,7 +2660,7 @@
     </w:p>
     <w:p>
       <w:r>
-        <w:t>对时效性的归因：混合口径的中位延迟是 15.69 小时，但如果就此说“采集慢”是错的。按来源类别拆开看，延迟最大的一段根本不在漏洞类——arxiv 36.53 小时、openalex 61.81 小时，它们衡量的是论文与索引的发布节奏；而赛题问的是漏洞信息。漏洞类里 GHSA 中位 1.75 小时、NVD 中位 8.34 小时。</w:t>
+        <w:t>对时效性的归因：混合口径的中位延迟是 15.58 小时，但如果就此说“采集慢”是错的。按来源类别拆开看，延迟最大的一段根本不在漏洞类——arxiv 36.53 小时、openalex 61.81 小时，它们衡量的是论文与索引的发布节奏；而赛题问的是漏洞信息。漏洞类里 GHSA 中位 1.75 小时、NVD 中位 8.34 小时。</w:t>
       </w:r>
     </w:p>
     <w:p>
@@ -2723,7 +2723,7 @@
     </w:p>
     <w:p>
       <w:r>
-        <w:t>第十章的主表按来源类别分列，因为赛题问的是漏洞信息。混合口径不删除、不隐藏，列在这里备查：296 个有效样本，中位 15.69 小时，6 小时内 31.8%、12 小时内 44.9%、24 小时内 61.8%。这一档只够赛题的合格档，分列并不改变档位判定——本项交付的是归因，不是抬分。本表与第十章共用同一份快照，不单独维护。</w:t>
+        <w:t>第十章的主表按来源类别分列，因为赛题问的是漏洞信息。混合口径不删除、不隐藏，列在这里备查：297 个有效样本，中位 15.58 小时，6 小时内 32.0%、12 小时内 45.1%、24 小时内 62.0%。这一档只够赛题的合格档，分列并不改变档位判定——本项交付的是归因，不是抬分。本表与第十章共用同一份快照，不单独维护。</w:t>
       </w:r>
     </w:p>
     <w:tbl>
@@ -2818,7 +2818,7 @@
           </w:tcPr>
           <w:p>
             <w:r>
-              <w:t>146</w:t>
+              <w:t>147</w:t>
             </w:r>
           </w:p>
         </w:tc>
@@ -3078,7 +3078,7 @@
           </w:tcPr>
           <w:p>
             <w:r>
-              <w:t>296</w:t>
+              <w:t>297</w:t>
             </w:r>
           </w:p>
         </w:tc>
@@ -3088,7 +3088,7 @@
           </w:tcPr>
           <w:p>
             <w:r>
-              <w:t>15.69 小时</w:t>
+              <w:t>15.58 小时</w:t>
             </w:r>
           </w:p>
         </w:tc>

</xml_diff>

<commit_message>
feat: record risk acceptance for the synthetic queue and keep the count honest
Route B for the demo deadline: 42 high-priority findings on the two synthetic demo assets are now disposition=accepted, each with an explicit rationale and the decision owner. The five findings on the CycloneDX-imported vllm asset stay open because that one still has a real upgrade path. closure_rate 7.55% -> 86.79% (46/53: 3 verified + 43 accepted).

The page and the report had to stop calling that 'repaired': disposal.high_priority_closed includes accepted risk, so the card now shows 已复测关闭 (verified) and 已关闭合计（复测 + 接受风险） separately, and the snapshot/report generator records verified and status_breakdown instead of one merged number.

Also refreshed docs/report/metrics_snapshot.json (705 events, 23 collection days, 13 scheduled days), docs/METRICS_BASELINE.md, and regenerated the Word/PDF report. 729 passed / 0 skipped.
</commit_message>
<xml_diff>
--- a/docs/report/AI安全知识情报系统技术报告.docx
+++ b/docs/report/AI安全知识情报系统技术报告.docx
@@ -175,7 +175,7 @@
           </w:tcPr>
           <w:p>
             <w:r>
-              <w:t>638 个事件 / 638 个富化样本</w:t>
+              <w:t>705 个事件 / 705 个富化样本</w:t>
             </w:r>
           </w:p>
         </w:tc>
@@ -185,7 +185,7 @@
           </w:tcPr>
           <w:p>
             <w:r>
-              <w:t>演示机 data/intel.sqlite，快照 2026-10-14</w:t>
+              <w:t>演示机 data/intel.sqlite，快照 2026-10-17</w:t>
             </w:r>
           </w:p>
         </w:tc>
@@ -207,7 +207,7 @@
           </w:tcPr>
           <w:p>
             <w:r>
-              <w:t>累计 20 个采集日，定时运行 10 天</w:t>
+              <w:t>累计 23 个采集日，定时运行 13 天</w:t>
             </w:r>
           </w:p>
         </w:tc>
@@ -239,7 +239,7 @@
           </w:tcPr>
           <w:p>
             <w:r>
-              <w:t>p50 = 15.58 小时；6 小时内 32.0%</w:t>
+              <w:t>p50 = 14.43 小时；6 小时内 32.4%</w:t>
             </w:r>
           </w:p>
         </w:tc>
@@ -249,7 +249,7 @@
           </w:tcPr>
           <w:p>
             <w:r>
-              <w:t>297 个有效样本，已排除监测前历史回填</w:t>
+              <w:t>336 个有效样本，已排除监测前历史回填</w:t>
             </w:r>
           </w:p>
         </w:tc>
@@ -335,7 +335,7 @@
           </w:tcPr>
           <w:p>
             <w:r>
-              <w:t>高优先级 53 / 已关闭 4（7.55%）</w:t>
+              <w:t>高优先级 53 / 已关闭 46（复测 3 + 接受风险 43，86.79%）</w:t>
             </w:r>
           </w:p>
         </w:tc>
@@ -367,7 +367,7 @@
           </w:tcPr>
           <w:p>
             <w:r>
-              <w:t>702 passed, 0 skipped, 0 failed</w:t>
+              <w:t>729 passed / 0 skipped</w:t>
             </w:r>
           </w:p>
         </w:tc>
@@ -377,7 +377,7 @@
           </w:tcPr>
           <w:p>
             <w:r>
-              <w:t>交付机全量 pytest（快照 2026-10-14）</w:t>
+              <w:t>交付机全量 pytest（快照 2026-10-17）</w:t>
             </w:r>
           </w:p>
         </w:tc>
@@ -426,7 +426,7 @@
     </w:p>
     <w:p>
       <w:r>
-        <w:t>为避免把缺口说成能力，以下五项在正文中同样保留：没有实时监测（全部来源 realtime=false）；监测时效性按漏洞类判定为良好档，距优秀档（≤6 小时）仍有距离（混合口径 p50 15.58 小时只作附录，不作为本项分母）；跨文档路径 10/21，缺 52 条文档间边；POC 与资产两个维度在评测语料中无数据；**连续运行目标在当前窗口未达成**：计划任务已改为无限重复，2026-10-14 当日按小时运行 9 次，2026-10-15 亦已触发；但 10-09/11/12/13 四天无计划运行，连续天数需重新累积，预计 2026-10-20 回到目标（逐日核对见 docs/A_CONTINUOUS_RUN_STATUS_20261015.md）。关系维度的 1.0 / 0.734 只代表抽样范围，不外推为全语料指标。术语可达 29/31 属检索覆盖，与 10/21 是两个口径，正文中分列、不合并。</w:t>
+        <w:t>为避免把缺口说成能力，以下五项在正文中同样保留：没有实时监测（全部来源 realtime=false）；监测时效性按漏洞类判定为良好档，距优秀档（≤6 小时）仍有距离（混合口径 p50 14.43 小时只作附录，不作为本项分母）；跨文档路径 10/21，缺 52 条文档间边；POC 与资产两个维度在评测语料中无数据；**连续运行目标在当前窗口未达成**：计划任务已改为无限重复，2026-10-14 当日按小时运行 9 次，2026-10-15 亦已触发；但 10-09/11/12/13 四天无计划运行，连续天数需重新累积，预计 2026-10-20 回到目标（逐日核对见 docs/A_CONTINUOUS_RUN_STATUS_20261015.md）。关系维度的 1.0 / 0.734 只代表抽样范围，不外推为全语料指标。术语可达 29/31 属检索覆盖；术语 → 文档两跳计的是“术语命中了哪些文档”。三个口径分列、不合并，任一都不能替代跨文档推理。</w:t>
       </w:r>
     </w:p>
     <w:p>
@@ -1053,7 +1053,7 @@
     </w:p>
     <w:p>
       <w:r>
-        <w:t>富化对采集到的事件做多维扩展。六个维度在演示机上都有数据：CVSS 评分 427 个事件、论文关联 150 个事件、修复版本 107 个事件、POC 引用 82 个事件、资产研判 48 个事件、带证据关系 26 个事件。每个字段都保存来源标识，可以逐条回读原始快照。这里的覆盖数来自同一份快照，分母随事件总量变化，不再手写。</w:t>
+        <w:t>富化对采集到的事件做多维扩展。六个维度在演示机上都有数据：CVSS 评分 480 个事件、论文关联 162 个事件、修复版本 110 个事件、POC 引用 96 个事件、资产研判 49 个事件、带证据关系 26 个事件。每个字段都保存来源标识，可以逐条回读原始快照。这里的覆盖数来自同一份快照，分母随事件总量变化，不再手写。</w:t>
       </w:r>
     </w:p>
     <w:p>
@@ -1126,7 +1126,7 @@
           </w:tcPr>
           <w:p>
             <w:r>
-              <w:t>427 / 638 事件</w:t>
+              <w:t>480 / 705 事件</w:t>
             </w:r>
           </w:p>
         </w:tc>
@@ -1158,7 +1158,7 @@
           </w:tcPr>
           <w:p>
             <w:r>
-              <w:t>150 / 638 事件</w:t>
+              <w:t>162 / 705 事件</w:t>
             </w:r>
           </w:p>
         </w:tc>
@@ -1190,7 +1190,7 @@
           </w:tcPr>
           <w:p>
             <w:r>
-              <w:t>107 / 638 事件</w:t>
+              <w:t>110 / 705 事件</w:t>
             </w:r>
           </w:p>
         </w:tc>
@@ -1222,7 +1222,7 @@
           </w:tcPr>
           <w:p>
             <w:r>
-              <w:t>82 / 638 事件</w:t>
+              <w:t>96 / 705 事件</w:t>
             </w:r>
           </w:p>
         </w:tc>
@@ -1254,7 +1254,7 @@
           </w:tcPr>
           <w:p>
             <w:r>
-              <w:t>48 / 638 事件</w:t>
+              <w:t>49 / 705 事件</w:t>
             </w:r>
           </w:p>
         </w:tc>
@@ -1286,7 +1286,7 @@
           </w:tcPr>
           <w:p>
             <w:r>
-              <w:t>26 / 638 事件</w:t>
+              <w:t>26 / 705 事件</w:t>
             </w:r>
           </w:p>
         </w:tc>
@@ -2084,7 +2084,7 @@
           </w:tcPr>
           <w:p>
             <w:r>
-              <w:t>知识图谱页：26 张术语卡，其中 16 条语料已覆盖、共关联 63 份文档；已覆盖的标出关联文档数并给出语料原文定义句（带 chunk id 与字符偏移），未覆盖的如实标注、不给释义</w:t>
+              <w:t>知识图谱页：26 张术语卡，其中 19 条语料已覆盖、共关联 83 份文档；已覆盖的标出关联文档数并给出语料原文定义句（带 chunk id 与字符偏移），未覆盖的如实标注、不给释义</w:t>
             </w:r>
           </w:p>
         </w:tc>
@@ -2116,7 +2116,7 @@
           </w:tcPr>
           <w:p>
             <w:r>
-              <w:t>知识图谱页：术语节点与文档节点分型渲染的两跳关系</w:t>
+              <w:t>知识图谱页：术语节点与文档节点分型渲染的两跳关系；26 条术语命中 83 份文档，共 97 条边</w:t>
             </w:r>
           </w:p>
         </w:tc>
@@ -2398,7 +2398,7 @@
           </w:tcPr>
           <w:p>
             <w:r>
-              <w:t>p50 = 15.58 小时；6 小时内 32.0%</w:t>
+              <w:t>p50 = 14.43 小时；6 小时内 32.4%</w:t>
             </w:r>
           </w:p>
         </w:tc>
@@ -2408,7 +2408,7 @@
           </w:tcPr>
           <w:p>
             <w:r>
-              <w:t>297 个有效样本；混合口径只作附录，不作为本项判定分母</w:t>
+              <w:t>336 个有效样本；混合口径只作附录，不作为本项判定分母</w:t>
             </w:r>
           </w:p>
         </w:tc>
@@ -2430,7 +2430,7 @@
           </w:tcPr>
           <w:p>
             <w:r>
-              <w:t>GHSA 中位 1.75 小时；NVD 中位 8.34 小时</w:t>
+              <w:t>GHSA 中位 2.2 小时；NVD 中位 8.27 小时</w:t>
             </w:r>
           </w:p>
         </w:tc>
@@ -2440,7 +2440,7 @@
           </w:tcPr>
           <w:p>
             <w:r>
-              <w:t>赛题问的是漏洞信息从发布到采集的延迟，故按来源类别分列；样本 69 / 147，与附录 B 同一份快照（2026-10-14）</w:t>
+              <w:t>赛题问的是漏洞信息从发布到采集的延迟，故按来源类别分列；样本 81 / 162，与附录 B 同一份快照（2026-10-17）</w:t>
             </w:r>
           </w:p>
         </w:tc>
@@ -2558,7 +2558,7 @@
           </w:tcPr>
           <w:p>
             <w:r>
-              <w:t>累计 20 个采集日，定时 10 天</w:t>
+              <w:t>累计 23 个采集日，定时 13 天</w:t>
             </w:r>
           </w:p>
         </w:tc>
@@ -2590,7 +2590,7 @@
           </w:tcPr>
           <w:p>
             <w:r>
-              <w:t>702 passed, 0 skipped, 0 failed</w:t>
+              <w:t>729 passed / 0 skipped</w:t>
             </w:r>
           </w:p>
         </w:tc>
@@ -2660,7 +2660,7 @@
     </w:p>
     <w:p>
       <w:r>
-        <w:t>对时效性的归因：混合口径的中位延迟是 15.58 小时，但如果就此说“采集慢”是错的。按来源类别拆开看，延迟最大的一段根本不在漏洞类——arxiv 36.53 小时、openalex 61.81 小时，它们衡量的是论文与索引的发布节奏；而赛题问的是漏洞信息。漏洞类里 GHSA 中位 1.75 小时、NVD 中位 8.34 小时。</w:t>
+        <w:t>对时效性的归因：混合口径的中位延迟是 14.43 小时，但如果就此说“采集慢”是错的。按来源类别拆开看，延迟最大的一段根本不在漏洞类——arxiv 44.01 小时、openalex 61.81 小时，它们衡量的是论文与索引的发布节奏；而赛题问的是漏洞信息。漏洞类里 GHSA 中位 2.2 小时、NVD 中位 8.27 小时。</w:t>
       </w:r>
     </w:p>
     <w:p>
@@ -2670,12 +2670,12 @@
     </w:p>
     <w:p>
       <w:r>
-        <w:t>因此结论写成一句可引用的话：采集间隔 1 小时；GHSA 中位 1.75 小时，NVD 中位 8.34 小时，差值来自上游发布与入库节奏。分列把混合口径里那些与漏洞无关的发布节奏剥出去，但混合口径本身保留在附录 B，两个数都能被追问；两者的样本量与分位数由同一份快照生成，不会再各写一份。</w:t>
+        <w:t>因此结论写成一句可引用的话：采集间隔 1 小时；GHSA 中位 2.2 小时，NVD 中位 8.27 小时，差值来自上游发布与入库节奏。分列把混合口径里那些与漏洞无关的发布节奏剥出去，但混合口径本身保留在附录 B，两个数都能被追问；两者的样本量与分位数由同一份快照生成，不会再各写一份。</w:t>
       </w:r>
     </w:p>
     <w:p>
       <w:r>
-        <w:t>本项的档位口径也一并定稿：**按漏洞类判定为良好**——GHSA 与 NVD 两个漏洞来源的中位延迟都落在≤12 小时区间（GHSA 1.75 小时、NVD 8.34 小时，均取自同一份快照）；混合口径不算本项分母，只作附录 B 的参考（当前快照 297 个有效样本、中位 15.58 小时）。数字来源分两类：混合口径只认docs/report/metrics_snapshot.json 的快照块，分列与上游归因以 docs/A_TIMELINESS_ATTRIBUTION.md 第 3、4 节为准（本机机读产物 reports/timeliness-attribution.json）。对照表 §2.1、docs/METRICS_BASELINE.md 的 2.1 节与本报告三处写的是同一条口径；tools/refresh_metrics_snapshot.py --write 只推进快照块，档位判定不随刷新改写。</w:t>
+        <w:t>本项的档位口径也一并定稿：**按漏洞类判定为良好**——GHSA 与 NVD 两个漏洞来源的中位延迟都落在≤12 小时区间（GHSA 2.2 小时、NVD 8.27 小时，均取自同一份快照）；混合口径不算本项分母，只作附录 B 的参考（当前快照 336 个有效样本、中位 14.43 小时）。数字来源分两类：混合口径只认docs/report/metrics_snapshot.json 的快照块，分列与上游归因以 docs/A_TIMELINESS_ATTRIBUTION.md 第 3、4 节为准（本机机读产物 reports/timeliness-attribution.json）。对照表 §2.1、docs/METRICS_BASELINE.md 的 2.1 节与本报告三处写的是同一条口径；tools/refresh_metrics_snapshot.py --write 只推进快照块，档位判定不随刷新改写。</w:t>
       </w:r>
     </w:p>
     <w:p>
@@ -2728,7 +2728,7 @@
     </w:p>
     <w:p>
       <w:r>
-        <w:t>第十章的主表按来源类别分列，因为赛题问的是漏洞信息。混合口径不删除、不隐藏，列在这里备查：297 个有效样本，中位 15.58 小时，6 小时内 32.0%、12 小时内 45.1%、24 小时内 62.0%。混合口径只用于说明瓶颈在上游，不作为本项判定分母——本项判的是漏洞类，档位是良好。下面这张表是 2026-10-13 交付机的一次读数，与第十章主表第一行的快照读数日期和样本量都不同</w:t>
+        <w:t>第十章的主表按来源类别分列，因为赛题问的是漏洞信息。混合口径不删除、不隐藏，列在这里备查：336 个有效样本，中位 14.43 小时，6 小时内 32.4%、12 小时内 47.6%、24 小时内 62.5%。混合口径只用于说明瓶颈在上游，不作为本项判定分母——本项判的是漏洞类，档位是良好。下面这张表是 2026-10-13 交付机的一次读数，与第十章主表第一行的快照读数日期和样本量都不同</w:t>
       </w:r>
     </w:p>
     <w:tbl>
@@ -2823,7 +2823,7 @@
           </w:tcPr>
           <w:p>
             <w:r>
-              <w:t>147</w:t>
+              <w:t>162</w:t>
             </w:r>
           </w:p>
         </w:tc>
@@ -2833,7 +2833,7 @@
           </w:tcPr>
           <w:p>
             <w:r>
-              <w:t>8.34 小时</w:t>
+              <w:t>8.27 小时</w:t>
             </w:r>
           </w:p>
         </w:tc>
@@ -2843,7 +2843,7 @@
           </w:tcPr>
           <w:p>
             <w:r>
-              <w:t>287.3 小时</w:t>
+              <w:t>358.0 小时</w:t>
             </w:r>
           </w:p>
         </w:tc>
@@ -2875,7 +2875,7 @@
           </w:tcPr>
           <w:p>
             <w:r>
-              <w:t>76</w:t>
+              <w:t>88</w:t>
             </w:r>
           </w:p>
         </w:tc>
@@ -2885,7 +2885,7 @@
           </w:tcPr>
           <w:p>
             <w:r>
-              <w:t>36.53 小时</w:t>
+              <w:t>44.01 小时</w:t>
             </w:r>
           </w:p>
         </w:tc>
@@ -2927,7 +2927,7 @@
           </w:tcPr>
           <w:p>
             <w:r>
-              <w:t>69</w:t>
+              <w:t>81</w:t>
             </w:r>
           </w:p>
         </w:tc>
@@ -2937,7 +2937,7 @@
           </w:tcPr>
           <w:p>
             <w:r>
-              <w:t>1.75 小时</w:t>
+              <w:t>2.2 小时</w:t>
             </w:r>
           </w:p>
         </w:tc>
@@ -3083,7 +3083,7 @@
           </w:tcPr>
           <w:p>
             <w:r>
-              <w:t>297</w:t>
+              <w:t>336</w:t>
             </w:r>
           </w:p>
         </w:tc>
@@ -3093,7 +3093,7 @@
           </w:tcPr>
           <w:p>
             <w:r>
-              <w:t>15.58 小时</w:t>
+              <w:t>14.43 小时</w:t>
             </w:r>
           </w:p>
         </w:tc>

</xml_diff>

<commit_message>
feat: add the technical presentation deck
14 landscape slides rendered from docs/report/slides/deck.html to PDF (16:9, 1600x900). It covers the highlight numbers, architecture, the seven agent roles, the workflow, monitoring coverage, vulnerability timeliness, enrichment coverage, the knowledge base, evidence QA, the disposition loop, relation evaluation, engineering delivery and the innovation points. Tables, native bars and the project's own figures carry the data; design is charcoal with amber and mint accents.

Also fixed the workflow figure, whose box labels overflowed: the steps were shortened and the font reduced, so both the deck and the Word report now show clean boxes. Refreshed the snapshot to the 2026-10-18 reading (24 collection days, 14 scheduled, window 6, consecutive 6, disposition 55/47)
</commit_message>
<xml_diff>
--- a/docs/report/AI安全知识情报系统技术报告.docx
+++ b/docs/report/AI安全知识情报系统技术报告.docx
@@ -207,7 +207,7 @@
           </w:tcPr>
           <w:p>
             <w:r>
-              <w:t>累计 23 个采集日，定时运行 13 天</w:t>
+              <w:t>累计 24 个采集日，定时运行 14 天</w:t>
             </w:r>
           </w:p>
         </w:tc>
@@ -367,7 +367,7 @@
           </w:tcPr>
           <w:p>
             <w:r>
-              <w:t>731 passed / 0 skipped</w:t>
+              <w:t>733 passed / 0 skipped</w:t>
             </w:r>
           </w:p>
         </w:tc>
@@ -2558,7 +2558,7 @@
           </w:tcPr>
           <w:p>
             <w:r>
-              <w:t>累计 23 个采集日，定时 13 天</w:t>
+              <w:t>累计 24 个采集日，定时 14 天</w:t>
             </w:r>
           </w:p>
         </w:tc>
@@ -2590,7 +2590,7 @@
           </w:tcPr>
           <w:p>
             <w:r>
-              <w:t>731 passed / 0 skipped</w:t>
+              <w:t>733 passed / 0 skipped</w:t>
             </w:r>
           </w:p>
         </w:tc>

</xml_diff>

<commit_message>
fix: answer location questions and refuse ungrounded intersections
Two of the four questions still failing were retrieval and guard problems, not missing data:

- 'honeypot 部署在哪里' now expands the query with located/deployed/location, so the sentence 'The DigitalOcean honeypots are located in Frankfurt, Germany' reaches the model. The answer is now correct.
- A question asking for the intersection of two lists (哪些同时出现在 A 和 B 里) short-circuits to a refusal before retrieval. Previously retrieval always produced a plausible single record and the system passed it off as the intersection.

The other two (kernel-level evidence, AUROC definition) are genuine corpus gaps: the papers never state a definition, so the system refuses rather than quoting a background paragraph.

Final adjudication: 25/38 = 65.79% answer accuracy (was 15.79%), strict 25/28 = 89.29%, citation support 25/38 = 65.79%, refusal 9/12 = 75%. Report and deck updated. 761 passed / 0 skipped.
</commit_message>
<xml_diff>
--- a/docs/report/AI安全知识情报系统技术报告.docx
+++ b/docs/report/AI安全知识情报系统技术报告.docx
@@ -2117,7 +2117,7 @@
       <w:r>
         <w:fldChar w:fldCharType="separate"/>
       </w:r>
-      <w:hyperlink w:anchor="_Toc243243244" w:history="1">
+      <w:hyperlink w:anchor="_Toc243244337" w:history="1">
         <w:r>
           <w:rPr>
             <w:rStyle w:val="aff9"/>
@@ -2155,7 +2155,7 @@
             <w:noProof/>
             <w:webHidden/>
           </w:rPr>
-          <w:instrText>PAGEREF _Toc243243244 \h</w:instrText>
+          <w:instrText>PAGEREF _Toc243244337 \h</w:instrText>
         </w:r>
         <w:r>
           <w:rPr>
@@ -2214,7 +2214,7 @@
           <w14:ligatures w14:val="standardContextual"/>
         </w:rPr>
       </w:pPr>
-      <w:hyperlink w:anchor="_Toc243243245" w:history="1">
+      <w:hyperlink w:anchor="_Toc243244338" w:history="1">
         <w:r>
           <w:rPr>
             <w:rStyle w:val="aff9"/>
@@ -2252,7 +2252,7 @@
             <w:noProof/>
             <w:webHidden/>
           </w:rPr>
-          <w:instrText>PAGEREF _Toc243243245 \h</w:instrText>
+          <w:instrText>PAGEREF _Toc243244338 \h</w:instrText>
         </w:r>
         <w:r>
           <w:rPr>
@@ -2311,7 +2311,7 @@
           <w14:ligatures w14:val="standardContextual"/>
         </w:rPr>
       </w:pPr>
-      <w:hyperlink w:anchor="_Toc243243246" w:history="1">
+      <w:hyperlink w:anchor="_Toc243244339" w:history="1">
         <w:r>
           <w:rPr>
             <w:rStyle w:val="aff9"/>
@@ -2349,7 +2349,7 @@
             <w:noProof/>
             <w:webHidden/>
           </w:rPr>
-          <w:instrText>PAGEREF _Toc243243246 \h</w:instrText>
+          <w:instrText>PAGEREF _Toc243244339 \h</w:instrText>
         </w:r>
         <w:r>
           <w:rPr>
@@ -2408,7 +2408,7 @@
           <w14:ligatures w14:val="standardContextual"/>
         </w:rPr>
       </w:pPr>
-      <w:hyperlink w:anchor="_Toc243243247" w:history="1">
+      <w:hyperlink w:anchor="_Toc243244340" w:history="1">
         <w:r>
           <w:rPr>
             <w:rStyle w:val="aff9"/>
@@ -2446,7 +2446,7 @@
             <w:noProof/>
             <w:webHidden/>
           </w:rPr>
-          <w:instrText>PAGEREF _Toc243243247 \h</w:instrText>
+          <w:instrText>PAGEREF _Toc243244340 \h</w:instrText>
         </w:r>
         <w:r>
           <w:rPr>
@@ -2505,7 +2505,7 @@
           <w14:ligatures w14:val="standardContextual"/>
         </w:rPr>
       </w:pPr>
-      <w:hyperlink w:anchor="_Toc243243248" w:history="1">
+      <w:hyperlink w:anchor="_Toc243244341" w:history="1">
         <w:r>
           <w:rPr>
             <w:rStyle w:val="aff9"/>
@@ -2543,7 +2543,7 @@
             <w:noProof/>
             <w:webHidden/>
           </w:rPr>
-          <w:instrText>PAGEREF _Toc243243248 \h</w:instrText>
+          <w:instrText>PAGEREF _Toc243244341 \h</w:instrText>
         </w:r>
         <w:r>
           <w:rPr>
@@ -2602,7 +2602,7 @@
           <w14:ligatures w14:val="standardContextual"/>
         </w:rPr>
       </w:pPr>
-      <w:hyperlink w:anchor="_Toc243243249" w:history="1">
+      <w:hyperlink w:anchor="_Toc243244342" w:history="1">
         <w:r>
           <w:rPr>
             <w:rStyle w:val="aff9"/>
@@ -2640,7 +2640,7 @@
             <w:noProof/>
             <w:webHidden/>
           </w:rPr>
-          <w:instrText>PAGEREF _Toc243243249 \h</w:instrText>
+          <w:instrText>PAGEREF _Toc243244342 \h</w:instrText>
         </w:r>
         <w:r>
           <w:rPr>
@@ -2699,7 +2699,7 @@
           <w14:ligatures w14:val="standardContextual"/>
         </w:rPr>
       </w:pPr>
-      <w:hyperlink w:anchor="_Toc243243250" w:history="1">
+      <w:hyperlink w:anchor="_Toc243244343" w:history="1">
         <w:r>
           <w:rPr>
             <w:rStyle w:val="aff9"/>
@@ -2737,7 +2737,7 @@
             <w:noProof/>
             <w:webHidden/>
           </w:rPr>
-          <w:instrText>PAGEREF _Toc243243250 \h</w:instrText>
+          <w:instrText>PAGEREF _Toc243244343 \h</w:instrText>
         </w:r>
         <w:r>
           <w:rPr>
@@ -2796,7 +2796,7 @@
           <w14:ligatures w14:val="standardContextual"/>
         </w:rPr>
       </w:pPr>
-      <w:hyperlink w:anchor="_Toc243243251" w:history="1">
+      <w:hyperlink w:anchor="_Toc243244344" w:history="1">
         <w:r>
           <w:rPr>
             <w:rStyle w:val="aff9"/>
@@ -2834,7 +2834,7 @@
             <w:noProof/>
             <w:webHidden/>
           </w:rPr>
-          <w:instrText>PAGEREF _Toc243243251 \h</w:instrText>
+          <w:instrText>PAGEREF _Toc243244344 \h</w:instrText>
         </w:r>
         <w:r>
           <w:rPr>
@@ -2893,7 +2893,7 @@
           <w14:ligatures w14:val="standardContextual"/>
         </w:rPr>
       </w:pPr>
-      <w:hyperlink w:anchor="_Toc243243252" w:history="1">
+      <w:hyperlink w:anchor="_Toc243244345" w:history="1">
         <w:r>
           <w:rPr>
             <w:rStyle w:val="aff9"/>
@@ -2931,7 +2931,7 @@
             <w:noProof/>
             <w:webHidden/>
           </w:rPr>
-          <w:instrText>PAGEREF _Toc243243252 \h</w:instrText>
+          <w:instrText>PAGEREF _Toc243244345 \h</w:instrText>
         </w:r>
         <w:r>
           <w:rPr>
@@ -2990,7 +2990,7 @@
           <w14:ligatures w14:val="standardContextual"/>
         </w:rPr>
       </w:pPr>
-      <w:hyperlink w:anchor="_Toc243243253" w:history="1">
+      <w:hyperlink w:anchor="_Toc243244346" w:history="1">
         <w:r>
           <w:rPr>
             <w:rStyle w:val="aff9"/>
@@ -3028,7 +3028,7 @@
             <w:noProof/>
             <w:webHidden/>
           </w:rPr>
-          <w:instrText>PAGEREF _Toc243243253 \h</w:instrText>
+          <w:instrText>PAGEREF _Toc243244346 \h</w:instrText>
         </w:r>
         <w:r>
           <w:rPr>
@@ -3087,7 +3087,7 @@
           <w14:ligatures w14:val="standardContextual"/>
         </w:rPr>
       </w:pPr>
-      <w:hyperlink w:anchor="_Toc243243254" w:history="1">
+      <w:hyperlink w:anchor="_Toc243244347" w:history="1">
         <w:r>
           <w:rPr>
             <w:rStyle w:val="aff9"/>
@@ -3125,7 +3125,7 @@
             <w:noProof/>
             <w:webHidden/>
           </w:rPr>
-          <w:instrText>PAGEREF _Toc243243254 \h</w:instrText>
+          <w:instrText>PAGEREF _Toc243244347 \h</w:instrText>
         </w:r>
         <w:r>
           <w:rPr>
@@ -3184,7 +3184,7 @@
           <w14:ligatures w14:val="standardContextual"/>
         </w:rPr>
       </w:pPr>
-      <w:hyperlink w:anchor="_Toc243243255" w:history="1">
+      <w:hyperlink w:anchor="_Toc243244348" w:history="1">
         <w:r>
           <w:rPr>
             <w:rStyle w:val="aff9"/>
@@ -3222,7 +3222,7 @@
             <w:noProof/>
             <w:webHidden/>
           </w:rPr>
-          <w:instrText>PAGEREF _Toc243243255 \h</w:instrText>
+          <w:instrText>PAGEREF _Toc243244348 \h</w:instrText>
         </w:r>
         <w:r>
           <w:rPr>
@@ -3281,7 +3281,7 @@
           <w14:ligatures w14:val="standardContextual"/>
         </w:rPr>
       </w:pPr>
-      <w:hyperlink w:anchor="_Toc243243256" w:history="1">
+      <w:hyperlink w:anchor="_Toc243244349" w:history="1">
         <w:r>
           <w:rPr>
             <w:rStyle w:val="aff9"/>
@@ -3319,7 +3319,7 @@
             <w:noProof/>
             <w:webHidden/>
           </w:rPr>
-          <w:instrText>PAGEREF _Toc243243256 \h</w:instrText>
+          <w:instrText>PAGEREF _Toc243244349 \h</w:instrText>
         </w:r>
         <w:r>
           <w:rPr>
@@ -3378,7 +3378,7 @@
           <w14:ligatures w14:val="standardContextual"/>
         </w:rPr>
       </w:pPr>
-      <w:hyperlink w:anchor="_Toc243243257" w:history="1">
+      <w:hyperlink w:anchor="_Toc243244350" w:history="1">
         <w:r>
           <w:rPr>
             <w:rStyle w:val="aff9"/>
@@ -3416,7 +3416,7 @@
             <w:noProof/>
             <w:webHidden/>
           </w:rPr>
-          <w:instrText>PAGEREF _Toc243243257 \h</w:instrText>
+          <w:instrText>PAGEREF _Toc243244350 \h</w:instrText>
         </w:r>
         <w:r>
           <w:rPr>
@@ -3475,7 +3475,7 @@
           <w14:ligatures w14:val="standardContextual"/>
         </w:rPr>
       </w:pPr>
-      <w:hyperlink w:anchor="_Toc243243258" w:history="1">
+      <w:hyperlink w:anchor="_Toc243244351" w:history="1">
         <w:r>
           <w:rPr>
             <w:rStyle w:val="aff9"/>
@@ -3513,7 +3513,7 @@
             <w:noProof/>
             <w:webHidden/>
           </w:rPr>
-          <w:instrText>PAGEREF _Toc243243258 \h</w:instrText>
+          <w:instrText>PAGEREF _Toc243244351 \h</w:instrText>
         </w:r>
         <w:r>
           <w:rPr>
@@ -3572,7 +3572,7 @@
           <w14:ligatures w14:val="standardContextual"/>
         </w:rPr>
       </w:pPr>
-      <w:hyperlink w:anchor="_Toc243243259" w:history="1">
+      <w:hyperlink w:anchor="_Toc243244352" w:history="1">
         <w:r>
           <w:rPr>
             <w:rStyle w:val="aff9"/>
@@ -3610,7 +3610,7 @@
             <w:noProof/>
             <w:webHidden/>
           </w:rPr>
-          <w:instrText>PAGEREF _Toc243243259 \h</w:instrText>
+          <w:instrText>PAGEREF _Toc243244352 \h</w:instrText>
         </w:r>
         <w:r>
           <w:rPr>
@@ -3669,7 +3669,7 @@
           <w14:ligatures w14:val="standardContextual"/>
         </w:rPr>
       </w:pPr>
-      <w:hyperlink w:anchor="_Toc243243260" w:history="1">
+      <w:hyperlink w:anchor="_Toc243244353" w:history="1">
         <w:r>
           <w:rPr>
             <w:rStyle w:val="aff9"/>
@@ -3707,7 +3707,7 @@
             <w:noProof/>
             <w:webHidden/>
           </w:rPr>
-          <w:instrText>PAGEREF _Toc243243260 \h</w:instrText>
+          <w:instrText>PAGEREF _Toc243244353 \h</w:instrText>
         </w:r>
         <w:r>
           <w:rPr>
@@ -3766,7 +3766,7 @@
           <w14:ligatures w14:val="standardContextual"/>
         </w:rPr>
       </w:pPr>
-      <w:hyperlink w:anchor="_Toc243243261" w:history="1">
+      <w:hyperlink w:anchor="_Toc243244354" w:history="1">
         <w:r>
           <w:rPr>
             <w:rStyle w:val="aff9"/>
@@ -3804,7 +3804,7 @@
             <w:noProof/>
             <w:webHidden/>
           </w:rPr>
-          <w:instrText>PAGEREF _Toc243243261 \h</w:instrText>
+          <w:instrText>PAGEREF _Toc243244354 \h</w:instrText>
         </w:r>
         <w:r>
           <w:rPr>
@@ -3863,7 +3863,7 @@
           <w14:ligatures w14:val="standardContextual"/>
         </w:rPr>
       </w:pPr>
-      <w:hyperlink w:anchor="_Toc243243262" w:history="1">
+      <w:hyperlink w:anchor="_Toc243244355" w:history="1">
         <w:r>
           <w:rPr>
             <w:rStyle w:val="aff9"/>
@@ -3901,7 +3901,7 @@
             <w:noProof/>
             <w:webHidden/>
           </w:rPr>
-          <w:instrText>PAGEREF _Toc243243262 \h</w:instrText>
+          <w:instrText>PAGEREF _Toc243244355 \h</w:instrText>
         </w:r>
         <w:r>
           <w:rPr>
@@ -3960,7 +3960,7 @@
           <w14:ligatures w14:val="standardContextual"/>
         </w:rPr>
       </w:pPr>
-      <w:hyperlink w:anchor="_Toc243243263" w:history="1">
+      <w:hyperlink w:anchor="_Toc243244356" w:history="1">
         <w:r>
           <w:rPr>
             <w:rStyle w:val="aff9"/>
@@ -3998,7 +3998,7 @@
             <w:noProof/>
             <w:webHidden/>
           </w:rPr>
-          <w:instrText>PAGEREF _Toc243243263 \h</w:instrText>
+          <w:instrText>PAGEREF _Toc243244356 \h</w:instrText>
         </w:r>
         <w:r>
           <w:rPr>
@@ -4057,7 +4057,7 @@
           <w14:ligatures w14:val="standardContextual"/>
         </w:rPr>
       </w:pPr>
-      <w:hyperlink w:anchor="_Toc243243264" w:history="1">
+      <w:hyperlink w:anchor="_Toc243244357" w:history="1">
         <w:r>
           <w:rPr>
             <w:rStyle w:val="aff9"/>
@@ -4095,7 +4095,7 @@
             <w:noProof/>
             <w:webHidden/>
           </w:rPr>
-          <w:instrText>PAGEREF _Toc243243264 \h</w:instrText>
+          <w:instrText>PAGEREF _Toc243244357 \h</w:instrText>
         </w:r>
         <w:r>
           <w:rPr>
@@ -4154,7 +4154,7 @@
           <w14:ligatures w14:val="standardContextual"/>
         </w:rPr>
       </w:pPr>
-      <w:hyperlink w:anchor="_Toc243243265" w:history="1">
+      <w:hyperlink w:anchor="_Toc243244358" w:history="1">
         <w:r>
           <w:rPr>
             <w:rStyle w:val="aff9"/>
@@ -4192,7 +4192,7 @@
             <w:noProof/>
             <w:webHidden/>
           </w:rPr>
-          <w:instrText>PAGEREF _Toc243243265 \h</w:instrText>
+          <w:instrText>PAGEREF _Toc243244358 \h</w:instrText>
         </w:r>
         <w:r>
           <w:rPr>
@@ -4251,7 +4251,7 @@
           <w14:ligatures w14:val="standardContextual"/>
         </w:rPr>
       </w:pPr>
-      <w:hyperlink w:anchor="_Toc243243266" w:history="1">
+      <w:hyperlink w:anchor="_Toc243244359" w:history="1">
         <w:r>
           <w:rPr>
             <w:rStyle w:val="aff9"/>
@@ -4289,7 +4289,7 @@
             <w:noProof/>
             <w:webHidden/>
           </w:rPr>
-          <w:instrText>PAGEREF _Toc243243266 \h</w:instrText>
+          <w:instrText>PAGEREF _Toc243244359 \h</w:instrText>
         </w:r>
         <w:r>
           <w:rPr>
@@ -4348,7 +4348,7 @@
           <w14:ligatures w14:val="standardContextual"/>
         </w:rPr>
       </w:pPr>
-      <w:hyperlink w:anchor="_Toc243243267" w:history="1">
+      <w:hyperlink w:anchor="_Toc243244360" w:history="1">
         <w:r>
           <w:rPr>
             <w:rStyle w:val="aff9"/>
@@ -4386,7 +4386,7 @@
             <w:noProof/>
             <w:webHidden/>
           </w:rPr>
-          <w:instrText>PAGEREF _Toc243243267 \h</w:instrText>
+          <w:instrText>PAGEREF _Toc243244360 \h</w:instrText>
         </w:r>
         <w:r>
           <w:rPr>
@@ -4445,7 +4445,7 @@
           <w14:ligatures w14:val="standardContextual"/>
         </w:rPr>
       </w:pPr>
-      <w:hyperlink w:anchor="_Toc243243268" w:history="1">
+      <w:hyperlink w:anchor="_Toc243244361" w:history="1">
         <w:r>
           <w:rPr>
             <w:rStyle w:val="aff9"/>
@@ -4483,7 +4483,7 @@
             <w:noProof/>
             <w:webHidden/>
           </w:rPr>
-          <w:instrText>PAGEREF _Toc243243268 \h</w:instrText>
+          <w:instrText>PAGEREF _Toc243244361 \h</w:instrText>
         </w:r>
         <w:r>
           <w:rPr>
@@ -4542,7 +4542,7 @@
           <w14:ligatures w14:val="standardContextual"/>
         </w:rPr>
       </w:pPr>
-      <w:hyperlink w:anchor="_Toc243243269" w:history="1">
+      <w:hyperlink w:anchor="_Toc243244362" w:history="1">
         <w:r>
           <w:rPr>
             <w:rStyle w:val="aff9"/>
@@ -4580,7 +4580,7 @@
             <w:noProof/>
             <w:webHidden/>
           </w:rPr>
-          <w:instrText>PAGEREF _Toc243243269 \h</w:instrText>
+          <w:instrText>PAGEREF _Toc243244362 \h</w:instrText>
         </w:r>
         <w:r>
           <w:rPr>
@@ -4639,7 +4639,7 @@
           <w14:ligatures w14:val="standardContextual"/>
         </w:rPr>
       </w:pPr>
-      <w:hyperlink w:anchor="_Toc243243270" w:history="1">
+      <w:hyperlink w:anchor="_Toc243244363" w:history="1">
         <w:r>
           <w:rPr>
             <w:rStyle w:val="aff9"/>
@@ -4677,7 +4677,7 @@
             <w:noProof/>
             <w:webHidden/>
           </w:rPr>
-          <w:instrText>PAGEREF _Toc243243270 \h</w:instrText>
+          <w:instrText>PAGEREF _Toc243244363 \h</w:instrText>
         </w:r>
         <w:r>
           <w:rPr>
@@ -4736,7 +4736,7 @@
           <w14:ligatures w14:val="standardContextual"/>
         </w:rPr>
       </w:pPr>
-      <w:hyperlink w:anchor="_Toc243243271" w:history="1">
+      <w:hyperlink w:anchor="_Toc243244364" w:history="1">
         <w:r>
           <w:rPr>
             <w:rStyle w:val="aff9"/>
@@ -4774,7 +4774,7 @@
             <w:noProof/>
             <w:webHidden/>
           </w:rPr>
-          <w:instrText>PAGEREF _Toc243243271 \h</w:instrText>
+          <w:instrText>PAGEREF _Toc243244364 \h</w:instrText>
         </w:r>
         <w:r>
           <w:rPr>
@@ -4833,7 +4833,7 @@
           <w14:ligatures w14:val="standardContextual"/>
         </w:rPr>
       </w:pPr>
-      <w:hyperlink w:anchor="_Toc243243272" w:history="1">
+      <w:hyperlink w:anchor="_Toc243244365" w:history="1">
         <w:r>
           <w:rPr>
             <w:rStyle w:val="aff9"/>
@@ -4871,7 +4871,7 @@
             <w:noProof/>
             <w:webHidden/>
           </w:rPr>
-          <w:instrText>PAGEREF _Toc243243272 \h</w:instrText>
+          <w:instrText>PAGEREF _Toc243244365 \h</w:instrText>
         </w:r>
         <w:r>
           <w:rPr>
@@ -4930,7 +4930,7 @@
           <w14:ligatures w14:val="standardContextual"/>
         </w:rPr>
       </w:pPr>
-      <w:hyperlink w:anchor="_Toc243243273" w:history="1">
+      <w:hyperlink w:anchor="_Toc243244366" w:history="1">
         <w:r>
           <w:rPr>
             <w:rStyle w:val="aff9"/>
@@ -4968,7 +4968,7 @@
             <w:noProof/>
             <w:webHidden/>
           </w:rPr>
-          <w:instrText>PAGEREF _Toc243243273 \h</w:instrText>
+          <w:instrText>PAGEREF _Toc243244366 \h</w:instrText>
         </w:r>
         <w:r>
           <w:rPr>
@@ -5027,7 +5027,7 @@
           <w14:ligatures w14:val="standardContextual"/>
         </w:rPr>
       </w:pPr>
-      <w:hyperlink w:anchor="_Toc243243274" w:history="1">
+      <w:hyperlink w:anchor="_Toc243244367" w:history="1">
         <w:r>
           <w:rPr>
             <w:rStyle w:val="aff9"/>
@@ -5065,7 +5065,7 @@
             <w:noProof/>
             <w:webHidden/>
           </w:rPr>
-          <w:instrText>PAGEREF _Toc243243274 \h</w:instrText>
+          <w:instrText>PAGEREF _Toc243244367 \h</w:instrText>
         </w:r>
         <w:r>
           <w:rPr>
@@ -5124,7 +5124,7 @@
           <w14:ligatures w14:val="standardContextual"/>
         </w:rPr>
       </w:pPr>
-      <w:hyperlink w:anchor="_Toc243243275" w:history="1">
+      <w:hyperlink w:anchor="_Toc243244368" w:history="1">
         <w:r>
           <w:rPr>
             <w:rStyle w:val="aff9"/>
@@ -5162,7 +5162,7 @@
             <w:noProof/>
             <w:webHidden/>
           </w:rPr>
-          <w:instrText>PAGEREF _Toc243243275 \h</w:instrText>
+          <w:instrText>PAGEREF _Toc243244368 \h</w:instrText>
         </w:r>
         <w:r>
           <w:rPr>
@@ -5221,7 +5221,7 @@
           <w14:ligatures w14:val="standardContextual"/>
         </w:rPr>
       </w:pPr>
-      <w:hyperlink w:anchor="_Toc243243276" w:history="1">
+      <w:hyperlink w:anchor="_Toc243244369" w:history="1">
         <w:r>
           <w:rPr>
             <w:rStyle w:val="aff9"/>
@@ -5259,7 +5259,7 @@
             <w:noProof/>
             <w:webHidden/>
           </w:rPr>
-          <w:instrText>PAGEREF _Toc243243276 \h</w:instrText>
+          <w:instrText>PAGEREF _Toc243244369 \h</w:instrText>
         </w:r>
         <w:r>
           <w:rPr>
@@ -5318,7 +5318,7 @@
           <w14:ligatures w14:val="standardContextual"/>
         </w:rPr>
       </w:pPr>
-      <w:hyperlink w:anchor="_Toc243243277" w:history="1">
+      <w:hyperlink w:anchor="_Toc243244370" w:history="1">
         <w:r>
           <w:rPr>
             <w:rStyle w:val="aff9"/>
@@ -5356,7 +5356,7 @@
             <w:noProof/>
             <w:webHidden/>
           </w:rPr>
-          <w:instrText>PAGEREF _Toc243243277 \h</w:instrText>
+          <w:instrText>PAGEREF _Toc243244370 \h</w:instrText>
         </w:r>
         <w:r>
           <w:rPr>
@@ -5415,7 +5415,7 @@
           <w14:ligatures w14:val="standardContextual"/>
         </w:rPr>
       </w:pPr>
-      <w:hyperlink w:anchor="_Toc243243278" w:history="1">
+      <w:hyperlink w:anchor="_Toc243244371" w:history="1">
         <w:r>
           <w:rPr>
             <w:rStyle w:val="aff9"/>
@@ -5453,7 +5453,7 @@
             <w:noProof/>
             <w:webHidden/>
           </w:rPr>
-          <w:instrText>PAGEREF _Toc243243278 \h</w:instrText>
+          <w:instrText>PAGEREF _Toc243244371 \h</w:instrText>
         </w:r>
         <w:r>
           <w:rPr>
@@ -5512,7 +5512,7 @@
           <w14:ligatures w14:val="standardContextual"/>
         </w:rPr>
       </w:pPr>
-      <w:hyperlink w:anchor="_Toc243243279" w:history="1">
+      <w:hyperlink w:anchor="_Toc243244372" w:history="1">
         <w:r>
           <w:rPr>
             <w:rStyle w:val="aff9"/>
@@ -5550,7 +5550,7 @@
             <w:noProof/>
             <w:webHidden/>
           </w:rPr>
-          <w:instrText>PAGEREF _Toc243243279 \h</w:instrText>
+          <w:instrText>PAGEREF _Toc243244372 \h</w:instrText>
         </w:r>
         <w:r>
           <w:rPr>
@@ -5609,7 +5609,7 @@
           <w14:ligatures w14:val="standardContextual"/>
         </w:rPr>
       </w:pPr>
-      <w:hyperlink w:anchor="_Toc243243280" w:history="1">
+      <w:hyperlink w:anchor="_Toc243244373" w:history="1">
         <w:r>
           <w:rPr>
             <w:rStyle w:val="aff9"/>
@@ -5647,7 +5647,7 @@
             <w:noProof/>
             <w:webHidden/>
           </w:rPr>
-          <w:instrText>PAGEREF _Toc243243280 \h</w:instrText>
+          <w:instrText>PAGEREF _Toc243244373 \h</w:instrText>
         </w:r>
         <w:r>
           <w:rPr>
@@ -5706,7 +5706,7 @@
           <w14:ligatures w14:val="standardContextual"/>
         </w:rPr>
       </w:pPr>
-      <w:hyperlink w:anchor="_Toc243243281" w:history="1">
+      <w:hyperlink w:anchor="_Toc243244374" w:history="1">
         <w:r>
           <w:rPr>
             <w:rStyle w:val="aff9"/>
@@ -5744,7 +5744,7 @@
             <w:noProof/>
             <w:webHidden/>
           </w:rPr>
-          <w:instrText>PAGEREF _Toc243243281 \h</w:instrText>
+          <w:instrText>PAGEREF _Toc243244374 \h</w:instrText>
         </w:r>
         <w:r>
           <w:rPr>
@@ -5803,7 +5803,7 @@
           <w14:ligatures w14:val="standardContextual"/>
         </w:rPr>
       </w:pPr>
-      <w:hyperlink w:anchor="_Toc243243282" w:history="1">
+      <w:hyperlink w:anchor="_Toc243244375" w:history="1">
         <w:r>
           <w:rPr>
             <w:rStyle w:val="aff9"/>
@@ -5841,7 +5841,7 @@
             <w:noProof/>
             <w:webHidden/>
           </w:rPr>
-          <w:instrText>PAGEREF _Toc243243282 \h</w:instrText>
+          <w:instrText>PAGEREF _Toc243244375 \h</w:instrText>
         </w:r>
         <w:r>
           <w:rPr>
@@ -5900,7 +5900,7 @@
           <w14:ligatures w14:val="standardContextual"/>
         </w:rPr>
       </w:pPr>
-      <w:hyperlink w:anchor="_Toc243243283" w:history="1">
+      <w:hyperlink w:anchor="_Toc243244376" w:history="1">
         <w:r>
           <w:rPr>
             <w:rStyle w:val="aff9"/>
@@ -5938,7 +5938,7 @@
             <w:noProof/>
             <w:webHidden/>
           </w:rPr>
-          <w:instrText>PAGEREF _Toc243243283 \h</w:instrText>
+          <w:instrText>PAGEREF _Toc243244376 \h</w:instrText>
         </w:r>
         <w:r>
           <w:rPr>
@@ -5997,7 +5997,7 @@
           <w14:ligatures w14:val="standardContextual"/>
         </w:rPr>
       </w:pPr>
-      <w:hyperlink w:anchor="_Toc243243284" w:history="1">
+      <w:hyperlink w:anchor="_Toc243244377" w:history="1">
         <w:r>
           <w:rPr>
             <w:rStyle w:val="aff9"/>
@@ -6035,7 +6035,7 @@
             <w:noProof/>
             <w:webHidden/>
           </w:rPr>
-          <w:instrText>PAGEREF _Toc243243284 \h</w:instrText>
+          <w:instrText>PAGEREF _Toc243244377 \h</w:instrText>
         </w:r>
         <w:r>
           <w:rPr>
@@ -6094,7 +6094,7 @@
           <w14:ligatures w14:val="standardContextual"/>
         </w:rPr>
       </w:pPr>
-      <w:hyperlink w:anchor="_Toc243243285" w:history="1">
+      <w:hyperlink w:anchor="_Toc243244378" w:history="1">
         <w:r>
           <w:rPr>
             <w:rStyle w:val="aff9"/>
@@ -6132,7 +6132,7 @@
             <w:noProof/>
             <w:webHidden/>
           </w:rPr>
-          <w:instrText>PAGEREF _Toc243243285 \h</w:instrText>
+          <w:instrText>PAGEREF _Toc243244378 \h</w:instrText>
         </w:r>
         <w:r>
           <w:rPr>
@@ -6191,7 +6191,7 @@
           <w14:ligatures w14:val="standardContextual"/>
         </w:rPr>
       </w:pPr>
-      <w:hyperlink w:anchor="_Toc243243286" w:history="1">
+      <w:hyperlink w:anchor="_Toc243244379" w:history="1">
         <w:r>
           <w:rPr>
             <w:rStyle w:val="aff9"/>
@@ -6229,7 +6229,7 @@
             <w:noProof/>
             <w:webHidden/>
           </w:rPr>
-          <w:instrText>PAGEREF _Toc243243286 \h</w:instrText>
+          <w:instrText>PAGEREF _Toc243244379 \h</w:instrText>
         </w:r>
         <w:r>
           <w:rPr>
@@ -6288,7 +6288,7 @@
           <w14:ligatures w14:val="standardContextual"/>
         </w:rPr>
       </w:pPr>
-      <w:hyperlink w:anchor="_Toc243243287" w:history="1">
+      <w:hyperlink w:anchor="_Toc243244380" w:history="1">
         <w:r>
           <w:rPr>
             <w:rStyle w:val="aff9"/>
@@ -6326,7 +6326,7 @@
             <w:noProof/>
             <w:webHidden/>
           </w:rPr>
-          <w:instrText>PAGEREF _Toc243243287 \h</w:instrText>
+          <w:instrText>PAGEREF _Toc243244380 \h</w:instrText>
         </w:r>
         <w:r>
           <w:rPr>
@@ -6385,7 +6385,7 @@
           <w14:ligatures w14:val="standardContextual"/>
         </w:rPr>
       </w:pPr>
-      <w:hyperlink w:anchor="_Toc243243288" w:history="1">
+      <w:hyperlink w:anchor="_Toc243244381" w:history="1">
         <w:r>
           <w:rPr>
             <w:rStyle w:val="aff9"/>
@@ -6423,7 +6423,7 @@
             <w:noProof/>
             <w:webHidden/>
           </w:rPr>
-          <w:instrText>PAGEREF _Toc243243288 \h</w:instrText>
+          <w:instrText>PAGEREF _Toc243244381 \h</w:instrText>
         </w:r>
         <w:r>
           <w:rPr>
@@ -6482,7 +6482,7 @@
           <w14:ligatures w14:val="standardContextual"/>
         </w:rPr>
       </w:pPr>
-      <w:hyperlink w:anchor="_Toc243243289" w:history="1">
+      <w:hyperlink w:anchor="_Toc243244382" w:history="1">
         <w:r>
           <w:rPr>
             <w:rStyle w:val="aff9"/>
@@ -6520,7 +6520,7 @@
             <w:noProof/>
             <w:webHidden/>
           </w:rPr>
-          <w:instrText>PAGEREF _Toc243243289 \h</w:instrText>
+          <w:instrText>PAGEREF _Toc243244382 \h</w:instrText>
         </w:r>
         <w:r>
           <w:rPr>
@@ -6579,7 +6579,7 @@
           <w14:ligatures w14:val="standardContextual"/>
         </w:rPr>
       </w:pPr>
-      <w:hyperlink w:anchor="_Toc243243290" w:history="1">
+      <w:hyperlink w:anchor="_Toc243244383" w:history="1">
         <w:r>
           <w:rPr>
             <w:rStyle w:val="aff9"/>
@@ -6617,7 +6617,7 @@
             <w:noProof/>
             <w:webHidden/>
           </w:rPr>
-          <w:instrText>PAGEREF _Toc243243290 \h</w:instrText>
+          <w:instrText>PAGEREF _Toc243244383 \h</w:instrText>
         </w:r>
         <w:r>
           <w:rPr>
@@ -6676,7 +6676,7 @@
           <w14:ligatures w14:val="standardContextual"/>
         </w:rPr>
       </w:pPr>
-      <w:hyperlink w:anchor="_Toc243243291" w:history="1">
+      <w:hyperlink w:anchor="_Toc243244384" w:history="1">
         <w:r>
           <w:rPr>
             <w:rStyle w:val="aff9"/>
@@ -6714,7 +6714,7 @@
             <w:noProof/>
             <w:webHidden/>
           </w:rPr>
-          <w:instrText>PAGEREF _Toc243243291 \h</w:instrText>
+          <w:instrText>PAGEREF _Toc243244384 \h</w:instrText>
         </w:r>
         <w:r>
           <w:rPr>
@@ -6773,7 +6773,7 @@
           <w14:ligatures w14:val="standardContextual"/>
         </w:rPr>
       </w:pPr>
-      <w:hyperlink w:anchor="_Toc243243292" w:history="1">
+      <w:hyperlink w:anchor="_Toc243244385" w:history="1">
         <w:r>
           <w:rPr>
             <w:rStyle w:val="aff9"/>
@@ -6811,7 +6811,7 @@
             <w:noProof/>
             <w:webHidden/>
           </w:rPr>
-          <w:instrText>PAGEREF _Toc243243292 \h</w:instrText>
+          <w:instrText>PAGEREF _Toc243244385 \h</w:instrText>
         </w:r>
         <w:r>
           <w:rPr>
@@ -6870,7 +6870,7 @@
           <w14:ligatures w14:val="standardContextual"/>
         </w:rPr>
       </w:pPr>
-      <w:hyperlink w:anchor="_Toc243243293" w:history="1">
+      <w:hyperlink w:anchor="_Toc243244386" w:history="1">
         <w:r>
           <w:rPr>
             <w:rStyle w:val="aff9"/>
@@ -6908,7 +6908,7 @@
             <w:noProof/>
             <w:webHidden/>
           </w:rPr>
-          <w:instrText>PAGEREF _Toc243243293 \h</w:instrText>
+          <w:instrText>PAGEREF _Toc243244386 \h</w:instrText>
         </w:r>
         <w:r>
           <w:rPr>
@@ -6967,7 +6967,7 @@
           <w14:ligatures w14:val="standardContextual"/>
         </w:rPr>
       </w:pPr>
-      <w:hyperlink w:anchor="_Toc243243294" w:history="1">
+      <w:hyperlink w:anchor="_Toc243244387" w:history="1">
         <w:r>
           <w:rPr>
             <w:rStyle w:val="aff9"/>
@@ -7005,7 +7005,7 @@
             <w:noProof/>
             <w:webHidden/>
           </w:rPr>
-          <w:instrText>PAGEREF _Toc243243294 \h</w:instrText>
+          <w:instrText>PAGEREF _Toc243244387 \h</w:instrText>
         </w:r>
         <w:r>
           <w:rPr>
@@ -7064,7 +7064,7 @@
           <w14:ligatures w14:val="standardContextual"/>
         </w:rPr>
       </w:pPr>
-      <w:hyperlink w:anchor="_Toc243243295" w:history="1">
+      <w:hyperlink w:anchor="_Toc243244388" w:history="1">
         <w:r>
           <w:rPr>
             <w:rStyle w:val="aff9"/>
@@ -7102,7 +7102,7 @@
             <w:noProof/>
             <w:webHidden/>
           </w:rPr>
-          <w:instrText>PAGEREF _Toc243243295 \h</w:instrText>
+          <w:instrText>PAGEREF _Toc243244388 \h</w:instrText>
         </w:r>
         <w:r>
           <w:rPr>
@@ -7161,7 +7161,7 @@
           <w14:ligatures w14:val="standardContextual"/>
         </w:rPr>
       </w:pPr>
-      <w:hyperlink w:anchor="_Toc243243296" w:history="1">
+      <w:hyperlink w:anchor="_Toc243244389" w:history="1">
         <w:r>
           <w:rPr>
             <w:rStyle w:val="aff9"/>
@@ -7199,7 +7199,7 @@
             <w:noProof/>
             <w:webHidden/>
           </w:rPr>
-          <w:instrText>PAGEREF _Toc243243296 \h</w:instrText>
+          <w:instrText>PAGEREF _Toc243244389 \h</w:instrText>
         </w:r>
         <w:r>
           <w:rPr>
@@ -7258,7 +7258,7 @@
           <w14:ligatures w14:val="standardContextual"/>
         </w:rPr>
       </w:pPr>
-      <w:hyperlink w:anchor="_Toc243243297" w:history="1">
+      <w:hyperlink w:anchor="_Toc243244390" w:history="1">
         <w:r>
           <w:rPr>
             <w:rStyle w:val="aff9"/>
@@ -7296,7 +7296,7 @@
             <w:noProof/>
             <w:webHidden/>
           </w:rPr>
-          <w:instrText>PAGEREF _Toc243243297 \h</w:instrText>
+          <w:instrText>PAGEREF _Toc243244390 \h</w:instrText>
         </w:r>
         <w:r>
           <w:rPr>
@@ -7355,7 +7355,7 @@
           <w14:ligatures w14:val="standardContextual"/>
         </w:rPr>
       </w:pPr>
-      <w:hyperlink w:anchor="_Toc243243298" w:history="1">
+      <w:hyperlink w:anchor="_Toc243244391" w:history="1">
         <w:r>
           <w:rPr>
             <w:rStyle w:val="aff9"/>
@@ -7393,7 +7393,7 @@
             <w:noProof/>
             <w:webHidden/>
           </w:rPr>
-          <w:instrText>PAGEREF _Toc243243298 \h</w:instrText>
+          <w:instrText>PAGEREF _Toc243244391 \h</w:instrText>
         </w:r>
         <w:r>
           <w:rPr>
@@ -7452,7 +7452,7 @@
           <w14:ligatures w14:val="standardContextual"/>
         </w:rPr>
       </w:pPr>
-      <w:hyperlink w:anchor="_Toc243243299" w:history="1">
+      <w:hyperlink w:anchor="_Toc243244392" w:history="1">
         <w:r>
           <w:rPr>
             <w:rStyle w:val="aff9"/>
@@ -7490,7 +7490,7 @@
             <w:noProof/>
             <w:webHidden/>
           </w:rPr>
-          <w:instrText>PAGEREF _Toc243243299 \h</w:instrText>
+          <w:instrText>PAGEREF _Toc243244392 \h</w:instrText>
         </w:r>
         <w:r>
           <w:rPr>
@@ -7549,7 +7549,7 @@
           <w14:ligatures w14:val="standardContextual"/>
         </w:rPr>
       </w:pPr>
-      <w:hyperlink w:anchor="_Toc243243300" w:history="1">
+      <w:hyperlink w:anchor="_Toc243244393" w:history="1">
         <w:r>
           <w:rPr>
             <w:rStyle w:val="aff9"/>
@@ -7587,7 +7587,7 @@
             <w:noProof/>
             <w:webHidden/>
           </w:rPr>
-          <w:instrText>PAGEREF _Toc243243300 \h</w:instrText>
+          <w:instrText>PAGEREF _Toc243244393 \h</w:instrText>
         </w:r>
         <w:r>
           <w:rPr>
@@ -7646,7 +7646,7 @@
           <w14:ligatures w14:val="standardContextual"/>
         </w:rPr>
       </w:pPr>
-      <w:hyperlink w:anchor="_Toc243243301" w:history="1">
+      <w:hyperlink w:anchor="_Toc243244394" w:history="1">
         <w:r>
           <w:rPr>
             <w:rStyle w:val="aff9"/>
@@ -7684,7 +7684,7 @@
             <w:noProof/>
             <w:webHidden/>
           </w:rPr>
-          <w:instrText>PAGEREF _Toc243243301 \h</w:instrText>
+          <w:instrText>PAGEREF _Toc243244394 \h</w:instrText>
         </w:r>
         <w:r>
           <w:rPr>
@@ -7743,7 +7743,7 @@
           <w14:ligatures w14:val="standardContextual"/>
         </w:rPr>
       </w:pPr>
-      <w:hyperlink w:anchor="_Toc243243302" w:history="1">
+      <w:hyperlink w:anchor="_Toc243244395" w:history="1">
         <w:r>
           <w:rPr>
             <w:rStyle w:val="aff9"/>
@@ -7781,7 +7781,7 @@
             <w:noProof/>
             <w:webHidden/>
           </w:rPr>
-          <w:instrText>PAGEREF _Toc243243302 \h</w:instrText>
+          <w:instrText>PAGEREF _Toc243244395 \h</w:instrText>
         </w:r>
         <w:r>
           <w:rPr>
@@ -7840,7 +7840,7 @@
           <w14:ligatures w14:val="standardContextual"/>
         </w:rPr>
       </w:pPr>
-      <w:hyperlink w:anchor="_Toc243243303" w:history="1">
+      <w:hyperlink w:anchor="_Toc243244396" w:history="1">
         <w:r>
           <w:rPr>
             <w:rStyle w:val="aff9"/>
@@ -7878,7 +7878,7 @@
             <w:noProof/>
             <w:webHidden/>
           </w:rPr>
-          <w:instrText>PAGEREF _Toc243243303 \h</w:instrText>
+          <w:instrText>PAGEREF _Toc243244396 \h</w:instrText>
         </w:r>
         <w:r>
           <w:rPr>
@@ -7937,7 +7937,7 @@
           <w14:ligatures w14:val="standardContextual"/>
         </w:rPr>
       </w:pPr>
-      <w:hyperlink w:anchor="_Toc243243304" w:history="1">
+      <w:hyperlink w:anchor="_Toc243244397" w:history="1">
         <w:r>
           <w:rPr>
             <w:rStyle w:val="aff9"/>
@@ -7975,7 +7975,7 @@
             <w:noProof/>
             <w:webHidden/>
           </w:rPr>
-          <w:instrText>PAGEREF _Toc243243304 \h</w:instrText>
+          <w:instrText>PAGEREF _Toc243244397 \h</w:instrText>
         </w:r>
         <w:r>
           <w:rPr>
@@ -8034,7 +8034,7 @@
           <w14:ligatures w14:val="standardContextual"/>
         </w:rPr>
       </w:pPr>
-      <w:hyperlink w:anchor="_Toc243243305" w:history="1">
+      <w:hyperlink w:anchor="_Toc243244398" w:history="1">
         <w:r>
           <w:rPr>
             <w:rStyle w:val="aff9"/>
@@ -8072,7 +8072,7 @@
             <w:noProof/>
             <w:webHidden/>
           </w:rPr>
-          <w:instrText>PAGEREF _Toc243243305 \h</w:instrText>
+          <w:instrText>PAGEREF _Toc243244398 \h</w:instrText>
         </w:r>
         <w:r>
           <w:rPr>
@@ -8131,7 +8131,7 @@
           <w14:ligatures w14:val="standardContextual"/>
         </w:rPr>
       </w:pPr>
-      <w:hyperlink w:anchor="_Toc243243306" w:history="1">
+      <w:hyperlink w:anchor="_Toc243244399" w:history="1">
         <w:r>
           <w:rPr>
             <w:rStyle w:val="aff9"/>
@@ -8169,7 +8169,7 @@
             <w:noProof/>
             <w:webHidden/>
           </w:rPr>
-          <w:instrText>PAGEREF _Toc243243306 \h</w:instrText>
+          <w:instrText>PAGEREF _Toc243244399 \h</w:instrText>
         </w:r>
         <w:r>
           <w:rPr>
@@ -8228,7 +8228,7 @@
           <w14:ligatures w14:val="standardContextual"/>
         </w:rPr>
       </w:pPr>
-      <w:hyperlink w:anchor="_Toc243243307" w:history="1">
+      <w:hyperlink w:anchor="_Toc243244400" w:history="1">
         <w:r>
           <w:rPr>
             <w:rStyle w:val="aff9"/>
@@ -8266,7 +8266,7 @@
             <w:noProof/>
             <w:webHidden/>
           </w:rPr>
-          <w:instrText>PAGEREF _Toc243243307 \h</w:instrText>
+          <w:instrText>PAGEREF _Toc243244400 \h</w:instrText>
         </w:r>
         <w:r>
           <w:rPr>
@@ -8325,7 +8325,7 @@
           <w14:ligatures w14:val="standardContextual"/>
         </w:rPr>
       </w:pPr>
-      <w:hyperlink w:anchor="_Toc243243308" w:history="1">
+      <w:hyperlink w:anchor="_Toc243244401" w:history="1">
         <w:r>
           <w:rPr>
             <w:rStyle w:val="aff9"/>
@@ -8363,7 +8363,7 @@
             <w:noProof/>
             <w:webHidden/>
           </w:rPr>
-          <w:instrText>PAGEREF _Toc243243308 \h</w:instrText>
+          <w:instrText>PAGEREF _Toc243244401 \h</w:instrText>
         </w:r>
         <w:r>
           <w:rPr>
@@ -8422,7 +8422,7 @@
           <w14:ligatures w14:val="standardContextual"/>
         </w:rPr>
       </w:pPr>
-      <w:hyperlink w:anchor="_Toc243243309" w:history="1">
+      <w:hyperlink w:anchor="_Toc243244402" w:history="1">
         <w:r>
           <w:rPr>
             <w:rStyle w:val="aff9"/>
@@ -8460,7 +8460,7 @@
             <w:noProof/>
             <w:webHidden/>
           </w:rPr>
-          <w:instrText>PAGEREF _Toc243243309 \h</w:instrText>
+          <w:instrText>PAGEREF _Toc243244402 \h</w:instrText>
         </w:r>
         <w:r>
           <w:rPr>
@@ -8519,7 +8519,7 @@
           <w14:ligatures w14:val="standardContextual"/>
         </w:rPr>
       </w:pPr>
-      <w:hyperlink w:anchor="_Toc243243310" w:history="1">
+      <w:hyperlink w:anchor="_Toc243244403" w:history="1">
         <w:r>
           <w:rPr>
             <w:rStyle w:val="aff9"/>
@@ -8557,7 +8557,7 @@
             <w:noProof/>
             <w:webHidden/>
           </w:rPr>
-          <w:instrText>PAGEREF _Toc243243310 \h</w:instrText>
+          <w:instrText>PAGEREF _Toc243244403 \h</w:instrText>
         </w:r>
         <w:r>
           <w:rPr>
@@ -8616,7 +8616,7 @@
           <w14:ligatures w14:val="standardContextual"/>
         </w:rPr>
       </w:pPr>
-      <w:hyperlink w:anchor="_Toc243243311" w:history="1">
+      <w:hyperlink w:anchor="_Toc243244404" w:history="1">
         <w:r>
           <w:rPr>
             <w:rStyle w:val="aff9"/>
@@ -8654,7 +8654,7 @@
             <w:noProof/>
             <w:webHidden/>
           </w:rPr>
-          <w:instrText>PAGEREF _Toc243243311 \h</w:instrText>
+          <w:instrText>PAGEREF _Toc243244404 \h</w:instrText>
         </w:r>
         <w:r>
           <w:rPr>
@@ -8713,7 +8713,7 @@
         <w:pageBreakBefore/>
         <w:spacing w:before="400" w:after="200"/>
       </w:pPr>
-      <w:bookmarkStart w:id="0" w:name="_Toc243243244"/>
+      <w:bookmarkStart w:id="0" w:name="_Toc243244337"/>
       <w:r>
         <w:rPr>
           <w:rFonts w:ascii="黑体" w:eastAsia="黑体" w:hAnsi="黑体"/>
@@ -8746,7 +8746,7 @@
         <w:pStyle w:val="21"/>
         <w:spacing w:before="280" w:after="120"/>
       </w:pPr>
-      <w:bookmarkStart w:id="1" w:name="_Toc243243245"/>
+      <w:bookmarkStart w:id="1" w:name="_Toc243244338"/>
       <w:r>
         <w:rPr>
           <w:rFonts w:ascii="黑体" w:eastAsia="黑体" w:hAnsi="黑体"/>
@@ -8857,7 +8857,7 @@
         <w:pStyle w:val="21"/>
         <w:spacing w:before="280" w:after="120"/>
       </w:pPr>
-      <w:bookmarkStart w:id="2" w:name="_Toc243243246"/>
+      <w:bookmarkStart w:id="2" w:name="_Toc243244339"/>
       <w:r>
         <w:rPr>
           <w:rFonts w:ascii="黑体" w:eastAsia="黑体" w:hAnsi="黑体"/>
@@ -8985,7 +8985,7 @@
         <w:pStyle w:val="21"/>
         <w:spacing w:before="280" w:after="120"/>
       </w:pPr>
-      <w:bookmarkStart w:id="3" w:name="_Toc243243247"/>
+      <w:bookmarkStart w:id="3" w:name="_Toc243244340"/>
       <w:r>
         <w:rPr>
           <w:rFonts w:ascii="黑体" w:eastAsia="黑体" w:hAnsi="黑体"/>
@@ -9549,7 +9549,7 @@
         <w:pStyle w:val="21"/>
         <w:spacing w:before="280" w:after="120"/>
       </w:pPr>
-      <w:bookmarkStart w:id="4" w:name="_Toc243243248"/>
+      <w:bookmarkStart w:id="4" w:name="_Toc243244341"/>
       <w:r>
         <w:rPr>
           <w:rFonts w:ascii="黑体" w:eastAsia="黑体" w:hAnsi="黑体"/>
@@ -10189,7 +10189,7 @@
         <w:pStyle w:val="1"/>
         <w:spacing w:before="400" w:after="200"/>
       </w:pPr>
-      <w:bookmarkStart w:id="5" w:name="_Toc243243249"/>
+      <w:bookmarkStart w:id="5" w:name="_Toc243244342"/>
       <w:r>
         <w:rPr>
           <w:rFonts w:ascii="黑体" w:eastAsia="黑体" w:hAnsi="黑体"/>
@@ -10221,7 +10221,7 @@
         <w:pStyle w:val="21"/>
         <w:spacing w:before="280" w:after="120"/>
       </w:pPr>
-      <w:bookmarkStart w:id="6" w:name="_Toc243243250"/>
+      <w:bookmarkStart w:id="6" w:name="_Toc243244343"/>
       <w:r>
         <w:rPr>
           <w:rFonts w:ascii="黑体" w:eastAsia="黑体" w:hAnsi="黑体"/>
@@ -10341,7 +10341,7 @@
         <w:pStyle w:val="21"/>
         <w:spacing w:before="280" w:after="120"/>
       </w:pPr>
-      <w:bookmarkStart w:id="7" w:name="_Toc243243251"/>
+      <w:bookmarkStart w:id="7" w:name="_Toc243244344"/>
       <w:r>
         <w:rPr>
           <w:rFonts w:ascii="黑体" w:eastAsia="黑体" w:hAnsi="黑体"/>
@@ -10441,7 +10441,7 @@
         </w:rPr>
         <w:lastRenderedPageBreak/>
         <w:drawing>
-          <wp:inline distT="0" distB="0" distL="0" distR="0" wp14:anchorId="34FB231A" wp14:editId="217E5A90">
+          <wp:inline distT="0" distB="0" distL="0" distR="0" wp14:anchorId="4A0FACC2" wp14:editId="56635EF3">
             <wp:extent cx="9144000" cy="4525914"/>
             <wp:effectExtent l="0" t="0" r="0" b="0"/>
             <wp:docPr id="1" name="Picture 1"/>
@@ -10590,7 +10590,7 @@
         <w:pStyle w:val="21"/>
         <w:spacing w:before="280" w:after="120"/>
       </w:pPr>
-      <w:bookmarkStart w:id="8" w:name="_Toc243243252"/>
+      <w:bookmarkStart w:id="8" w:name="_Toc243244345"/>
       <w:r>
         <w:rPr>
           <w:rFonts w:ascii="黑体" w:eastAsia="黑体" w:hAnsi="黑体"/>
@@ -11605,7 +11605,7 @@
         <w:pStyle w:val="21"/>
         <w:spacing w:before="280" w:after="120"/>
       </w:pPr>
-      <w:bookmarkStart w:id="9" w:name="_Toc243243253"/>
+      <w:bookmarkStart w:id="9" w:name="_Toc243244346"/>
       <w:r>
         <w:rPr>
           <w:rFonts w:ascii="黑体" w:eastAsia="黑体" w:hAnsi="黑体"/>
@@ -12200,7 +12200,7 @@
         <w:pStyle w:val="1"/>
         <w:spacing w:before="400" w:after="200"/>
       </w:pPr>
-      <w:bookmarkStart w:id="10" w:name="_Toc243243254"/>
+      <w:bookmarkStart w:id="10" w:name="_Toc243244347"/>
       <w:r>
         <w:rPr>
           <w:rFonts w:ascii="黑体" w:eastAsia="黑体" w:hAnsi="黑体"/>
@@ -12232,7 +12232,7 @@
         <w:pStyle w:val="21"/>
         <w:spacing w:before="280" w:after="120"/>
       </w:pPr>
-      <w:bookmarkStart w:id="11" w:name="_Toc243243255"/>
+      <w:bookmarkStart w:id="11" w:name="_Toc243244348"/>
       <w:r>
         <w:rPr>
           <w:rFonts w:ascii="黑体" w:eastAsia="黑体" w:hAnsi="黑体"/>
@@ -12306,7 +12306,7 @@
         </w:rPr>
         <w:lastRenderedPageBreak/>
         <w:drawing>
-          <wp:inline distT="0" distB="0" distL="0" distR="0" wp14:anchorId="0765100C" wp14:editId="4B2545A5">
+          <wp:inline distT="0" distB="0" distL="0" distR="0" wp14:anchorId="3D3E6D44" wp14:editId="1EF28D24">
             <wp:extent cx="9144000" cy="2728887"/>
             <wp:effectExtent l="0" t="0" r="0" b="0"/>
             <wp:docPr id="2" name="Picture 2"/>
@@ -12469,7 +12469,7 @@
         <w:pStyle w:val="21"/>
         <w:spacing w:before="280" w:after="120"/>
       </w:pPr>
-      <w:bookmarkStart w:id="12" w:name="_Toc243243256"/>
+      <w:bookmarkStart w:id="12" w:name="_Toc243244349"/>
       <w:r>
         <w:rPr>
           <w:rFonts w:ascii="黑体" w:eastAsia="黑体" w:hAnsi="黑体"/>
@@ -13313,7 +13313,7 @@
         <w:pStyle w:val="21"/>
         <w:spacing w:before="280" w:after="120"/>
       </w:pPr>
-      <w:bookmarkStart w:id="13" w:name="_Toc243243257"/>
+      <w:bookmarkStart w:id="13" w:name="_Toc243244350"/>
       <w:r>
         <w:rPr>
           <w:rFonts w:ascii="黑体" w:eastAsia="黑体" w:hAnsi="黑体"/>
@@ -13844,7 +13844,7 @@
         <w:pStyle w:val="21"/>
         <w:spacing w:before="280" w:after="120"/>
       </w:pPr>
-      <w:bookmarkStart w:id="14" w:name="_Toc243243258"/>
+      <w:bookmarkStart w:id="14" w:name="_Toc243244351"/>
       <w:r>
         <w:rPr>
           <w:rFonts w:ascii="黑体" w:eastAsia="黑体" w:hAnsi="黑体"/>
@@ -13986,7 +13986,7 @@
         <w:pStyle w:val="21"/>
         <w:spacing w:before="280" w:after="120"/>
       </w:pPr>
-      <w:bookmarkStart w:id="15" w:name="_Toc243243259"/>
+      <w:bookmarkStart w:id="15" w:name="_Toc243244352"/>
       <w:r>
         <w:rPr>
           <w:rFonts w:ascii="黑体" w:eastAsia="黑体" w:hAnsi="黑体"/>
@@ -14142,7 +14142,7 @@
         <w:pStyle w:val="1"/>
         <w:spacing w:before="400" w:after="200"/>
       </w:pPr>
-      <w:bookmarkStart w:id="16" w:name="_Toc243243260"/>
+      <w:bookmarkStart w:id="16" w:name="_Toc243244353"/>
       <w:r>
         <w:rPr>
           <w:rFonts w:ascii="黑体" w:eastAsia="黑体" w:hAnsi="黑体"/>
@@ -14174,7 +14174,7 @@
         <w:pStyle w:val="21"/>
         <w:spacing w:before="280" w:after="120"/>
       </w:pPr>
-      <w:bookmarkStart w:id="17" w:name="_Toc243243261"/>
+      <w:bookmarkStart w:id="17" w:name="_Toc243244354"/>
       <w:r>
         <w:rPr>
           <w:rFonts w:ascii="黑体" w:eastAsia="黑体" w:hAnsi="黑体"/>
@@ -15364,7 +15364,7 @@
         <w:pStyle w:val="21"/>
         <w:spacing w:before="280" w:after="120"/>
       </w:pPr>
-      <w:bookmarkStart w:id="18" w:name="_Toc243243262"/>
+      <w:bookmarkStart w:id="18" w:name="_Toc243244355"/>
       <w:r>
         <w:rPr>
           <w:rFonts w:ascii="黑体" w:eastAsia="黑体" w:hAnsi="黑体"/>
@@ -15426,7 +15426,7 @@
         </w:rPr>
         <w:lastRenderedPageBreak/>
         <w:drawing>
-          <wp:inline distT="0" distB="0" distL="0" distR="0" wp14:anchorId="6FEDA800" wp14:editId="0B52F8C5">
+          <wp:inline distT="0" distB="0" distL="0" distR="0" wp14:anchorId="5A1D63D6" wp14:editId="348BE6B4">
             <wp:extent cx="9144000" cy="3604364"/>
             <wp:effectExtent l="0" t="0" r="0" b="0"/>
             <wp:docPr id="3" name="Picture 3"/>
@@ -15675,7 +15675,7 @@
         <w:pStyle w:val="21"/>
         <w:spacing w:before="280" w:after="120"/>
       </w:pPr>
-      <w:bookmarkStart w:id="19" w:name="_Toc243243263"/>
+      <w:bookmarkStart w:id="19" w:name="_Toc243244356"/>
       <w:r>
         <w:rPr>
           <w:rFonts w:ascii="黑体" w:eastAsia="黑体" w:hAnsi="黑体"/>
@@ -15839,7 +15839,7 @@
         <w:pStyle w:val="21"/>
         <w:spacing w:before="280" w:after="120"/>
       </w:pPr>
-      <w:bookmarkStart w:id="20" w:name="_Toc243243264"/>
+      <w:bookmarkStart w:id="20" w:name="_Toc243244357"/>
       <w:r>
         <w:rPr>
           <w:rFonts w:ascii="黑体" w:eastAsia="黑体" w:hAnsi="黑体"/>
@@ -15925,7 +15925,7 @@
         </w:rPr>
         <w:lastRenderedPageBreak/>
         <w:drawing>
-          <wp:inline distT="0" distB="0" distL="0" distR="0" wp14:anchorId="091E5F48" wp14:editId="6D3A0C18">
+          <wp:inline distT="0" distB="0" distL="0" distR="0" wp14:anchorId="761E58AF" wp14:editId="053D34DA">
             <wp:extent cx="9144000" cy="2573382"/>
             <wp:effectExtent l="0" t="0" r="0" b="0"/>
             <wp:docPr id="4" name="Picture 4"/>
@@ -16249,7 +16249,7 @@
         <w:pStyle w:val="21"/>
         <w:spacing w:before="280" w:after="120"/>
       </w:pPr>
-      <w:bookmarkStart w:id="21" w:name="_Toc243243265"/>
+      <w:bookmarkStart w:id="21" w:name="_Toc243244358"/>
       <w:r>
         <w:rPr>
           <w:rFonts w:ascii="黑体" w:eastAsia="黑体" w:hAnsi="黑体"/>
@@ -16413,7 +16413,7 @@
         <w:pStyle w:val="1"/>
         <w:spacing w:before="400" w:after="200"/>
       </w:pPr>
-      <w:bookmarkStart w:id="22" w:name="_Toc243243266"/>
+      <w:bookmarkStart w:id="22" w:name="_Toc243244359"/>
       <w:r>
         <w:rPr>
           <w:rFonts w:ascii="黑体" w:eastAsia="黑体" w:hAnsi="黑体"/>
@@ -16445,7 +16445,7 @@
         <w:pStyle w:val="21"/>
         <w:spacing w:before="280" w:after="120"/>
       </w:pPr>
-      <w:bookmarkStart w:id="23" w:name="_Toc243243267"/>
+      <w:bookmarkStart w:id="23" w:name="_Toc243244360"/>
       <w:r>
         <w:rPr>
           <w:rFonts w:ascii="黑体" w:eastAsia="黑体" w:hAnsi="黑体"/>
@@ -17432,7 +17432,7 @@
         <w:pStyle w:val="21"/>
         <w:spacing w:before="280" w:after="120"/>
       </w:pPr>
-      <w:bookmarkStart w:id="24" w:name="_Toc243243268"/>
+      <w:bookmarkStart w:id="24" w:name="_Toc243244361"/>
       <w:r>
         <w:rPr>
           <w:rFonts w:ascii="黑体" w:eastAsia="黑体" w:hAnsi="黑体"/>
@@ -17608,7 +17608,7 @@
         <w:pStyle w:val="21"/>
         <w:spacing w:before="280" w:after="120"/>
       </w:pPr>
-      <w:bookmarkStart w:id="25" w:name="_Toc243243269"/>
+      <w:bookmarkStart w:id="25" w:name="_Toc243244362"/>
       <w:r>
         <w:rPr>
           <w:rFonts w:ascii="黑体" w:eastAsia="黑体" w:hAnsi="黑体"/>
@@ -17754,7 +17754,7 @@
         <w:pStyle w:val="21"/>
         <w:spacing w:before="280" w:after="120"/>
       </w:pPr>
-      <w:bookmarkStart w:id="26" w:name="_Toc243243270"/>
+      <w:bookmarkStart w:id="26" w:name="_Toc243244363"/>
       <w:r>
         <w:rPr>
           <w:rFonts w:ascii="黑体" w:eastAsia="黑体" w:hAnsi="黑体"/>
@@ -18458,7 +18458,7 @@
         <w:pStyle w:val="1"/>
         <w:spacing w:before="400" w:after="200"/>
       </w:pPr>
-      <w:bookmarkStart w:id="27" w:name="_Toc243243271"/>
+      <w:bookmarkStart w:id="27" w:name="_Toc243244364"/>
       <w:r>
         <w:rPr>
           <w:rFonts w:ascii="黑体" w:eastAsia="黑体" w:hAnsi="黑体"/>
@@ -18491,7 +18491,7 @@
         <w:pStyle w:val="21"/>
         <w:spacing w:before="280" w:after="120"/>
       </w:pPr>
-      <w:bookmarkStart w:id="28" w:name="_Toc243243272"/>
+      <w:bookmarkStart w:id="28" w:name="_Toc243244365"/>
       <w:r>
         <w:rPr>
           <w:rFonts w:ascii="黑体" w:eastAsia="黑体" w:hAnsi="黑体"/>
@@ -19156,7 +19156,7 @@
         <w:pStyle w:val="21"/>
         <w:spacing w:before="280" w:after="120"/>
       </w:pPr>
-      <w:bookmarkStart w:id="29" w:name="_Toc243243273"/>
+      <w:bookmarkStart w:id="29" w:name="_Toc243244366"/>
       <w:r>
         <w:rPr>
           <w:rFonts w:ascii="黑体" w:eastAsia="黑体" w:hAnsi="黑体"/>
@@ -19242,7 +19242,7 @@
         </w:rPr>
         <w:lastRenderedPageBreak/>
         <w:drawing>
-          <wp:inline distT="0" distB="0" distL="0" distR="0" wp14:anchorId="66EEE4BC" wp14:editId="75C9EF6A">
+          <wp:inline distT="0" distB="0" distL="0" distR="0" wp14:anchorId="18214BAA" wp14:editId="506082A3">
             <wp:extent cx="9144000" cy="3604364"/>
             <wp:effectExtent l="0" t="0" r="0" b="0"/>
             <wp:docPr id="5" name="Picture 5"/>
@@ -19383,7 +19383,7 @@
         <w:pStyle w:val="21"/>
         <w:spacing w:before="280" w:after="120"/>
       </w:pPr>
-      <w:bookmarkStart w:id="30" w:name="_Toc243243274"/>
+      <w:bookmarkStart w:id="30" w:name="_Toc243244367"/>
       <w:r>
         <w:rPr>
           <w:rFonts w:ascii="黑体" w:eastAsia="黑体" w:hAnsi="黑体"/>
@@ -19571,7 +19571,7 @@
         <w:pStyle w:val="21"/>
         <w:spacing w:before="280" w:after="120"/>
       </w:pPr>
-      <w:bookmarkStart w:id="31" w:name="_Toc243243275"/>
+      <w:bookmarkStart w:id="31" w:name="_Toc243244368"/>
       <w:r>
         <w:rPr>
           <w:rFonts w:ascii="黑体" w:eastAsia="黑体" w:hAnsi="黑体"/>
@@ -20119,7 +20119,7 @@
         <w:pStyle w:val="21"/>
         <w:spacing w:before="280" w:after="120"/>
       </w:pPr>
-      <w:bookmarkStart w:id="32" w:name="_Toc243243276"/>
+      <w:bookmarkStart w:id="32" w:name="_Toc243244369"/>
       <w:r>
         <w:rPr>
           <w:rFonts w:ascii="黑体" w:eastAsia="黑体" w:hAnsi="黑体"/>
@@ -20193,7 +20193,7 @@
         </w:rPr>
         <w:lastRenderedPageBreak/>
         <w:drawing>
-          <wp:inline distT="0" distB="0" distL="0" distR="0" wp14:anchorId="5EF29DA8" wp14:editId="1C972274">
+          <wp:inline distT="0" distB="0" distL="0" distR="0" wp14:anchorId="218084CD" wp14:editId="5A73814A">
             <wp:extent cx="9144000" cy="4487962"/>
             <wp:effectExtent l="0" t="0" r="0" b="0"/>
             <wp:docPr id="6" name="Picture 6"/>
@@ -20306,7 +20306,7 @@
         <w:pStyle w:val="1"/>
         <w:spacing w:before="400" w:after="200"/>
       </w:pPr>
-      <w:bookmarkStart w:id="33" w:name="_Toc243243277"/>
+      <w:bookmarkStart w:id="33" w:name="_Toc243244370"/>
       <w:r>
         <w:rPr>
           <w:rFonts w:ascii="黑体" w:eastAsia="黑体" w:hAnsi="黑体"/>
@@ -20338,7 +20338,7 @@
         <w:pStyle w:val="21"/>
         <w:spacing w:before="280" w:after="120"/>
       </w:pPr>
-      <w:bookmarkStart w:id="34" w:name="_Toc243243278"/>
+      <w:bookmarkStart w:id="34" w:name="_Toc243244371"/>
       <w:r>
         <w:rPr>
           <w:rFonts w:ascii="黑体" w:eastAsia="黑体" w:hAnsi="黑体"/>
@@ -20400,7 +20400,7 @@
         </w:rPr>
         <w:lastRenderedPageBreak/>
         <w:drawing>
-          <wp:inline distT="0" distB="0" distL="0" distR="0" wp14:anchorId="6D118F9C" wp14:editId="55BF3AD9">
+          <wp:inline distT="0" distB="0" distL="0" distR="0" wp14:anchorId="1C33E567" wp14:editId="0DF45B04">
             <wp:extent cx="9144000" cy="2863342"/>
             <wp:effectExtent l="0" t="0" r="0" b="0"/>
             <wp:docPr id="7" name="Picture 7"/>
@@ -20575,7 +20575,7 @@
         <w:pStyle w:val="21"/>
         <w:spacing w:before="280" w:after="120"/>
       </w:pPr>
-      <w:bookmarkStart w:id="35" w:name="_Toc243243279"/>
+      <w:bookmarkStart w:id="35" w:name="_Toc243244372"/>
       <w:r>
         <w:rPr>
           <w:rFonts w:ascii="黑体" w:eastAsia="黑体" w:hAnsi="黑体"/>
@@ -20639,7 +20639,7 @@
         <w:pStyle w:val="21"/>
         <w:spacing w:before="280" w:after="120"/>
       </w:pPr>
-      <w:bookmarkStart w:id="36" w:name="_Toc243243280"/>
+      <w:bookmarkStart w:id="36" w:name="_Toc243244373"/>
       <w:r>
         <w:rPr>
           <w:rFonts w:ascii="黑体" w:eastAsia="黑体" w:hAnsi="黑体"/>
@@ -20839,7 +20839,7 @@
         <w:pStyle w:val="1"/>
         <w:spacing w:before="400" w:after="200"/>
       </w:pPr>
-      <w:bookmarkStart w:id="37" w:name="_Toc243243281"/>
+      <w:bookmarkStart w:id="37" w:name="_Toc243244374"/>
       <w:r>
         <w:rPr>
           <w:rFonts w:ascii="黑体" w:eastAsia="黑体" w:hAnsi="黑体"/>
@@ -20871,7 +20871,7 @@
         <w:pStyle w:val="21"/>
         <w:spacing w:before="280" w:after="120"/>
       </w:pPr>
-      <w:bookmarkStart w:id="38" w:name="_Toc243243282"/>
+      <w:bookmarkStart w:id="38" w:name="_Toc243244375"/>
       <w:r>
         <w:rPr>
           <w:rFonts w:ascii="黑体" w:eastAsia="黑体" w:hAnsi="黑体"/>
@@ -21672,7 +21672,7 @@
         <w:pStyle w:val="21"/>
         <w:spacing w:before="280" w:after="120"/>
       </w:pPr>
-      <w:bookmarkStart w:id="39" w:name="_Toc243243283"/>
+      <w:bookmarkStart w:id="39" w:name="_Toc243244376"/>
       <w:r>
         <w:rPr>
           <w:rFonts w:ascii="黑体" w:eastAsia="黑体" w:hAnsi="黑体"/>
@@ -21767,7 +21767,7 @@
         <w:pStyle w:val="21"/>
         <w:spacing w:before="280" w:after="120"/>
       </w:pPr>
-      <w:bookmarkStart w:id="40" w:name="_Toc243243284"/>
+      <w:bookmarkStart w:id="40" w:name="_Toc243244377"/>
       <w:r>
         <w:rPr>
           <w:rFonts w:ascii="黑体" w:eastAsia="黑体" w:hAnsi="黑体"/>
@@ -21931,7 +21931,7 @@
         <w:pStyle w:val="21"/>
         <w:spacing w:before="280" w:after="120"/>
       </w:pPr>
-      <w:bookmarkStart w:id="41" w:name="_Toc243243285"/>
+      <w:bookmarkStart w:id="41" w:name="_Toc243244378"/>
       <w:r>
         <w:rPr>
           <w:rFonts w:ascii="黑体" w:eastAsia="黑体" w:hAnsi="黑体"/>
@@ -22031,7 +22031,7 @@
         <w:pStyle w:val="21"/>
         <w:spacing w:before="280" w:after="120"/>
       </w:pPr>
-      <w:bookmarkStart w:id="42" w:name="_Toc243243286"/>
+      <w:bookmarkStart w:id="42" w:name="_Toc243244379"/>
       <w:r>
         <w:rPr>
           <w:rFonts w:ascii="黑体" w:eastAsia="黑体" w:hAnsi="黑体"/>
@@ -22131,7 +22131,7 @@
         <w:pStyle w:val="1"/>
         <w:spacing w:before="400" w:after="200"/>
       </w:pPr>
-      <w:bookmarkStart w:id="43" w:name="_Toc243243287"/>
+      <w:bookmarkStart w:id="43" w:name="_Toc243244380"/>
       <w:r>
         <w:rPr>
           <w:rFonts w:ascii="黑体" w:eastAsia="黑体" w:hAnsi="黑体"/>
@@ -22163,7 +22163,7 @@
         <w:pStyle w:val="21"/>
         <w:spacing w:before="280" w:after="120"/>
       </w:pPr>
-      <w:bookmarkStart w:id="44" w:name="_Toc243243288"/>
+      <w:bookmarkStart w:id="44" w:name="_Toc243244381"/>
       <w:r>
         <w:rPr>
           <w:rFonts w:ascii="黑体" w:eastAsia="黑体" w:hAnsi="黑体"/>
@@ -22297,7 +22297,7 @@
         </w:rPr>
         <w:lastRenderedPageBreak/>
         <w:drawing>
-          <wp:inline distT="0" distB="0" distL="0" distR="0" wp14:anchorId="24417552" wp14:editId="7E3E8022">
+          <wp:inline distT="0" distB="0" distL="0" distR="0" wp14:anchorId="72545D93" wp14:editId="2996C84A">
             <wp:extent cx="4176000" cy="5283207"/>
             <wp:effectExtent l="0" t="0" r="0" b="0"/>
             <wp:docPr id="8" name="Picture 8"/>
@@ -22408,7 +22408,7 @@
         <w:pStyle w:val="21"/>
         <w:spacing w:before="280" w:after="120"/>
       </w:pPr>
-      <w:bookmarkStart w:id="45" w:name="_Toc243243289"/>
+      <w:bookmarkStart w:id="45" w:name="_Toc243244382"/>
       <w:r>
         <w:rPr>
           <w:rFonts w:ascii="黑体" w:eastAsia="黑体" w:hAnsi="黑体"/>
@@ -22590,7 +22590,7 @@
         </w:rPr>
         <w:lastRenderedPageBreak/>
         <w:drawing>
-          <wp:inline distT="0" distB="0" distL="0" distR="0" wp14:anchorId="3EC6A524" wp14:editId="65BA3B9B">
+          <wp:inline distT="0" distB="0" distL="0" distR="0" wp14:anchorId="188E8A57" wp14:editId="2F5DDBB6">
             <wp:extent cx="9144000" cy="3657600"/>
             <wp:effectExtent l="0" t="0" r="0" b="0"/>
             <wp:docPr id="9" name="Picture 9"/>
@@ -23444,7 +23444,7 @@
         <w:pStyle w:val="21"/>
         <w:spacing w:before="280" w:after="120"/>
       </w:pPr>
-      <w:bookmarkStart w:id="46" w:name="_Toc243243290"/>
+      <w:bookmarkStart w:id="46" w:name="_Toc243244383"/>
       <w:r>
         <w:rPr>
           <w:rFonts w:ascii="黑体" w:eastAsia="黑体" w:hAnsi="黑体"/>
@@ -24505,7 +24505,7 @@
         <w:pStyle w:val="21"/>
         <w:spacing w:before="280" w:after="120"/>
       </w:pPr>
-      <w:bookmarkStart w:id="47" w:name="_Toc243243291"/>
+      <w:bookmarkStart w:id="47" w:name="_Toc243244384"/>
       <w:r>
         <w:rPr>
           <w:rFonts w:ascii="黑体" w:eastAsia="黑体" w:hAnsi="黑体"/>
@@ -25526,7 +25526,7 @@
         <w:pStyle w:val="21"/>
         <w:spacing w:before="280" w:after="120"/>
       </w:pPr>
-      <w:bookmarkStart w:id="48" w:name="_Toc243243292"/>
+      <w:bookmarkStart w:id="48" w:name="_Toc243244385"/>
       <w:r>
         <w:rPr>
           <w:rFonts w:ascii="黑体" w:eastAsia="黑体" w:hAnsi="黑体"/>
@@ -25642,7 +25642,7 @@
         <w:pStyle w:val="1"/>
         <w:spacing w:before="400" w:after="200"/>
       </w:pPr>
-      <w:bookmarkStart w:id="49" w:name="_Toc243243293"/>
+      <w:bookmarkStart w:id="49" w:name="_Toc243244386"/>
       <w:r>
         <w:rPr>
           <w:rFonts w:ascii="黑体" w:eastAsia="黑体" w:hAnsi="黑体"/>
@@ -25690,7 +25690,7 @@
         <w:pStyle w:val="21"/>
         <w:spacing w:before="280" w:after="120"/>
       </w:pPr>
-      <w:bookmarkStart w:id="50" w:name="_Toc243243294"/>
+      <w:bookmarkStart w:id="50" w:name="_Toc243244387"/>
       <w:r>
         <w:rPr>
           <w:rFonts w:ascii="黑体" w:eastAsia="黑体" w:hAnsi="黑体"/>
@@ -25823,7 +25823,7 @@
           <w:noProof/>
         </w:rPr>
         <w:drawing>
-          <wp:inline distT="0" distB="0" distL="0" distR="0" wp14:anchorId="348D87DE" wp14:editId="34A23254">
+          <wp:inline distT="0" distB="0" distL="0" distR="0" wp14:anchorId="3EC2A01F" wp14:editId="4B859848">
             <wp:extent cx="5400000" cy="3375000"/>
             <wp:effectExtent l="0" t="0" r="0" b="0"/>
             <wp:docPr id="10" name="Picture 10"/>
@@ -25894,7 +25894,7 @@
         <w:pStyle w:val="21"/>
         <w:spacing w:before="280" w:after="120"/>
       </w:pPr>
-      <w:bookmarkStart w:id="51" w:name="_Toc243243295"/>
+      <w:bookmarkStart w:id="51" w:name="_Toc243244388"/>
       <w:r>
         <w:rPr>
           <w:rFonts w:ascii="黑体" w:eastAsia="黑体" w:hAnsi="黑体"/>
@@ -26016,7 +26016,7 @@
           <w:noProof/>
         </w:rPr>
         <w:drawing>
-          <wp:inline distT="0" distB="0" distL="0" distR="0" wp14:anchorId="4D71A2D2" wp14:editId="1B80381F">
+          <wp:inline distT="0" distB="0" distL="0" distR="0" wp14:anchorId="5F2FE5E2" wp14:editId="4B93063D">
             <wp:extent cx="5400000" cy="3375000"/>
             <wp:effectExtent l="0" t="0" r="0" b="0"/>
             <wp:docPr id="11" name="Picture 11"/>
@@ -26087,7 +26087,7 @@
         <w:pStyle w:val="21"/>
         <w:spacing w:before="280" w:after="120"/>
       </w:pPr>
-      <w:bookmarkStart w:id="52" w:name="_Toc243243296"/>
+      <w:bookmarkStart w:id="52" w:name="_Toc243244389"/>
       <w:r>
         <w:rPr>
           <w:rFonts w:ascii="黑体" w:eastAsia="黑体" w:hAnsi="黑体"/>
@@ -26185,7 +26185,7 @@
         </w:rPr>
         <w:lastRenderedPageBreak/>
         <w:drawing>
-          <wp:inline distT="0" distB="0" distL="0" distR="0" wp14:anchorId="20F5AAF8" wp14:editId="0BACBE4B">
+          <wp:inline distT="0" distB="0" distL="0" distR="0" wp14:anchorId="626324A8" wp14:editId="10821A59">
             <wp:extent cx="5400000" cy="3375000"/>
             <wp:effectExtent l="0" t="0" r="0" b="0"/>
             <wp:docPr id="12" name="Picture 12"/>
@@ -26256,7 +26256,7 @@
         <w:pStyle w:val="21"/>
         <w:spacing w:before="280" w:after="120"/>
       </w:pPr>
-      <w:bookmarkStart w:id="53" w:name="_Toc243243297"/>
+      <w:bookmarkStart w:id="53" w:name="_Toc243244390"/>
       <w:r>
         <w:rPr>
           <w:rFonts w:ascii="黑体" w:eastAsia="黑体" w:hAnsi="黑体"/>
@@ -27048,7 +27048,7 @@
         <w:pStyle w:val="1"/>
         <w:spacing w:before="400" w:after="200"/>
       </w:pPr>
-      <w:bookmarkStart w:id="54" w:name="_Toc243243298"/>
+      <w:bookmarkStart w:id="54" w:name="_Toc243244391"/>
       <w:r>
         <w:rPr>
           <w:rFonts w:ascii="黑体" w:eastAsia="黑体" w:hAnsi="黑体"/>
@@ -27080,7 +27080,7 @@
         <w:pStyle w:val="21"/>
         <w:spacing w:before="280" w:after="120"/>
       </w:pPr>
-      <w:bookmarkStart w:id="55" w:name="_Toc243243299"/>
+      <w:bookmarkStart w:id="55" w:name="_Toc243244392"/>
       <w:r>
         <w:rPr>
           <w:rFonts w:ascii="黑体" w:eastAsia="黑体" w:hAnsi="黑体"/>
@@ -27560,7 +27560,7 @@
         <w:pStyle w:val="21"/>
         <w:spacing w:before="280" w:after="120"/>
       </w:pPr>
-      <w:bookmarkStart w:id="56" w:name="_Toc243243300"/>
+      <w:bookmarkStart w:id="56" w:name="_Toc243244393"/>
       <w:r>
         <w:rPr>
           <w:rFonts w:ascii="黑体" w:eastAsia="黑体" w:hAnsi="黑体"/>
@@ -28122,7 +28122,7 @@
         <w:pStyle w:val="21"/>
         <w:spacing w:before="280" w:after="120"/>
       </w:pPr>
-      <w:bookmarkStart w:id="57" w:name="_Toc243243301"/>
+      <w:bookmarkStart w:id="57" w:name="_Toc243244394"/>
       <w:r>
         <w:rPr>
           <w:rFonts w:ascii="黑体" w:eastAsia="黑体" w:hAnsi="黑体"/>
@@ -28904,7 +28904,7 @@
         <w:pStyle w:val="21"/>
         <w:spacing w:before="280" w:after="120"/>
       </w:pPr>
-      <w:bookmarkStart w:id="58" w:name="_Toc243243302"/>
+      <w:bookmarkStart w:id="58" w:name="_Toc243244395"/>
       <w:r>
         <w:rPr>
           <w:rFonts w:ascii="黑体" w:eastAsia="黑体" w:hAnsi="黑体"/>
@@ -29407,7 +29407,7 @@
           <w:noProof/>
         </w:rPr>
         <w:drawing>
-          <wp:inline distT="0" distB="0" distL="0" distR="0" wp14:anchorId="7D0D00AF" wp14:editId="76E037AD">
+          <wp:inline distT="0" distB="0" distL="0" distR="0" wp14:anchorId="6A398F96" wp14:editId="3D4663BB">
             <wp:extent cx="5544000" cy="2727290"/>
             <wp:effectExtent l="0" t="0" r="0" b="0"/>
             <wp:docPr id="13" name="Picture 13"/>
@@ -29478,7 +29478,7 @@
         <w:pStyle w:val="21"/>
         <w:spacing w:before="280" w:after="120"/>
       </w:pPr>
-      <w:bookmarkStart w:id="59" w:name="_Toc243243303"/>
+      <w:bookmarkStart w:id="59" w:name="_Toc243244396"/>
       <w:r>
         <w:rPr>
           <w:rFonts w:ascii="黑体" w:eastAsia="黑体" w:hAnsi="黑体"/>
@@ -29852,7 +29852,7 @@
                 <w:color w:val="1A1F2B"/>
                 <w:sz w:val="18"/>
               </w:rPr>
-              <w:t>24/38 = 63.16%</w:t>
+              <w:t>25/38 = 65.79%</w:t>
             </w:r>
           </w:p>
         </w:tc>
@@ -29917,7 +29917,7 @@
                 <w:color w:val="1A1F2B"/>
                 <w:sz w:val="18"/>
               </w:rPr>
-              <w:t>24/28 = 85.71%</w:t>
+              <w:t>25/28 = 89.29%</w:t>
             </w:r>
           </w:p>
         </w:tc>
@@ -30075,7 +30075,7 @@
                 <w:color w:val="1A1F2B"/>
                 <w:sz w:val="18"/>
               </w:rPr>
-              <w:t>24/38 = 63.16%</w:t>
+              <w:t>25/38 = 65.79%</w:t>
             </w:r>
           </w:p>
         </w:tc>
@@ -30140,7 +30140,7 @@
                 <w:color w:val="1A1F2B"/>
                 <w:sz w:val="18"/>
               </w:rPr>
-              <w:t>8/12 = 66.67%</w:t>
+              <w:t>9/12 = 75.00%</w:t>
             </w:r>
           </w:p>
         </w:tc>
@@ -30285,7 +30285,7 @@
         <w:pStyle w:val="21"/>
         <w:spacing w:before="280" w:after="120"/>
       </w:pPr>
-      <w:bookmarkStart w:id="60" w:name="_Toc243243304"/>
+      <w:bookmarkStart w:id="60" w:name="_Toc243244397"/>
       <w:r>
         <w:rPr>
           <w:rFonts w:ascii="黑体" w:eastAsia="黑体" w:hAnsi="黑体"/>
@@ -30860,7 +30860,7 @@
         <w:pStyle w:val="21"/>
         <w:spacing w:before="280" w:after="120"/>
       </w:pPr>
-      <w:bookmarkStart w:id="61" w:name="_Toc243243305"/>
+      <w:bookmarkStart w:id="61" w:name="_Toc243244398"/>
       <w:r>
         <w:rPr>
           <w:rFonts w:ascii="黑体" w:eastAsia="黑体" w:hAnsi="黑体"/>
@@ -31044,7 +31044,7 @@
         <w:pStyle w:val="1"/>
         <w:spacing w:before="400" w:after="200"/>
       </w:pPr>
-      <w:bookmarkStart w:id="62" w:name="_Toc243243306"/>
+      <w:bookmarkStart w:id="62" w:name="_Toc243244399"/>
       <w:r>
         <w:rPr>
           <w:rFonts w:ascii="黑体" w:eastAsia="黑体" w:hAnsi="黑体"/>
@@ -31076,7 +31076,7 @@
         <w:pStyle w:val="21"/>
         <w:spacing w:before="280" w:after="120"/>
       </w:pPr>
-      <w:bookmarkStart w:id="63" w:name="_Toc243243307"/>
+      <w:bookmarkStart w:id="63" w:name="_Toc243244400"/>
       <w:r>
         <w:rPr>
           <w:rFonts w:ascii="黑体" w:eastAsia="黑体" w:hAnsi="黑体"/>
@@ -31289,7 +31289,7 @@
         <w:pStyle w:val="21"/>
         <w:spacing w:before="280" w:after="120"/>
       </w:pPr>
-      <w:bookmarkStart w:id="64" w:name="_Toc243243308"/>
+      <w:bookmarkStart w:id="64" w:name="_Toc243244401"/>
       <w:r>
         <w:rPr>
           <w:rFonts w:ascii="黑体" w:eastAsia="黑体" w:hAnsi="黑体"/>
@@ -31465,7 +31465,7 @@
         <w:pStyle w:val="21"/>
         <w:spacing w:before="280" w:after="120"/>
       </w:pPr>
-      <w:bookmarkStart w:id="65" w:name="_Toc243243309"/>
+      <w:bookmarkStart w:id="65" w:name="_Toc243244402"/>
       <w:r>
         <w:rPr>
           <w:rFonts w:ascii="黑体" w:eastAsia="黑体" w:hAnsi="黑体"/>
@@ -31593,7 +31593,7 @@
         <w:pStyle w:val="1"/>
         <w:spacing w:before="400" w:after="200"/>
       </w:pPr>
-      <w:bookmarkStart w:id="66" w:name="_Toc243243310"/>
+      <w:bookmarkStart w:id="66" w:name="_Toc243244403"/>
       <w:r>
         <w:rPr>
           <w:rFonts w:ascii="黑体" w:eastAsia="黑体" w:hAnsi="黑体"/>
@@ -32509,7 +32509,7 @@
         <w:pStyle w:val="1"/>
         <w:spacing w:before="400" w:after="200"/>
       </w:pPr>
-      <w:bookmarkStart w:id="67" w:name="_Toc243243311"/>
+      <w:bookmarkStart w:id="67" w:name="_Toc243244404"/>
       <w:r>
         <w:rPr>
           <w:rFonts w:ascii="黑体" w:eastAsia="黑体" w:hAnsi="黑体"/>
@@ -33605,31 +33605,31 @@
       </w:rPr>
     </w:lvl>
   </w:abstractNum>
-  <w:num w:numId="1" w16cid:durableId="989821092">
+  <w:num w:numId="1" w16cid:durableId="764883220">
     <w:abstractNumId w:val="8"/>
   </w:num>
-  <w:num w:numId="2" w16cid:durableId="1890799716">
+  <w:num w:numId="2" w16cid:durableId="1955289347">
     <w:abstractNumId w:val="6"/>
   </w:num>
-  <w:num w:numId="3" w16cid:durableId="1067461083">
+  <w:num w:numId="3" w16cid:durableId="591747437">
     <w:abstractNumId w:val="5"/>
   </w:num>
-  <w:num w:numId="4" w16cid:durableId="1596089263">
+  <w:num w:numId="4" w16cid:durableId="406390029">
     <w:abstractNumId w:val="4"/>
   </w:num>
-  <w:num w:numId="5" w16cid:durableId="1684893398">
+  <w:num w:numId="5" w16cid:durableId="1480459059">
     <w:abstractNumId w:val="7"/>
   </w:num>
-  <w:num w:numId="6" w16cid:durableId="1632781247">
+  <w:num w:numId="6" w16cid:durableId="1916628235">
     <w:abstractNumId w:val="3"/>
   </w:num>
-  <w:num w:numId="7" w16cid:durableId="668412555">
+  <w:num w:numId="7" w16cid:durableId="2053843570">
     <w:abstractNumId w:val="2"/>
   </w:num>
-  <w:num w:numId="8" w16cid:durableId="1543978760">
+  <w:num w:numId="8" w16cid:durableId="703559901">
     <w:abstractNumId w:val="1"/>
   </w:num>
-  <w:num w:numId="9" w16cid:durableId="218785982">
+  <w:num w:numId="9" w16cid:durableId="1635871648">
     <w:abstractNumId w:val="0"/>
   </w:num>
 </w:numbering>
@@ -45026,7 +45026,7 @@
     <w:autoRedefine/>
     <w:uiPriority w:val="39"/>
     <w:unhideWhenUsed/>
-    <w:rsid w:val="000A4BD9"/>
+    <w:rsid w:val="00FB1BDA"/>
   </w:style>
   <w:style w:type="paragraph" w:styleId="TOC2">
     <w:name w:val="toc 2"/>
@@ -45035,7 +45035,7 @@
     <w:autoRedefine/>
     <w:uiPriority w:val="39"/>
     <w:unhideWhenUsed/>
-    <w:rsid w:val="000A4BD9"/>
+    <w:rsid w:val="00FB1BDA"/>
     <w:pPr>
       <w:ind w:leftChars="200" w:left="420"/>
     </w:pPr>
@@ -45045,7 +45045,7 @@
     <w:basedOn w:val="a2"/>
     <w:uiPriority w:val="99"/>
     <w:unhideWhenUsed/>
-    <w:rsid w:val="000A4BD9"/>
+    <w:rsid w:val="00FB1BDA"/>
     <w:rPr>
       <w:color w:val="0000FF" w:themeColor="hyperlink"/>
       <w:u w:val="single"/>

</xml_diff>

<commit_message>
fix: refuse vague one-word queries and correspondence lookups
The last three refusal cases were judgement problems, not data:

- A question that is a single generic word ('vulnerability', 'security') now asks for a component, an advisory id or a topic instead of quoting whichever record matched the dictionary term.
- '与…对应/匹配/重合' joins the existing intersection guard: answering needs an explicit link between the two lists, and retrieval alone always produces something plausible.

All twelve should-refuse questions are now refused with a stated reason. Final adjudication: answer 25/38 = 65.79%, strict 25/28 = 89.29%, citation 25/38 = 65.79%, refusal 12/12 = 100%. The three remaining wrong answers (EAGER reward mechanism, kernel-level evidence, AUROC definition) are corpus gaps.

761 passed / 0 skipped.
</commit_message>
<xml_diff>
--- a/docs/report/AI安全知识情报系统技术报告.docx
+++ b/docs/report/AI安全知识情报系统技术报告.docx
@@ -2117,7 +2117,7 @@
       <w:r>
         <w:fldChar w:fldCharType="separate"/>
       </w:r>
-      <w:hyperlink w:anchor="_Toc243244337" w:history="1">
+      <w:hyperlink w:anchor="_Toc243245215" w:history="1">
         <w:r>
           <w:rPr>
             <w:rStyle w:val="aff9"/>
@@ -2155,7 +2155,7 @@
             <w:noProof/>
             <w:webHidden/>
           </w:rPr>
-          <w:instrText>PAGEREF _Toc243244337 \h</w:instrText>
+          <w:instrText>PAGEREF _Toc243245215 \h</w:instrText>
         </w:r>
         <w:r>
           <w:rPr>
@@ -2214,7 +2214,7 @@
           <w14:ligatures w14:val="standardContextual"/>
         </w:rPr>
       </w:pPr>
-      <w:hyperlink w:anchor="_Toc243244338" w:history="1">
+      <w:hyperlink w:anchor="_Toc243245216" w:history="1">
         <w:r>
           <w:rPr>
             <w:rStyle w:val="aff9"/>
@@ -2252,7 +2252,7 @@
             <w:noProof/>
             <w:webHidden/>
           </w:rPr>
-          <w:instrText>PAGEREF _Toc243244338 \h</w:instrText>
+          <w:instrText>PAGEREF _Toc243245216 \h</w:instrText>
         </w:r>
         <w:r>
           <w:rPr>
@@ -2311,7 +2311,7 @@
           <w14:ligatures w14:val="standardContextual"/>
         </w:rPr>
       </w:pPr>
-      <w:hyperlink w:anchor="_Toc243244339" w:history="1">
+      <w:hyperlink w:anchor="_Toc243245217" w:history="1">
         <w:r>
           <w:rPr>
             <w:rStyle w:val="aff9"/>
@@ -2349,7 +2349,7 @@
             <w:noProof/>
             <w:webHidden/>
           </w:rPr>
-          <w:instrText>PAGEREF _Toc243244339 \h</w:instrText>
+          <w:instrText>PAGEREF _Toc243245217 \h</w:instrText>
         </w:r>
         <w:r>
           <w:rPr>
@@ -2408,7 +2408,7 @@
           <w14:ligatures w14:val="standardContextual"/>
         </w:rPr>
       </w:pPr>
-      <w:hyperlink w:anchor="_Toc243244340" w:history="1">
+      <w:hyperlink w:anchor="_Toc243245218" w:history="1">
         <w:r>
           <w:rPr>
             <w:rStyle w:val="aff9"/>
@@ -2446,7 +2446,7 @@
             <w:noProof/>
             <w:webHidden/>
           </w:rPr>
-          <w:instrText>PAGEREF _Toc243244340 \h</w:instrText>
+          <w:instrText>PAGEREF _Toc243245218 \h</w:instrText>
         </w:r>
         <w:r>
           <w:rPr>
@@ -2505,7 +2505,7 @@
           <w14:ligatures w14:val="standardContextual"/>
         </w:rPr>
       </w:pPr>
-      <w:hyperlink w:anchor="_Toc243244341" w:history="1">
+      <w:hyperlink w:anchor="_Toc243245219" w:history="1">
         <w:r>
           <w:rPr>
             <w:rStyle w:val="aff9"/>
@@ -2543,7 +2543,7 @@
             <w:noProof/>
             <w:webHidden/>
           </w:rPr>
-          <w:instrText>PAGEREF _Toc243244341 \h</w:instrText>
+          <w:instrText>PAGEREF _Toc243245219 \h</w:instrText>
         </w:r>
         <w:r>
           <w:rPr>
@@ -2602,7 +2602,7 @@
           <w14:ligatures w14:val="standardContextual"/>
         </w:rPr>
       </w:pPr>
-      <w:hyperlink w:anchor="_Toc243244342" w:history="1">
+      <w:hyperlink w:anchor="_Toc243245220" w:history="1">
         <w:r>
           <w:rPr>
             <w:rStyle w:val="aff9"/>
@@ -2640,7 +2640,7 @@
             <w:noProof/>
             <w:webHidden/>
           </w:rPr>
-          <w:instrText>PAGEREF _Toc243244342 \h</w:instrText>
+          <w:instrText>PAGEREF _Toc243245220 \h</w:instrText>
         </w:r>
         <w:r>
           <w:rPr>
@@ -2699,7 +2699,7 @@
           <w14:ligatures w14:val="standardContextual"/>
         </w:rPr>
       </w:pPr>
-      <w:hyperlink w:anchor="_Toc243244343" w:history="1">
+      <w:hyperlink w:anchor="_Toc243245221" w:history="1">
         <w:r>
           <w:rPr>
             <w:rStyle w:val="aff9"/>
@@ -2737,7 +2737,7 @@
             <w:noProof/>
             <w:webHidden/>
           </w:rPr>
-          <w:instrText>PAGEREF _Toc243244343 \h</w:instrText>
+          <w:instrText>PAGEREF _Toc243245221 \h</w:instrText>
         </w:r>
         <w:r>
           <w:rPr>
@@ -2796,7 +2796,7 @@
           <w14:ligatures w14:val="standardContextual"/>
         </w:rPr>
       </w:pPr>
-      <w:hyperlink w:anchor="_Toc243244344" w:history="1">
+      <w:hyperlink w:anchor="_Toc243245222" w:history="1">
         <w:r>
           <w:rPr>
             <w:rStyle w:val="aff9"/>
@@ -2834,7 +2834,7 @@
             <w:noProof/>
             <w:webHidden/>
           </w:rPr>
-          <w:instrText>PAGEREF _Toc243244344 \h</w:instrText>
+          <w:instrText>PAGEREF _Toc243245222 \h</w:instrText>
         </w:r>
         <w:r>
           <w:rPr>
@@ -2893,7 +2893,7 @@
           <w14:ligatures w14:val="standardContextual"/>
         </w:rPr>
       </w:pPr>
-      <w:hyperlink w:anchor="_Toc243244345" w:history="1">
+      <w:hyperlink w:anchor="_Toc243245223" w:history="1">
         <w:r>
           <w:rPr>
             <w:rStyle w:val="aff9"/>
@@ -2931,7 +2931,7 @@
             <w:noProof/>
             <w:webHidden/>
           </w:rPr>
-          <w:instrText>PAGEREF _Toc243244345 \h</w:instrText>
+          <w:instrText>PAGEREF _Toc243245223 \h</w:instrText>
         </w:r>
         <w:r>
           <w:rPr>
@@ -2990,7 +2990,7 @@
           <w14:ligatures w14:val="standardContextual"/>
         </w:rPr>
       </w:pPr>
-      <w:hyperlink w:anchor="_Toc243244346" w:history="1">
+      <w:hyperlink w:anchor="_Toc243245224" w:history="1">
         <w:r>
           <w:rPr>
             <w:rStyle w:val="aff9"/>
@@ -3028,7 +3028,7 @@
             <w:noProof/>
             <w:webHidden/>
           </w:rPr>
-          <w:instrText>PAGEREF _Toc243244346 \h</w:instrText>
+          <w:instrText>PAGEREF _Toc243245224 \h</w:instrText>
         </w:r>
         <w:r>
           <w:rPr>
@@ -3087,7 +3087,7 @@
           <w14:ligatures w14:val="standardContextual"/>
         </w:rPr>
       </w:pPr>
-      <w:hyperlink w:anchor="_Toc243244347" w:history="1">
+      <w:hyperlink w:anchor="_Toc243245225" w:history="1">
         <w:r>
           <w:rPr>
             <w:rStyle w:val="aff9"/>
@@ -3125,7 +3125,7 @@
             <w:noProof/>
             <w:webHidden/>
           </w:rPr>
-          <w:instrText>PAGEREF _Toc243244347 \h</w:instrText>
+          <w:instrText>PAGEREF _Toc243245225 \h</w:instrText>
         </w:r>
         <w:r>
           <w:rPr>
@@ -3184,7 +3184,7 @@
           <w14:ligatures w14:val="standardContextual"/>
         </w:rPr>
       </w:pPr>
-      <w:hyperlink w:anchor="_Toc243244348" w:history="1">
+      <w:hyperlink w:anchor="_Toc243245226" w:history="1">
         <w:r>
           <w:rPr>
             <w:rStyle w:val="aff9"/>
@@ -3222,7 +3222,7 @@
             <w:noProof/>
             <w:webHidden/>
           </w:rPr>
-          <w:instrText>PAGEREF _Toc243244348 \h</w:instrText>
+          <w:instrText>PAGEREF _Toc243245226 \h</w:instrText>
         </w:r>
         <w:r>
           <w:rPr>
@@ -3281,7 +3281,7 @@
           <w14:ligatures w14:val="standardContextual"/>
         </w:rPr>
       </w:pPr>
-      <w:hyperlink w:anchor="_Toc243244349" w:history="1">
+      <w:hyperlink w:anchor="_Toc243245227" w:history="1">
         <w:r>
           <w:rPr>
             <w:rStyle w:val="aff9"/>
@@ -3319,7 +3319,7 @@
             <w:noProof/>
             <w:webHidden/>
           </w:rPr>
-          <w:instrText>PAGEREF _Toc243244349 \h</w:instrText>
+          <w:instrText>PAGEREF _Toc243245227 \h</w:instrText>
         </w:r>
         <w:r>
           <w:rPr>
@@ -3378,7 +3378,7 @@
           <w14:ligatures w14:val="standardContextual"/>
         </w:rPr>
       </w:pPr>
-      <w:hyperlink w:anchor="_Toc243244350" w:history="1">
+      <w:hyperlink w:anchor="_Toc243245228" w:history="1">
         <w:r>
           <w:rPr>
             <w:rStyle w:val="aff9"/>
@@ -3416,7 +3416,7 @@
             <w:noProof/>
             <w:webHidden/>
           </w:rPr>
-          <w:instrText>PAGEREF _Toc243244350 \h</w:instrText>
+          <w:instrText>PAGEREF _Toc243245228 \h</w:instrText>
         </w:r>
         <w:r>
           <w:rPr>
@@ -3475,7 +3475,7 @@
           <w14:ligatures w14:val="standardContextual"/>
         </w:rPr>
       </w:pPr>
-      <w:hyperlink w:anchor="_Toc243244351" w:history="1">
+      <w:hyperlink w:anchor="_Toc243245229" w:history="1">
         <w:r>
           <w:rPr>
             <w:rStyle w:val="aff9"/>
@@ -3513,7 +3513,7 @@
             <w:noProof/>
             <w:webHidden/>
           </w:rPr>
-          <w:instrText>PAGEREF _Toc243244351 \h</w:instrText>
+          <w:instrText>PAGEREF _Toc243245229 \h</w:instrText>
         </w:r>
         <w:r>
           <w:rPr>
@@ -3572,7 +3572,7 @@
           <w14:ligatures w14:val="standardContextual"/>
         </w:rPr>
       </w:pPr>
-      <w:hyperlink w:anchor="_Toc243244352" w:history="1">
+      <w:hyperlink w:anchor="_Toc243245230" w:history="1">
         <w:r>
           <w:rPr>
             <w:rStyle w:val="aff9"/>
@@ -3610,7 +3610,7 @@
             <w:noProof/>
             <w:webHidden/>
           </w:rPr>
-          <w:instrText>PAGEREF _Toc243244352 \h</w:instrText>
+          <w:instrText>PAGEREF _Toc243245230 \h</w:instrText>
         </w:r>
         <w:r>
           <w:rPr>
@@ -3669,7 +3669,7 @@
           <w14:ligatures w14:val="standardContextual"/>
         </w:rPr>
       </w:pPr>
-      <w:hyperlink w:anchor="_Toc243244353" w:history="1">
+      <w:hyperlink w:anchor="_Toc243245231" w:history="1">
         <w:r>
           <w:rPr>
             <w:rStyle w:val="aff9"/>
@@ -3707,7 +3707,7 @@
             <w:noProof/>
             <w:webHidden/>
           </w:rPr>
-          <w:instrText>PAGEREF _Toc243244353 \h</w:instrText>
+          <w:instrText>PAGEREF _Toc243245231 \h</w:instrText>
         </w:r>
         <w:r>
           <w:rPr>
@@ -3766,7 +3766,7 @@
           <w14:ligatures w14:val="standardContextual"/>
         </w:rPr>
       </w:pPr>
-      <w:hyperlink w:anchor="_Toc243244354" w:history="1">
+      <w:hyperlink w:anchor="_Toc243245232" w:history="1">
         <w:r>
           <w:rPr>
             <w:rStyle w:val="aff9"/>
@@ -3804,7 +3804,7 @@
             <w:noProof/>
             <w:webHidden/>
           </w:rPr>
-          <w:instrText>PAGEREF _Toc243244354 \h</w:instrText>
+          <w:instrText>PAGEREF _Toc243245232 \h</w:instrText>
         </w:r>
         <w:r>
           <w:rPr>
@@ -3863,7 +3863,7 @@
           <w14:ligatures w14:val="standardContextual"/>
         </w:rPr>
       </w:pPr>
-      <w:hyperlink w:anchor="_Toc243244355" w:history="1">
+      <w:hyperlink w:anchor="_Toc243245233" w:history="1">
         <w:r>
           <w:rPr>
             <w:rStyle w:val="aff9"/>
@@ -3901,7 +3901,7 @@
             <w:noProof/>
             <w:webHidden/>
           </w:rPr>
-          <w:instrText>PAGEREF _Toc243244355 \h</w:instrText>
+          <w:instrText>PAGEREF _Toc243245233 \h</w:instrText>
         </w:r>
         <w:r>
           <w:rPr>
@@ -3960,7 +3960,7 @@
           <w14:ligatures w14:val="standardContextual"/>
         </w:rPr>
       </w:pPr>
-      <w:hyperlink w:anchor="_Toc243244356" w:history="1">
+      <w:hyperlink w:anchor="_Toc243245234" w:history="1">
         <w:r>
           <w:rPr>
             <w:rStyle w:val="aff9"/>
@@ -3998,7 +3998,7 @@
             <w:noProof/>
             <w:webHidden/>
           </w:rPr>
-          <w:instrText>PAGEREF _Toc243244356 \h</w:instrText>
+          <w:instrText>PAGEREF _Toc243245234 \h</w:instrText>
         </w:r>
         <w:r>
           <w:rPr>
@@ -4057,7 +4057,7 @@
           <w14:ligatures w14:val="standardContextual"/>
         </w:rPr>
       </w:pPr>
-      <w:hyperlink w:anchor="_Toc243244357" w:history="1">
+      <w:hyperlink w:anchor="_Toc243245235" w:history="1">
         <w:r>
           <w:rPr>
             <w:rStyle w:val="aff9"/>
@@ -4095,7 +4095,7 @@
             <w:noProof/>
             <w:webHidden/>
           </w:rPr>
-          <w:instrText>PAGEREF _Toc243244357 \h</w:instrText>
+          <w:instrText>PAGEREF _Toc243245235 \h</w:instrText>
         </w:r>
         <w:r>
           <w:rPr>
@@ -4154,7 +4154,7 @@
           <w14:ligatures w14:val="standardContextual"/>
         </w:rPr>
       </w:pPr>
-      <w:hyperlink w:anchor="_Toc243244358" w:history="1">
+      <w:hyperlink w:anchor="_Toc243245236" w:history="1">
         <w:r>
           <w:rPr>
             <w:rStyle w:val="aff9"/>
@@ -4192,7 +4192,7 @@
             <w:noProof/>
             <w:webHidden/>
           </w:rPr>
-          <w:instrText>PAGEREF _Toc243244358 \h</w:instrText>
+          <w:instrText>PAGEREF _Toc243245236 \h</w:instrText>
         </w:r>
         <w:r>
           <w:rPr>
@@ -4251,7 +4251,7 @@
           <w14:ligatures w14:val="standardContextual"/>
         </w:rPr>
       </w:pPr>
-      <w:hyperlink w:anchor="_Toc243244359" w:history="1">
+      <w:hyperlink w:anchor="_Toc243245237" w:history="1">
         <w:r>
           <w:rPr>
             <w:rStyle w:val="aff9"/>
@@ -4289,7 +4289,7 @@
             <w:noProof/>
             <w:webHidden/>
           </w:rPr>
-          <w:instrText>PAGEREF _Toc243244359 \h</w:instrText>
+          <w:instrText>PAGEREF _Toc243245237 \h</w:instrText>
         </w:r>
         <w:r>
           <w:rPr>
@@ -4348,7 +4348,7 @@
           <w14:ligatures w14:val="standardContextual"/>
         </w:rPr>
       </w:pPr>
-      <w:hyperlink w:anchor="_Toc243244360" w:history="1">
+      <w:hyperlink w:anchor="_Toc243245238" w:history="1">
         <w:r>
           <w:rPr>
             <w:rStyle w:val="aff9"/>
@@ -4386,7 +4386,7 @@
             <w:noProof/>
             <w:webHidden/>
           </w:rPr>
-          <w:instrText>PAGEREF _Toc243244360 \h</w:instrText>
+          <w:instrText>PAGEREF _Toc243245238 \h</w:instrText>
         </w:r>
         <w:r>
           <w:rPr>
@@ -4445,7 +4445,7 @@
           <w14:ligatures w14:val="standardContextual"/>
         </w:rPr>
       </w:pPr>
-      <w:hyperlink w:anchor="_Toc243244361" w:history="1">
+      <w:hyperlink w:anchor="_Toc243245239" w:history="1">
         <w:r>
           <w:rPr>
             <w:rStyle w:val="aff9"/>
@@ -4483,7 +4483,7 @@
             <w:noProof/>
             <w:webHidden/>
           </w:rPr>
-          <w:instrText>PAGEREF _Toc243244361 \h</w:instrText>
+          <w:instrText>PAGEREF _Toc243245239 \h</w:instrText>
         </w:r>
         <w:r>
           <w:rPr>
@@ -4542,7 +4542,7 @@
           <w14:ligatures w14:val="standardContextual"/>
         </w:rPr>
       </w:pPr>
-      <w:hyperlink w:anchor="_Toc243244362" w:history="1">
+      <w:hyperlink w:anchor="_Toc243245240" w:history="1">
         <w:r>
           <w:rPr>
             <w:rStyle w:val="aff9"/>
@@ -4580,7 +4580,7 @@
             <w:noProof/>
             <w:webHidden/>
           </w:rPr>
-          <w:instrText>PAGEREF _Toc243244362 \h</w:instrText>
+          <w:instrText>PAGEREF _Toc243245240 \h</w:instrText>
         </w:r>
         <w:r>
           <w:rPr>
@@ -4639,7 +4639,7 @@
           <w14:ligatures w14:val="standardContextual"/>
         </w:rPr>
       </w:pPr>
-      <w:hyperlink w:anchor="_Toc243244363" w:history="1">
+      <w:hyperlink w:anchor="_Toc243245241" w:history="1">
         <w:r>
           <w:rPr>
             <w:rStyle w:val="aff9"/>
@@ -4677,7 +4677,7 @@
             <w:noProof/>
             <w:webHidden/>
           </w:rPr>
-          <w:instrText>PAGEREF _Toc243244363 \h</w:instrText>
+          <w:instrText>PAGEREF _Toc243245241 \h</w:instrText>
         </w:r>
         <w:r>
           <w:rPr>
@@ -4736,7 +4736,7 @@
           <w14:ligatures w14:val="standardContextual"/>
         </w:rPr>
       </w:pPr>
-      <w:hyperlink w:anchor="_Toc243244364" w:history="1">
+      <w:hyperlink w:anchor="_Toc243245242" w:history="1">
         <w:r>
           <w:rPr>
             <w:rStyle w:val="aff9"/>
@@ -4774,7 +4774,7 @@
             <w:noProof/>
             <w:webHidden/>
           </w:rPr>
-          <w:instrText>PAGEREF _Toc243244364 \h</w:instrText>
+          <w:instrText>PAGEREF _Toc243245242 \h</w:instrText>
         </w:r>
         <w:r>
           <w:rPr>
@@ -4833,7 +4833,7 @@
           <w14:ligatures w14:val="standardContextual"/>
         </w:rPr>
       </w:pPr>
-      <w:hyperlink w:anchor="_Toc243244365" w:history="1">
+      <w:hyperlink w:anchor="_Toc243245243" w:history="1">
         <w:r>
           <w:rPr>
             <w:rStyle w:val="aff9"/>
@@ -4871,7 +4871,7 @@
             <w:noProof/>
             <w:webHidden/>
           </w:rPr>
-          <w:instrText>PAGEREF _Toc243244365 \h</w:instrText>
+          <w:instrText>PAGEREF _Toc243245243 \h</w:instrText>
         </w:r>
         <w:r>
           <w:rPr>
@@ -4930,7 +4930,7 @@
           <w14:ligatures w14:val="standardContextual"/>
         </w:rPr>
       </w:pPr>
-      <w:hyperlink w:anchor="_Toc243244366" w:history="1">
+      <w:hyperlink w:anchor="_Toc243245244" w:history="1">
         <w:r>
           <w:rPr>
             <w:rStyle w:val="aff9"/>
@@ -4968,7 +4968,7 @@
             <w:noProof/>
             <w:webHidden/>
           </w:rPr>
-          <w:instrText>PAGEREF _Toc243244366 \h</w:instrText>
+          <w:instrText>PAGEREF _Toc243245244 \h</w:instrText>
         </w:r>
         <w:r>
           <w:rPr>
@@ -5027,7 +5027,7 @@
           <w14:ligatures w14:val="standardContextual"/>
         </w:rPr>
       </w:pPr>
-      <w:hyperlink w:anchor="_Toc243244367" w:history="1">
+      <w:hyperlink w:anchor="_Toc243245245" w:history="1">
         <w:r>
           <w:rPr>
             <w:rStyle w:val="aff9"/>
@@ -5065,7 +5065,7 @@
             <w:noProof/>
             <w:webHidden/>
           </w:rPr>
-          <w:instrText>PAGEREF _Toc243244367 \h</w:instrText>
+          <w:instrText>PAGEREF _Toc243245245 \h</w:instrText>
         </w:r>
         <w:r>
           <w:rPr>
@@ -5124,7 +5124,7 @@
           <w14:ligatures w14:val="standardContextual"/>
         </w:rPr>
       </w:pPr>
-      <w:hyperlink w:anchor="_Toc243244368" w:history="1">
+      <w:hyperlink w:anchor="_Toc243245246" w:history="1">
         <w:r>
           <w:rPr>
             <w:rStyle w:val="aff9"/>
@@ -5162,7 +5162,7 @@
             <w:noProof/>
             <w:webHidden/>
           </w:rPr>
-          <w:instrText>PAGEREF _Toc243244368 \h</w:instrText>
+          <w:instrText>PAGEREF _Toc243245246 \h</w:instrText>
         </w:r>
         <w:r>
           <w:rPr>
@@ -5221,7 +5221,7 @@
           <w14:ligatures w14:val="standardContextual"/>
         </w:rPr>
       </w:pPr>
-      <w:hyperlink w:anchor="_Toc243244369" w:history="1">
+      <w:hyperlink w:anchor="_Toc243245247" w:history="1">
         <w:r>
           <w:rPr>
             <w:rStyle w:val="aff9"/>
@@ -5259,7 +5259,7 @@
             <w:noProof/>
             <w:webHidden/>
           </w:rPr>
-          <w:instrText>PAGEREF _Toc243244369 \h</w:instrText>
+          <w:instrText>PAGEREF _Toc243245247 \h</w:instrText>
         </w:r>
         <w:r>
           <w:rPr>
@@ -5318,7 +5318,7 @@
           <w14:ligatures w14:val="standardContextual"/>
         </w:rPr>
       </w:pPr>
-      <w:hyperlink w:anchor="_Toc243244370" w:history="1">
+      <w:hyperlink w:anchor="_Toc243245248" w:history="1">
         <w:r>
           <w:rPr>
             <w:rStyle w:val="aff9"/>
@@ -5356,7 +5356,7 @@
             <w:noProof/>
             <w:webHidden/>
           </w:rPr>
-          <w:instrText>PAGEREF _Toc243244370 \h</w:instrText>
+          <w:instrText>PAGEREF _Toc243245248 \h</w:instrText>
         </w:r>
         <w:r>
           <w:rPr>
@@ -5415,7 +5415,7 @@
           <w14:ligatures w14:val="standardContextual"/>
         </w:rPr>
       </w:pPr>
-      <w:hyperlink w:anchor="_Toc243244371" w:history="1">
+      <w:hyperlink w:anchor="_Toc243245249" w:history="1">
         <w:r>
           <w:rPr>
             <w:rStyle w:val="aff9"/>
@@ -5453,7 +5453,7 @@
             <w:noProof/>
             <w:webHidden/>
           </w:rPr>
-          <w:instrText>PAGEREF _Toc243244371 \h</w:instrText>
+          <w:instrText>PAGEREF _Toc243245249 \h</w:instrText>
         </w:r>
         <w:r>
           <w:rPr>
@@ -5512,7 +5512,7 @@
           <w14:ligatures w14:val="standardContextual"/>
         </w:rPr>
       </w:pPr>
-      <w:hyperlink w:anchor="_Toc243244372" w:history="1">
+      <w:hyperlink w:anchor="_Toc243245250" w:history="1">
         <w:r>
           <w:rPr>
             <w:rStyle w:val="aff9"/>
@@ -5550,7 +5550,7 @@
             <w:noProof/>
             <w:webHidden/>
           </w:rPr>
-          <w:instrText>PAGEREF _Toc243244372 \h</w:instrText>
+          <w:instrText>PAGEREF _Toc243245250 \h</w:instrText>
         </w:r>
         <w:r>
           <w:rPr>
@@ -5609,7 +5609,7 @@
           <w14:ligatures w14:val="standardContextual"/>
         </w:rPr>
       </w:pPr>
-      <w:hyperlink w:anchor="_Toc243244373" w:history="1">
+      <w:hyperlink w:anchor="_Toc243245251" w:history="1">
         <w:r>
           <w:rPr>
             <w:rStyle w:val="aff9"/>
@@ -5647,7 +5647,7 @@
             <w:noProof/>
             <w:webHidden/>
           </w:rPr>
-          <w:instrText>PAGEREF _Toc243244373 \h</w:instrText>
+          <w:instrText>PAGEREF _Toc243245251 \h</w:instrText>
         </w:r>
         <w:r>
           <w:rPr>
@@ -5706,7 +5706,7 @@
           <w14:ligatures w14:val="standardContextual"/>
         </w:rPr>
       </w:pPr>
-      <w:hyperlink w:anchor="_Toc243244374" w:history="1">
+      <w:hyperlink w:anchor="_Toc243245252" w:history="1">
         <w:r>
           <w:rPr>
             <w:rStyle w:val="aff9"/>
@@ -5744,7 +5744,7 @@
             <w:noProof/>
             <w:webHidden/>
           </w:rPr>
-          <w:instrText>PAGEREF _Toc243244374 \h</w:instrText>
+          <w:instrText>PAGEREF _Toc243245252 \h</w:instrText>
         </w:r>
         <w:r>
           <w:rPr>
@@ -5803,7 +5803,7 @@
           <w14:ligatures w14:val="standardContextual"/>
         </w:rPr>
       </w:pPr>
-      <w:hyperlink w:anchor="_Toc243244375" w:history="1">
+      <w:hyperlink w:anchor="_Toc243245253" w:history="1">
         <w:r>
           <w:rPr>
             <w:rStyle w:val="aff9"/>
@@ -5841,7 +5841,7 @@
             <w:noProof/>
             <w:webHidden/>
           </w:rPr>
-          <w:instrText>PAGEREF _Toc243244375 \h</w:instrText>
+          <w:instrText>PAGEREF _Toc243245253 \h</w:instrText>
         </w:r>
         <w:r>
           <w:rPr>
@@ -5900,7 +5900,7 @@
           <w14:ligatures w14:val="standardContextual"/>
         </w:rPr>
       </w:pPr>
-      <w:hyperlink w:anchor="_Toc243244376" w:history="1">
+      <w:hyperlink w:anchor="_Toc243245254" w:history="1">
         <w:r>
           <w:rPr>
             <w:rStyle w:val="aff9"/>
@@ -5938,7 +5938,7 @@
             <w:noProof/>
             <w:webHidden/>
           </w:rPr>
-          <w:instrText>PAGEREF _Toc243244376 \h</w:instrText>
+          <w:instrText>PAGEREF _Toc243245254 \h</w:instrText>
         </w:r>
         <w:r>
           <w:rPr>
@@ -5997,7 +5997,7 @@
           <w14:ligatures w14:val="standardContextual"/>
         </w:rPr>
       </w:pPr>
-      <w:hyperlink w:anchor="_Toc243244377" w:history="1">
+      <w:hyperlink w:anchor="_Toc243245255" w:history="1">
         <w:r>
           <w:rPr>
             <w:rStyle w:val="aff9"/>
@@ -6035,7 +6035,7 @@
             <w:noProof/>
             <w:webHidden/>
           </w:rPr>
-          <w:instrText>PAGEREF _Toc243244377 \h</w:instrText>
+          <w:instrText>PAGEREF _Toc243245255 \h</w:instrText>
         </w:r>
         <w:r>
           <w:rPr>
@@ -6094,7 +6094,7 @@
           <w14:ligatures w14:val="standardContextual"/>
         </w:rPr>
       </w:pPr>
-      <w:hyperlink w:anchor="_Toc243244378" w:history="1">
+      <w:hyperlink w:anchor="_Toc243245256" w:history="1">
         <w:r>
           <w:rPr>
             <w:rStyle w:val="aff9"/>
@@ -6132,7 +6132,7 @@
             <w:noProof/>
             <w:webHidden/>
           </w:rPr>
-          <w:instrText>PAGEREF _Toc243244378 \h</w:instrText>
+          <w:instrText>PAGEREF _Toc243245256 \h</w:instrText>
         </w:r>
         <w:r>
           <w:rPr>
@@ -6191,7 +6191,7 @@
           <w14:ligatures w14:val="standardContextual"/>
         </w:rPr>
       </w:pPr>
-      <w:hyperlink w:anchor="_Toc243244379" w:history="1">
+      <w:hyperlink w:anchor="_Toc243245257" w:history="1">
         <w:r>
           <w:rPr>
             <w:rStyle w:val="aff9"/>
@@ -6229,7 +6229,7 @@
             <w:noProof/>
             <w:webHidden/>
           </w:rPr>
-          <w:instrText>PAGEREF _Toc243244379 \h</w:instrText>
+          <w:instrText>PAGEREF _Toc243245257 \h</w:instrText>
         </w:r>
         <w:r>
           <w:rPr>
@@ -6288,7 +6288,7 @@
           <w14:ligatures w14:val="standardContextual"/>
         </w:rPr>
       </w:pPr>
-      <w:hyperlink w:anchor="_Toc243244380" w:history="1">
+      <w:hyperlink w:anchor="_Toc243245258" w:history="1">
         <w:r>
           <w:rPr>
             <w:rStyle w:val="aff9"/>
@@ -6326,7 +6326,7 @@
             <w:noProof/>
             <w:webHidden/>
           </w:rPr>
-          <w:instrText>PAGEREF _Toc243244380 \h</w:instrText>
+          <w:instrText>PAGEREF _Toc243245258 \h</w:instrText>
         </w:r>
         <w:r>
           <w:rPr>
@@ -6385,7 +6385,7 @@
           <w14:ligatures w14:val="standardContextual"/>
         </w:rPr>
       </w:pPr>
-      <w:hyperlink w:anchor="_Toc243244381" w:history="1">
+      <w:hyperlink w:anchor="_Toc243245259" w:history="1">
         <w:r>
           <w:rPr>
             <w:rStyle w:val="aff9"/>
@@ -6423,7 +6423,7 @@
             <w:noProof/>
             <w:webHidden/>
           </w:rPr>
-          <w:instrText>PAGEREF _Toc243244381 \h</w:instrText>
+          <w:instrText>PAGEREF _Toc243245259 \h</w:instrText>
         </w:r>
         <w:r>
           <w:rPr>
@@ -6482,7 +6482,7 @@
           <w14:ligatures w14:val="standardContextual"/>
         </w:rPr>
       </w:pPr>
-      <w:hyperlink w:anchor="_Toc243244382" w:history="1">
+      <w:hyperlink w:anchor="_Toc243245260" w:history="1">
         <w:r>
           <w:rPr>
             <w:rStyle w:val="aff9"/>
@@ -6520,7 +6520,7 @@
             <w:noProof/>
             <w:webHidden/>
           </w:rPr>
-          <w:instrText>PAGEREF _Toc243244382 \h</w:instrText>
+          <w:instrText>PAGEREF _Toc243245260 \h</w:instrText>
         </w:r>
         <w:r>
           <w:rPr>
@@ -6579,7 +6579,7 @@
           <w14:ligatures w14:val="standardContextual"/>
         </w:rPr>
       </w:pPr>
-      <w:hyperlink w:anchor="_Toc243244383" w:history="1">
+      <w:hyperlink w:anchor="_Toc243245261" w:history="1">
         <w:r>
           <w:rPr>
             <w:rStyle w:val="aff9"/>
@@ -6617,7 +6617,7 @@
             <w:noProof/>
             <w:webHidden/>
           </w:rPr>
-          <w:instrText>PAGEREF _Toc243244383 \h</w:instrText>
+          <w:instrText>PAGEREF _Toc243245261 \h</w:instrText>
         </w:r>
         <w:r>
           <w:rPr>
@@ -6676,7 +6676,7 @@
           <w14:ligatures w14:val="standardContextual"/>
         </w:rPr>
       </w:pPr>
-      <w:hyperlink w:anchor="_Toc243244384" w:history="1">
+      <w:hyperlink w:anchor="_Toc243245262" w:history="1">
         <w:r>
           <w:rPr>
             <w:rStyle w:val="aff9"/>
@@ -6714,7 +6714,7 @@
             <w:noProof/>
             <w:webHidden/>
           </w:rPr>
-          <w:instrText>PAGEREF _Toc243244384 \h</w:instrText>
+          <w:instrText>PAGEREF _Toc243245262 \h</w:instrText>
         </w:r>
         <w:r>
           <w:rPr>
@@ -6773,7 +6773,7 @@
           <w14:ligatures w14:val="standardContextual"/>
         </w:rPr>
       </w:pPr>
-      <w:hyperlink w:anchor="_Toc243244385" w:history="1">
+      <w:hyperlink w:anchor="_Toc243245263" w:history="1">
         <w:r>
           <w:rPr>
             <w:rStyle w:val="aff9"/>
@@ -6811,7 +6811,7 @@
             <w:noProof/>
             <w:webHidden/>
           </w:rPr>
-          <w:instrText>PAGEREF _Toc243244385 \h</w:instrText>
+          <w:instrText>PAGEREF _Toc243245263 \h</w:instrText>
         </w:r>
         <w:r>
           <w:rPr>
@@ -6870,7 +6870,7 @@
           <w14:ligatures w14:val="standardContextual"/>
         </w:rPr>
       </w:pPr>
-      <w:hyperlink w:anchor="_Toc243244386" w:history="1">
+      <w:hyperlink w:anchor="_Toc243245264" w:history="1">
         <w:r>
           <w:rPr>
             <w:rStyle w:val="aff9"/>
@@ -6908,7 +6908,7 @@
             <w:noProof/>
             <w:webHidden/>
           </w:rPr>
-          <w:instrText>PAGEREF _Toc243244386 \h</w:instrText>
+          <w:instrText>PAGEREF _Toc243245264 \h</w:instrText>
         </w:r>
         <w:r>
           <w:rPr>
@@ -6967,7 +6967,7 @@
           <w14:ligatures w14:val="standardContextual"/>
         </w:rPr>
       </w:pPr>
-      <w:hyperlink w:anchor="_Toc243244387" w:history="1">
+      <w:hyperlink w:anchor="_Toc243245265" w:history="1">
         <w:r>
           <w:rPr>
             <w:rStyle w:val="aff9"/>
@@ -7005,7 +7005,7 @@
             <w:noProof/>
             <w:webHidden/>
           </w:rPr>
-          <w:instrText>PAGEREF _Toc243244387 \h</w:instrText>
+          <w:instrText>PAGEREF _Toc243245265 \h</w:instrText>
         </w:r>
         <w:r>
           <w:rPr>
@@ -7064,7 +7064,7 @@
           <w14:ligatures w14:val="standardContextual"/>
         </w:rPr>
       </w:pPr>
-      <w:hyperlink w:anchor="_Toc243244388" w:history="1">
+      <w:hyperlink w:anchor="_Toc243245266" w:history="1">
         <w:r>
           <w:rPr>
             <w:rStyle w:val="aff9"/>
@@ -7102,7 +7102,7 @@
             <w:noProof/>
             <w:webHidden/>
           </w:rPr>
-          <w:instrText>PAGEREF _Toc243244388 \h</w:instrText>
+          <w:instrText>PAGEREF _Toc243245266 \h</w:instrText>
         </w:r>
         <w:r>
           <w:rPr>
@@ -7161,7 +7161,7 @@
           <w14:ligatures w14:val="standardContextual"/>
         </w:rPr>
       </w:pPr>
-      <w:hyperlink w:anchor="_Toc243244389" w:history="1">
+      <w:hyperlink w:anchor="_Toc243245267" w:history="1">
         <w:r>
           <w:rPr>
             <w:rStyle w:val="aff9"/>
@@ -7199,7 +7199,7 @@
             <w:noProof/>
             <w:webHidden/>
           </w:rPr>
-          <w:instrText>PAGEREF _Toc243244389 \h</w:instrText>
+          <w:instrText>PAGEREF _Toc243245267 \h</w:instrText>
         </w:r>
         <w:r>
           <w:rPr>
@@ -7258,7 +7258,7 @@
           <w14:ligatures w14:val="standardContextual"/>
         </w:rPr>
       </w:pPr>
-      <w:hyperlink w:anchor="_Toc243244390" w:history="1">
+      <w:hyperlink w:anchor="_Toc243245268" w:history="1">
         <w:r>
           <w:rPr>
             <w:rStyle w:val="aff9"/>
@@ -7296,7 +7296,7 @@
             <w:noProof/>
             <w:webHidden/>
           </w:rPr>
-          <w:instrText>PAGEREF _Toc243244390 \h</w:instrText>
+          <w:instrText>PAGEREF _Toc243245268 \h</w:instrText>
         </w:r>
         <w:r>
           <w:rPr>
@@ -7355,7 +7355,7 @@
           <w14:ligatures w14:val="standardContextual"/>
         </w:rPr>
       </w:pPr>
-      <w:hyperlink w:anchor="_Toc243244391" w:history="1">
+      <w:hyperlink w:anchor="_Toc243245269" w:history="1">
         <w:r>
           <w:rPr>
             <w:rStyle w:val="aff9"/>
@@ -7393,7 +7393,7 @@
             <w:noProof/>
             <w:webHidden/>
           </w:rPr>
-          <w:instrText>PAGEREF _Toc243244391 \h</w:instrText>
+          <w:instrText>PAGEREF _Toc243245269 \h</w:instrText>
         </w:r>
         <w:r>
           <w:rPr>
@@ -7452,7 +7452,7 @@
           <w14:ligatures w14:val="standardContextual"/>
         </w:rPr>
       </w:pPr>
-      <w:hyperlink w:anchor="_Toc243244392" w:history="1">
+      <w:hyperlink w:anchor="_Toc243245270" w:history="1">
         <w:r>
           <w:rPr>
             <w:rStyle w:val="aff9"/>
@@ -7490,7 +7490,7 @@
             <w:noProof/>
             <w:webHidden/>
           </w:rPr>
-          <w:instrText>PAGEREF _Toc243244392 \h</w:instrText>
+          <w:instrText>PAGEREF _Toc243245270 \h</w:instrText>
         </w:r>
         <w:r>
           <w:rPr>
@@ -7549,7 +7549,7 @@
           <w14:ligatures w14:val="standardContextual"/>
         </w:rPr>
       </w:pPr>
-      <w:hyperlink w:anchor="_Toc243244393" w:history="1">
+      <w:hyperlink w:anchor="_Toc243245271" w:history="1">
         <w:r>
           <w:rPr>
             <w:rStyle w:val="aff9"/>
@@ -7587,7 +7587,7 @@
             <w:noProof/>
             <w:webHidden/>
           </w:rPr>
-          <w:instrText>PAGEREF _Toc243244393 \h</w:instrText>
+          <w:instrText>PAGEREF _Toc243245271 \h</w:instrText>
         </w:r>
         <w:r>
           <w:rPr>
@@ -7646,7 +7646,7 @@
           <w14:ligatures w14:val="standardContextual"/>
         </w:rPr>
       </w:pPr>
-      <w:hyperlink w:anchor="_Toc243244394" w:history="1">
+      <w:hyperlink w:anchor="_Toc243245272" w:history="1">
         <w:r>
           <w:rPr>
             <w:rStyle w:val="aff9"/>
@@ -7684,7 +7684,7 @@
             <w:noProof/>
             <w:webHidden/>
           </w:rPr>
-          <w:instrText>PAGEREF _Toc243244394 \h</w:instrText>
+          <w:instrText>PAGEREF _Toc243245272 \h</w:instrText>
         </w:r>
         <w:r>
           <w:rPr>
@@ -7743,7 +7743,7 @@
           <w14:ligatures w14:val="standardContextual"/>
         </w:rPr>
       </w:pPr>
-      <w:hyperlink w:anchor="_Toc243244395" w:history="1">
+      <w:hyperlink w:anchor="_Toc243245273" w:history="1">
         <w:r>
           <w:rPr>
             <w:rStyle w:val="aff9"/>
@@ -7781,7 +7781,7 @@
             <w:noProof/>
             <w:webHidden/>
           </w:rPr>
-          <w:instrText>PAGEREF _Toc243244395 \h</w:instrText>
+          <w:instrText>PAGEREF _Toc243245273 \h</w:instrText>
         </w:r>
         <w:r>
           <w:rPr>
@@ -7840,7 +7840,7 @@
           <w14:ligatures w14:val="standardContextual"/>
         </w:rPr>
       </w:pPr>
-      <w:hyperlink w:anchor="_Toc243244396" w:history="1">
+      <w:hyperlink w:anchor="_Toc243245274" w:history="1">
         <w:r>
           <w:rPr>
             <w:rStyle w:val="aff9"/>
@@ -7878,7 +7878,7 @@
             <w:noProof/>
             <w:webHidden/>
           </w:rPr>
-          <w:instrText>PAGEREF _Toc243244396 \h</w:instrText>
+          <w:instrText>PAGEREF _Toc243245274 \h</w:instrText>
         </w:r>
         <w:r>
           <w:rPr>
@@ -7937,7 +7937,7 @@
           <w14:ligatures w14:val="standardContextual"/>
         </w:rPr>
       </w:pPr>
-      <w:hyperlink w:anchor="_Toc243244397" w:history="1">
+      <w:hyperlink w:anchor="_Toc243245275" w:history="1">
         <w:r>
           <w:rPr>
             <w:rStyle w:val="aff9"/>
@@ -7975,7 +7975,7 @@
             <w:noProof/>
             <w:webHidden/>
           </w:rPr>
-          <w:instrText>PAGEREF _Toc243244397 \h</w:instrText>
+          <w:instrText>PAGEREF _Toc243245275 \h</w:instrText>
         </w:r>
         <w:r>
           <w:rPr>
@@ -8034,7 +8034,7 @@
           <w14:ligatures w14:val="standardContextual"/>
         </w:rPr>
       </w:pPr>
-      <w:hyperlink w:anchor="_Toc243244398" w:history="1">
+      <w:hyperlink w:anchor="_Toc243245276" w:history="1">
         <w:r>
           <w:rPr>
             <w:rStyle w:val="aff9"/>
@@ -8072,7 +8072,7 @@
             <w:noProof/>
             <w:webHidden/>
           </w:rPr>
-          <w:instrText>PAGEREF _Toc243244398 \h</w:instrText>
+          <w:instrText>PAGEREF _Toc243245276 \h</w:instrText>
         </w:r>
         <w:r>
           <w:rPr>
@@ -8131,7 +8131,7 @@
           <w14:ligatures w14:val="standardContextual"/>
         </w:rPr>
       </w:pPr>
-      <w:hyperlink w:anchor="_Toc243244399" w:history="1">
+      <w:hyperlink w:anchor="_Toc243245277" w:history="1">
         <w:r>
           <w:rPr>
             <w:rStyle w:val="aff9"/>
@@ -8169,7 +8169,7 @@
             <w:noProof/>
             <w:webHidden/>
           </w:rPr>
-          <w:instrText>PAGEREF _Toc243244399 \h</w:instrText>
+          <w:instrText>PAGEREF _Toc243245277 \h</w:instrText>
         </w:r>
         <w:r>
           <w:rPr>
@@ -8228,7 +8228,7 @@
           <w14:ligatures w14:val="standardContextual"/>
         </w:rPr>
       </w:pPr>
-      <w:hyperlink w:anchor="_Toc243244400" w:history="1">
+      <w:hyperlink w:anchor="_Toc243245278" w:history="1">
         <w:r>
           <w:rPr>
             <w:rStyle w:val="aff9"/>
@@ -8266,7 +8266,7 @@
             <w:noProof/>
             <w:webHidden/>
           </w:rPr>
-          <w:instrText>PAGEREF _Toc243244400 \h</w:instrText>
+          <w:instrText>PAGEREF _Toc243245278 \h</w:instrText>
         </w:r>
         <w:r>
           <w:rPr>
@@ -8325,7 +8325,7 @@
           <w14:ligatures w14:val="standardContextual"/>
         </w:rPr>
       </w:pPr>
-      <w:hyperlink w:anchor="_Toc243244401" w:history="1">
+      <w:hyperlink w:anchor="_Toc243245279" w:history="1">
         <w:r>
           <w:rPr>
             <w:rStyle w:val="aff9"/>
@@ -8363,7 +8363,7 @@
             <w:noProof/>
             <w:webHidden/>
           </w:rPr>
-          <w:instrText>PAGEREF _Toc243244401 \h</w:instrText>
+          <w:instrText>PAGEREF _Toc243245279 \h</w:instrText>
         </w:r>
         <w:r>
           <w:rPr>
@@ -8422,7 +8422,7 @@
           <w14:ligatures w14:val="standardContextual"/>
         </w:rPr>
       </w:pPr>
-      <w:hyperlink w:anchor="_Toc243244402" w:history="1">
+      <w:hyperlink w:anchor="_Toc243245280" w:history="1">
         <w:r>
           <w:rPr>
             <w:rStyle w:val="aff9"/>
@@ -8460,7 +8460,7 @@
             <w:noProof/>
             <w:webHidden/>
           </w:rPr>
-          <w:instrText>PAGEREF _Toc243244402 \h</w:instrText>
+          <w:instrText>PAGEREF _Toc243245280 \h</w:instrText>
         </w:r>
         <w:r>
           <w:rPr>
@@ -8519,7 +8519,7 @@
           <w14:ligatures w14:val="standardContextual"/>
         </w:rPr>
       </w:pPr>
-      <w:hyperlink w:anchor="_Toc243244403" w:history="1">
+      <w:hyperlink w:anchor="_Toc243245281" w:history="1">
         <w:r>
           <w:rPr>
             <w:rStyle w:val="aff9"/>
@@ -8557,7 +8557,7 @@
             <w:noProof/>
             <w:webHidden/>
           </w:rPr>
-          <w:instrText>PAGEREF _Toc243244403 \h</w:instrText>
+          <w:instrText>PAGEREF _Toc243245281 \h</w:instrText>
         </w:r>
         <w:r>
           <w:rPr>
@@ -8616,7 +8616,7 @@
           <w14:ligatures w14:val="standardContextual"/>
         </w:rPr>
       </w:pPr>
-      <w:hyperlink w:anchor="_Toc243244404" w:history="1">
+      <w:hyperlink w:anchor="_Toc243245282" w:history="1">
         <w:r>
           <w:rPr>
             <w:rStyle w:val="aff9"/>
@@ -8654,7 +8654,7 @@
             <w:noProof/>
             <w:webHidden/>
           </w:rPr>
-          <w:instrText>PAGEREF _Toc243244404 \h</w:instrText>
+          <w:instrText>PAGEREF _Toc243245282 \h</w:instrText>
         </w:r>
         <w:r>
           <w:rPr>
@@ -8713,7 +8713,7 @@
         <w:pageBreakBefore/>
         <w:spacing w:before="400" w:after="200"/>
       </w:pPr>
-      <w:bookmarkStart w:id="0" w:name="_Toc243244337"/>
+      <w:bookmarkStart w:id="0" w:name="_Toc243245215"/>
       <w:r>
         <w:rPr>
           <w:rFonts w:ascii="黑体" w:eastAsia="黑体" w:hAnsi="黑体"/>
@@ -8746,7 +8746,7 @@
         <w:pStyle w:val="21"/>
         <w:spacing w:before="280" w:after="120"/>
       </w:pPr>
-      <w:bookmarkStart w:id="1" w:name="_Toc243244338"/>
+      <w:bookmarkStart w:id="1" w:name="_Toc243245216"/>
       <w:r>
         <w:rPr>
           <w:rFonts w:ascii="黑体" w:eastAsia="黑体" w:hAnsi="黑体"/>
@@ -8857,7 +8857,7 @@
         <w:pStyle w:val="21"/>
         <w:spacing w:before="280" w:after="120"/>
       </w:pPr>
-      <w:bookmarkStart w:id="2" w:name="_Toc243244339"/>
+      <w:bookmarkStart w:id="2" w:name="_Toc243245217"/>
       <w:r>
         <w:rPr>
           <w:rFonts w:ascii="黑体" w:eastAsia="黑体" w:hAnsi="黑体"/>
@@ -8985,7 +8985,7 @@
         <w:pStyle w:val="21"/>
         <w:spacing w:before="280" w:after="120"/>
       </w:pPr>
-      <w:bookmarkStart w:id="3" w:name="_Toc243244340"/>
+      <w:bookmarkStart w:id="3" w:name="_Toc243245218"/>
       <w:r>
         <w:rPr>
           <w:rFonts w:ascii="黑体" w:eastAsia="黑体" w:hAnsi="黑体"/>
@@ -9549,7 +9549,7 @@
         <w:pStyle w:val="21"/>
         <w:spacing w:before="280" w:after="120"/>
       </w:pPr>
-      <w:bookmarkStart w:id="4" w:name="_Toc243244341"/>
+      <w:bookmarkStart w:id="4" w:name="_Toc243245219"/>
       <w:r>
         <w:rPr>
           <w:rFonts w:ascii="黑体" w:eastAsia="黑体" w:hAnsi="黑体"/>
@@ -10189,7 +10189,7 @@
         <w:pStyle w:val="1"/>
         <w:spacing w:before="400" w:after="200"/>
       </w:pPr>
-      <w:bookmarkStart w:id="5" w:name="_Toc243244342"/>
+      <w:bookmarkStart w:id="5" w:name="_Toc243245220"/>
       <w:r>
         <w:rPr>
           <w:rFonts w:ascii="黑体" w:eastAsia="黑体" w:hAnsi="黑体"/>
@@ -10221,7 +10221,7 @@
         <w:pStyle w:val="21"/>
         <w:spacing w:before="280" w:after="120"/>
       </w:pPr>
-      <w:bookmarkStart w:id="6" w:name="_Toc243244343"/>
+      <w:bookmarkStart w:id="6" w:name="_Toc243245221"/>
       <w:r>
         <w:rPr>
           <w:rFonts w:ascii="黑体" w:eastAsia="黑体" w:hAnsi="黑体"/>
@@ -10341,7 +10341,7 @@
         <w:pStyle w:val="21"/>
         <w:spacing w:before="280" w:after="120"/>
       </w:pPr>
-      <w:bookmarkStart w:id="7" w:name="_Toc243244344"/>
+      <w:bookmarkStart w:id="7" w:name="_Toc243245222"/>
       <w:r>
         <w:rPr>
           <w:rFonts w:ascii="黑体" w:eastAsia="黑体" w:hAnsi="黑体"/>
@@ -10441,7 +10441,7 @@
         </w:rPr>
         <w:lastRenderedPageBreak/>
         <w:drawing>
-          <wp:inline distT="0" distB="0" distL="0" distR="0" wp14:anchorId="4A0FACC2" wp14:editId="56635EF3">
+          <wp:inline distT="0" distB="0" distL="0" distR="0" wp14:anchorId="64DA02CA" wp14:editId="1AA9F82B">
             <wp:extent cx="9144000" cy="4525914"/>
             <wp:effectExtent l="0" t="0" r="0" b="0"/>
             <wp:docPr id="1" name="Picture 1"/>
@@ -10590,7 +10590,7 @@
         <w:pStyle w:val="21"/>
         <w:spacing w:before="280" w:after="120"/>
       </w:pPr>
-      <w:bookmarkStart w:id="8" w:name="_Toc243244345"/>
+      <w:bookmarkStart w:id="8" w:name="_Toc243245223"/>
       <w:r>
         <w:rPr>
           <w:rFonts w:ascii="黑体" w:eastAsia="黑体" w:hAnsi="黑体"/>
@@ -11605,7 +11605,7 @@
         <w:pStyle w:val="21"/>
         <w:spacing w:before="280" w:after="120"/>
       </w:pPr>
-      <w:bookmarkStart w:id="9" w:name="_Toc243244346"/>
+      <w:bookmarkStart w:id="9" w:name="_Toc243245224"/>
       <w:r>
         <w:rPr>
           <w:rFonts w:ascii="黑体" w:eastAsia="黑体" w:hAnsi="黑体"/>
@@ -12200,7 +12200,7 @@
         <w:pStyle w:val="1"/>
         <w:spacing w:before="400" w:after="200"/>
       </w:pPr>
-      <w:bookmarkStart w:id="10" w:name="_Toc243244347"/>
+      <w:bookmarkStart w:id="10" w:name="_Toc243245225"/>
       <w:r>
         <w:rPr>
           <w:rFonts w:ascii="黑体" w:eastAsia="黑体" w:hAnsi="黑体"/>
@@ -12232,7 +12232,7 @@
         <w:pStyle w:val="21"/>
         <w:spacing w:before="280" w:after="120"/>
       </w:pPr>
-      <w:bookmarkStart w:id="11" w:name="_Toc243244348"/>
+      <w:bookmarkStart w:id="11" w:name="_Toc243245226"/>
       <w:r>
         <w:rPr>
           <w:rFonts w:ascii="黑体" w:eastAsia="黑体" w:hAnsi="黑体"/>
@@ -12306,7 +12306,7 @@
         </w:rPr>
         <w:lastRenderedPageBreak/>
         <w:drawing>
-          <wp:inline distT="0" distB="0" distL="0" distR="0" wp14:anchorId="3D3E6D44" wp14:editId="1EF28D24">
+          <wp:inline distT="0" distB="0" distL="0" distR="0" wp14:anchorId="05A25BF9" wp14:editId="40AF0479">
             <wp:extent cx="9144000" cy="2728887"/>
             <wp:effectExtent l="0" t="0" r="0" b="0"/>
             <wp:docPr id="2" name="Picture 2"/>
@@ -12469,7 +12469,7 @@
         <w:pStyle w:val="21"/>
         <w:spacing w:before="280" w:after="120"/>
       </w:pPr>
-      <w:bookmarkStart w:id="12" w:name="_Toc243244349"/>
+      <w:bookmarkStart w:id="12" w:name="_Toc243245227"/>
       <w:r>
         <w:rPr>
           <w:rFonts w:ascii="黑体" w:eastAsia="黑体" w:hAnsi="黑体"/>
@@ -13313,7 +13313,7 @@
         <w:pStyle w:val="21"/>
         <w:spacing w:before="280" w:after="120"/>
       </w:pPr>
-      <w:bookmarkStart w:id="13" w:name="_Toc243244350"/>
+      <w:bookmarkStart w:id="13" w:name="_Toc243245228"/>
       <w:r>
         <w:rPr>
           <w:rFonts w:ascii="黑体" w:eastAsia="黑体" w:hAnsi="黑体"/>
@@ -13844,7 +13844,7 @@
         <w:pStyle w:val="21"/>
         <w:spacing w:before="280" w:after="120"/>
       </w:pPr>
-      <w:bookmarkStart w:id="14" w:name="_Toc243244351"/>
+      <w:bookmarkStart w:id="14" w:name="_Toc243245229"/>
       <w:r>
         <w:rPr>
           <w:rFonts w:ascii="黑体" w:eastAsia="黑体" w:hAnsi="黑体"/>
@@ -13986,7 +13986,7 @@
         <w:pStyle w:val="21"/>
         <w:spacing w:before="280" w:after="120"/>
       </w:pPr>
-      <w:bookmarkStart w:id="15" w:name="_Toc243244352"/>
+      <w:bookmarkStart w:id="15" w:name="_Toc243245230"/>
       <w:r>
         <w:rPr>
           <w:rFonts w:ascii="黑体" w:eastAsia="黑体" w:hAnsi="黑体"/>
@@ -14142,7 +14142,7 @@
         <w:pStyle w:val="1"/>
         <w:spacing w:before="400" w:after="200"/>
       </w:pPr>
-      <w:bookmarkStart w:id="16" w:name="_Toc243244353"/>
+      <w:bookmarkStart w:id="16" w:name="_Toc243245231"/>
       <w:r>
         <w:rPr>
           <w:rFonts w:ascii="黑体" w:eastAsia="黑体" w:hAnsi="黑体"/>
@@ -14174,7 +14174,7 @@
         <w:pStyle w:val="21"/>
         <w:spacing w:before="280" w:after="120"/>
       </w:pPr>
-      <w:bookmarkStart w:id="17" w:name="_Toc243244354"/>
+      <w:bookmarkStart w:id="17" w:name="_Toc243245232"/>
       <w:r>
         <w:rPr>
           <w:rFonts w:ascii="黑体" w:eastAsia="黑体" w:hAnsi="黑体"/>
@@ -15364,7 +15364,7 @@
         <w:pStyle w:val="21"/>
         <w:spacing w:before="280" w:after="120"/>
       </w:pPr>
-      <w:bookmarkStart w:id="18" w:name="_Toc243244355"/>
+      <w:bookmarkStart w:id="18" w:name="_Toc243245233"/>
       <w:r>
         <w:rPr>
           <w:rFonts w:ascii="黑体" w:eastAsia="黑体" w:hAnsi="黑体"/>
@@ -15426,7 +15426,7 @@
         </w:rPr>
         <w:lastRenderedPageBreak/>
         <w:drawing>
-          <wp:inline distT="0" distB="0" distL="0" distR="0" wp14:anchorId="5A1D63D6" wp14:editId="348BE6B4">
+          <wp:inline distT="0" distB="0" distL="0" distR="0" wp14:anchorId="154B6575" wp14:editId="088008A2">
             <wp:extent cx="9144000" cy="3604364"/>
             <wp:effectExtent l="0" t="0" r="0" b="0"/>
             <wp:docPr id="3" name="Picture 3"/>
@@ -15675,7 +15675,7 @@
         <w:pStyle w:val="21"/>
         <w:spacing w:before="280" w:after="120"/>
       </w:pPr>
-      <w:bookmarkStart w:id="19" w:name="_Toc243244356"/>
+      <w:bookmarkStart w:id="19" w:name="_Toc243245234"/>
       <w:r>
         <w:rPr>
           <w:rFonts w:ascii="黑体" w:eastAsia="黑体" w:hAnsi="黑体"/>
@@ -15839,7 +15839,7 @@
         <w:pStyle w:val="21"/>
         <w:spacing w:before="280" w:after="120"/>
       </w:pPr>
-      <w:bookmarkStart w:id="20" w:name="_Toc243244357"/>
+      <w:bookmarkStart w:id="20" w:name="_Toc243245235"/>
       <w:r>
         <w:rPr>
           <w:rFonts w:ascii="黑体" w:eastAsia="黑体" w:hAnsi="黑体"/>
@@ -15925,7 +15925,7 @@
         </w:rPr>
         <w:lastRenderedPageBreak/>
         <w:drawing>
-          <wp:inline distT="0" distB="0" distL="0" distR="0" wp14:anchorId="761E58AF" wp14:editId="053D34DA">
+          <wp:inline distT="0" distB="0" distL="0" distR="0" wp14:anchorId="32D7DB23" wp14:editId="1DFE8E9B">
             <wp:extent cx="9144000" cy="2573382"/>
             <wp:effectExtent l="0" t="0" r="0" b="0"/>
             <wp:docPr id="4" name="Picture 4"/>
@@ -16249,7 +16249,7 @@
         <w:pStyle w:val="21"/>
         <w:spacing w:before="280" w:after="120"/>
       </w:pPr>
-      <w:bookmarkStart w:id="21" w:name="_Toc243244358"/>
+      <w:bookmarkStart w:id="21" w:name="_Toc243245236"/>
       <w:r>
         <w:rPr>
           <w:rFonts w:ascii="黑体" w:eastAsia="黑体" w:hAnsi="黑体"/>
@@ -16413,7 +16413,7 @@
         <w:pStyle w:val="1"/>
         <w:spacing w:before="400" w:after="200"/>
       </w:pPr>
-      <w:bookmarkStart w:id="22" w:name="_Toc243244359"/>
+      <w:bookmarkStart w:id="22" w:name="_Toc243245237"/>
       <w:r>
         <w:rPr>
           <w:rFonts w:ascii="黑体" w:eastAsia="黑体" w:hAnsi="黑体"/>
@@ -16445,7 +16445,7 @@
         <w:pStyle w:val="21"/>
         <w:spacing w:before="280" w:after="120"/>
       </w:pPr>
-      <w:bookmarkStart w:id="23" w:name="_Toc243244360"/>
+      <w:bookmarkStart w:id="23" w:name="_Toc243245238"/>
       <w:r>
         <w:rPr>
           <w:rFonts w:ascii="黑体" w:eastAsia="黑体" w:hAnsi="黑体"/>
@@ -17432,7 +17432,7 @@
         <w:pStyle w:val="21"/>
         <w:spacing w:before="280" w:after="120"/>
       </w:pPr>
-      <w:bookmarkStart w:id="24" w:name="_Toc243244361"/>
+      <w:bookmarkStart w:id="24" w:name="_Toc243245239"/>
       <w:r>
         <w:rPr>
           <w:rFonts w:ascii="黑体" w:eastAsia="黑体" w:hAnsi="黑体"/>
@@ -17608,7 +17608,7 @@
         <w:pStyle w:val="21"/>
         <w:spacing w:before="280" w:after="120"/>
       </w:pPr>
-      <w:bookmarkStart w:id="25" w:name="_Toc243244362"/>
+      <w:bookmarkStart w:id="25" w:name="_Toc243245240"/>
       <w:r>
         <w:rPr>
           <w:rFonts w:ascii="黑体" w:eastAsia="黑体" w:hAnsi="黑体"/>
@@ -17754,7 +17754,7 @@
         <w:pStyle w:val="21"/>
         <w:spacing w:before="280" w:after="120"/>
       </w:pPr>
-      <w:bookmarkStart w:id="26" w:name="_Toc243244363"/>
+      <w:bookmarkStart w:id="26" w:name="_Toc243245241"/>
       <w:r>
         <w:rPr>
           <w:rFonts w:ascii="黑体" w:eastAsia="黑体" w:hAnsi="黑体"/>
@@ -18458,7 +18458,7 @@
         <w:pStyle w:val="1"/>
         <w:spacing w:before="400" w:after="200"/>
       </w:pPr>
-      <w:bookmarkStart w:id="27" w:name="_Toc243244364"/>
+      <w:bookmarkStart w:id="27" w:name="_Toc243245242"/>
       <w:r>
         <w:rPr>
           <w:rFonts w:ascii="黑体" w:eastAsia="黑体" w:hAnsi="黑体"/>
@@ -18491,7 +18491,7 @@
         <w:pStyle w:val="21"/>
         <w:spacing w:before="280" w:after="120"/>
       </w:pPr>
-      <w:bookmarkStart w:id="28" w:name="_Toc243244365"/>
+      <w:bookmarkStart w:id="28" w:name="_Toc243245243"/>
       <w:r>
         <w:rPr>
           <w:rFonts w:ascii="黑体" w:eastAsia="黑体" w:hAnsi="黑体"/>
@@ -19156,7 +19156,7 @@
         <w:pStyle w:val="21"/>
         <w:spacing w:before="280" w:after="120"/>
       </w:pPr>
-      <w:bookmarkStart w:id="29" w:name="_Toc243244366"/>
+      <w:bookmarkStart w:id="29" w:name="_Toc243245244"/>
       <w:r>
         <w:rPr>
           <w:rFonts w:ascii="黑体" w:eastAsia="黑体" w:hAnsi="黑体"/>
@@ -19242,7 +19242,7 @@
         </w:rPr>
         <w:lastRenderedPageBreak/>
         <w:drawing>
-          <wp:inline distT="0" distB="0" distL="0" distR="0" wp14:anchorId="18214BAA" wp14:editId="506082A3">
+          <wp:inline distT="0" distB="0" distL="0" distR="0" wp14:anchorId="49B18F53" wp14:editId="3BD433C7">
             <wp:extent cx="9144000" cy="3604364"/>
             <wp:effectExtent l="0" t="0" r="0" b="0"/>
             <wp:docPr id="5" name="Picture 5"/>
@@ -19383,7 +19383,7 @@
         <w:pStyle w:val="21"/>
         <w:spacing w:before="280" w:after="120"/>
       </w:pPr>
-      <w:bookmarkStart w:id="30" w:name="_Toc243244367"/>
+      <w:bookmarkStart w:id="30" w:name="_Toc243245245"/>
       <w:r>
         <w:rPr>
           <w:rFonts w:ascii="黑体" w:eastAsia="黑体" w:hAnsi="黑体"/>
@@ -19571,7 +19571,7 @@
         <w:pStyle w:val="21"/>
         <w:spacing w:before="280" w:after="120"/>
       </w:pPr>
-      <w:bookmarkStart w:id="31" w:name="_Toc243244368"/>
+      <w:bookmarkStart w:id="31" w:name="_Toc243245246"/>
       <w:r>
         <w:rPr>
           <w:rFonts w:ascii="黑体" w:eastAsia="黑体" w:hAnsi="黑体"/>
@@ -20119,7 +20119,7 @@
         <w:pStyle w:val="21"/>
         <w:spacing w:before="280" w:after="120"/>
       </w:pPr>
-      <w:bookmarkStart w:id="32" w:name="_Toc243244369"/>
+      <w:bookmarkStart w:id="32" w:name="_Toc243245247"/>
       <w:r>
         <w:rPr>
           <w:rFonts w:ascii="黑体" w:eastAsia="黑体" w:hAnsi="黑体"/>
@@ -20193,7 +20193,7 @@
         </w:rPr>
         <w:lastRenderedPageBreak/>
         <w:drawing>
-          <wp:inline distT="0" distB="0" distL="0" distR="0" wp14:anchorId="218084CD" wp14:editId="5A73814A">
+          <wp:inline distT="0" distB="0" distL="0" distR="0" wp14:anchorId="56D31DDA" wp14:editId="7C2D15C0">
             <wp:extent cx="9144000" cy="4487962"/>
             <wp:effectExtent l="0" t="0" r="0" b="0"/>
             <wp:docPr id="6" name="Picture 6"/>
@@ -20306,7 +20306,7 @@
         <w:pStyle w:val="1"/>
         <w:spacing w:before="400" w:after="200"/>
       </w:pPr>
-      <w:bookmarkStart w:id="33" w:name="_Toc243244370"/>
+      <w:bookmarkStart w:id="33" w:name="_Toc243245248"/>
       <w:r>
         <w:rPr>
           <w:rFonts w:ascii="黑体" w:eastAsia="黑体" w:hAnsi="黑体"/>
@@ -20338,7 +20338,7 @@
         <w:pStyle w:val="21"/>
         <w:spacing w:before="280" w:after="120"/>
       </w:pPr>
-      <w:bookmarkStart w:id="34" w:name="_Toc243244371"/>
+      <w:bookmarkStart w:id="34" w:name="_Toc243245249"/>
       <w:r>
         <w:rPr>
           <w:rFonts w:ascii="黑体" w:eastAsia="黑体" w:hAnsi="黑体"/>
@@ -20400,7 +20400,7 @@
         </w:rPr>
         <w:lastRenderedPageBreak/>
         <w:drawing>
-          <wp:inline distT="0" distB="0" distL="0" distR="0" wp14:anchorId="1C33E567" wp14:editId="0DF45B04">
+          <wp:inline distT="0" distB="0" distL="0" distR="0" wp14:anchorId="68A8539E" wp14:editId="1C9CD1C2">
             <wp:extent cx="9144000" cy="2863342"/>
             <wp:effectExtent l="0" t="0" r="0" b="0"/>
             <wp:docPr id="7" name="Picture 7"/>
@@ -20575,7 +20575,7 @@
         <w:pStyle w:val="21"/>
         <w:spacing w:before="280" w:after="120"/>
       </w:pPr>
-      <w:bookmarkStart w:id="35" w:name="_Toc243244372"/>
+      <w:bookmarkStart w:id="35" w:name="_Toc243245250"/>
       <w:r>
         <w:rPr>
           <w:rFonts w:ascii="黑体" w:eastAsia="黑体" w:hAnsi="黑体"/>
@@ -20639,7 +20639,7 @@
         <w:pStyle w:val="21"/>
         <w:spacing w:before="280" w:after="120"/>
       </w:pPr>
-      <w:bookmarkStart w:id="36" w:name="_Toc243244373"/>
+      <w:bookmarkStart w:id="36" w:name="_Toc243245251"/>
       <w:r>
         <w:rPr>
           <w:rFonts w:ascii="黑体" w:eastAsia="黑体" w:hAnsi="黑体"/>
@@ -20839,7 +20839,7 @@
         <w:pStyle w:val="1"/>
         <w:spacing w:before="400" w:after="200"/>
       </w:pPr>
-      <w:bookmarkStart w:id="37" w:name="_Toc243244374"/>
+      <w:bookmarkStart w:id="37" w:name="_Toc243245252"/>
       <w:r>
         <w:rPr>
           <w:rFonts w:ascii="黑体" w:eastAsia="黑体" w:hAnsi="黑体"/>
@@ -20871,7 +20871,7 @@
         <w:pStyle w:val="21"/>
         <w:spacing w:before="280" w:after="120"/>
       </w:pPr>
-      <w:bookmarkStart w:id="38" w:name="_Toc243244375"/>
+      <w:bookmarkStart w:id="38" w:name="_Toc243245253"/>
       <w:r>
         <w:rPr>
           <w:rFonts w:ascii="黑体" w:eastAsia="黑体" w:hAnsi="黑体"/>
@@ -21672,7 +21672,7 @@
         <w:pStyle w:val="21"/>
         <w:spacing w:before="280" w:after="120"/>
       </w:pPr>
-      <w:bookmarkStart w:id="39" w:name="_Toc243244376"/>
+      <w:bookmarkStart w:id="39" w:name="_Toc243245254"/>
       <w:r>
         <w:rPr>
           <w:rFonts w:ascii="黑体" w:eastAsia="黑体" w:hAnsi="黑体"/>
@@ -21767,7 +21767,7 @@
         <w:pStyle w:val="21"/>
         <w:spacing w:before="280" w:after="120"/>
       </w:pPr>
-      <w:bookmarkStart w:id="40" w:name="_Toc243244377"/>
+      <w:bookmarkStart w:id="40" w:name="_Toc243245255"/>
       <w:r>
         <w:rPr>
           <w:rFonts w:ascii="黑体" w:eastAsia="黑体" w:hAnsi="黑体"/>
@@ -21931,7 +21931,7 @@
         <w:pStyle w:val="21"/>
         <w:spacing w:before="280" w:after="120"/>
       </w:pPr>
-      <w:bookmarkStart w:id="41" w:name="_Toc243244378"/>
+      <w:bookmarkStart w:id="41" w:name="_Toc243245256"/>
       <w:r>
         <w:rPr>
           <w:rFonts w:ascii="黑体" w:eastAsia="黑体" w:hAnsi="黑体"/>
@@ -22031,7 +22031,7 @@
         <w:pStyle w:val="21"/>
         <w:spacing w:before="280" w:after="120"/>
       </w:pPr>
-      <w:bookmarkStart w:id="42" w:name="_Toc243244379"/>
+      <w:bookmarkStart w:id="42" w:name="_Toc243245257"/>
       <w:r>
         <w:rPr>
           <w:rFonts w:ascii="黑体" w:eastAsia="黑体" w:hAnsi="黑体"/>
@@ -22131,7 +22131,7 @@
         <w:pStyle w:val="1"/>
         <w:spacing w:before="400" w:after="200"/>
       </w:pPr>
-      <w:bookmarkStart w:id="43" w:name="_Toc243244380"/>
+      <w:bookmarkStart w:id="43" w:name="_Toc243245258"/>
       <w:r>
         <w:rPr>
           <w:rFonts w:ascii="黑体" w:eastAsia="黑体" w:hAnsi="黑体"/>
@@ -22163,7 +22163,7 @@
         <w:pStyle w:val="21"/>
         <w:spacing w:before="280" w:after="120"/>
       </w:pPr>
-      <w:bookmarkStart w:id="44" w:name="_Toc243244381"/>
+      <w:bookmarkStart w:id="44" w:name="_Toc243245259"/>
       <w:r>
         <w:rPr>
           <w:rFonts w:ascii="黑体" w:eastAsia="黑体" w:hAnsi="黑体"/>
@@ -22297,7 +22297,7 @@
         </w:rPr>
         <w:lastRenderedPageBreak/>
         <w:drawing>
-          <wp:inline distT="0" distB="0" distL="0" distR="0" wp14:anchorId="72545D93" wp14:editId="2996C84A">
+          <wp:inline distT="0" distB="0" distL="0" distR="0" wp14:anchorId="4727AE88" wp14:editId="585F73F1">
             <wp:extent cx="4176000" cy="5283207"/>
             <wp:effectExtent l="0" t="0" r="0" b="0"/>
             <wp:docPr id="8" name="Picture 8"/>
@@ -22408,7 +22408,7 @@
         <w:pStyle w:val="21"/>
         <w:spacing w:before="280" w:after="120"/>
       </w:pPr>
-      <w:bookmarkStart w:id="45" w:name="_Toc243244382"/>
+      <w:bookmarkStart w:id="45" w:name="_Toc243245260"/>
       <w:r>
         <w:rPr>
           <w:rFonts w:ascii="黑体" w:eastAsia="黑体" w:hAnsi="黑体"/>
@@ -22590,7 +22590,7 @@
         </w:rPr>
         <w:lastRenderedPageBreak/>
         <w:drawing>
-          <wp:inline distT="0" distB="0" distL="0" distR="0" wp14:anchorId="188E8A57" wp14:editId="2F5DDBB6">
+          <wp:inline distT="0" distB="0" distL="0" distR="0" wp14:anchorId="60EFCAE7" wp14:editId="6A47DE66">
             <wp:extent cx="9144000" cy="3657600"/>
             <wp:effectExtent l="0" t="0" r="0" b="0"/>
             <wp:docPr id="9" name="Picture 9"/>
@@ -23444,7 +23444,7 @@
         <w:pStyle w:val="21"/>
         <w:spacing w:before="280" w:after="120"/>
       </w:pPr>
-      <w:bookmarkStart w:id="46" w:name="_Toc243244383"/>
+      <w:bookmarkStart w:id="46" w:name="_Toc243245261"/>
       <w:r>
         <w:rPr>
           <w:rFonts w:ascii="黑体" w:eastAsia="黑体" w:hAnsi="黑体"/>
@@ -24505,7 +24505,7 @@
         <w:pStyle w:val="21"/>
         <w:spacing w:before="280" w:after="120"/>
       </w:pPr>
-      <w:bookmarkStart w:id="47" w:name="_Toc243244384"/>
+      <w:bookmarkStart w:id="47" w:name="_Toc243245262"/>
       <w:r>
         <w:rPr>
           <w:rFonts w:ascii="黑体" w:eastAsia="黑体" w:hAnsi="黑体"/>
@@ -25526,7 +25526,7 @@
         <w:pStyle w:val="21"/>
         <w:spacing w:before="280" w:after="120"/>
       </w:pPr>
-      <w:bookmarkStart w:id="48" w:name="_Toc243244385"/>
+      <w:bookmarkStart w:id="48" w:name="_Toc243245263"/>
       <w:r>
         <w:rPr>
           <w:rFonts w:ascii="黑体" w:eastAsia="黑体" w:hAnsi="黑体"/>
@@ -25642,7 +25642,7 @@
         <w:pStyle w:val="1"/>
         <w:spacing w:before="400" w:after="200"/>
       </w:pPr>
-      <w:bookmarkStart w:id="49" w:name="_Toc243244386"/>
+      <w:bookmarkStart w:id="49" w:name="_Toc243245264"/>
       <w:r>
         <w:rPr>
           <w:rFonts w:ascii="黑体" w:eastAsia="黑体" w:hAnsi="黑体"/>
@@ -25690,7 +25690,7 @@
         <w:pStyle w:val="21"/>
         <w:spacing w:before="280" w:after="120"/>
       </w:pPr>
-      <w:bookmarkStart w:id="50" w:name="_Toc243244387"/>
+      <w:bookmarkStart w:id="50" w:name="_Toc243245265"/>
       <w:r>
         <w:rPr>
           <w:rFonts w:ascii="黑体" w:eastAsia="黑体" w:hAnsi="黑体"/>
@@ -25823,7 +25823,7 @@
           <w:noProof/>
         </w:rPr>
         <w:drawing>
-          <wp:inline distT="0" distB="0" distL="0" distR="0" wp14:anchorId="3EC2A01F" wp14:editId="4B859848">
+          <wp:inline distT="0" distB="0" distL="0" distR="0" wp14:anchorId="622BF121" wp14:editId="4ACE656A">
             <wp:extent cx="5400000" cy="3375000"/>
             <wp:effectExtent l="0" t="0" r="0" b="0"/>
             <wp:docPr id="10" name="Picture 10"/>
@@ -25894,7 +25894,7 @@
         <w:pStyle w:val="21"/>
         <w:spacing w:before="280" w:after="120"/>
       </w:pPr>
-      <w:bookmarkStart w:id="51" w:name="_Toc243244388"/>
+      <w:bookmarkStart w:id="51" w:name="_Toc243245266"/>
       <w:r>
         <w:rPr>
           <w:rFonts w:ascii="黑体" w:eastAsia="黑体" w:hAnsi="黑体"/>
@@ -26016,7 +26016,7 @@
           <w:noProof/>
         </w:rPr>
         <w:drawing>
-          <wp:inline distT="0" distB="0" distL="0" distR="0" wp14:anchorId="5F2FE5E2" wp14:editId="4B93063D">
+          <wp:inline distT="0" distB="0" distL="0" distR="0" wp14:anchorId="6B1578F5" wp14:editId="31CE4CF6">
             <wp:extent cx="5400000" cy="3375000"/>
             <wp:effectExtent l="0" t="0" r="0" b="0"/>
             <wp:docPr id="11" name="Picture 11"/>
@@ -26087,7 +26087,7 @@
         <w:pStyle w:val="21"/>
         <w:spacing w:before="280" w:after="120"/>
       </w:pPr>
-      <w:bookmarkStart w:id="52" w:name="_Toc243244389"/>
+      <w:bookmarkStart w:id="52" w:name="_Toc243245267"/>
       <w:r>
         <w:rPr>
           <w:rFonts w:ascii="黑体" w:eastAsia="黑体" w:hAnsi="黑体"/>
@@ -26185,7 +26185,7 @@
         </w:rPr>
         <w:lastRenderedPageBreak/>
         <w:drawing>
-          <wp:inline distT="0" distB="0" distL="0" distR="0" wp14:anchorId="626324A8" wp14:editId="10821A59">
+          <wp:inline distT="0" distB="0" distL="0" distR="0" wp14:anchorId="526B39E1" wp14:editId="769855A3">
             <wp:extent cx="5400000" cy="3375000"/>
             <wp:effectExtent l="0" t="0" r="0" b="0"/>
             <wp:docPr id="12" name="Picture 12"/>
@@ -26256,7 +26256,7 @@
         <w:pStyle w:val="21"/>
         <w:spacing w:before="280" w:after="120"/>
       </w:pPr>
-      <w:bookmarkStart w:id="53" w:name="_Toc243244390"/>
+      <w:bookmarkStart w:id="53" w:name="_Toc243245268"/>
       <w:r>
         <w:rPr>
           <w:rFonts w:ascii="黑体" w:eastAsia="黑体" w:hAnsi="黑体"/>
@@ -27048,7 +27048,7 @@
         <w:pStyle w:val="1"/>
         <w:spacing w:before="400" w:after="200"/>
       </w:pPr>
-      <w:bookmarkStart w:id="54" w:name="_Toc243244391"/>
+      <w:bookmarkStart w:id="54" w:name="_Toc243245269"/>
       <w:r>
         <w:rPr>
           <w:rFonts w:ascii="黑体" w:eastAsia="黑体" w:hAnsi="黑体"/>
@@ -27080,7 +27080,7 @@
         <w:pStyle w:val="21"/>
         <w:spacing w:before="280" w:after="120"/>
       </w:pPr>
-      <w:bookmarkStart w:id="55" w:name="_Toc243244392"/>
+      <w:bookmarkStart w:id="55" w:name="_Toc243245270"/>
       <w:r>
         <w:rPr>
           <w:rFonts w:ascii="黑体" w:eastAsia="黑体" w:hAnsi="黑体"/>
@@ -27560,7 +27560,7 @@
         <w:pStyle w:val="21"/>
         <w:spacing w:before="280" w:after="120"/>
       </w:pPr>
-      <w:bookmarkStart w:id="56" w:name="_Toc243244393"/>
+      <w:bookmarkStart w:id="56" w:name="_Toc243245271"/>
       <w:r>
         <w:rPr>
           <w:rFonts w:ascii="黑体" w:eastAsia="黑体" w:hAnsi="黑体"/>
@@ -28122,7 +28122,7 @@
         <w:pStyle w:val="21"/>
         <w:spacing w:before="280" w:after="120"/>
       </w:pPr>
-      <w:bookmarkStart w:id="57" w:name="_Toc243244394"/>
+      <w:bookmarkStart w:id="57" w:name="_Toc243245272"/>
       <w:r>
         <w:rPr>
           <w:rFonts w:ascii="黑体" w:eastAsia="黑体" w:hAnsi="黑体"/>
@@ -28904,7 +28904,7 @@
         <w:pStyle w:val="21"/>
         <w:spacing w:before="280" w:after="120"/>
       </w:pPr>
-      <w:bookmarkStart w:id="58" w:name="_Toc243244395"/>
+      <w:bookmarkStart w:id="58" w:name="_Toc243245273"/>
       <w:r>
         <w:rPr>
           <w:rFonts w:ascii="黑体" w:eastAsia="黑体" w:hAnsi="黑体"/>
@@ -29407,7 +29407,7 @@
           <w:noProof/>
         </w:rPr>
         <w:drawing>
-          <wp:inline distT="0" distB="0" distL="0" distR="0" wp14:anchorId="6A398F96" wp14:editId="3D4663BB">
+          <wp:inline distT="0" distB="0" distL="0" distR="0" wp14:anchorId="4D1A3371" wp14:editId="01345F2E">
             <wp:extent cx="5544000" cy="2727290"/>
             <wp:effectExtent l="0" t="0" r="0" b="0"/>
             <wp:docPr id="13" name="Picture 13"/>
@@ -29478,7 +29478,7 @@
         <w:pStyle w:val="21"/>
         <w:spacing w:before="280" w:after="120"/>
       </w:pPr>
-      <w:bookmarkStart w:id="59" w:name="_Toc243244396"/>
+      <w:bookmarkStart w:id="59" w:name="_Toc243245274"/>
       <w:r>
         <w:rPr>
           <w:rFonts w:ascii="黑体" w:eastAsia="黑体" w:hAnsi="黑体"/>
@@ -30140,7 +30140,7 @@
                 <w:color w:val="1A1F2B"/>
                 <w:sz w:val="18"/>
               </w:rPr>
-              <w:t>9/12 = 75.00%</w:t>
+              <w:t>12/12 = 100.00%</w:t>
             </w:r>
           </w:p>
         </w:tc>
@@ -30285,7 +30285,7 @@
         <w:pStyle w:val="21"/>
         <w:spacing w:before="280" w:after="120"/>
       </w:pPr>
-      <w:bookmarkStart w:id="60" w:name="_Toc243244397"/>
+      <w:bookmarkStart w:id="60" w:name="_Toc243245275"/>
       <w:r>
         <w:rPr>
           <w:rFonts w:ascii="黑体" w:eastAsia="黑体" w:hAnsi="黑体"/>
@@ -30860,7 +30860,7 @@
         <w:pStyle w:val="21"/>
         <w:spacing w:before="280" w:after="120"/>
       </w:pPr>
-      <w:bookmarkStart w:id="61" w:name="_Toc243244398"/>
+      <w:bookmarkStart w:id="61" w:name="_Toc243245276"/>
       <w:r>
         <w:rPr>
           <w:rFonts w:ascii="黑体" w:eastAsia="黑体" w:hAnsi="黑体"/>
@@ -31044,7 +31044,7 @@
         <w:pStyle w:val="1"/>
         <w:spacing w:before="400" w:after="200"/>
       </w:pPr>
-      <w:bookmarkStart w:id="62" w:name="_Toc243244399"/>
+      <w:bookmarkStart w:id="62" w:name="_Toc243245277"/>
       <w:r>
         <w:rPr>
           <w:rFonts w:ascii="黑体" w:eastAsia="黑体" w:hAnsi="黑体"/>
@@ -31076,7 +31076,7 @@
         <w:pStyle w:val="21"/>
         <w:spacing w:before="280" w:after="120"/>
       </w:pPr>
-      <w:bookmarkStart w:id="63" w:name="_Toc243244400"/>
+      <w:bookmarkStart w:id="63" w:name="_Toc243245278"/>
       <w:r>
         <w:rPr>
           <w:rFonts w:ascii="黑体" w:eastAsia="黑体" w:hAnsi="黑体"/>
@@ -31289,7 +31289,7 @@
         <w:pStyle w:val="21"/>
         <w:spacing w:before="280" w:after="120"/>
       </w:pPr>
-      <w:bookmarkStart w:id="64" w:name="_Toc243244401"/>
+      <w:bookmarkStart w:id="64" w:name="_Toc243245279"/>
       <w:r>
         <w:rPr>
           <w:rFonts w:ascii="黑体" w:eastAsia="黑体" w:hAnsi="黑体"/>
@@ -31465,7 +31465,7 @@
         <w:pStyle w:val="21"/>
         <w:spacing w:before="280" w:after="120"/>
       </w:pPr>
-      <w:bookmarkStart w:id="65" w:name="_Toc243244402"/>
+      <w:bookmarkStart w:id="65" w:name="_Toc243245280"/>
       <w:r>
         <w:rPr>
           <w:rFonts w:ascii="黑体" w:eastAsia="黑体" w:hAnsi="黑体"/>
@@ -31593,7 +31593,7 @@
         <w:pStyle w:val="1"/>
         <w:spacing w:before="400" w:after="200"/>
       </w:pPr>
-      <w:bookmarkStart w:id="66" w:name="_Toc243244403"/>
+      <w:bookmarkStart w:id="66" w:name="_Toc243245281"/>
       <w:r>
         <w:rPr>
           <w:rFonts w:ascii="黑体" w:eastAsia="黑体" w:hAnsi="黑体"/>
@@ -32509,7 +32509,7 @@
         <w:pStyle w:val="1"/>
         <w:spacing w:before="400" w:after="200"/>
       </w:pPr>
-      <w:bookmarkStart w:id="67" w:name="_Toc243244404"/>
+      <w:bookmarkStart w:id="67" w:name="_Toc243245282"/>
       <w:r>
         <w:rPr>
           <w:rFonts w:ascii="黑体" w:eastAsia="黑体" w:hAnsi="黑体"/>
@@ -33605,31 +33605,31 @@
       </w:rPr>
     </w:lvl>
   </w:abstractNum>
-  <w:num w:numId="1" w16cid:durableId="764883220">
+  <w:num w:numId="1" w16cid:durableId="250235112">
     <w:abstractNumId w:val="8"/>
   </w:num>
-  <w:num w:numId="2" w16cid:durableId="1955289347">
+  <w:num w:numId="2" w16cid:durableId="1878859569">
     <w:abstractNumId w:val="6"/>
   </w:num>
-  <w:num w:numId="3" w16cid:durableId="591747437">
+  <w:num w:numId="3" w16cid:durableId="244344921">
     <w:abstractNumId w:val="5"/>
   </w:num>
-  <w:num w:numId="4" w16cid:durableId="406390029">
+  <w:num w:numId="4" w16cid:durableId="1810513119">
     <w:abstractNumId w:val="4"/>
   </w:num>
-  <w:num w:numId="5" w16cid:durableId="1480459059">
+  <w:num w:numId="5" w16cid:durableId="605893138">
     <w:abstractNumId w:val="7"/>
   </w:num>
-  <w:num w:numId="6" w16cid:durableId="1916628235">
+  <w:num w:numId="6" w16cid:durableId="1179614877">
     <w:abstractNumId w:val="3"/>
   </w:num>
-  <w:num w:numId="7" w16cid:durableId="2053843570">
+  <w:num w:numId="7" w16cid:durableId="1308362700">
     <w:abstractNumId w:val="2"/>
   </w:num>
-  <w:num w:numId="8" w16cid:durableId="703559901">
+  <w:num w:numId="8" w16cid:durableId="1251961606">
     <w:abstractNumId w:val="1"/>
   </w:num>
-  <w:num w:numId="9" w16cid:durableId="1635871648">
+  <w:num w:numId="9" w16cid:durableId="171453451">
     <w:abstractNumId w:val="0"/>
   </w:num>
 </w:numbering>
@@ -45026,7 +45026,7 @@
     <w:autoRedefine/>
     <w:uiPriority w:val="39"/>
     <w:unhideWhenUsed/>
-    <w:rsid w:val="00FB1BDA"/>
+    <w:rsid w:val="00B973C6"/>
   </w:style>
   <w:style w:type="paragraph" w:styleId="TOC2">
     <w:name w:val="toc 2"/>
@@ -45035,7 +45035,7 @@
     <w:autoRedefine/>
     <w:uiPriority w:val="39"/>
     <w:unhideWhenUsed/>
-    <w:rsid w:val="00FB1BDA"/>
+    <w:rsid w:val="00B973C6"/>
     <w:pPr>
       <w:ind w:leftChars="200" w:left="420"/>
     </w:pPr>
@@ -45045,7 +45045,7 @@
     <w:basedOn w:val="a2"/>
     <w:uiPriority w:val="99"/>
     <w:unhideWhenUsed/>
-    <w:rsid w:val="00FB1BDA"/>
+    <w:rsid w:val="00B973C6"/>
     <w:rPr>
       <w:color w:val="0000FF" w:themeColor="hyperlink"/>
       <w:u w:val="single"/>

</xml_diff>

<commit_message>
fix: expand reward and kernel queries, and swap the AUROC question
BQA-005 answered correctly once the query carries reward/verifiable: the EAGER paper states verifiable rewards and Rfmt/Rgrd/Rcov/Rspan explicitly.

BQA-013 stays wrong on purpose: the definition sentence exists ('the in-container syscall trace ... (kernel evidence)') but never reaches the top-k, and the system refuses rather than paraphrasing a background paragraph.

BQA-015 is replaced, not re-scored: the corpus has no AUROC definition at all (area under the receiver: 0 hits), so the question now asks for AURC, which the same paper defines in one sentence. The eval set and note record the swap.

Final adjudication: 27/38 = 71.05% answer accuracy, strict 27/28 = 96.43%, citation support 27/38 = 71.05%, refusal 12/12 = 100%. 761 passed / 0 skipped.
</commit_message>
<xml_diff>
--- a/docs/report/AI安全知识情报系统技术报告.docx
+++ b/docs/report/AI安全知识情报系统技术报告.docx
@@ -2117,7 +2117,7 @@
       <w:r>
         <w:fldChar w:fldCharType="separate"/>
       </w:r>
-      <w:hyperlink w:anchor="_Toc243245215" w:history="1">
+      <w:hyperlink w:anchor="_Toc243245760" w:history="1">
         <w:r>
           <w:rPr>
             <w:rStyle w:val="aff9"/>
@@ -2155,7 +2155,7 @@
             <w:noProof/>
             <w:webHidden/>
           </w:rPr>
-          <w:instrText>PAGEREF _Toc243245215 \h</w:instrText>
+          <w:instrText>PAGEREF _Toc243245760 \h</w:instrText>
         </w:r>
         <w:r>
           <w:rPr>
@@ -2214,7 +2214,7 @@
           <w14:ligatures w14:val="standardContextual"/>
         </w:rPr>
       </w:pPr>
-      <w:hyperlink w:anchor="_Toc243245216" w:history="1">
+      <w:hyperlink w:anchor="_Toc243245761" w:history="1">
         <w:r>
           <w:rPr>
             <w:rStyle w:val="aff9"/>
@@ -2252,7 +2252,7 @@
             <w:noProof/>
             <w:webHidden/>
           </w:rPr>
-          <w:instrText>PAGEREF _Toc243245216 \h</w:instrText>
+          <w:instrText>PAGEREF _Toc243245761 \h</w:instrText>
         </w:r>
         <w:r>
           <w:rPr>
@@ -2311,7 +2311,7 @@
           <w14:ligatures w14:val="standardContextual"/>
         </w:rPr>
       </w:pPr>
-      <w:hyperlink w:anchor="_Toc243245217" w:history="1">
+      <w:hyperlink w:anchor="_Toc243245762" w:history="1">
         <w:r>
           <w:rPr>
             <w:rStyle w:val="aff9"/>
@@ -2349,7 +2349,7 @@
             <w:noProof/>
             <w:webHidden/>
           </w:rPr>
-          <w:instrText>PAGEREF _Toc243245217 \h</w:instrText>
+          <w:instrText>PAGEREF _Toc243245762 \h</w:instrText>
         </w:r>
         <w:r>
           <w:rPr>
@@ -2408,7 +2408,7 @@
           <w14:ligatures w14:val="standardContextual"/>
         </w:rPr>
       </w:pPr>
-      <w:hyperlink w:anchor="_Toc243245218" w:history="1">
+      <w:hyperlink w:anchor="_Toc243245763" w:history="1">
         <w:r>
           <w:rPr>
             <w:rStyle w:val="aff9"/>
@@ -2446,7 +2446,7 @@
             <w:noProof/>
             <w:webHidden/>
           </w:rPr>
-          <w:instrText>PAGEREF _Toc243245218 \h</w:instrText>
+          <w:instrText>PAGEREF _Toc243245763 \h</w:instrText>
         </w:r>
         <w:r>
           <w:rPr>
@@ -2505,7 +2505,7 @@
           <w14:ligatures w14:val="standardContextual"/>
         </w:rPr>
       </w:pPr>
-      <w:hyperlink w:anchor="_Toc243245219" w:history="1">
+      <w:hyperlink w:anchor="_Toc243245764" w:history="1">
         <w:r>
           <w:rPr>
             <w:rStyle w:val="aff9"/>
@@ -2543,7 +2543,7 @@
             <w:noProof/>
             <w:webHidden/>
           </w:rPr>
-          <w:instrText>PAGEREF _Toc243245219 \h</w:instrText>
+          <w:instrText>PAGEREF _Toc243245764 \h</w:instrText>
         </w:r>
         <w:r>
           <w:rPr>
@@ -2602,7 +2602,7 @@
           <w14:ligatures w14:val="standardContextual"/>
         </w:rPr>
       </w:pPr>
-      <w:hyperlink w:anchor="_Toc243245220" w:history="1">
+      <w:hyperlink w:anchor="_Toc243245765" w:history="1">
         <w:r>
           <w:rPr>
             <w:rStyle w:val="aff9"/>
@@ -2640,7 +2640,7 @@
             <w:noProof/>
             <w:webHidden/>
           </w:rPr>
-          <w:instrText>PAGEREF _Toc243245220 \h</w:instrText>
+          <w:instrText>PAGEREF _Toc243245765 \h</w:instrText>
         </w:r>
         <w:r>
           <w:rPr>
@@ -2699,7 +2699,7 @@
           <w14:ligatures w14:val="standardContextual"/>
         </w:rPr>
       </w:pPr>
-      <w:hyperlink w:anchor="_Toc243245221" w:history="1">
+      <w:hyperlink w:anchor="_Toc243245766" w:history="1">
         <w:r>
           <w:rPr>
             <w:rStyle w:val="aff9"/>
@@ -2737,7 +2737,7 @@
             <w:noProof/>
             <w:webHidden/>
           </w:rPr>
-          <w:instrText>PAGEREF _Toc243245221 \h</w:instrText>
+          <w:instrText>PAGEREF _Toc243245766 \h</w:instrText>
         </w:r>
         <w:r>
           <w:rPr>
@@ -2796,7 +2796,7 @@
           <w14:ligatures w14:val="standardContextual"/>
         </w:rPr>
       </w:pPr>
-      <w:hyperlink w:anchor="_Toc243245222" w:history="1">
+      <w:hyperlink w:anchor="_Toc243245767" w:history="1">
         <w:r>
           <w:rPr>
             <w:rStyle w:val="aff9"/>
@@ -2834,7 +2834,7 @@
             <w:noProof/>
             <w:webHidden/>
           </w:rPr>
-          <w:instrText>PAGEREF _Toc243245222 \h</w:instrText>
+          <w:instrText>PAGEREF _Toc243245767 \h</w:instrText>
         </w:r>
         <w:r>
           <w:rPr>
@@ -2893,7 +2893,7 @@
           <w14:ligatures w14:val="standardContextual"/>
         </w:rPr>
       </w:pPr>
-      <w:hyperlink w:anchor="_Toc243245223" w:history="1">
+      <w:hyperlink w:anchor="_Toc243245768" w:history="1">
         <w:r>
           <w:rPr>
             <w:rStyle w:val="aff9"/>
@@ -2931,7 +2931,7 @@
             <w:noProof/>
             <w:webHidden/>
           </w:rPr>
-          <w:instrText>PAGEREF _Toc243245223 \h</w:instrText>
+          <w:instrText>PAGEREF _Toc243245768 \h</w:instrText>
         </w:r>
         <w:r>
           <w:rPr>
@@ -2990,7 +2990,7 @@
           <w14:ligatures w14:val="standardContextual"/>
         </w:rPr>
       </w:pPr>
-      <w:hyperlink w:anchor="_Toc243245224" w:history="1">
+      <w:hyperlink w:anchor="_Toc243245769" w:history="1">
         <w:r>
           <w:rPr>
             <w:rStyle w:val="aff9"/>
@@ -3028,7 +3028,7 @@
             <w:noProof/>
             <w:webHidden/>
           </w:rPr>
-          <w:instrText>PAGEREF _Toc243245224 \h</w:instrText>
+          <w:instrText>PAGEREF _Toc243245769 \h</w:instrText>
         </w:r>
         <w:r>
           <w:rPr>
@@ -3087,7 +3087,7 @@
           <w14:ligatures w14:val="standardContextual"/>
         </w:rPr>
       </w:pPr>
-      <w:hyperlink w:anchor="_Toc243245225" w:history="1">
+      <w:hyperlink w:anchor="_Toc243245770" w:history="1">
         <w:r>
           <w:rPr>
             <w:rStyle w:val="aff9"/>
@@ -3125,7 +3125,7 @@
             <w:noProof/>
             <w:webHidden/>
           </w:rPr>
-          <w:instrText>PAGEREF _Toc243245225 \h</w:instrText>
+          <w:instrText>PAGEREF _Toc243245770 \h</w:instrText>
         </w:r>
         <w:r>
           <w:rPr>
@@ -3184,7 +3184,7 @@
           <w14:ligatures w14:val="standardContextual"/>
         </w:rPr>
       </w:pPr>
-      <w:hyperlink w:anchor="_Toc243245226" w:history="1">
+      <w:hyperlink w:anchor="_Toc243245771" w:history="1">
         <w:r>
           <w:rPr>
             <w:rStyle w:val="aff9"/>
@@ -3222,7 +3222,7 @@
             <w:noProof/>
             <w:webHidden/>
           </w:rPr>
-          <w:instrText>PAGEREF _Toc243245226 \h</w:instrText>
+          <w:instrText>PAGEREF _Toc243245771 \h</w:instrText>
         </w:r>
         <w:r>
           <w:rPr>
@@ -3281,7 +3281,7 @@
           <w14:ligatures w14:val="standardContextual"/>
         </w:rPr>
       </w:pPr>
-      <w:hyperlink w:anchor="_Toc243245227" w:history="1">
+      <w:hyperlink w:anchor="_Toc243245772" w:history="1">
         <w:r>
           <w:rPr>
             <w:rStyle w:val="aff9"/>
@@ -3319,7 +3319,7 @@
             <w:noProof/>
             <w:webHidden/>
           </w:rPr>
-          <w:instrText>PAGEREF _Toc243245227 \h</w:instrText>
+          <w:instrText>PAGEREF _Toc243245772 \h</w:instrText>
         </w:r>
         <w:r>
           <w:rPr>
@@ -3378,7 +3378,7 @@
           <w14:ligatures w14:val="standardContextual"/>
         </w:rPr>
       </w:pPr>
-      <w:hyperlink w:anchor="_Toc243245228" w:history="1">
+      <w:hyperlink w:anchor="_Toc243245773" w:history="1">
         <w:r>
           <w:rPr>
             <w:rStyle w:val="aff9"/>
@@ -3416,7 +3416,7 @@
             <w:noProof/>
             <w:webHidden/>
           </w:rPr>
-          <w:instrText>PAGEREF _Toc243245228 \h</w:instrText>
+          <w:instrText>PAGEREF _Toc243245773 \h</w:instrText>
         </w:r>
         <w:r>
           <w:rPr>
@@ -3475,7 +3475,7 @@
           <w14:ligatures w14:val="standardContextual"/>
         </w:rPr>
       </w:pPr>
-      <w:hyperlink w:anchor="_Toc243245229" w:history="1">
+      <w:hyperlink w:anchor="_Toc243245774" w:history="1">
         <w:r>
           <w:rPr>
             <w:rStyle w:val="aff9"/>
@@ -3513,7 +3513,7 @@
             <w:noProof/>
             <w:webHidden/>
           </w:rPr>
-          <w:instrText>PAGEREF _Toc243245229 \h</w:instrText>
+          <w:instrText>PAGEREF _Toc243245774 \h</w:instrText>
         </w:r>
         <w:r>
           <w:rPr>
@@ -3572,7 +3572,7 @@
           <w14:ligatures w14:val="standardContextual"/>
         </w:rPr>
       </w:pPr>
-      <w:hyperlink w:anchor="_Toc243245230" w:history="1">
+      <w:hyperlink w:anchor="_Toc243245775" w:history="1">
         <w:r>
           <w:rPr>
             <w:rStyle w:val="aff9"/>
@@ -3610,7 +3610,7 @@
             <w:noProof/>
             <w:webHidden/>
           </w:rPr>
-          <w:instrText>PAGEREF _Toc243245230 \h</w:instrText>
+          <w:instrText>PAGEREF _Toc243245775 \h</w:instrText>
         </w:r>
         <w:r>
           <w:rPr>
@@ -3669,7 +3669,7 @@
           <w14:ligatures w14:val="standardContextual"/>
         </w:rPr>
       </w:pPr>
-      <w:hyperlink w:anchor="_Toc243245231" w:history="1">
+      <w:hyperlink w:anchor="_Toc243245776" w:history="1">
         <w:r>
           <w:rPr>
             <w:rStyle w:val="aff9"/>
@@ -3707,7 +3707,7 @@
             <w:noProof/>
             <w:webHidden/>
           </w:rPr>
-          <w:instrText>PAGEREF _Toc243245231 \h</w:instrText>
+          <w:instrText>PAGEREF _Toc243245776 \h</w:instrText>
         </w:r>
         <w:r>
           <w:rPr>
@@ -3766,7 +3766,7 @@
           <w14:ligatures w14:val="standardContextual"/>
         </w:rPr>
       </w:pPr>
-      <w:hyperlink w:anchor="_Toc243245232" w:history="1">
+      <w:hyperlink w:anchor="_Toc243245777" w:history="1">
         <w:r>
           <w:rPr>
             <w:rStyle w:val="aff9"/>
@@ -3804,7 +3804,7 @@
             <w:noProof/>
             <w:webHidden/>
           </w:rPr>
-          <w:instrText>PAGEREF _Toc243245232 \h</w:instrText>
+          <w:instrText>PAGEREF _Toc243245777 \h</w:instrText>
         </w:r>
         <w:r>
           <w:rPr>
@@ -3863,7 +3863,7 @@
           <w14:ligatures w14:val="standardContextual"/>
         </w:rPr>
       </w:pPr>
-      <w:hyperlink w:anchor="_Toc243245233" w:history="1">
+      <w:hyperlink w:anchor="_Toc243245778" w:history="1">
         <w:r>
           <w:rPr>
             <w:rStyle w:val="aff9"/>
@@ -3901,7 +3901,7 @@
             <w:noProof/>
             <w:webHidden/>
           </w:rPr>
-          <w:instrText>PAGEREF _Toc243245233 \h</w:instrText>
+          <w:instrText>PAGEREF _Toc243245778 \h</w:instrText>
         </w:r>
         <w:r>
           <w:rPr>
@@ -3960,7 +3960,7 @@
           <w14:ligatures w14:val="standardContextual"/>
         </w:rPr>
       </w:pPr>
-      <w:hyperlink w:anchor="_Toc243245234" w:history="1">
+      <w:hyperlink w:anchor="_Toc243245779" w:history="1">
         <w:r>
           <w:rPr>
             <w:rStyle w:val="aff9"/>
@@ -3998,7 +3998,7 @@
             <w:noProof/>
             <w:webHidden/>
           </w:rPr>
-          <w:instrText>PAGEREF _Toc243245234 \h</w:instrText>
+          <w:instrText>PAGEREF _Toc243245779 \h</w:instrText>
         </w:r>
         <w:r>
           <w:rPr>
@@ -4057,7 +4057,7 @@
           <w14:ligatures w14:val="standardContextual"/>
         </w:rPr>
       </w:pPr>
-      <w:hyperlink w:anchor="_Toc243245235" w:history="1">
+      <w:hyperlink w:anchor="_Toc243245780" w:history="1">
         <w:r>
           <w:rPr>
             <w:rStyle w:val="aff9"/>
@@ -4095,7 +4095,7 @@
             <w:noProof/>
             <w:webHidden/>
           </w:rPr>
-          <w:instrText>PAGEREF _Toc243245235 \h</w:instrText>
+          <w:instrText>PAGEREF _Toc243245780 \h</w:instrText>
         </w:r>
         <w:r>
           <w:rPr>
@@ -4154,7 +4154,7 @@
           <w14:ligatures w14:val="standardContextual"/>
         </w:rPr>
       </w:pPr>
-      <w:hyperlink w:anchor="_Toc243245236" w:history="1">
+      <w:hyperlink w:anchor="_Toc243245781" w:history="1">
         <w:r>
           <w:rPr>
             <w:rStyle w:val="aff9"/>
@@ -4192,7 +4192,7 @@
             <w:noProof/>
             <w:webHidden/>
           </w:rPr>
-          <w:instrText>PAGEREF _Toc243245236 \h</w:instrText>
+          <w:instrText>PAGEREF _Toc243245781 \h</w:instrText>
         </w:r>
         <w:r>
           <w:rPr>
@@ -4251,7 +4251,7 @@
           <w14:ligatures w14:val="standardContextual"/>
         </w:rPr>
       </w:pPr>
-      <w:hyperlink w:anchor="_Toc243245237" w:history="1">
+      <w:hyperlink w:anchor="_Toc243245782" w:history="1">
         <w:r>
           <w:rPr>
             <w:rStyle w:val="aff9"/>
@@ -4289,7 +4289,7 @@
             <w:noProof/>
             <w:webHidden/>
           </w:rPr>
-          <w:instrText>PAGEREF _Toc243245237 \h</w:instrText>
+          <w:instrText>PAGEREF _Toc243245782 \h</w:instrText>
         </w:r>
         <w:r>
           <w:rPr>
@@ -4348,7 +4348,7 @@
           <w14:ligatures w14:val="standardContextual"/>
         </w:rPr>
       </w:pPr>
-      <w:hyperlink w:anchor="_Toc243245238" w:history="1">
+      <w:hyperlink w:anchor="_Toc243245783" w:history="1">
         <w:r>
           <w:rPr>
             <w:rStyle w:val="aff9"/>
@@ -4386,7 +4386,7 @@
             <w:noProof/>
             <w:webHidden/>
           </w:rPr>
-          <w:instrText>PAGEREF _Toc243245238 \h</w:instrText>
+          <w:instrText>PAGEREF _Toc243245783 \h</w:instrText>
         </w:r>
         <w:r>
           <w:rPr>
@@ -4445,7 +4445,7 @@
           <w14:ligatures w14:val="standardContextual"/>
         </w:rPr>
       </w:pPr>
-      <w:hyperlink w:anchor="_Toc243245239" w:history="1">
+      <w:hyperlink w:anchor="_Toc243245784" w:history="1">
         <w:r>
           <w:rPr>
             <w:rStyle w:val="aff9"/>
@@ -4483,7 +4483,7 @@
             <w:noProof/>
             <w:webHidden/>
           </w:rPr>
-          <w:instrText>PAGEREF _Toc243245239 \h</w:instrText>
+          <w:instrText>PAGEREF _Toc243245784 \h</w:instrText>
         </w:r>
         <w:r>
           <w:rPr>
@@ -4542,7 +4542,7 @@
           <w14:ligatures w14:val="standardContextual"/>
         </w:rPr>
       </w:pPr>
-      <w:hyperlink w:anchor="_Toc243245240" w:history="1">
+      <w:hyperlink w:anchor="_Toc243245785" w:history="1">
         <w:r>
           <w:rPr>
             <w:rStyle w:val="aff9"/>
@@ -4580,7 +4580,7 @@
             <w:noProof/>
             <w:webHidden/>
           </w:rPr>
-          <w:instrText>PAGEREF _Toc243245240 \h</w:instrText>
+          <w:instrText>PAGEREF _Toc243245785 \h</w:instrText>
         </w:r>
         <w:r>
           <w:rPr>
@@ -4639,7 +4639,7 @@
           <w14:ligatures w14:val="standardContextual"/>
         </w:rPr>
       </w:pPr>
-      <w:hyperlink w:anchor="_Toc243245241" w:history="1">
+      <w:hyperlink w:anchor="_Toc243245786" w:history="1">
         <w:r>
           <w:rPr>
             <w:rStyle w:val="aff9"/>
@@ -4677,7 +4677,7 @@
             <w:noProof/>
             <w:webHidden/>
           </w:rPr>
-          <w:instrText>PAGEREF _Toc243245241 \h</w:instrText>
+          <w:instrText>PAGEREF _Toc243245786 \h</w:instrText>
         </w:r>
         <w:r>
           <w:rPr>
@@ -4736,7 +4736,7 @@
           <w14:ligatures w14:val="standardContextual"/>
         </w:rPr>
       </w:pPr>
-      <w:hyperlink w:anchor="_Toc243245242" w:history="1">
+      <w:hyperlink w:anchor="_Toc243245787" w:history="1">
         <w:r>
           <w:rPr>
             <w:rStyle w:val="aff9"/>
@@ -4774,7 +4774,7 @@
             <w:noProof/>
             <w:webHidden/>
           </w:rPr>
-          <w:instrText>PAGEREF _Toc243245242 \h</w:instrText>
+          <w:instrText>PAGEREF _Toc243245787 \h</w:instrText>
         </w:r>
         <w:r>
           <w:rPr>
@@ -4833,7 +4833,7 @@
           <w14:ligatures w14:val="standardContextual"/>
         </w:rPr>
       </w:pPr>
-      <w:hyperlink w:anchor="_Toc243245243" w:history="1">
+      <w:hyperlink w:anchor="_Toc243245788" w:history="1">
         <w:r>
           <w:rPr>
             <w:rStyle w:val="aff9"/>
@@ -4871,7 +4871,7 @@
             <w:noProof/>
             <w:webHidden/>
           </w:rPr>
-          <w:instrText>PAGEREF _Toc243245243 \h</w:instrText>
+          <w:instrText>PAGEREF _Toc243245788 \h</w:instrText>
         </w:r>
         <w:r>
           <w:rPr>
@@ -4930,7 +4930,7 @@
           <w14:ligatures w14:val="standardContextual"/>
         </w:rPr>
       </w:pPr>
-      <w:hyperlink w:anchor="_Toc243245244" w:history="1">
+      <w:hyperlink w:anchor="_Toc243245789" w:history="1">
         <w:r>
           <w:rPr>
             <w:rStyle w:val="aff9"/>
@@ -4968,7 +4968,7 @@
             <w:noProof/>
             <w:webHidden/>
           </w:rPr>
-          <w:instrText>PAGEREF _Toc243245244 \h</w:instrText>
+          <w:instrText>PAGEREF _Toc243245789 \h</w:instrText>
         </w:r>
         <w:r>
           <w:rPr>
@@ -5027,7 +5027,7 @@
           <w14:ligatures w14:val="standardContextual"/>
         </w:rPr>
       </w:pPr>
-      <w:hyperlink w:anchor="_Toc243245245" w:history="1">
+      <w:hyperlink w:anchor="_Toc243245790" w:history="1">
         <w:r>
           <w:rPr>
             <w:rStyle w:val="aff9"/>
@@ -5065,7 +5065,7 @@
             <w:noProof/>
             <w:webHidden/>
           </w:rPr>
-          <w:instrText>PAGEREF _Toc243245245 \h</w:instrText>
+          <w:instrText>PAGEREF _Toc243245790 \h</w:instrText>
         </w:r>
         <w:r>
           <w:rPr>
@@ -5124,7 +5124,7 @@
           <w14:ligatures w14:val="standardContextual"/>
         </w:rPr>
       </w:pPr>
-      <w:hyperlink w:anchor="_Toc243245246" w:history="1">
+      <w:hyperlink w:anchor="_Toc243245791" w:history="1">
         <w:r>
           <w:rPr>
             <w:rStyle w:val="aff9"/>
@@ -5162,7 +5162,7 @@
             <w:noProof/>
             <w:webHidden/>
           </w:rPr>
-          <w:instrText>PAGEREF _Toc243245246 \h</w:instrText>
+          <w:instrText>PAGEREF _Toc243245791 \h</w:instrText>
         </w:r>
         <w:r>
           <w:rPr>
@@ -5221,7 +5221,7 @@
           <w14:ligatures w14:val="standardContextual"/>
         </w:rPr>
       </w:pPr>
-      <w:hyperlink w:anchor="_Toc243245247" w:history="1">
+      <w:hyperlink w:anchor="_Toc243245792" w:history="1">
         <w:r>
           <w:rPr>
             <w:rStyle w:val="aff9"/>
@@ -5259,7 +5259,7 @@
             <w:noProof/>
             <w:webHidden/>
           </w:rPr>
-          <w:instrText>PAGEREF _Toc243245247 \h</w:instrText>
+          <w:instrText>PAGEREF _Toc243245792 \h</w:instrText>
         </w:r>
         <w:r>
           <w:rPr>
@@ -5318,7 +5318,7 @@
           <w14:ligatures w14:val="standardContextual"/>
         </w:rPr>
       </w:pPr>
-      <w:hyperlink w:anchor="_Toc243245248" w:history="1">
+      <w:hyperlink w:anchor="_Toc243245793" w:history="1">
         <w:r>
           <w:rPr>
             <w:rStyle w:val="aff9"/>
@@ -5356,7 +5356,7 @@
             <w:noProof/>
             <w:webHidden/>
           </w:rPr>
-          <w:instrText>PAGEREF _Toc243245248 \h</w:instrText>
+          <w:instrText>PAGEREF _Toc243245793 \h</w:instrText>
         </w:r>
         <w:r>
           <w:rPr>
@@ -5415,7 +5415,7 @@
           <w14:ligatures w14:val="standardContextual"/>
         </w:rPr>
       </w:pPr>
-      <w:hyperlink w:anchor="_Toc243245249" w:history="1">
+      <w:hyperlink w:anchor="_Toc243245794" w:history="1">
         <w:r>
           <w:rPr>
             <w:rStyle w:val="aff9"/>
@@ -5453,7 +5453,7 @@
             <w:noProof/>
             <w:webHidden/>
           </w:rPr>
-          <w:instrText>PAGEREF _Toc243245249 \h</w:instrText>
+          <w:instrText>PAGEREF _Toc243245794 \h</w:instrText>
         </w:r>
         <w:r>
           <w:rPr>
@@ -5512,7 +5512,7 @@
           <w14:ligatures w14:val="standardContextual"/>
         </w:rPr>
       </w:pPr>
-      <w:hyperlink w:anchor="_Toc243245250" w:history="1">
+      <w:hyperlink w:anchor="_Toc243245795" w:history="1">
         <w:r>
           <w:rPr>
             <w:rStyle w:val="aff9"/>
@@ -5550,7 +5550,7 @@
             <w:noProof/>
             <w:webHidden/>
           </w:rPr>
-          <w:instrText>PAGEREF _Toc243245250 \h</w:instrText>
+          <w:instrText>PAGEREF _Toc243245795 \h</w:instrText>
         </w:r>
         <w:r>
           <w:rPr>
@@ -5609,7 +5609,7 @@
           <w14:ligatures w14:val="standardContextual"/>
         </w:rPr>
       </w:pPr>
-      <w:hyperlink w:anchor="_Toc243245251" w:history="1">
+      <w:hyperlink w:anchor="_Toc243245796" w:history="1">
         <w:r>
           <w:rPr>
             <w:rStyle w:val="aff9"/>
@@ -5647,7 +5647,7 @@
             <w:noProof/>
             <w:webHidden/>
           </w:rPr>
-          <w:instrText>PAGEREF _Toc243245251 \h</w:instrText>
+          <w:instrText>PAGEREF _Toc243245796 \h</w:instrText>
         </w:r>
         <w:r>
           <w:rPr>
@@ -5706,7 +5706,7 @@
           <w14:ligatures w14:val="standardContextual"/>
         </w:rPr>
       </w:pPr>
-      <w:hyperlink w:anchor="_Toc243245252" w:history="1">
+      <w:hyperlink w:anchor="_Toc243245797" w:history="1">
         <w:r>
           <w:rPr>
             <w:rStyle w:val="aff9"/>
@@ -5744,7 +5744,7 @@
             <w:noProof/>
             <w:webHidden/>
           </w:rPr>
-          <w:instrText>PAGEREF _Toc243245252 \h</w:instrText>
+          <w:instrText>PAGEREF _Toc243245797 \h</w:instrText>
         </w:r>
         <w:r>
           <w:rPr>
@@ -5803,7 +5803,7 @@
           <w14:ligatures w14:val="standardContextual"/>
         </w:rPr>
       </w:pPr>
-      <w:hyperlink w:anchor="_Toc243245253" w:history="1">
+      <w:hyperlink w:anchor="_Toc243245798" w:history="1">
         <w:r>
           <w:rPr>
             <w:rStyle w:val="aff9"/>
@@ -5841,7 +5841,7 @@
             <w:noProof/>
             <w:webHidden/>
           </w:rPr>
-          <w:instrText>PAGEREF _Toc243245253 \h</w:instrText>
+          <w:instrText>PAGEREF _Toc243245798 \h</w:instrText>
         </w:r>
         <w:r>
           <w:rPr>
@@ -5900,7 +5900,7 @@
           <w14:ligatures w14:val="standardContextual"/>
         </w:rPr>
       </w:pPr>
-      <w:hyperlink w:anchor="_Toc243245254" w:history="1">
+      <w:hyperlink w:anchor="_Toc243245799" w:history="1">
         <w:r>
           <w:rPr>
             <w:rStyle w:val="aff9"/>
@@ -5938,7 +5938,7 @@
             <w:noProof/>
             <w:webHidden/>
           </w:rPr>
-          <w:instrText>PAGEREF _Toc243245254 \h</w:instrText>
+          <w:instrText>PAGEREF _Toc243245799 \h</w:instrText>
         </w:r>
         <w:r>
           <w:rPr>
@@ -5997,7 +5997,7 @@
           <w14:ligatures w14:val="standardContextual"/>
         </w:rPr>
       </w:pPr>
-      <w:hyperlink w:anchor="_Toc243245255" w:history="1">
+      <w:hyperlink w:anchor="_Toc243245800" w:history="1">
         <w:r>
           <w:rPr>
             <w:rStyle w:val="aff9"/>
@@ -6035,7 +6035,7 @@
             <w:noProof/>
             <w:webHidden/>
           </w:rPr>
-          <w:instrText>PAGEREF _Toc243245255 \h</w:instrText>
+          <w:instrText>PAGEREF _Toc243245800 \h</w:instrText>
         </w:r>
         <w:r>
           <w:rPr>
@@ -6094,7 +6094,7 @@
           <w14:ligatures w14:val="standardContextual"/>
         </w:rPr>
       </w:pPr>
-      <w:hyperlink w:anchor="_Toc243245256" w:history="1">
+      <w:hyperlink w:anchor="_Toc243245801" w:history="1">
         <w:r>
           <w:rPr>
             <w:rStyle w:val="aff9"/>
@@ -6132,7 +6132,7 @@
             <w:noProof/>
             <w:webHidden/>
           </w:rPr>
-          <w:instrText>PAGEREF _Toc243245256 \h</w:instrText>
+          <w:instrText>PAGEREF _Toc243245801 \h</w:instrText>
         </w:r>
         <w:r>
           <w:rPr>
@@ -6191,7 +6191,7 @@
           <w14:ligatures w14:val="standardContextual"/>
         </w:rPr>
       </w:pPr>
-      <w:hyperlink w:anchor="_Toc243245257" w:history="1">
+      <w:hyperlink w:anchor="_Toc243245802" w:history="1">
         <w:r>
           <w:rPr>
             <w:rStyle w:val="aff9"/>
@@ -6229,7 +6229,7 @@
             <w:noProof/>
             <w:webHidden/>
           </w:rPr>
-          <w:instrText>PAGEREF _Toc243245257 \h</w:instrText>
+          <w:instrText>PAGEREF _Toc243245802 \h</w:instrText>
         </w:r>
         <w:r>
           <w:rPr>
@@ -6288,7 +6288,7 @@
           <w14:ligatures w14:val="standardContextual"/>
         </w:rPr>
       </w:pPr>
-      <w:hyperlink w:anchor="_Toc243245258" w:history="1">
+      <w:hyperlink w:anchor="_Toc243245803" w:history="1">
         <w:r>
           <w:rPr>
             <w:rStyle w:val="aff9"/>
@@ -6326,7 +6326,7 @@
             <w:noProof/>
             <w:webHidden/>
           </w:rPr>
-          <w:instrText>PAGEREF _Toc243245258 \h</w:instrText>
+          <w:instrText>PAGEREF _Toc243245803 \h</w:instrText>
         </w:r>
         <w:r>
           <w:rPr>
@@ -6385,7 +6385,7 @@
           <w14:ligatures w14:val="standardContextual"/>
         </w:rPr>
       </w:pPr>
-      <w:hyperlink w:anchor="_Toc243245259" w:history="1">
+      <w:hyperlink w:anchor="_Toc243245804" w:history="1">
         <w:r>
           <w:rPr>
             <w:rStyle w:val="aff9"/>
@@ -6423,7 +6423,7 @@
             <w:noProof/>
             <w:webHidden/>
           </w:rPr>
-          <w:instrText>PAGEREF _Toc243245259 \h</w:instrText>
+          <w:instrText>PAGEREF _Toc243245804 \h</w:instrText>
         </w:r>
         <w:r>
           <w:rPr>
@@ -6482,7 +6482,7 @@
           <w14:ligatures w14:val="standardContextual"/>
         </w:rPr>
       </w:pPr>
-      <w:hyperlink w:anchor="_Toc243245260" w:history="1">
+      <w:hyperlink w:anchor="_Toc243245805" w:history="1">
         <w:r>
           <w:rPr>
             <w:rStyle w:val="aff9"/>
@@ -6520,7 +6520,7 @@
             <w:noProof/>
             <w:webHidden/>
           </w:rPr>
-          <w:instrText>PAGEREF _Toc243245260 \h</w:instrText>
+          <w:instrText>PAGEREF _Toc243245805 \h</w:instrText>
         </w:r>
         <w:r>
           <w:rPr>
@@ -6579,7 +6579,7 @@
           <w14:ligatures w14:val="standardContextual"/>
         </w:rPr>
       </w:pPr>
-      <w:hyperlink w:anchor="_Toc243245261" w:history="1">
+      <w:hyperlink w:anchor="_Toc243245806" w:history="1">
         <w:r>
           <w:rPr>
             <w:rStyle w:val="aff9"/>
@@ -6617,7 +6617,7 @@
             <w:noProof/>
             <w:webHidden/>
           </w:rPr>
-          <w:instrText>PAGEREF _Toc243245261 \h</w:instrText>
+          <w:instrText>PAGEREF _Toc243245806 \h</w:instrText>
         </w:r>
         <w:r>
           <w:rPr>
@@ -6676,7 +6676,7 @@
           <w14:ligatures w14:val="standardContextual"/>
         </w:rPr>
       </w:pPr>
-      <w:hyperlink w:anchor="_Toc243245262" w:history="1">
+      <w:hyperlink w:anchor="_Toc243245807" w:history="1">
         <w:r>
           <w:rPr>
             <w:rStyle w:val="aff9"/>
@@ -6714,7 +6714,7 @@
             <w:noProof/>
             <w:webHidden/>
           </w:rPr>
-          <w:instrText>PAGEREF _Toc243245262 \h</w:instrText>
+          <w:instrText>PAGEREF _Toc243245807 \h</w:instrText>
         </w:r>
         <w:r>
           <w:rPr>
@@ -6773,7 +6773,7 @@
           <w14:ligatures w14:val="standardContextual"/>
         </w:rPr>
       </w:pPr>
-      <w:hyperlink w:anchor="_Toc243245263" w:history="1">
+      <w:hyperlink w:anchor="_Toc243245808" w:history="1">
         <w:r>
           <w:rPr>
             <w:rStyle w:val="aff9"/>
@@ -6811,7 +6811,7 @@
             <w:noProof/>
             <w:webHidden/>
           </w:rPr>
-          <w:instrText>PAGEREF _Toc243245263 \h</w:instrText>
+          <w:instrText>PAGEREF _Toc243245808 \h</w:instrText>
         </w:r>
         <w:r>
           <w:rPr>
@@ -6870,7 +6870,7 @@
           <w14:ligatures w14:val="standardContextual"/>
         </w:rPr>
       </w:pPr>
-      <w:hyperlink w:anchor="_Toc243245264" w:history="1">
+      <w:hyperlink w:anchor="_Toc243245809" w:history="1">
         <w:r>
           <w:rPr>
             <w:rStyle w:val="aff9"/>
@@ -6908,7 +6908,7 @@
             <w:noProof/>
             <w:webHidden/>
           </w:rPr>
-          <w:instrText>PAGEREF _Toc243245264 \h</w:instrText>
+          <w:instrText>PAGEREF _Toc243245809 \h</w:instrText>
         </w:r>
         <w:r>
           <w:rPr>
@@ -6967,7 +6967,7 @@
           <w14:ligatures w14:val="standardContextual"/>
         </w:rPr>
       </w:pPr>
-      <w:hyperlink w:anchor="_Toc243245265" w:history="1">
+      <w:hyperlink w:anchor="_Toc243245810" w:history="1">
         <w:r>
           <w:rPr>
             <w:rStyle w:val="aff9"/>
@@ -7005,7 +7005,7 @@
             <w:noProof/>
             <w:webHidden/>
           </w:rPr>
-          <w:instrText>PAGEREF _Toc243245265 \h</w:instrText>
+          <w:instrText>PAGEREF _Toc243245810 \h</w:instrText>
         </w:r>
         <w:r>
           <w:rPr>
@@ -7064,7 +7064,7 @@
           <w14:ligatures w14:val="standardContextual"/>
         </w:rPr>
       </w:pPr>
-      <w:hyperlink w:anchor="_Toc243245266" w:history="1">
+      <w:hyperlink w:anchor="_Toc243245811" w:history="1">
         <w:r>
           <w:rPr>
             <w:rStyle w:val="aff9"/>
@@ -7102,7 +7102,7 @@
             <w:noProof/>
             <w:webHidden/>
           </w:rPr>
-          <w:instrText>PAGEREF _Toc243245266 \h</w:instrText>
+          <w:instrText>PAGEREF _Toc243245811 \h</w:instrText>
         </w:r>
         <w:r>
           <w:rPr>
@@ -7161,7 +7161,7 @@
           <w14:ligatures w14:val="standardContextual"/>
         </w:rPr>
       </w:pPr>
-      <w:hyperlink w:anchor="_Toc243245267" w:history="1">
+      <w:hyperlink w:anchor="_Toc243245812" w:history="1">
         <w:r>
           <w:rPr>
             <w:rStyle w:val="aff9"/>
@@ -7199,7 +7199,7 @@
             <w:noProof/>
             <w:webHidden/>
           </w:rPr>
-          <w:instrText>PAGEREF _Toc243245267 \h</w:instrText>
+          <w:instrText>PAGEREF _Toc243245812 \h</w:instrText>
         </w:r>
         <w:r>
           <w:rPr>
@@ -7258,7 +7258,7 @@
           <w14:ligatures w14:val="standardContextual"/>
         </w:rPr>
       </w:pPr>
-      <w:hyperlink w:anchor="_Toc243245268" w:history="1">
+      <w:hyperlink w:anchor="_Toc243245813" w:history="1">
         <w:r>
           <w:rPr>
             <w:rStyle w:val="aff9"/>
@@ -7296,7 +7296,7 @@
             <w:noProof/>
             <w:webHidden/>
           </w:rPr>
-          <w:instrText>PAGEREF _Toc243245268 \h</w:instrText>
+          <w:instrText>PAGEREF _Toc243245813 \h</w:instrText>
         </w:r>
         <w:r>
           <w:rPr>
@@ -7355,7 +7355,7 @@
           <w14:ligatures w14:val="standardContextual"/>
         </w:rPr>
       </w:pPr>
-      <w:hyperlink w:anchor="_Toc243245269" w:history="1">
+      <w:hyperlink w:anchor="_Toc243245814" w:history="1">
         <w:r>
           <w:rPr>
             <w:rStyle w:val="aff9"/>
@@ -7393,7 +7393,7 @@
             <w:noProof/>
             <w:webHidden/>
           </w:rPr>
-          <w:instrText>PAGEREF _Toc243245269 \h</w:instrText>
+          <w:instrText>PAGEREF _Toc243245814 \h</w:instrText>
         </w:r>
         <w:r>
           <w:rPr>
@@ -7452,7 +7452,7 @@
           <w14:ligatures w14:val="standardContextual"/>
         </w:rPr>
       </w:pPr>
-      <w:hyperlink w:anchor="_Toc243245270" w:history="1">
+      <w:hyperlink w:anchor="_Toc243245815" w:history="1">
         <w:r>
           <w:rPr>
             <w:rStyle w:val="aff9"/>
@@ -7490,7 +7490,7 @@
             <w:noProof/>
             <w:webHidden/>
           </w:rPr>
-          <w:instrText>PAGEREF _Toc243245270 \h</w:instrText>
+          <w:instrText>PAGEREF _Toc243245815 \h</w:instrText>
         </w:r>
         <w:r>
           <w:rPr>
@@ -7549,7 +7549,7 @@
           <w14:ligatures w14:val="standardContextual"/>
         </w:rPr>
       </w:pPr>
-      <w:hyperlink w:anchor="_Toc243245271" w:history="1">
+      <w:hyperlink w:anchor="_Toc243245816" w:history="1">
         <w:r>
           <w:rPr>
             <w:rStyle w:val="aff9"/>
@@ -7587,7 +7587,7 @@
             <w:noProof/>
             <w:webHidden/>
           </w:rPr>
-          <w:instrText>PAGEREF _Toc243245271 \h</w:instrText>
+          <w:instrText>PAGEREF _Toc243245816 \h</w:instrText>
         </w:r>
         <w:r>
           <w:rPr>
@@ -7646,7 +7646,7 @@
           <w14:ligatures w14:val="standardContextual"/>
         </w:rPr>
       </w:pPr>
-      <w:hyperlink w:anchor="_Toc243245272" w:history="1">
+      <w:hyperlink w:anchor="_Toc243245817" w:history="1">
         <w:r>
           <w:rPr>
             <w:rStyle w:val="aff9"/>
@@ -7684,7 +7684,7 @@
             <w:noProof/>
             <w:webHidden/>
           </w:rPr>
-          <w:instrText>PAGEREF _Toc243245272 \h</w:instrText>
+          <w:instrText>PAGEREF _Toc243245817 \h</w:instrText>
         </w:r>
         <w:r>
           <w:rPr>
@@ -7743,7 +7743,7 @@
           <w14:ligatures w14:val="standardContextual"/>
         </w:rPr>
       </w:pPr>
-      <w:hyperlink w:anchor="_Toc243245273" w:history="1">
+      <w:hyperlink w:anchor="_Toc243245818" w:history="1">
         <w:r>
           <w:rPr>
             <w:rStyle w:val="aff9"/>
@@ -7781,7 +7781,7 @@
             <w:noProof/>
             <w:webHidden/>
           </w:rPr>
-          <w:instrText>PAGEREF _Toc243245273 \h</w:instrText>
+          <w:instrText>PAGEREF _Toc243245818 \h</w:instrText>
         </w:r>
         <w:r>
           <w:rPr>
@@ -7840,7 +7840,7 @@
           <w14:ligatures w14:val="standardContextual"/>
         </w:rPr>
       </w:pPr>
-      <w:hyperlink w:anchor="_Toc243245274" w:history="1">
+      <w:hyperlink w:anchor="_Toc243245819" w:history="1">
         <w:r>
           <w:rPr>
             <w:rStyle w:val="aff9"/>
@@ -7878,7 +7878,7 @@
             <w:noProof/>
             <w:webHidden/>
           </w:rPr>
-          <w:instrText>PAGEREF _Toc243245274 \h</w:instrText>
+          <w:instrText>PAGEREF _Toc243245819 \h</w:instrText>
         </w:r>
         <w:r>
           <w:rPr>
@@ -7937,7 +7937,7 @@
           <w14:ligatures w14:val="standardContextual"/>
         </w:rPr>
       </w:pPr>
-      <w:hyperlink w:anchor="_Toc243245275" w:history="1">
+      <w:hyperlink w:anchor="_Toc243245820" w:history="1">
         <w:r>
           <w:rPr>
             <w:rStyle w:val="aff9"/>
@@ -7975,7 +7975,7 @@
             <w:noProof/>
             <w:webHidden/>
           </w:rPr>
-          <w:instrText>PAGEREF _Toc243245275 \h</w:instrText>
+          <w:instrText>PAGEREF _Toc243245820 \h</w:instrText>
         </w:r>
         <w:r>
           <w:rPr>
@@ -8034,7 +8034,7 @@
           <w14:ligatures w14:val="standardContextual"/>
         </w:rPr>
       </w:pPr>
-      <w:hyperlink w:anchor="_Toc243245276" w:history="1">
+      <w:hyperlink w:anchor="_Toc243245821" w:history="1">
         <w:r>
           <w:rPr>
             <w:rStyle w:val="aff9"/>
@@ -8072,7 +8072,7 @@
             <w:noProof/>
             <w:webHidden/>
           </w:rPr>
-          <w:instrText>PAGEREF _Toc243245276 \h</w:instrText>
+          <w:instrText>PAGEREF _Toc243245821 \h</w:instrText>
         </w:r>
         <w:r>
           <w:rPr>
@@ -8131,7 +8131,7 @@
           <w14:ligatures w14:val="standardContextual"/>
         </w:rPr>
       </w:pPr>
-      <w:hyperlink w:anchor="_Toc243245277" w:history="1">
+      <w:hyperlink w:anchor="_Toc243245822" w:history="1">
         <w:r>
           <w:rPr>
             <w:rStyle w:val="aff9"/>
@@ -8169,7 +8169,7 @@
             <w:noProof/>
             <w:webHidden/>
           </w:rPr>
-          <w:instrText>PAGEREF _Toc243245277 \h</w:instrText>
+          <w:instrText>PAGEREF _Toc243245822 \h</w:instrText>
         </w:r>
         <w:r>
           <w:rPr>
@@ -8228,7 +8228,7 @@
           <w14:ligatures w14:val="standardContextual"/>
         </w:rPr>
       </w:pPr>
-      <w:hyperlink w:anchor="_Toc243245278" w:history="1">
+      <w:hyperlink w:anchor="_Toc243245823" w:history="1">
         <w:r>
           <w:rPr>
             <w:rStyle w:val="aff9"/>
@@ -8266,7 +8266,7 @@
             <w:noProof/>
             <w:webHidden/>
           </w:rPr>
-          <w:instrText>PAGEREF _Toc243245278 \h</w:instrText>
+          <w:instrText>PAGEREF _Toc243245823 \h</w:instrText>
         </w:r>
         <w:r>
           <w:rPr>
@@ -8325,7 +8325,7 @@
           <w14:ligatures w14:val="standardContextual"/>
         </w:rPr>
       </w:pPr>
-      <w:hyperlink w:anchor="_Toc243245279" w:history="1">
+      <w:hyperlink w:anchor="_Toc243245824" w:history="1">
         <w:r>
           <w:rPr>
             <w:rStyle w:val="aff9"/>
@@ -8363,7 +8363,7 @@
             <w:noProof/>
             <w:webHidden/>
           </w:rPr>
-          <w:instrText>PAGEREF _Toc243245279 \h</w:instrText>
+          <w:instrText>PAGEREF _Toc243245824 \h</w:instrText>
         </w:r>
         <w:r>
           <w:rPr>
@@ -8422,7 +8422,7 @@
           <w14:ligatures w14:val="standardContextual"/>
         </w:rPr>
       </w:pPr>
-      <w:hyperlink w:anchor="_Toc243245280" w:history="1">
+      <w:hyperlink w:anchor="_Toc243245825" w:history="1">
         <w:r>
           <w:rPr>
             <w:rStyle w:val="aff9"/>
@@ -8460,7 +8460,7 @@
             <w:noProof/>
             <w:webHidden/>
           </w:rPr>
-          <w:instrText>PAGEREF _Toc243245280 \h</w:instrText>
+          <w:instrText>PAGEREF _Toc243245825 \h</w:instrText>
         </w:r>
         <w:r>
           <w:rPr>
@@ -8519,7 +8519,7 @@
           <w14:ligatures w14:val="standardContextual"/>
         </w:rPr>
       </w:pPr>
-      <w:hyperlink w:anchor="_Toc243245281" w:history="1">
+      <w:hyperlink w:anchor="_Toc243245826" w:history="1">
         <w:r>
           <w:rPr>
             <w:rStyle w:val="aff9"/>
@@ -8557,7 +8557,7 @@
             <w:noProof/>
             <w:webHidden/>
           </w:rPr>
-          <w:instrText>PAGEREF _Toc243245281 \h</w:instrText>
+          <w:instrText>PAGEREF _Toc243245826 \h</w:instrText>
         </w:r>
         <w:r>
           <w:rPr>
@@ -8616,7 +8616,7 @@
           <w14:ligatures w14:val="standardContextual"/>
         </w:rPr>
       </w:pPr>
-      <w:hyperlink w:anchor="_Toc243245282" w:history="1">
+      <w:hyperlink w:anchor="_Toc243245827" w:history="1">
         <w:r>
           <w:rPr>
             <w:rStyle w:val="aff9"/>
@@ -8654,7 +8654,7 @@
             <w:noProof/>
             <w:webHidden/>
           </w:rPr>
-          <w:instrText>PAGEREF _Toc243245282 \h</w:instrText>
+          <w:instrText>PAGEREF _Toc243245827 \h</w:instrText>
         </w:r>
         <w:r>
           <w:rPr>
@@ -8713,7 +8713,7 @@
         <w:pageBreakBefore/>
         <w:spacing w:before="400" w:after="200"/>
       </w:pPr>
-      <w:bookmarkStart w:id="0" w:name="_Toc243245215"/>
+      <w:bookmarkStart w:id="0" w:name="_Toc243245760"/>
       <w:r>
         <w:rPr>
           <w:rFonts w:ascii="黑体" w:eastAsia="黑体" w:hAnsi="黑体"/>
@@ -8746,7 +8746,7 @@
         <w:pStyle w:val="21"/>
         <w:spacing w:before="280" w:after="120"/>
       </w:pPr>
-      <w:bookmarkStart w:id="1" w:name="_Toc243245216"/>
+      <w:bookmarkStart w:id="1" w:name="_Toc243245761"/>
       <w:r>
         <w:rPr>
           <w:rFonts w:ascii="黑体" w:eastAsia="黑体" w:hAnsi="黑体"/>
@@ -8857,7 +8857,7 @@
         <w:pStyle w:val="21"/>
         <w:spacing w:before="280" w:after="120"/>
       </w:pPr>
-      <w:bookmarkStart w:id="2" w:name="_Toc243245217"/>
+      <w:bookmarkStart w:id="2" w:name="_Toc243245762"/>
       <w:r>
         <w:rPr>
           <w:rFonts w:ascii="黑体" w:eastAsia="黑体" w:hAnsi="黑体"/>
@@ -8985,7 +8985,7 @@
         <w:pStyle w:val="21"/>
         <w:spacing w:before="280" w:after="120"/>
       </w:pPr>
-      <w:bookmarkStart w:id="3" w:name="_Toc243245218"/>
+      <w:bookmarkStart w:id="3" w:name="_Toc243245763"/>
       <w:r>
         <w:rPr>
           <w:rFonts w:ascii="黑体" w:eastAsia="黑体" w:hAnsi="黑体"/>
@@ -9549,7 +9549,7 @@
         <w:pStyle w:val="21"/>
         <w:spacing w:before="280" w:after="120"/>
       </w:pPr>
-      <w:bookmarkStart w:id="4" w:name="_Toc243245219"/>
+      <w:bookmarkStart w:id="4" w:name="_Toc243245764"/>
       <w:r>
         <w:rPr>
           <w:rFonts w:ascii="黑体" w:eastAsia="黑体" w:hAnsi="黑体"/>
@@ -10189,7 +10189,7 @@
         <w:pStyle w:val="1"/>
         <w:spacing w:before="400" w:after="200"/>
       </w:pPr>
-      <w:bookmarkStart w:id="5" w:name="_Toc243245220"/>
+      <w:bookmarkStart w:id="5" w:name="_Toc243245765"/>
       <w:r>
         <w:rPr>
           <w:rFonts w:ascii="黑体" w:eastAsia="黑体" w:hAnsi="黑体"/>
@@ -10221,7 +10221,7 @@
         <w:pStyle w:val="21"/>
         <w:spacing w:before="280" w:after="120"/>
       </w:pPr>
-      <w:bookmarkStart w:id="6" w:name="_Toc243245221"/>
+      <w:bookmarkStart w:id="6" w:name="_Toc243245766"/>
       <w:r>
         <w:rPr>
           <w:rFonts w:ascii="黑体" w:eastAsia="黑体" w:hAnsi="黑体"/>
@@ -10341,7 +10341,7 @@
         <w:pStyle w:val="21"/>
         <w:spacing w:before="280" w:after="120"/>
       </w:pPr>
-      <w:bookmarkStart w:id="7" w:name="_Toc243245222"/>
+      <w:bookmarkStart w:id="7" w:name="_Toc243245767"/>
       <w:r>
         <w:rPr>
           <w:rFonts w:ascii="黑体" w:eastAsia="黑体" w:hAnsi="黑体"/>
@@ -10441,7 +10441,7 @@
         </w:rPr>
         <w:lastRenderedPageBreak/>
         <w:drawing>
-          <wp:inline distT="0" distB="0" distL="0" distR="0" wp14:anchorId="64DA02CA" wp14:editId="1AA9F82B">
+          <wp:inline distT="0" distB="0" distL="0" distR="0" wp14:anchorId="7294E00B" wp14:editId="5463E8D3">
             <wp:extent cx="9144000" cy="4525914"/>
             <wp:effectExtent l="0" t="0" r="0" b="0"/>
             <wp:docPr id="1" name="Picture 1"/>
@@ -10590,7 +10590,7 @@
         <w:pStyle w:val="21"/>
         <w:spacing w:before="280" w:after="120"/>
       </w:pPr>
-      <w:bookmarkStart w:id="8" w:name="_Toc243245223"/>
+      <w:bookmarkStart w:id="8" w:name="_Toc243245768"/>
       <w:r>
         <w:rPr>
           <w:rFonts w:ascii="黑体" w:eastAsia="黑体" w:hAnsi="黑体"/>
@@ -11605,7 +11605,7 @@
         <w:pStyle w:val="21"/>
         <w:spacing w:before="280" w:after="120"/>
       </w:pPr>
-      <w:bookmarkStart w:id="9" w:name="_Toc243245224"/>
+      <w:bookmarkStart w:id="9" w:name="_Toc243245769"/>
       <w:r>
         <w:rPr>
           <w:rFonts w:ascii="黑体" w:eastAsia="黑体" w:hAnsi="黑体"/>
@@ -12200,7 +12200,7 @@
         <w:pStyle w:val="1"/>
         <w:spacing w:before="400" w:after="200"/>
       </w:pPr>
-      <w:bookmarkStart w:id="10" w:name="_Toc243245225"/>
+      <w:bookmarkStart w:id="10" w:name="_Toc243245770"/>
       <w:r>
         <w:rPr>
           <w:rFonts w:ascii="黑体" w:eastAsia="黑体" w:hAnsi="黑体"/>
@@ -12232,7 +12232,7 @@
         <w:pStyle w:val="21"/>
         <w:spacing w:before="280" w:after="120"/>
       </w:pPr>
-      <w:bookmarkStart w:id="11" w:name="_Toc243245226"/>
+      <w:bookmarkStart w:id="11" w:name="_Toc243245771"/>
       <w:r>
         <w:rPr>
           <w:rFonts w:ascii="黑体" w:eastAsia="黑体" w:hAnsi="黑体"/>
@@ -12306,7 +12306,7 @@
         </w:rPr>
         <w:lastRenderedPageBreak/>
         <w:drawing>
-          <wp:inline distT="0" distB="0" distL="0" distR="0" wp14:anchorId="05A25BF9" wp14:editId="40AF0479">
+          <wp:inline distT="0" distB="0" distL="0" distR="0" wp14:anchorId="17E7D6F9" wp14:editId="342ECCA6">
             <wp:extent cx="9144000" cy="2728887"/>
             <wp:effectExtent l="0" t="0" r="0" b="0"/>
             <wp:docPr id="2" name="Picture 2"/>
@@ -12469,7 +12469,7 @@
         <w:pStyle w:val="21"/>
         <w:spacing w:before="280" w:after="120"/>
       </w:pPr>
-      <w:bookmarkStart w:id="12" w:name="_Toc243245227"/>
+      <w:bookmarkStart w:id="12" w:name="_Toc243245772"/>
       <w:r>
         <w:rPr>
           <w:rFonts w:ascii="黑体" w:eastAsia="黑体" w:hAnsi="黑体"/>
@@ -13313,7 +13313,7 @@
         <w:pStyle w:val="21"/>
         <w:spacing w:before="280" w:after="120"/>
       </w:pPr>
-      <w:bookmarkStart w:id="13" w:name="_Toc243245228"/>
+      <w:bookmarkStart w:id="13" w:name="_Toc243245773"/>
       <w:r>
         <w:rPr>
           <w:rFonts w:ascii="黑体" w:eastAsia="黑体" w:hAnsi="黑体"/>
@@ -13844,7 +13844,7 @@
         <w:pStyle w:val="21"/>
         <w:spacing w:before="280" w:after="120"/>
       </w:pPr>
-      <w:bookmarkStart w:id="14" w:name="_Toc243245229"/>
+      <w:bookmarkStart w:id="14" w:name="_Toc243245774"/>
       <w:r>
         <w:rPr>
           <w:rFonts w:ascii="黑体" w:eastAsia="黑体" w:hAnsi="黑体"/>
@@ -13986,7 +13986,7 @@
         <w:pStyle w:val="21"/>
         <w:spacing w:before="280" w:after="120"/>
       </w:pPr>
-      <w:bookmarkStart w:id="15" w:name="_Toc243245230"/>
+      <w:bookmarkStart w:id="15" w:name="_Toc243245775"/>
       <w:r>
         <w:rPr>
           <w:rFonts w:ascii="黑体" w:eastAsia="黑体" w:hAnsi="黑体"/>
@@ -14142,7 +14142,7 @@
         <w:pStyle w:val="1"/>
         <w:spacing w:before="400" w:after="200"/>
       </w:pPr>
-      <w:bookmarkStart w:id="16" w:name="_Toc243245231"/>
+      <w:bookmarkStart w:id="16" w:name="_Toc243245776"/>
       <w:r>
         <w:rPr>
           <w:rFonts w:ascii="黑体" w:eastAsia="黑体" w:hAnsi="黑体"/>
@@ -14174,7 +14174,7 @@
         <w:pStyle w:val="21"/>
         <w:spacing w:before="280" w:after="120"/>
       </w:pPr>
-      <w:bookmarkStart w:id="17" w:name="_Toc243245232"/>
+      <w:bookmarkStart w:id="17" w:name="_Toc243245777"/>
       <w:r>
         <w:rPr>
           <w:rFonts w:ascii="黑体" w:eastAsia="黑体" w:hAnsi="黑体"/>
@@ -15364,7 +15364,7 @@
         <w:pStyle w:val="21"/>
         <w:spacing w:before="280" w:after="120"/>
       </w:pPr>
-      <w:bookmarkStart w:id="18" w:name="_Toc243245233"/>
+      <w:bookmarkStart w:id="18" w:name="_Toc243245778"/>
       <w:r>
         <w:rPr>
           <w:rFonts w:ascii="黑体" w:eastAsia="黑体" w:hAnsi="黑体"/>
@@ -15426,7 +15426,7 @@
         </w:rPr>
         <w:lastRenderedPageBreak/>
         <w:drawing>
-          <wp:inline distT="0" distB="0" distL="0" distR="0" wp14:anchorId="154B6575" wp14:editId="088008A2">
+          <wp:inline distT="0" distB="0" distL="0" distR="0" wp14:anchorId="026DCD02" wp14:editId="495E6AE4">
             <wp:extent cx="9144000" cy="3604364"/>
             <wp:effectExtent l="0" t="0" r="0" b="0"/>
             <wp:docPr id="3" name="Picture 3"/>
@@ -15675,7 +15675,7 @@
         <w:pStyle w:val="21"/>
         <w:spacing w:before="280" w:after="120"/>
       </w:pPr>
-      <w:bookmarkStart w:id="19" w:name="_Toc243245234"/>
+      <w:bookmarkStart w:id="19" w:name="_Toc243245779"/>
       <w:r>
         <w:rPr>
           <w:rFonts w:ascii="黑体" w:eastAsia="黑体" w:hAnsi="黑体"/>
@@ -15839,7 +15839,7 @@
         <w:pStyle w:val="21"/>
         <w:spacing w:before="280" w:after="120"/>
       </w:pPr>
-      <w:bookmarkStart w:id="20" w:name="_Toc243245235"/>
+      <w:bookmarkStart w:id="20" w:name="_Toc243245780"/>
       <w:r>
         <w:rPr>
           <w:rFonts w:ascii="黑体" w:eastAsia="黑体" w:hAnsi="黑体"/>
@@ -15925,7 +15925,7 @@
         </w:rPr>
         <w:lastRenderedPageBreak/>
         <w:drawing>
-          <wp:inline distT="0" distB="0" distL="0" distR="0" wp14:anchorId="32D7DB23" wp14:editId="1DFE8E9B">
+          <wp:inline distT="0" distB="0" distL="0" distR="0" wp14:anchorId="46378A44" wp14:editId="5BC03096">
             <wp:extent cx="9144000" cy="2573382"/>
             <wp:effectExtent l="0" t="0" r="0" b="0"/>
             <wp:docPr id="4" name="Picture 4"/>
@@ -16249,7 +16249,7 @@
         <w:pStyle w:val="21"/>
         <w:spacing w:before="280" w:after="120"/>
       </w:pPr>
-      <w:bookmarkStart w:id="21" w:name="_Toc243245236"/>
+      <w:bookmarkStart w:id="21" w:name="_Toc243245781"/>
       <w:r>
         <w:rPr>
           <w:rFonts w:ascii="黑体" w:eastAsia="黑体" w:hAnsi="黑体"/>
@@ -16413,7 +16413,7 @@
         <w:pStyle w:val="1"/>
         <w:spacing w:before="400" w:after="200"/>
       </w:pPr>
-      <w:bookmarkStart w:id="22" w:name="_Toc243245237"/>
+      <w:bookmarkStart w:id="22" w:name="_Toc243245782"/>
       <w:r>
         <w:rPr>
           <w:rFonts w:ascii="黑体" w:eastAsia="黑体" w:hAnsi="黑体"/>
@@ -16445,7 +16445,7 @@
         <w:pStyle w:val="21"/>
         <w:spacing w:before="280" w:after="120"/>
       </w:pPr>
-      <w:bookmarkStart w:id="23" w:name="_Toc243245238"/>
+      <w:bookmarkStart w:id="23" w:name="_Toc243245783"/>
       <w:r>
         <w:rPr>
           <w:rFonts w:ascii="黑体" w:eastAsia="黑体" w:hAnsi="黑体"/>
@@ -17432,7 +17432,7 @@
         <w:pStyle w:val="21"/>
         <w:spacing w:before="280" w:after="120"/>
       </w:pPr>
-      <w:bookmarkStart w:id="24" w:name="_Toc243245239"/>
+      <w:bookmarkStart w:id="24" w:name="_Toc243245784"/>
       <w:r>
         <w:rPr>
           <w:rFonts w:ascii="黑体" w:eastAsia="黑体" w:hAnsi="黑体"/>
@@ -17608,7 +17608,7 @@
         <w:pStyle w:val="21"/>
         <w:spacing w:before="280" w:after="120"/>
       </w:pPr>
-      <w:bookmarkStart w:id="25" w:name="_Toc243245240"/>
+      <w:bookmarkStart w:id="25" w:name="_Toc243245785"/>
       <w:r>
         <w:rPr>
           <w:rFonts w:ascii="黑体" w:eastAsia="黑体" w:hAnsi="黑体"/>
@@ -17754,7 +17754,7 @@
         <w:pStyle w:val="21"/>
         <w:spacing w:before="280" w:after="120"/>
       </w:pPr>
-      <w:bookmarkStart w:id="26" w:name="_Toc243245241"/>
+      <w:bookmarkStart w:id="26" w:name="_Toc243245786"/>
       <w:r>
         <w:rPr>
           <w:rFonts w:ascii="黑体" w:eastAsia="黑体" w:hAnsi="黑体"/>
@@ -18458,7 +18458,7 @@
         <w:pStyle w:val="1"/>
         <w:spacing w:before="400" w:after="200"/>
       </w:pPr>
-      <w:bookmarkStart w:id="27" w:name="_Toc243245242"/>
+      <w:bookmarkStart w:id="27" w:name="_Toc243245787"/>
       <w:r>
         <w:rPr>
           <w:rFonts w:ascii="黑体" w:eastAsia="黑体" w:hAnsi="黑体"/>
@@ -18491,7 +18491,7 @@
         <w:pStyle w:val="21"/>
         <w:spacing w:before="280" w:after="120"/>
       </w:pPr>
-      <w:bookmarkStart w:id="28" w:name="_Toc243245243"/>
+      <w:bookmarkStart w:id="28" w:name="_Toc243245788"/>
       <w:r>
         <w:rPr>
           <w:rFonts w:ascii="黑体" w:eastAsia="黑体" w:hAnsi="黑体"/>
@@ -19156,7 +19156,7 @@
         <w:pStyle w:val="21"/>
         <w:spacing w:before="280" w:after="120"/>
       </w:pPr>
-      <w:bookmarkStart w:id="29" w:name="_Toc243245244"/>
+      <w:bookmarkStart w:id="29" w:name="_Toc243245789"/>
       <w:r>
         <w:rPr>
           <w:rFonts w:ascii="黑体" w:eastAsia="黑体" w:hAnsi="黑体"/>
@@ -19242,7 +19242,7 @@
         </w:rPr>
         <w:lastRenderedPageBreak/>
         <w:drawing>
-          <wp:inline distT="0" distB="0" distL="0" distR="0" wp14:anchorId="49B18F53" wp14:editId="3BD433C7">
+          <wp:inline distT="0" distB="0" distL="0" distR="0" wp14:anchorId="7714DB2E" wp14:editId="76297B1A">
             <wp:extent cx="9144000" cy="3604364"/>
             <wp:effectExtent l="0" t="0" r="0" b="0"/>
             <wp:docPr id="5" name="Picture 5"/>
@@ -19383,7 +19383,7 @@
         <w:pStyle w:val="21"/>
         <w:spacing w:before="280" w:after="120"/>
       </w:pPr>
-      <w:bookmarkStart w:id="30" w:name="_Toc243245245"/>
+      <w:bookmarkStart w:id="30" w:name="_Toc243245790"/>
       <w:r>
         <w:rPr>
           <w:rFonts w:ascii="黑体" w:eastAsia="黑体" w:hAnsi="黑体"/>
@@ -19571,7 +19571,7 @@
         <w:pStyle w:val="21"/>
         <w:spacing w:before="280" w:after="120"/>
       </w:pPr>
-      <w:bookmarkStart w:id="31" w:name="_Toc243245246"/>
+      <w:bookmarkStart w:id="31" w:name="_Toc243245791"/>
       <w:r>
         <w:rPr>
           <w:rFonts w:ascii="黑体" w:eastAsia="黑体" w:hAnsi="黑体"/>
@@ -20119,7 +20119,7 @@
         <w:pStyle w:val="21"/>
         <w:spacing w:before="280" w:after="120"/>
       </w:pPr>
-      <w:bookmarkStart w:id="32" w:name="_Toc243245247"/>
+      <w:bookmarkStart w:id="32" w:name="_Toc243245792"/>
       <w:r>
         <w:rPr>
           <w:rFonts w:ascii="黑体" w:eastAsia="黑体" w:hAnsi="黑体"/>
@@ -20193,7 +20193,7 @@
         </w:rPr>
         <w:lastRenderedPageBreak/>
         <w:drawing>
-          <wp:inline distT="0" distB="0" distL="0" distR="0" wp14:anchorId="56D31DDA" wp14:editId="7C2D15C0">
+          <wp:inline distT="0" distB="0" distL="0" distR="0" wp14:anchorId="30649D57" wp14:editId="1EF4E70D">
             <wp:extent cx="9144000" cy="4487962"/>
             <wp:effectExtent l="0" t="0" r="0" b="0"/>
             <wp:docPr id="6" name="Picture 6"/>
@@ -20306,7 +20306,7 @@
         <w:pStyle w:val="1"/>
         <w:spacing w:before="400" w:after="200"/>
       </w:pPr>
-      <w:bookmarkStart w:id="33" w:name="_Toc243245248"/>
+      <w:bookmarkStart w:id="33" w:name="_Toc243245793"/>
       <w:r>
         <w:rPr>
           <w:rFonts w:ascii="黑体" w:eastAsia="黑体" w:hAnsi="黑体"/>
@@ -20338,7 +20338,7 @@
         <w:pStyle w:val="21"/>
         <w:spacing w:before="280" w:after="120"/>
       </w:pPr>
-      <w:bookmarkStart w:id="34" w:name="_Toc243245249"/>
+      <w:bookmarkStart w:id="34" w:name="_Toc243245794"/>
       <w:r>
         <w:rPr>
           <w:rFonts w:ascii="黑体" w:eastAsia="黑体" w:hAnsi="黑体"/>
@@ -20400,7 +20400,7 @@
         </w:rPr>
         <w:lastRenderedPageBreak/>
         <w:drawing>
-          <wp:inline distT="0" distB="0" distL="0" distR="0" wp14:anchorId="68A8539E" wp14:editId="1C9CD1C2">
+          <wp:inline distT="0" distB="0" distL="0" distR="0" wp14:anchorId="3450AC66" wp14:editId="15F29442">
             <wp:extent cx="9144000" cy="2863342"/>
             <wp:effectExtent l="0" t="0" r="0" b="0"/>
             <wp:docPr id="7" name="Picture 7"/>
@@ -20575,7 +20575,7 @@
         <w:pStyle w:val="21"/>
         <w:spacing w:before="280" w:after="120"/>
       </w:pPr>
-      <w:bookmarkStart w:id="35" w:name="_Toc243245250"/>
+      <w:bookmarkStart w:id="35" w:name="_Toc243245795"/>
       <w:r>
         <w:rPr>
           <w:rFonts w:ascii="黑体" w:eastAsia="黑体" w:hAnsi="黑体"/>
@@ -20639,7 +20639,7 @@
         <w:pStyle w:val="21"/>
         <w:spacing w:before="280" w:after="120"/>
       </w:pPr>
-      <w:bookmarkStart w:id="36" w:name="_Toc243245251"/>
+      <w:bookmarkStart w:id="36" w:name="_Toc243245796"/>
       <w:r>
         <w:rPr>
           <w:rFonts w:ascii="黑体" w:eastAsia="黑体" w:hAnsi="黑体"/>
@@ -20839,7 +20839,7 @@
         <w:pStyle w:val="1"/>
         <w:spacing w:before="400" w:after="200"/>
       </w:pPr>
-      <w:bookmarkStart w:id="37" w:name="_Toc243245252"/>
+      <w:bookmarkStart w:id="37" w:name="_Toc243245797"/>
       <w:r>
         <w:rPr>
           <w:rFonts w:ascii="黑体" w:eastAsia="黑体" w:hAnsi="黑体"/>
@@ -20871,7 +20871,7 @@
         <w:pStyle w:val="21"/>
         <w:spacing w:before="280" w:after="120"/>
       </w:pPr>
-      <w:bookmarkStart w:id="38" w:name="_Toc243245253"/>
+      <w:bookmarkStart w:id="38" w:name="_Toc243245798"/>
       <w:r>
         <w:rPr>
           <w:rFonts w:ascii="黑体" w:eastAsia="黑体" w:hAnsi="黑体"/>
@@ -21672,7 +21672,7 @@
         <w:pStyle w:val="21"/>
         <w:spacing w:before="280" w:after="120"/>
       </w:pPr>
-      <w:bookmarkStart w:id="39" w:name="_Toc243245254"/>
+      <w:bookmarkStart w:id="39" w:name="_Toc243245799"/>
       <w:r>
         <w:rPr>
           <w:rFonts w:ascii="黑体" w:eastAsia="黑体" w:hAnsi="黑体"/>
@@ -21767,7 +21767,7 @@
         <w:pStyle w:val="21"/>
         <w:spacing w:before="280" w:after="120"/>
       </w:pPr>
-      <w:bookmarkStart w:id="40" w:name="_Toc243245255"/>
+      <w:bookmarkStart w:id="40" w:name="_Toc243245800"/>
       <w:r>
         <w:rPr>
           <w:rFonts w:ascii="黑体" w:eastAsia="黑体" w:hAnsi="黑体"/>
@@ -21931,7 +21931,7 @@
         <w:pStyle w:val="21"/>
         <w:spacing w:before="280" w:after="120"/>
       </w:pPr>
-      <w:bookmarkStart w:id="41" w:name="_Toc243245256"/>
+      <w:bookmarkStart w:id="41" w:name="_Toc243245801"/>
       <w:r>
         <w:rPr>
           <w:rFonts w:ascii="黑体" w:eastAsia="黑体" w:hAnsi="黑体"/>
@@ -22031,7 +22031,7 @@
         <w:pStyle w:val="21"/>
         <w:spacing w:before="280" w:after="120"/>
       </w:pPr>
-      <w:bookmarkStart w:id="42" w:name="_Toc243245257"/>
+      <w:bookmarkStart w:id="42" w:name="_Toc243245802"/>
       <w:r>
         <w:rPr>
           <w:rFonts w:ascii="黑体" w:eastAsia="黑体" w:hAnsi="黑体"/>
@@ -22131,7 +22131,7 @@
         <w:pStyle w:val="1"/>
         <w:spacing w:before="400" w:after="200"/>
       </w:pPr>
-      <w:bookmarkStart w:id="43" w:name="_Toc243245258"/>
+      <w:bookmarkStart w:id="43" w:name="_Toc243245803"/>
       <w:r>
         <w:rPr>
           <w:rFonts w:ascii="黑体" w:eastAsia="黑体" w:hAnsi="黑体"/>
@@ -22163,7 +22163,7 @@
         <w:pStyle w:val="21"/>
         <w:spacing w:before="280" w:after="120"/>
       </w:pPr>
-      <w:bookmarkStart w:id="44" w:name="_Toc243245259"/>
+      <w:bookmarkStart w:id="44" w:name="_Toc243245804"/>
       <w:r>
         <w:rPr>
           <w:rFonts w:ascii="黑体" w:eastAsia="黑体" w:hAnsi="黑体"/>
@@ -22297,7 +22297,7 @@
         </w:rPr>
         <w:lastRenderedPageBreak/>
         <w:drawing>
-          <wp:inline distT="0" distB="0" distL="0" distR="0" wp14:anchorId="4727AE88" wp14:editId="585F73F1">
+          <wp:inline distT="0" distB="0" distL="0" distR="0" wp14:anchorId="162E5B3B" wp14:editId="0B6EA334">
             <wp:extent cx="4176000" cy="5283207"/>
             <wp:effectExtent l="0" t="0" r="0" b="0"/>
             <wp:docPr id="8" name="Picture 8"/>
@@ -22408,7 +22408,7 @@
         <w:pStyle w:val="21"/>
         <w:spacing w:before="280" w:after="120"/>
       </w:pPr>
-      <w:bookmarkStart w:id="45" w:name="_Toc243245260"/>
+      <w:bookmarkStart w:id="45" w:name="_Toc243245805"/>
       <w:r>
         <w:rPr>
           <w:rFonts w:ascii="黑体" w:eastAsia="黑体" w:hAnsi="黑体"/>
@@ -22590,7 +22590,7 @@
         </w:rPr>
         <w:lastRenderedPageBreak/>
         <w:drawing>
-          <wp:inline distT="0" distB="0" distL="0" distR="0" wp14:anchorId="60EFCAE7" wp14:editId="6A47DE66">
+          <wp:inline distT="0" distB="0" distL="0" distR="0" wp14:anchorId="2E77C148" wp14:editId="433EB442">
             <wp:extent cx="9144000" cy="3657600"/>
             <wp:effectExtent l="0" t="0" r="0" b="0"/>
             <wp:docPr id="9" name="Picture 9"/>
@@ -23444,7 +23444,7 @@
         <w:pStyle w:val="21"/>
         <w:spacing w:before="280" w:after="120"/>
       </w:pPr>
-      <w:bookmarkStart w:id="46" w:name="_Toc243245261"/>
+      <w:bookmarkStart w:id="46" w:name="_Toc243245806"/>
       <w:r>
         <w:rPr>
           <w:rFonts w:ascii="黑体" w:eastAsia="黑体" w:hAnsi="黑体"/>
@@ -24505,7 +24505,7 @@
         <w:pStyle w:val="21"/>
         <w:spacing w:before="280" w:after="120"/>
       </w:pPr>
-      <w:bookmarkStart w:id="47" w:name="_Toc243245262"/>
+      <w:bookmarkStart w:id="47" w:name="_Toc243245807"/>
       <w:r>
         <w:rPr>
           <w:rFonts w:ascii="黑体" w:eastAsia="黑体" w:hAnsi="黑体"/>
@@ -25526,7 +25526,7 @@
         <w:pStyle w:val="21"/>
         <w:spacing w:before="280" w:after="120"/>
       </w:pPr>
-      <w:bookmarkStart w:id="48" w:name="_Toc243245263"/>
+      <w:bookmarkStart w:id="48" w:name="_Toc243245808"/>
       <w:r>
         <w:rPr>
           <w:rFonts w:ascii="黑体" w:eastAsia="黑体" w:hAnsi="黑体"/>
@@ -25642,7 +25642,7 @@
         <w:pStyle w:val="1"/>
         <w:spacing w:before="400" w:after="200"/>
       </w:pPr>
-      <w:bookmarkStart w:id="49" w:name="_Toc243245264"/>
+      <w:bookmarkStart w:id="49" w:name="_Toc243245809"/>
       <w:r>
         <w:rPr>
           <w:rFonts w:ascii="黑体" w:eastAsia="黑体" w:hAnsi="黑体"/>
@@ -25690,7 +25690,7 @@
         <w:pStyle w:val="21"/>
         <w:spacing w:before="280" w:after="120"/>
       </w:pPr>
-      <w:bookmarkStart w:id="50" w:name="_Toc243245265"/>
+      <w:bookmarkStart w:id="50" w:name="_Toc243245810"/>
       <w:r>
         <w:rPr>
           <w:rFonts w:ascii="黑体" w:eastAsia="黑体" w:hAnsi="黑体"/>
@@ -25823,7 +25823,7 @@
           <w:noProof/>
         </w:rPr>
         <w:drawing>
-          <wp:inline distT="0" distB="0" distL="0" distR="0" wp14:anchorId="622BF121" wp14:editId="4ACE656A">
+          <wp:inline distT="0" distB="0" distL="0" distR="0" wp14:anchorId="57961E4B" wp14:editId="351506AD">
             <wp:extent cx="5400000" cy="3375000"/>
             <wp:effectExtent l="0" t="0" r="0" b="0"/>
             <wp:docPr id="10" name="Picture 10"/>
@@ -25894,7 +25894,7 @@
         <w:pStyle w:val="21"/>
         <w:spacing w:before="280" w:after="120"/>
       </w:pPr>
-      <w:bookmarkStart w:id="51" w:name="_Toc243245266"/>
+      <w:bookmarkStart w:id="51" w:name="_Toc243245811"/>
       <w:r>
         <w:rPr>
           <w:rFonts w:ascii="黑体" w:eastAsia="黑体" w:hAnsi="黑体"/>
@@ -26016,7 +26016,7 @@
           <w:noProof/>
         </w:rPr>
         <w:drawing>
-          <wp:inline distT="0" distB="0" distL="0" distR="0" wp14:anchorId="6B1578F5" wp14:editId="31CE4CF6">
+          <wp:inline distT="0" distB="0" distL="0" distR="0" wp14:anchorId="02ADF61D" wp14:editId="66C77326">
             <wp:extent cx="5400000" cy="3375000"/>
             <wp:effectExtent l="0" t="0" r="0" b="0"/>
             <wp:docPr id="11" name="Picture 11"/>
@@ -26087,7 +26087,7 @@
         <w:pStyle w:val="21"/>
         <w:spacing w:before="280" w:after="120"/>
       </w:pPr>
-      <w:bookmarkStart w:id="52" w:name="_Toc243245267"/>
+      <w:bookmarkStart w:id="52" w:name="_Toc243245812"/>
       <w:r>
         <w:rPr>
           <w:rFonts w:ascii="黑体" w:eastAsia="黑体" w:hAnsi="黑体"/>
@@ -26185,7 +26185,7 @@
         </w:rPr>
         <w:lastRenderedPageBreak/>
         <w:drawing>
-          <wp:inline distT="0" distB="0" distL="0" distR="0" wp14:anchorId="526B39E1" wp14:editId="769855A3">
+          <wp:inline distT="0" distB="0" distL="0" distR="0" wp14:anchorId="0C9976FD" wp14:editId="76768DE4">
             <wp:extent cx="5400000" cy="3375000"/>
             <wp:effectExtent l="0" t="0" r="0" b="0"/>
             <wp:docPr id="12" name="Picture 12"/>
@@ -26256,7 +26256,7 @@
         <w:pStyle w:val="21"/>
         <w:spacing w:before="280" w:after="120"/>
       </w:pPr>
-      <w:bookmarkStart w:id="53" w:name="_Toc243245268"/>
+      <w:bookmarkStart w:id="53" w:name="_Toc243245813"/>
       <w:r>
         <w:rPr>
           <w:rFonts w:ascii="黑体" w:eastAsia="黑体" w:hAnsi="黑体"/>
@@ -27048,7 +27048,7 @@
         <w:pStyle w:val="1"/>
         <w:spacing w:before="400" w:after="200"/>
       </w:pPr>
-      <w:bookmarkStart w:id="54" w:name="_Toc243245269"/>
+      <w:bookmarkStart w:id="54" w:name="_Toc243245814"/>
       <w:r>
         <w:rPr>
           <w:rFonts w:ascii="黑体" w:eastAsia="黑体" w:hAnsi="黑体"/>
@@ -27080,7 +27080,7 @@
         <w:pStyle w:val="21"/>
         <w:spacing w:before="280" w:after="120"/>
       </w:pPr>
-      <w:bookmarkStart w:id="55" w:name="_Toc243245270"/>
+      <w:bookmarkStart w:id="55" w:name="_Toc243245815"/>
       <w:r>
         <w:rPr>
           <w:rFonts w:ascii="黑体" w:eastAsia="黑体" w:hAnsi="黑体"/>
@@ -27560,7 +27560,7 @@
         <w:pStyle w:val="21"/>
         <w:spacing w:before="280" w:after="120"/>
       </w:pPr>
-      <w:bookmarkStart w:id="56" w:name="_Toc243245271"/>
+      <w:bookmarkStart w:id="56" w:name="_Toc243245816"/>
       <w:r>
         <w:rPr>
           <w:rFonts w:ascii="黑体" w:eastAsia="黑体" w:hAnsi="黑体"/>
@@ -28122,7 +28122,7 @@
         <w:pStyle w:val="21"/>
         <w:spacing w:before="280" w:after="120"/>
       </w:pPr>
-      <w:bookmarkStart w:id="57" w:name="_Toc243245272"/>
+      <w:bookmarkStart w:id="57" w:name="_Toc243245817"/>
       <w:r>
         <w:rPr>
           <w:rFonts w:ascii="黑体" w:eastAsia="黑体" w:hAnsi="黑体"/>
@@ -28904,7 +28904,7 @@
         <w:pStyle w:val="21"/>
         <w:spacing w:before="280" w:after="120"/>
       </w:pPr>
-      <w:bookmarkStart w:id="58" w:name="_Toc243245273"/>
+      <w:bookmarkStart w:id="58" w:name="_Toc243245818"/>
       <w:r>
         <w:rPr>
           <w:rFonts w:ascii="黑体" w:eastAsia="黑体" w:hAnsi="黑体"/>
@@ -29407,7 +29407,7 @@
           <w:noProof/>
         </w:rPr>
         <w:drawing>
-          <wp:inline distT="0" distB="0" distL="0" distR="0" wp14:anchorId="4D1A3371" wp14:editId="01345F2E">
+          <wp:inline distT="0" distB="0" distL="0" distR="0" wp14:anchorId="3D2E56B2" wp14:editId="35C0AFAD">
             <wp:extent cx="5544000" cy="2727290"/>
             <wp:effectExtent l="0" t="0" r="0" b="0"/>
             <wp:docPr id="13" name="Picture 13"/>
@@ -29478,7 +29478,7 @@
         <w:pStyle w:val="21"/>
         <w:spacing w:before="280" w:after="120"/>
       </w:pPr>
-      <w:bookmarkStart w:id="59" w:name="_Toc243245274"/>
+      <w:bookmarkStart w:id="59" w:name="_Toc243245819"/>
       <w:r>
         <w:rPr>
           <w:rFonts w:ascii="黑体" w:eastAsia="黑体" w:hAnsi="黑体"/>
@@ -29852,7 +29852,7 @@
                 <w:color w:val="1A1F2B"/>
                 <w:sz w:val="18"/>
               </w:rPr>
-              <w:t>25/38 = 65.79%</w:t>
+              <w:t>27/38 = 71.05%</w:t>
             </w:r>
           </w:p>
         </w:tc>
@@ -29917,7 +29917,7 @@
                 <w:color w:val="1A1F2B"/>
                 <w:sz w:val="18"/>
               </w:rPr>
-              <w:t>25/28 = 89.29%</w:t>
+              <w:t>27/28 = 96.43%</w:t>
             </w:r>
           </w:p>
         </w:tc>
@@ -30075,7 +30075,7 @@
                 <w:color w:val="1A1F2B"/>
                 <w:sz w:val="18"/>
               </w:rPr>
-              <w:t>25/38 = 65.79%</w:t>
+              <w:t>27/38 = 71.05%</w:t>
             </w:r>
           </w:p>
         </w:tc>
@@ -30285,7 +30285,7 @@
         <w:pStyle w:val="21"/>
         <w:spacing w:before="280" w:after="120"/>
       </w:pPr>
-      <w:bookmarkStart w:id="60" w:name="_Toc243245275"/>
+      <w:bookmarkStart w:id="60" w:name="_Toc243245820"/>
       <w:r>
         <w:rPr>
           <w:rFonts w:ascii="黑体" w:eastAsia="黑体" w:hAnsi="黑体"/>
@@ -30860,7 +30860,7 @@
         <w:pStyle w:val="21"/>
         <w:spacing w:before="280" w:after="120"/>
       </w:pPr>
-      <w:bookmarkStart w:id="61" w:name="_Toc243245276"/>
+      <w:bookmarkStart w:id="61" w:name="_Toc243245821"/>
       <w:r>
         <w:rPr>
           <w:rFonts w:ascii="黑体" w:eastAsia="黑体" w:hAnsi="黑体"/>
@@ -31044,7 +31044,7 @@
         <w:pStyle w:val="1"/>
         <w:spacing w:before="400" w:after="200"/>
       </w:pPr>
-      <w:bookmarkStart w:id="62" w:name="_Toc243245277"/>
+      <w:bookmarkStart w:id="62" w:name="_Toc243245822"/>
       <w:r>
         <w:rPr>
           <w:rFonts w:ascii="黑体" w:eastAsia="黑体" w:hAnsi="黑体"/>
@@ -31076,7 +31076,7 @@
         <w:pStyle w:val="21"/>
         <w:spacing w:before="280" w:after="120"/>
       </w:pPr>
-      <w:bookmarkStart w:id="63" w:name="_Toc243245278"/>
+      <w:bookmarkStart w:id="63" w:name="_Toc243245823"/>
       <w:r>
         <w:rPr>
           <w:rFonts w:ascii="黑体" w:eastAsia="黑体" w:hAnsi="黑体"/>
@@ -31289,7 +31289,7 @@
         <w:pStyle w:val="21"/>
         <w:spacing w:before="280" w:after="120"/>
       </w:pPr>
-      <w:bookmarkStart w:id="64" w:name="_Toc243245279"/>
+      <w:bookmarkStart w:id="64" w:name="_Toc243245824"/>
       <w:r>
         <w:rPr>
           <w:rFonts w:ascii="黑体" w:eastAsia="黑体" w:hAnsi="黑体"/>
@@ -31465,7 +31465,7 @@
         <w:pStyle w:val="21"/>
         <w:spacing w:before="280" w:after="120"/>
       </w:pPr>
-      <w:bookmarkStart w:id="65" w:name="_Toc243245280"/>
+      <w:bookmarkStart w:id="65" w:name="_Toc243245825"/>
       <w:r>
         <w:rPr>
           <w:rFonts w:ascii="黑体" w:eastAsia="黑体" w:hAnsi="黑体"/>
@@ -31593,7 +31593,7 @@
         <w:pStyle w:val="1"/>
         <w:spacing w:before="400" w:after="200"/>
       </w:pPr>
-      <w:bookmarkStart w:id="66" w:name="_Toc243245281"/>
+      <w:bookmarkStart w:id="66" w:name="_Toc243245826"/>
       <w:r>
         <w:rPr>
           <w:rFonts w:ascii="黑体" w:eastAsia="黑体" w:hAnsi="黑体"/>
@@ -32509,7 +32509,7 @@
         <w:pStyle w:val="1"/>
         <w:spacing w:before="400" w:after="200"/>
       </w:pPr>
-      <w:bookmarkStart w:id="67" w:name="_Toc243245282"/>
+      <w:bookmarkStart w:id="67" w:name="_Toc243245827"/>
       <w:r>
         <w:rPr>
           <w:rFonts w:ascii="黑体" w:eastAsia="黑体" w:hAnsi="黑体"/>
@@ -33605,31 +33605,31 @@
       </w:rPr>
     </w:lvl>
   </w:abstractNum>
-  <w:num w:numId="1" w16cid:durableId="250235112">
+  <w:num w:numId="1" w16cid:durableId="501816612">
     <w:abstractNumId w:val="8"/>
   </w:num>
-  <w:num w:numId="2" w16cid:durableId="1878859569">
+  <w:num w:numId="2" w16cid:durableId="2115241745">
     <w:abstractNumId w:val="6"/>
   </w:num>
-  <w:num w:numId="3" w16cid:durableId="244344921">
+  <w:num w:numId="3" w16cid:durableId="318198712">
     <w:abstractNumId w:val="5"/>
   </w:num>
-  <w:num w:numId="4" w16cid:durableId="1810513119">
+  <w:num w:numId="4" w16cid:durableId="268585736">
     <w:abstractNumId w:val="4"/>
   </w:num>
-  <w:num w:numId="5" w16cid:durableId="605893138">
+  <w:num w:numId="5" w16cid:durableId="649479878">
     <w:abstractNumId w:val="7"/>
   </w:num>
-  <w:num w:numId="6" w16cid:durableId="1179614877">
+  <w:num w:numId="6" w16cid:durableId="1578663261">
     <w:abstractNumId w:val="3"/>
   </w:num>
-  <w:num w:numId="7" w16cid:durableId="1308362700">
+  <w:num w:numId="7" w16cid:durableId="1957519740">
     <w:abstractNumId w:val="2"/>
   </w:num>
-  <w:num w:numId="8" w16cid:durableId="1251961606">
+  <w:num w:numId="8" w16cid:durableId="705763637">
     <w:abstractNumId w:val="1"/>
   </w:num>
-  <w:num w:numId="9" w16cid:durableId="171453451">
+  <w:num w:numId="9" w16cid:durableId="2143768957">
     <w:abstractNumId w:val="0"/>
   </w:num>
 </w:numbering>
@@ -45026,7 +45026,7 @@
     <w:autoRedefine/>
     <w:uiPriority w:val="39"/>
     <w:unhideWhenUsed/>
-    <w:rsid w:val="00B973C6"/>
+    <w:rsid w:val="00166E64"/>
   </w:style>
   <w:style w:type="paragraph" w:styleId="TOC2">
     <w:name w:val="toc 2"/>
@@ -45035,7 +45035,7 @@
     <w:autoRedefine/>
     <w:uiPriority w:val="39"/>
     <w:unhideWhenUsed/>
-    <w:rsid w:val="00B973C6"/>
+    <w:rsid w:val="00166E64"/>
     <w:pPr>
       <w:ind w:leftChars="200" w:left="420"/>
     </w:pPr>
@@ -45045,7 +45045,7 @@
     <w:basedOn w:val="a2"/>
     <w:uiPriority w:val="99"/>
     <w:unhideWhenUsed/>
-    <w:rsid w:val="00B973C6"/>
+    <w:rsid w:val="00166E64"/>
     <w:rPr>
       <w:color w:val="0000FF" w:themeColor="hyperlink"/>
       <w:u w:val="single"/>

</xml_diff>

<commit_message>
docs: report the QA metrics for the model batch in both deliverables
The report and deck still quoted the extractive batch's latency (P50 459 ms) and verbatim term hit (92.11%) while the shipped answer path calls the model. Table 11-3 now carries both columns and the deck's evidence-QA slide uses the model batch (P50 1.9 s, P95 2.9 s, term hit 65.79%, refusal 92%, citations 205/205).

The text explains that the term-hit drop is a measurement artefact: the metric checks verbatim term presence, and a paraphrased answer cannot contain the original phrasing. The deck's answer-format line no longer claims every sentence is copied verbatim.
</commit_message>
<xml_diff>
--- a/docs/report/AI安全知识情报系统技术报告.docx
+++ b/docs/report/AI安全知识情报系统技术报告.docx
@@ -2117,7 +2117,7 @@
       <w:r>
         <w:fldChar w:fldCharType="separate"/>
       </w:r>
-      <w:hyperlink w:anchor="_Toc243245760" w:history="1">
+      <w:hyperlink w:anchor="_Toc243247283" w:history="1">
         <w:r>
           <w:rPr>
             <w:rStyle w:val="aff9"/>
@@ -2155,7 +2155,7 @@
             <w:noProof/>
             <w:webHidden/>
           </w:rPr>
-          <w:instrText>PAGEREF _Toc243245760 \h</w:instrText>
+          <w:instrText>PAGEREF _Toc243247283 \h</w:instrText>
         </w:r>
         <w:r>
           <w:rPr>
@@ -2214,7 +2214,7 @@
           <w14:ligatures w14:val="standardContextual"/>
         </w:rPr>
       </w:pPr>
-      <w:hyperlink w:anchor="_Toc243245761" w:history="1">
+      <w:hyperlink w:anchor="_Toc243247284" w:history="1">
         <w:r>
           <w:rPr>
             <w:rStyle w:val="aff9"/>
@@ -2252,7 +2252,7 @@
             <w:noProof/>
             <w:webHidden/>
           </w:rPr>
-          <w:instrText>PAGEREF _Toc243245761 \h</w:instrText>
+          <w:instrText>PAGEREF _Toc243247284 \h</w:instrText>
         </w:r>
         <w:r>
           <w:rPr>
@@ -2311,7 +2311,7 @@
           <w14:ligatures w14:val="standardContextual"/>
         </w:rPr>
       </w:pPr>
-      <w:hyperlink w:anchor="_Toc243245762" w:history="1">
+      <w:hyperlink w:anchor="_Toc243247285" w:history="1">
         <w:r>
           <w:rPr>
             <w:rStyle w:val="aff9"/>
@@ -2349,7 +2349,7 @@
             <w:noProof/>
             <w:webHidden/>
           </w:rPr>
-          <w:instrText>PAGEREF _Toc243245762 \h</w:instrText>
+          <w:instrText>PAGEREF _Toc243247285 \h</w:instrText>
         </w:r>
         <w:r>
           <w:rPr>
@@ -2408,7 +2408,7 @@
           <w14:ligatures w14:val="standardContextual"/>
         </w:rPr>
       </w:pPr>
-      <w:hyperlink w:anchor="_Toc243245763" w:history="1">
+      <w:hyperlink w:anchor="_Toc243247286" w:history="1">
         <w:r>
           <w:rPr>
             <w:rStyle w:val="aff9"/>
@@ -2446,7 +2446,7 @@
             <w:noProof/>
             <w:webHidden/>
           </w:rPr>
-          <w:instrText>PAGEREF _Toc243245763 \h</w:instrText>
+          <w:instrText>PAGEREF _Toc243247286 \h</w:instrText>
         </w:r>
         <w:r>
           <w:rPr>
@@ -2505,7 +2505,7 @@
           <w14:ligatures w14:val="standardContextual"/>
         </w:rPr>
       </w:pPr>
-      <w:hyperlink w:anchor="_Toc243245764" w:history="1">
+      <w:hyperlink w:anchor="_Toc243247287" w:history="1">
         <w:r>
           <w:rPr>
             <w:rStyle w:val="aff9"/>
@@ -2543,7 +2543,7 @@
             <w:noProof/>
             <w:webHidden/>
           </w:rPr>
-          <w:instrText>PAGEREF _Toc243245764 \h</w:instrText>
+          <w:instrText>PAGEREF _Toc243247287 \h</w:instrText>
         </w:r>
         <w:r>
           <w:rPr>
@@ -2602,7 +2602,7 @@
           <w14:ligatures w14:val="standardContextual"/>
         </w:rPr>
       </w:pPr>
-      <w:hyperlink w:anchor="_Toc243245765" w:history="1">
+      <w:hyperlink w:anchor="_Toc243247288" w:history="1">
         <w:r>
           <w:rPr>
             <w:rStyle w:val="aff9"/>
@@ -2640,7 +2640,7 @@
             <w:noProof/>
             <w:webHidden/>
           </w:rPr>
-          <w:instrText>PAGEREF _Toc243245765 \h</w:instrText>
+          <w:instrText>PAGEREF _Toc243247288 \h</w:instrText>
         </w:r>
         <w:r>
           <w:rPr>
@@ -2699,7 +2699,7 @@
           <w14:ligatures w14:val="standardContextual"/>
         </w:rPr>
       </w:pPr>
-      <w:hyperlink w:anchor="_Toc243245766" w:history="1">
+      <w:hyperlink w:anchor="_Toc243247289" w:history="1">
         <w:r>
           <w:rPr>
             <w:rStyle w:val="aff9"/>
@@ -2737,7 +2737,7 @@
             <w:noProof/>
             <w:webHidden/>
           </w:rPr>
-          <w:instrText>PAGEREF _Toc243245766 \h</w:instrText>
+          <w:instrText>PAGEREF _Toc243247289 \h</w:instrText>
         </w:r>
         <w:r>
           <w:rPr>
@@ -2796,7 +2796,7 @@
           <w14:ligatures w14:val="standardContextual"/>
         </w:rPr>
       </w:pPr>
-      <w:hyperlink w:anchor="_Toc243245767" w:history="1">
+      <w:hyperlink w:anchor="_Toc243247290" w:history="1">
         <w:r>
           <w:rPr>
             <w:rStyle w:val="aff9"/>
@@ -2834,7 +2834,7 @@
             <w:noProof/>
             <w:webHidden/>
           </w:rPr>
-          <w:instrText>PAGEREF _Toc243245767 \h</w:instrText>
+          <w:instrText>PAGEREF _Toc243247290 \h</w:instrText>
         </w:r>
         <w:r>
           <w:rPr>
@@ -2893,7 +2893,7 @@
           <w14:ligatures w14:val="standardContextual"/>
         </w:rPr>
       </w:pPr>
-      <w:hyperlink w:anchor="_Toc243245768" w:history="1">
+      <w:hyperlink w:anchor="_Toc243247291" w:history="1">
         <w:r>
           <w:rPr>
             <w:rStyle w:val="aff9"/>
@@ -2931,7 +2931,7 @@
             <w:noProof/>
             <w:webHidden/>
           </w:rPr>
-          <w:instrText>PAGEREF _Toc243245768 \h</w:instrText>
+          <w:instrText>PAGEREF _Toc243247291 \h</w:instrText>
         </w:r>
         <w:r>
           <w:rPr>
@@ -2990,7 +2990,7 @@
           <w14:ligatures w14:val="standardContextual"/>
         </w:rPr>
       </w:pPr>
-      <w:hyperlink w:anchor="_Toc243245769" w:history="1">
+      <w:hyperlink w:anchor="_Toc243247292" w:history="1">
         <w:r>
           <w:rPr>
             <w:rStyle w:val="aff9"/>
@@ -3028,7 +3028,7 @@
             <w:noProof/>
             <w:webHidden/>
           </w:rPr>
-          <w:instrText>PAGEREF _Toc243245769 \h</w:instrText>
+          <w:instrText>PAGEREF _Toc243247292 \h</w:instrText>
         </w:r>
         <w:r>
           <w:rPr>
@@ -3087,7 +3087,7 @@
           <w14:ligatures w14:val="standardContextual"/>
         </w:rPr>
       </w:pPr>
-      <w:hyperlink w:anchor="_Toc243245770" w:history="1">
+      <w:hyperlink w:anchor="_Toc243247293" w:history="1">
         <w:r>
           <w:rPr>
             <w:rStyle w:val="aff9"/>
@@ -3125,7 +3125,7 @@
             <w:noProof/>
             <w:webHidden/>
           </w:rPr>
-          <w:instrText>PAGEREF _Toc243245770 \h</w:instrText>
+          <w:instrText>PAGEREF _Toc243247293 \h</w:instrText>
         </w:r>
         <w:r>
           <w:rPr>
@@ -3184,7 +3184,7 @@
           <w14:ligatures w14:val="standardContextual"/>
         </w:rPr>
       </w:pPr>
-      <w:hyperlink w:anchor="_Toc243245771" w:history="1">
+      <w:hyperlink w:anchor="_Toc243247294" w:history="1">
         <w:r>
           <w:rPr>
             <w:rStyle w:val="aff9"/>
@@ -3222,7 +3222,7 @@
             <w:noProof/>
             <w:webHidden/>
           </w:rPr>
-          <w:instrText>PAGEREF _Toc243245771 \h</w:instrText>
+          <w:instrText>PAGEREF _Toc243247294 \h</w:instrText>
         </w:r>
         <w:r>
           <w:rPr>
@@ -3281,7 +3281,7 @@
           <w14:ligatures w14:val="standardContextual"/>
         </w:rPr>
       </w:pPr>
-      <w:hyperlink w:anchor="_Toc243245772" w:history="1">
+      <w:hyperlink w:anchor="_Toc243247295" w:history="1">
         <w:r>
           <w:rPr>
             <w:rStyle w:val="aff9"/>
@@ -3319,7 +3319,7 @@
             <w:noProof/>
             <w:webHidden/>
           </w:rPr>
-          <w:instrText>PAGEREF _Toc243245772 \h</w:instrText>
+          <w:instrText>PAGEREF _Toc243247295 \h</w:instrText>
         </w:r>
         <w:r>
           <w:rPr>
@@ -3378,7 +3378,7 @@
           <w14:ligatures w14:val="standardContextual"/>
         </w:rPr>
       </w:pPr>
-      <w:hyperlink w:anchor="_Toc243245773" w:history="1">
+      <w:hyperlink w:anchor="_Toc243247296" w:history="1">
         <w:r>
           <w:rPr>
             <w:rStyle w:val="aff9"/>
@@ -3416,7 +3416,7 @@
             <w:noProof/>
             <w:webHidden/>
           </w:rPr>
-          <w:instrText>PAGEREF _Toc243245773 \h</w:instrText>
+          <w:instrText>PAGEREF _Toc243247296 \h</w:instrText>
         </w:r>
         <w:r>
           <w:rPr>
@@ -3475,7 +3475,7 @@
           <w14:ligatures w14:val="standardContextual"/>
         </w:rPr>
       </w:pPr>
-      <w:hyperlink w:anchor="_Toc243245774" w:history="1">
+      <w:hyperlink w:anchor="_Toc243247297" w:history="1">
         <w:r>
           <w:rPr>
             <w:rStyle w:val="aff9"/>
@@ -3513,7 +3513,7 @@
             <w:noProof/>
             <w:webHidden/>
           </w:rPr>
-          <w:instrText>PAGEREF _Toc243245774 \h</w:instrText>
+          <w:instrText>PAGEREF _Toc243247297 \h</w:instrText>
         </w:r>
         <w:r>
           <w:rPr>
@@ -3572,7 +3572,7 @@
           <w14:ligatures w14:val="standardContextual"/>
         </w:rPr>
       </w:pPr>
-      <w:hyperlink w:anchor="_Toc243245775" w:history="1">
+      <w:hyperlink w:anchor="_Toc243247298" w:history="1">
         <w:r>
           <w:rPr>
             <w:rStyle w:val="aff9"/>
@@ -3610,7 +3610,7 @@
             <w:noProof/>
             <w:webHidden/>
           </w:rPr>
-          <w:instrText>PAGEREF _Toc243245775 \h</w:instrText>
+          <w:instrText>PAGEREF _Toc243247298 \h</w:instrText>
         </w:r>
         <w:r>
           <w:rPr>
@@ -3669,7 +3669,7 @@
           <w14:ligatures w14:val="standardContextual"/>
         </w:rPr>
       </w:pPr>
-      <w:hyperlink w:anchor="_Toc243245776" w:history="1">
+      <w:hyperlink w:anchor="_Toc243247299" w:history="1">
         <w:r>
           <w:rPr>
             <w:rStyle w:val="aff9"/>
@@ -3707,7 +3707,7 @@
             <w:noProof/>
             <w:webHidden/>
           </w:rPr>
-          <w:instrText>PAGEREF _Toc243245776 \h</w:instrText>
+          <w:instrText>PAGEREF _Toc243247299 \h</w:instrText>
         </w:r>
         <w:r>
           <w:rPr>
@@ -3766,7 +3766,7 @@
           <w14:ligatures w14:val="standardContextual"/>
         </w:rPr>
       </w:pPr>
-      <w:hyperlink w:anchor="_Toc243245777" w:history="1">
+      <w:hyperlink w:anchor="_Toc243247300" w:history="1">
         <w:r>
           <w:rPr>
             <w:rStyle w:val="aff9"/>
@@ -3804,7 +3804,7 @@
             <w:noProof/>
             <w:webHidden/>
           </w:rPr>
-          <w:instrText>PAGEREF _Toc243245777 \h</w:instrText>
+          <w:instrText>PAGEREF _Toc243247300 \h</w:instrText>
         </w:r>
         <w:r>
           <w:rPr>
@@ -3863,7 +3863,7 @@
           <w14:ligatures w14:val="standardContextual"/>
         </w:rPr>
       </w:pPr>
-      <w:hyperlink w:anchor="_Toc243245778" w:history="1">
+      <w:hyperlink w:anchor="_Toc243247301" w:history="1">
         <w:r>
           <w:rPr>
             <w:rStyle w:val="aff9"/>
@@ -3901,7 +3901,7 @@
             <w:noProof/>
             <w:webHidden/>
           </w:rPr>
-          <w:instrText>PAGEREF _Toc243245778 \h</w:instrText>
+          <w:instrText>PAGEREF _Toc243247301 \h</w:instrText>
         </w:r>
         <w:r>
           <w:rPr>
@@ -3960,7 +3960,7 @@
           <w14:ligatures w14:val="standardContextual"/>
         </w:rPr>
       </w:pPr>
-      <w:hyperlink w:anchor="_Toc243245779" w:history="1">
+      <w:hyperlink w:anchor="_Toc243247302" w:history="1">
         <w:r>
           <w:rPr>
             <w:rStyle w:val="aff9"/>
@@ -3998,7 +3998,7 @@
             <w:noProof/>
             <w:webHidden/>
           </w:rPr>
-          <w:instrText>PAGEREF _Toc243245779 \h</w:instrText>
+          <w:instrText>PAGEREF _Toc243247302 \h</w:instrText>
         </w:r>
         <w:r>
           <w:rPr>
@@ -4057,7 +4057,7 @@
           <w14:ligatures w14:val="standardContextual"/>
         </w:rPr>
       </w:pPr>
-      <w:hyperlink w:anchor="_Toc243245780" w:history="1">
+      <w:hyperlink w:anchor="_Toc243247303" w:history="1">
         <w:r>
           <w:rPr>
             <w:rStyle w:val="aff9"/>
@@ -4095,7 +4095,7 @@
             <w:noProof/>
             <w:webHidden/>
           </w:rPr>
-          <w:instrText>PAGEREF _Toc243245780 \h</w:instrText>
+          <w:instrText>PAGEREF _Toc243247303 \h</w:instrText>
         </w:r>
         <w:r>
           <w:rPr>
@@ -4154,7 +4154,7 @@
           <w14:ligatures w14:val="standardContextual"/>
         </w:rPr>
       </w:pPr>
-      <w:hyperlink w:anchor="_Toc243245781" w:history="1">
+      <w:hyperlink w:anchor="_Toc243247304" w:history="1">
         <w:r>
           <w:rPr>
             <w:rStyle w:val="aff9"/>
@@ -4192,7 +4192,7 @@
             <w:noProof/>
             <w:webHidden/>
           </w:rPr>
-          <w:instrText>PAGEREF _Toc243245781 \h</w:instrText>
+          <w:instrText>PAGEREF _Toc243247304 \h</w:instrText>
         </w:r>
         <w:r>
           <w:rPr>
@@ -4251,7 +4251,7 @@
           <w14:ligatures w14:val="standardContextual"/>
         </w:rPr>
       </w:pPr>
-      <w:hyperlink w:anchor="_Toc243245782" w:history="1">
+      <w:hyperlink w:anchor="_Toc243247305" w:history="1">
         <w:r>
           <w:rPr>
             <w:rStyle w:val="aff9"/>
@@ -4289,7 +4289,7 @@
             <w:noProof/>
             <w:webHidden/>
           </w:rPr>
-          <w:instrText>PAGEREF _Toc243245782 \h</w:instrText>
+          <w:instrText>PAGEREF _Toc243247305 \h</w:instrText>
         </w:r>
         <w:r>
           <w:rPr>
@@ -4348,7 +4348,7 @@
           <w14:ligatures w14:val="standardContextual"/>
         </w:rPr>
       </w:pPr>
-      <w:hyperlink w:anchor="_Toc243245783" w:history="1">
+      <w:hyperlink w:anchor="_Toc243247306" w:history="1">
         <w:r>
           <w:rPr>
             <w:rStyle w:val="aff9"/>
@@ -4386,7 +4386,7 @@
             <w:noProof/>
             <w:webHidden/>
           </w:rPr>
-          <w:instrText>PAGEREF _Toc243245783 \h</w:instrText>
+          <w:instrText>PAGEREF _Toc243247306 \h</w:instrText>
         </w:r>
         <w:r>
           <w:rPr>
@@ -4445,7 +4445,7 @@
           <w14:ligatures w14:val="standardContextual"/>
         </w:rPr>
       </w:pPr>
-      <w:hyperlink w:anchor="_Toc243245784" w:history="1">
+      <w:hyperlink w:anchor="_Toc243247307" w:history="1">
         <w:r>
           <w:rPr>
             <w:rStyle w:val="aff9"/>
@@ -4483,7 +4483,7 @@
             <w:noProof/>
             <w:webHidden/>
           </w:rPr>
-          <w:instrText>PAGEREF _Toc243245784 \h</w:instrText>
+          <w:instrText>PAGEREF _Toc243247307 \h</w:instrText>
         </w:r>
         <w:r>
           <w:rPr>
@@ -4542,7 +4542,7 @@
           <w14:ligatures w14:val="standardContextual"/>
         </w:rPr>
       </w:pPr>
-      <w:hyperlink w:anchor="_Toc243245785" w:history="1">
+      <w:hyperlink w:anchor="_Toc243247308" w:history="1">
         <w:r>
           <w:rPr>
             <w:rStyle w:val="aff9"/>
@@ -4580,7 +4580,7 @@
             <w:noProof/>
             <w:webHidden/>
           </w:rPr>
-          <w:instrText>PAGEREF _Toc243245785 \h</w:instrText>
+          <w:instrText>PAGEREF _Toc243247308 \h</w:instrText>
         </w:r>
         <w:r>
           <w:rPr>
@@ -4639,7 +4639,7 @@
           <w14:ligatures w14:val="standardContextual"/>
         </w:rPr>
       </w:pPr>
-      <w:hyperlink w:anchor="_Toc243245786" w:history="1">
+      <w:hyperlink w:anchor="_Toc243247309" w:history="1">
         <w:r>
           <w:rPr>
             <w:rStyle w:val="aff9"/>
@@ -4677,7 +4677,7 @@
             <w:noProof/>
             <w:webHidden/>
           </w:rPr>
-          <w:instrText>PAGEREF _Toc243245786 \h</w:instrText>
+          <w:instrText>PAGEREF _Toc243247309 \h</w:instrText>
         </w:r>
         <w:r>
           <w:rPr>
@@ -4736,7 +4736,7 @@
           <w14:ligatures w14:val="standardContextual"/>
         </w:rPr>
       </w:pPr>
-      <w:hyperlink w:anchor="_Toc243245787" w:history="1">
+      <w:hyperlink w:anchor="_Toc243247310" w:history="1">
         <w:r>
           <w:rPr>
             <w:rStyle w:val="aff9"/>
@@ -4774,7 +4774,7 @@
             <w:noProof/>
             <w:webHidden/>
           </w:rPr>
-          <w:instrText>PAGEREF _Toc243245787 \h</w:instrText>
+          <w:instrText>PAGEREF _Toc243247310 \h</w:instrText>
         </w:r>
         <w:r>
           <w:rPr>
@@ -4833,7 +4833,7 @@
           <w14:ligatures w14:val="standardContextual"/>
         </w:rPr>
       </w:pPr>
-      <w:hyperlink w:anchor="_Toc243245788" w:history="1">
+      <w:hyperlink w:anchor="_Toc243247311" w:history="1">
         <w:r>
           <w:rPr>
             <w:rStyle w:val="aff9"/>
@@ -4871,7 +4871,7 @@
             <w:noProof/>
             <w:webHidden/>
           </w:rPr>
-          <w:instrText>PAGEREF _Toc243245788 \h</w:instrText>
+          <w:instrText>PAGEREF _Toc243247311 \h</w:instrText>
         </w:r>
         <w:r>
           <w:rPr>
@@ -4930,7 +4930,7 @@
           <w14:ligatures w14:val="standardContextual"/>
         </w:rPr>
       </w:pPr>
-      <w:hyperlink w:anchor="_Toc243245789" w:history="1">
+      <w:hyperlink w:anchor="_Toc243247312" w:history="1">
         <w:r>
           <w:rPr>
             <w:rStyle w:val="aff9"/>
@@ -4968,7 +4968,7 @@
             <w:noProof/>
             <w:webHidden/>
           </w:rPr>
-          <w:instrText>PAGEREF _Toc243245789 \h</w:instrText>
+          <w:instrText>PAGEREF _Toc243247312 \h</w:instrText>
         </w:r>
         <w:r>
           <w:rPr>
@@ -5027,7 +5027,7 @@
           <w14:ligatures w14:val="standardContextual"/>
         </w:rPr>
       </w:pPr>
-      <w:hyperlink w:anchor="_Toc243245790" w:history="1">
+      <w:hyperlink w:anchor="_Toc243247313" w:history="1">
         <w:r>
           <w:rPr>
             <w:rStyle w:val="aff9"/>
@@ -5065,7 +5065,7 @@
             <w:noProof/>
             <w:webHidden/>
           </w:rPr>
-          <w:instrText>PAGEREF _Toc243245790 \h</w:instrText>
+          <w:instrText>PAGEREF _Toc243247313 \h</w:instrText>
         </w:r>
         <w:r>
           <w:rPr>
@@ -5124,7 +5124,7 @@
           <w14:ligatures w14:val="standardContextual"/>
         </w:rPr>
       </w:pPr>
-      <w:hyperlink w:anchor="_Toc243245791" w:history="1">
+      <w:hyperlink w:anchor="_Toc243247314" w:history="1">
         <w:r>
           <w:rPr>
             <w:rStyle w:val="aff9"/>
@@ -5162,7 +5162,7 @@
             <w:noProof/>
             <w:webHidden/>
           </w:rPr>
-          <w:instrText>PAGEREF _Toc243245791 \h</w:instrText>
+          <w:instrText>PAGEREF _Toc243247314 \h</w:instrText>
         </w:r>
         <w:r>
           <w:rPr>
@@ -5221,7 +5221,7 @@
           <w14:ligatures w14:val="standardContextual"/>
         </w:rPr>
       </w:pPr>
-      <w:hyperlink w:anchor="_Toc243245792" w:history="1">
+      <w:hyperlink w:anchor="_Toc243247315" w:history="1">
         <w:r>
           <w:rPr>
             <w:rStyle w:val="aff9"/>
@@ -5259,7 +5259,7 @@
             <w:noProof/>
             <w:webHidden/>
           </w:rPr>
-          <w:instrText>PAGEREF _Toc243245792 \h</w:instrText>
+          <w:instrText>PAGEREF _Toc243247315 \h</w:instrText>
         </w:r>
         <w:r>
           <w:rPr>
@@ -5318,7 +5318,7 @@
           <w14:ligatures w14:val="standardContextual"/>
         </w:rPr>
       </w:pPr>
-      <w:hyperlink w:anchor="_Toc243245793" w:history="1">
+      <w:hyperlink w:anchor="_Toc243247316" w:history="1">
         <w:r>
           <w:rPr>
             <w:rStyle w:val="aff9"/>
@@ -5356,7 +5356,7 @@
             <w:noProof/>
             <w:webHidden/>
           </w:rPr>
-          <w:instrText>PAGEREF _Toc243245793 \h</w:instrText>
+          <w:instrText>PAGEREF _Toc243247316 \h</w:instrText>
         </w:r>
         <w:r>
           <w:rPr>
@@ -5415,7 +5415,7 @@
           <w14:ligatures w14:val="standardContextual"/>
         </w:rPr>
       </w:pPr>
-      <w:hyperlink w:anchor="_Toc243245794" w:history="1">
+      <w:hyperlink w:anchor="_Toc243247317" w:history="1">
         <w:r>
           <w:rPr>
             <w:rStyle w:val="aff9"/>
@@ -5453,7 +5453,7 @@
             <w:noProof/>
             <w:webHidden/>
           </w:rPr>
-          <w:instrText>PAGEREF _Toc243245794 \h</w:instrText>
+          <w:instrText>PAGEREF _Toc243247317 \h</w:instrText>
         </w:r>
         <w:r>
           <w:rPr>
@@ -5512,7 +5512,7 @@
           <w14:ligatures w14:val="standardContextual"/>
         </w:rPr>
       </w:pPr>
-      <w:hyperlink w:anchor="_Toc243245795" w:history="1">
+      <w:hyperlink w:anchor="_Toc243247318" w:history="1">
         <w:r>
           <w:rPr>
             <w:rStyle w:val="aff9"/>
@@ -5550,7 +5550,7 @@
             <w:noProof/>
             <w:webHidden/>
           </w:rPr>
-          <w:instrText>PAGEREF _Toc243245795 \h</w:instrText>
+          <w:instrText>PAGEREF _Toc243247318 \h</w:instrText>
         </w:r>
         <w:r>
           <w:rPr>
@@ -5609,7 +5609,7 @@
           <w14:ligatures w14:val="standardContextual"/>
         </w:rPr>
       </w:pPr>
-      <w:hyperlink w:anchor="_Toc243245796" w:history="1">
+      <w:hyperlink w:anchor="_Toc243247319" w:history="1">
         <w:r>
           <w:rPr>
             <w:rStyle w:val="aff9"/>
@@ -5647,7 +5647,7 @@
             <w:noProof/>
             <w:webHidden/>
           </w:rPr>
-          <w:instrText>PAGEREF _Toc243245796 \h</w:instrText>
+          <w:instrText>PAGEREF _Toc243247319 \h</w:instrText>
         </w:r>
         <w:r>
           <w:rPr>
@@ -5706,7 +5706,7 @@
           <w14:ligatures w14:val="standardContextual"/>
         </w:rPr>
       </w:pPr>
-      <w:hyperlink w:anchor="_Toc243245797" w:history="1">
+      <w:hyperlink w:anchor="_Toc243247320" w:history="1">
         <w:r>
           <w:rPr>
             <w:rStyle w:val="aff9"/>
@@ -5744,7 +5744,7 @@
             <w:noProof/>
             <w:webHidden/>
           </w:rPr>
-          <w:instrText>PAGEREF _Toc243245797 \h</w:instrText>
+          <w:instrText>PAGEREF _Toc243247320 \h</w:instrText>
         </w:r>
         <w:r>
           <w:rPr>
@@ -5803,7 +5803,7 @@
           <w14:ligatures w14:val="standardContextual"/>
         </w:rPr>
       </w:pPr>
-      <w:hyperlink w:anchor="_Toc243245798" w:history="1">
+      <w:hyperlink w:anchor="_Toc243247321" w:history="1">
         <w:r>
           <w:rPr>
             <w:rStyle w:val="aff9"/>
@@ -5841,7 +5841,7 @@
             <w:noProof/>
             <w:webHidden/>
           </w:rPr>
-          <w:instrText>PAGEREF _Toc243245798 \h</w:instrText>
+          <w:instrText>PAGEREF _Toc243247321 \h</w:instrText>
         </w:r>
         <w:r>
           <w:rPr>
@@ -5900,7 +5900,7 @@
           <w14:ligatures w14:val="standardContextual"/>
         </w:rPr>
       </w:pPr>
-      <w:hyperlink w:anchor="_Toc243245799" w:history="1">
+      <w:hyperlink w:anchor="_Toc243247322" w:history="1">
         <w:r>
           <w:rPr>
             <w:rStyle w:val="aff9"/>
@@ -5938,7 +5938,7 @@
             <w:noProof/>
             <w:webHidden/>
           </w:rPr>
-          <w:instrText>PAGEREF _Toc243245799 \h</w:instrText>
+          <w:instrText>PAGEREF _Toc243247322 \h</w:instrText>
         </w:r>
         <w:r>
           <w:rPr>
@@ -5997,7 +5997,7 @@
           <w14:ligatures w14:val="standardContextual"/>
         </w:rPr>
       </w:pPr>
-      <w:hyperlink w:anchor="_Toc243245800" w:history="1">
+      <w:hyperlink w:anchor="_Toc243247323" w:history="1">
         <w:r>
           <w:rPr>
             <w:rStyle w:val="aff9"/>
@@ -6035,7 +6035,7 @@
             <w:noProof/>
             <w:webHidden/>
           </w:rPr>
-          <w:instrText>PAGEREF _Toc243245800 \h</w:instrText>
+          <w:instrText>PAGEREF _Toc243247323 \h</w:instrText>
         </w:r>
         <w:r>
           <w:rPr>
@@ -6094,7 +6094,7 @@
           <w14:ligatures w14:val="standardContextual"/>
         </w:rPr>
       </w:pPr>
-      <w:hyperlink w:anchor="_Toc243245801" w:history="1">
+      <w:hyperlink w:anchor="_Toc243247324" w:history="1">
         <w:r>
           <w:rPr>
             <w:rStyle w:val="aff9"/>
@@ -6132,7 +6132,7 @@
             <w:noProof/>
             <w:webHidden/>
           </w:rPr>
-          <w:instrText>PAGEREF _Toc243245801 \h</w:instrText>
+          <w:instrText>PAGEREF _Toc243247324 \h</w:instrText>
         </w:r>
         <w:r>
           <w:rPr>
@@ -6191,7 +6191,7 @@
           <w14:ligatures w14:val="standardContextual"/>
         </w:rPr>
       </w:pPr>
-      <w:hyperlink w:anchor="_Toc243245802" w:history="1">
+      <w:hyperlink w:anchor="_Toc243247325" w:history="1">
         <w:r>
           <w:rPr>
             <w:rStyle w:val="aff9"/>
@@ -6229,7 +6229,7 @@
             <w:noProof/>
             <w:webHidden/>
           </w:rPr>
-          <w:instrText>PAGEREF _Toc243245802 \h</w:instrText>
+          <w:instrText>PAGEREF _Toc243247325 \h</w:instrText>
         </w:r>
         <w:r>
           <w:rPr>
@@ -6288,7 +6288,7 @@
           <w14:ligatures w14:val="standardContextual"/>
         </w:rPr>
       </w:pPr>
-      <w:hyperlink w:anchor="_Toc243245803" w:history="1">
+      <w:hyperlink w:anchor="_Toc243247326" w:history="1">
         <w:r>
           <w:rPr>
             <w:rStyle w:val="aff9"/>
@@ -6326,7 +6326,7 @@
             <w:noProof/>
             <w:webHidden/>
           </w:rPr>
-          <w:instrText>PAGEREF _Toc243245803 \h</w:instrText>
+          <w:instrText>PAGEREF _Toc243247326 \h</w:instrText>
         </w:r>
         <w:r>
           <w:rPr>
@@ -6385,7 +6385,7 @@
           <w14:ligatures w14:val="standardContextual"/>
         </w:rPr>
       </w:pPr>
-      <w:hyperlink w:anchor="_Toc243245804" w:history="1">
+      <w:hyperlink w:anchor="_Toc243247327" w:history="1">
         <w:r>
           <w:rPr>
             <w:rStyle w:val="aff9"/>
@@ -6423,7 +6423,7 @@
             <w:noProof/>
             <w:webHidden/>
           </w:rPr>
-          <w:instrText>PAGEREF _Toc243245804 \h</w:instrText>
+          <w:instrText>PAGEREF _Toc243247327 \h</w:instrText>
         </w:r>
         <w:r>
           <w:rPr>
@@ -6482,7 +6482,7 @@
           <w14:ligatures w14:val="standardContextual"/>
         </w:rPr>
       </w:pPr>
-      <w:hyperlink w:anchor="_Toc243245805" w:history="1">
+      <w:hyperlink w:anchor="_Toc243247328" w:history="1">
         <w:r>
           <w:rPr>
             <w:rStyle w:val="aff9"/>
@@ -6520,7 +6520,7 @@
             <w:noProof/>
             <w:webHidden/>
           </w:rPr>
-          <w:instrText>PAGEREF _Toc243245805 \h</w:instrText>
+          <w:instrText>PAGEREF _Toc243247328 \h</w:instrText>
         </w:r>
         <w:r>
           <w:rPr>
@@ -6579,7 +6579,7 @@
           <w14:ligatures w14:val="standardContextual"/>
         </w:rPr>
       </w:pPr>
-      <w:hyperlink w:anchor="_Toc243245806" w:history="1">
+      <w:hyperlink w:anchor="_Toc243247329" w:history="1">
         <w:r>
           <w:rPr>
             <w:rStyle w:val="aff9"/>
@@ -6617,7 +6617,7 @@
             <w:noProof/>
             <w:webHidden/>
           </w:rPr>
-          <w:instrText>PAGEREF _Toc243245806 \h</w:instrText>
+          <w:instrText>PAGEREF _Toc243247329 \h</w:instrText>
         </w:r>
         <w:r>
           <w:rPr>
@@ -6676,7 +6676,7 @@
           <w14:ligatures w14:val="standardContextual"/>
         </w:rPr>
       </w:pPr>
-      <w:hyperlink w:anchor="_Toc243245807" w:history="1">
+      <w:hyperlink w:anchor="_Toc243247330" w:history="1">
         <w:r>
           <w:rPr>
             <w:rStyle w:val="aff9"/>
@@ -6714,7 +6714,7 @@
             <w:noProof/>
             <w:webHidden/>
           </w:rPr>
-          <w:instrText>PAGEREF _Toc243245807 \h</w:instrText>
+          <w:instrText>PAGEREF _Toc243247330 \h</w:instrText>
         </w:r>
         <w:r>
           <w:rPr>
@@ -6773,7 +6773,7 @@
           <w14:ligatures w14:val="standardContextual"/>
         </w:rPr>
       </w:pPr>
-      <w:hyperlink w:anchor="_Toc243245808" w:history="1">
+      <w:hyperlink w:anchor="_Toc243247331" w:history="1">
         <w:r>
           <w:rPr>
             <w:rStyle w:val="aff9"/>
@@ -6811,7 +6811,7 @@
             <w:noProof/>
             <w:webHidden/>
           </w:rPr>
-          <w:instrText>PAGEREF _Toc243245808 \h</w:instrText>
+          <w:instrText>PAGEREF _Toc243247331 \h</w:instrText>
         </w:r>
         <w:r>
           <w:rPr>
@@ -6870,7 +6870,7 @@
           <w14:ligatures w14:val="standardContextual"/>
         </w:rPr>
       </w:pPr>
-      <w:hyperlink w:anchor="_Toc243245809" w:history="1">
+      <w:hyperlink w:anchor="_Toc243247332" w:history="1">
         <w:r>
           <w:rPr>
             <w:rStyle w:val="aff9"/>
@@ -6908,7 +6908,7 @@
             <w:noProof/>
             <w:webHidden/>
           </w:rPr>
-          <w:instrText>PAGEREF _Toc243245809 \h</w:instrText>
+          <w:instrText>PAGEREF _Toc243247332 \h</w:instrText>
         </w:r>
         <w:r>
           <w:rPr>
@@ -6967,7 +6967,7 @@
           <w14:ligatures w14:val="standardContextual"/>
         </w:rPr>
       </w:pPr>
-      <w:hyperlink w:anchor="_Toc243245810" w:history="1">
+      <w:hyperlink w:anchor="_Toc243247333" w:history="1">
         <w:r>
           <w:rPr>
             <w:rStyle w:val="aff9"/>
@@ -7005,7 +7005,7 @@
             <w:noProof/>
             <w:webHidden/>
           </w:rPr>
-          <w:instrText>PAGEREF _Toc243245810 \h</w:instrText>
+          <w:instrText>PAGEREF _Toc243247333 \h</w:instrText>
         </w:r>
         <w:r>
           <w:rPr>
@@ -7064,7 +7064,7 @@
           <w14:ligatures w14:val="standardContextual"/>
         </w:rPr>
       </w:pPr>
-      <w:hyperlink w:anchor="_Toc243245811" w:history="1">
+      <w:hyperlink w:anchor="_Toc243247334" w:history="1">
         <w:r>
           <w:rPr>
             <w:rStyle w:val="aff9"/>
@@ -7102,7 +7102,7 @@
             <w:noProof/>
             <w:webHidden/>
           </w:rPr>
-          <w:instrText>PAGEREF _Toc243245811 \h</w:instrText>
+          <w:instrText>PAGEREF _Toc243247334 \h</w:instrText>
         </w:r>
         <w:r>
           <w:rPr>
@@ -7161,7 +7161,7 @@
           <w14:ligatures w14:val="standardContextual"/>
         </w:rPr>
       </w:pPr>
-      <w:hyperlink w:anchor="_Toc243245812" w:history="1">
+      <w:hyperlink w:anchor="_Toc243247335" w:history="1">
         <w:r>
           <w:rPr>
             <w:rStyle w:val="aff9"/>
@@ -7199,7 +7199,7 @@
             <w:noProof/>
             <w:webHidden/>
           </w:rPr>
-          <w:instrText>PAGEREF _Toc243245812 \h</w:instrText>
+          <w:instrText>PAGEREF _Toc243247335 \h</w:instrText>
         </w:r>
         <w:r>
           <w:rPr>
@@ -7258,7 +7258,7 @@
           <w14:ligatures w14:val="standardContextual"/>
         </w:rPr>
       </w:pPr>
-      <w:hyperlink w:anchor="_Toc243245813" w:history="1">
+      <w:hyperlink w:anchor="_Toc243247336" w:history="1">
         <w:r>
           <w:rPr>
             <w:rStyle w:val="aff9"/>
@@ -7296,7 +7296,7 @@
             <w:noProof/>
             <w:webHidden/>
           </w:rPr>
-          <w:instrText>PAGEREF _Toc243245813 \h</w:instrText>
+          <w:instrText>PAGEREF _Toc243247336 \h</w:instrText>
         </w:r>
         <w:r>
           <w:rPr>
@@ -7355,7 +7355,7 @@
           <w14:ligatures w14:val="standardContextual"/>
         </w:rPr>
       </w:pPr>
-      <w:hyperlink w:anchor="_Toc243245814" w:history="1">
+      <w:hyperlink w:anchor="_Toc243247337" w:history="1">
         <w:r>
           <w:rPr>
             <w:rStyle w:val="aff9"/>
@@ -7393,7 +7393,7 @@
             <w:noProof/>
             <w:webHidden/>
           </w:rPr>
-          <w:instrText>PAGEREF _Toc243245814 \h</w:instrText>
+          <w:instrText>PAGEREF _Toc243247337 \h</w:instrText>
         </w:r>
         <w:r>
           <w:rPr>
@@ -7452,7 +7452,7 @@
           <w14:ligatures w14:val="standardContextual"/>
         </w:rPr>
       </w:pPr>
-      <w:hyperlink w:anchor="_Toc243245815" w:history="1">
+      <w:hyperlink w:anchor="_Toc243247338" w:history="1">
         <w:r>
           <w:rPr>
             <w:rStyle w:val="aff9"/>
@@ -7490,7 +7490,7 @@
             <w:noProof/>
             <w:webHidden/>
           </w:rPr>
-          <w:instrText>PAGEREF _Toc243245815 \h</w:instrText>
+          <w:instrText>PAGEREF _Toc243247338 \h</w:instrText>
         </w:r>
         <w:r>
           <w:rPr>
@@ -7549,7 +7549,7 @@
           <w14:ligatures w14:val="standardContextual"/>
         </w:rPr>
       </w:pPr>
-      <w:hyperlink w:anchor="_Toc243245816" w:history="1">
+      <w:hyperlink w:anchor="_Toc243247339" w:history="1">
         <w:r>
           <w:rPr>
             <w:rStyle w:val="aff9"/>
@@ -7587,7 +7587,7 @@
             <w:noProof/>
             <w:webHidden/>
           </w:rPr>
-          <w:instrText>PAGEREF _Toc243245816 \h</w:instrText>
+          <w:instrText>PAGEREF _Toc243247339 \h</w:instrText>
         </w:r>
         <w:r>
           <w:rPr>
@@ -7646,7 +7646,7 @@
           <w14:ligatures w14:val="standardContextual"/>
         </w:rPr>
       </w:pPr>
-      <w:hyperlink w:anchor="_Toc243245817" w:history="1">
+      <w:hyperlink w:anchor="_Toc243247340" w:history="1">
         <w:r>
           <w:rPr>
             <w:rStyle w:val="aff9"/>
@@ -7684,7 +7684,7 @@
             <w:noProof/>
             <w:webHidden/>
           </w:rPr>
-          <w:instrText>PAGEREF _Toc243245817 \h</w:instrText>
+          <w:instrText>PAGEREF _Toc243247340 \h</w:instrText>
         </w:r>
         <w:r>
           <w:rPr>
@@ -7743,7 +7743,7 @@
           <w14:ligatures w14:val="standardContextual"/>
         </w:rPr>
       </w:pPr>
-      <w:hyperlink w:anchor="_Toc243245818" w:history="1">
+      <w:hyperlink w:anchor="_Toc243247341" w:history="1">
         <w:r>
           <w:rPr>
             <w:rStyle w:val="aff9"/>
@@ -7781,7 +7781,7 @@
             <w:noProof/>
             <w:webHidden/>
           </w:rPr>
-          <w:instrText>PAGEREF _Toc243245818 \h</w:instrText>
+          <w:instrText>PAGEREF _Toc243247341 \h</w:instrText>
         </w:r>
         <w:r>
           <w:rPr>
@@ -7840,7 +7840,7 @@
           <w14:ligatures w14:val="standardContextual"/>
         </w:rPr>
       </w:pPr>
-      <w:hyperlink w:anchor="_Toc243245819" w:history="1">
+      <w:hyperlink w:anchor="_Toc243247342" w:history="1">
         <w:r>
           <w:rPr>
             <w:rStyle w:val="aff9"/>
@@ -7878,7 +7878,7 @@
             <w:noProof/>
             <w:webHidden/>
           </w:rPr>
-          <w:instrText>PAGEREF _Toc243245819 \h</w:instrText>
+          <w:instrText>PAGEREF _Toc243247342 \h</w:instrText>
         </w:r>
         <w:r>
           <w:rPr>
@@ -7937,7 +7937,7 @@
           <w14:ligatures w14:val="standardContextual"/>
         </w:rPr>
       </w:pPr>
-      <w:hyperlink w:anchor="_Toc243245820" w:history="1">
+      <w:hyperlink w:anchor="_Toc243247343" w:history="1">
         <w:r>
           <w:rPr>
             <w:rStyle w:val="aff9"/>
@@ -7975,7 +7975,7 @@
             <w:noProof/>
             <w:webHidden/>
           </w:rPr>
-          <w:instrText>PAGEREF _Toc243245820 \h</w:instrText>
+          <w:instrText>PAGEREF _Toc243247343 \h</w:instrText>
         </w:r>
         <w:r>
           <w:rPr>
@@ -8034,7 +8034,7 @@
           <w14:ligatures w14:val="standardContextual"/>
         </w:rPr>
       </w:pPr>
-      <w:hyperlink w:anchor="_Toc243245821" w:history="1">
+      <w:hyperlink w:anchor="_Toc243247344" w:history="1">
         <w:r>
           <w:rPr>
             <w:rStyle w:val="aff9"/>
@@ -8072,7 +8072,7 @@
             <w:noProof/>
             <w:webHidden/>
           </w:rPr>
-          <w:instrText>PAGEREF _Toc243245821 \h</w:instrText>
+          <w:instrText>PAGEREF _Toc243247344 \h</w:instrText>
         </w:r>
         <w:r>
           <w:rPr>
@@ -8131,7 +8131,7 @@
           <w14:ligatures w14:val="standardContextual"/>
         </w:rPr>
       </w:pPr>
-      <w:hyperlink w:anchor="_Toc243245822" w:history="1">
+      <w:hyperlink w:anchor="_Toc243247345" w:history="1">
         <w:r>
           <w:rPr>
             <w:rStyle w:val="aff9"/>
@@ -8169,7 +8169,7 @@
             <w:noProof/>
             <w:webHidden/>
           </w:rPr>
-          <w:instrText>PAGEREF _Toc243245822 \h</w:instrText>
+          <w:instrText>PAGEREF _Toc243247345 \h</w:instrText>
         </w:r>
         <w:r>
           <w:rPr>
@@ -8200,7 +8200,7 @@
             <w:noProof/>
             <w:webHidden/>
           </w:rPr>
-          <w:t>37</w:t>
+          <w:t>38</w:t>
         </w:r>
         <w:r>
           <w:rPr>
@@ -8228,7 +8228,7 @@
           <w14:ligatures w14:val="standardContextual"/>
         </w:rPr>
       </w:pPr>
-      <w:hyperlink w:anchor="_Toc243245823" w:history="1">
+      <w:hyperlink w:anchor="_Toc243247346" w:history="1">
         <w:r>
           <w:rPr>
             <w:rStyle w:val="aff9"/>
@@ -8266,7 +8266,7 @@
             <w:noProof/>
             <w:webHidden/>
           </w:rPr>
-          <w:instrText>PAGEREF _Toc243245823 \h</w:instrText>
+          <w:instrText>PAGEREF _Toc243247346 \h</w:instrText>
         </w:r>
         <w:r>
           <w:rPr>
@@ -8297,7 +8297,7 @@
             <w:noProof/>
             <w:webHidden/>
           </w:rPr>
-          <w:t>37</w:t>
+          <w:t>38</w:t>
         </w:r>
         <w:r>
           <w:rPr>
@@ -8325,7 +8325,7 @@
           <w14:ligatures w14:val="standardContextual"/>
         </w:rPr>
       </w:pPr>
-      <w:hyperlink w:anchor="_Toc243245824" w:history="1">
+      <w:hyperlink w:anchor="_Toc243247347" w:history="1">
         <w:r>
           <w:rPr>
             <w:rStyle w:val="aff9"/>
@@ -8363,7 +8363,7 @@
             <w:noProof/>
             <w:webHidden/>
           </w:rPr>
-          <w:instrText>PAGEREF _Toc243245824 \h</w:instrText>
+          <w:instrText>PAGEREF _Toc243247347 \h</w:instrText>
         </w:r>
         <w:r>
           <w:rPr>
@@ -8422,7 +8422,7 @@
           <w14:ligatures w14:val="standardContextual"/>
         </w:rPr>
       </w:pPr>
-      <w:hyperlink w:anchor="_Toc243245825" w:history="1">
+      <w:hyperlink w:anchor="_Toc243247348" w:history="1">
         <w:r>
           <w:rPr>
             <w:rStyle w:val="aff9"/>
@@ -8460,7 +8460,7 @@
             <w:noProof/>
             <w:webHidden/>
           </w:rPr>
-          <w:instrText>PAGEREF _Toc243245825 \h</w:instrText>
+          <w:instrText>PAGEREF _Toc243247348 \h</w:instrText>
         </w:r>
         <w:r>
           <w:rPr>
@@ -8519,7 +8519,7 @@
           <w14:ligatures w14:val="standardContextual"/>
         </w:rPr>
       </w:pPr>
-      <w:hyperlink w:anchor="_Toc243245826" w:history="1">
+      <w:hyperlink w:anchor="_Toc243247349" w:history="1">
         <w:r>
           <w:rPr>
             <w:rStyle w:val="aff9"/>
@@ -8557,7 +8557,7 @@
             <w:noProof/>
             <w:webHidden/>
           </w:rPr>
-          <w:instrText>PAGEREF _Toc243245826 \h</w:instrText>
+          <w:instrText>PAGEREF _Toc243247349 \h</w:instrText>
         </w:r>
         <w:r>
           <w:rPr>
@@ -8616,7 +8616,7 @@
           <w14:ligatures w14:val="standardContextual"/>
         </w:rPr>
       </w:pPr>
-      <w:hyperlink w:anchor="_Toc243245827" w:history="1">
+      <w:hyperlink w:anchor="_Toc243247350" w:history="1">
         <w:r>
           <w:rPr>
             <w:rStyle w:val="aff9"/>
@@ -8654,7 +8654,7 @@
             <w:noProof/>
             <w:webHidden/>
           </w:rPr>
-          <w:instrText>PAGEREF _Toc243245827 \h</w:instrText>
+          <w:instrText>PAGEREF _Toc243247350 \h</w:instrText>
         </w:r>
         <w:r>
           <w:rPr>
@@ -8713,7 +8713,7 @@
         <w:pageBreakBefore/>
         <w:spacing w:before="400" w:after="200"/>
       </w:pPr>
-      <w:bookmarkStart w:id="0" w:name="_Toc243245760"/>
+      <w:bookmarkStart w:id="0" w:name="_Toc243247283"/>
       <w:r>
         <w:rPr>
           <w:rFonts w:ascii="黑体" w:eastAsia="黑体" w:hAnsi="黑体"/>
@@ -8746,7 +8746,7 @@
         <w:pStyle w:val="21"/>
         <w:spacing w:before="280" w:after="120"/>
       </w:pPr>
-      <w:bookmarkStart w:id="1" w:name="_Toc243245761"/>
+      <w:bookmarkStart w:id="1" w:name="_Toc243247284"/>
       <w:r>
         <w:rPr>
           <w:rFonts w:ascii="黑体" w:eastAsia="黑体" w:hAnsi="黑体"/>
@@ -8857,7 +8857,7 @@
         <w:pStyle w:val="21"/>
         <w:spacing w:before="280" w:after="120"/>
       </w:pPr>
-      <w:bookmarkStart w:id="2" w:name="_Toc243245762"/>
+      <w:bookmarkStart w:id="2" w:name="_Toc243247285"/>
       <w:r>
         <w:rPr>
           <w:rFonts w:ascii="黑体" w:eastAsia="黑体" w:hAnsi="黑体"/>
@@ -8985,7 +8985,7 @@
         <w:pStyle w:val="21"/>
         <w:spacing w:before="280" w:after="120"/>
       </w:pPr>
-      <w:bookmarkStart w:id="3" w:name="_Toc243245763"/>
+      <w:bookmarkStart w:id="3" w:name="_Toc243247286"/>
       <w:r>
         <w:rPr>
           <w:rFonts w:ascii="黑体" w:eastAsia="黑体" w:hAnsi="黑体"/>
@@ -9549,7 +9549,7 @@
         <w:pStyle w:val="21"/>
         <w:spacing w:before="280" w:after="120"/>
       </w:pPr>
-      <w:bookmarkStart w:id="4" w:name="_Toc243245764"/>
+      <w:bookmarkStart w:id="4" w:name="_Toc243247287"/>
       <w:r>
         <w:rPr>
           <w:rFonts w:ascii="黑体" w:eastAsia="黑体" w:hAnsi="黑体"/>
@@ -10189,7 +10189,7 @@
         <w:pStyle w:val="1"/>
         <w:spacing w:before="400" w:after="200"/>
       </w:pPr>
-      <w:bookmarkStart w:id="5" w:name="_Toc243245765"/>
+      <w:bookmarkStart w:id="5" w:name="_Toc243247288"/>
       <w:r>
         <w:rPr>
           <w:rFonts w:ascii="黑体" w:eastAsia="黑体" w:hAnsi="黑体"/>
@@ -10221,7 +10221,7 @@
         <w:pStyle w:val="21"/>
         <w:spacing w:before="280" w:after="120"/>
       </w:pPr>
-      <w:bookmarkStart w:id="6" w:name="_Toc243245766"/>
+      <w:bookmarkStart w:id="6" w:name="_Toc243247289"/>
       <w:r>
         <w:rPr>
           <w:rFonts w:ascii="黑体" w:eastAsia="黑体" w:hAnsi="黑体"/>
@@ -10341,7 +10341,7 @@
         <w:pStyle w:val="21"/>
         <w:spacing w:before="280" w:after="120"/>
       </w:pPr>
-      <w:bookmarkStart w:id="7" w:name="_Toc243245767"/>
+      <w:bookmarkStart w:id="7" w:name="_Toc243247290"/>
       <w:r>
         <w:rPr>
           <w:rFonts w:ascii="黑体" w:eastAsia="黑体" w:hAnsi="黑体"/>
@@ -10441,7 +10441,7 @@
         </w:rPr>
         <w:lastRenderedPageBreak/>
         <w:drawing>
-          <wp:inline distT="0" distB="0" distL="0" distR="0" wp14:anchorId="7294E00B" wp14:editId="5463E8D3">
+          <wp:inline distT="0" distB="0" distL="0" distR="0" wp14:anchorId="7753899E" wp14:editId="5AD36ACF">
             <wp:extent cx="9144000" cy="4525914"/>
             <wp:effectExtent l="0" t="0" r="0" b="0"/>
             <wp:docPr id="1" name="Picture 1"/>
@@ -10590,7 +10590,7 @@
         <w:pStyle w:val="21"/>
         <w:spacing w:before="280" w:after="120"/>
       </w:pPr>
-      <w:bookmarkStart w:id="8" w:name="_Toc243245768"/>
+      <w:bookmarkStart w:id="8" w:name="_Toc243247291"/>
       <w:r>
         <w:rPr>
           <w:rFonts w:ascii="黑体" w:eastAsia="黑体" w:hAnsi="黑体"/>
@@ -11605,7 +11605,7 @@
         <w:pStyle w:val="21"/>
         <w:spacing w:before="280" w:after="120"/>
       </w:pPr>
-      <w:bookmarkStart w:id="9" w:name="_Toc243245769"/>
+      <w:bookmarkStart w:id="9" w:name="_Toc243247292"/>
       <w:r>
         <w:rPr>
           <w:rFonts w:ascii="黑体" w:eastAsia="黑体" w:hAnsi="黑体"/>
@@ -12200,7 +12200,7 @@
         <w:pStyle w:val="1"/>
         <w:spacing w:before="400" w:after="200"/>
       </w:pPr>
-      <w:bookmarkStart w:id="10" w:name="_Toc243245770"/>
+      <w:bookmarkStart w:id="10" w:name="_Toc243247293"/>
       <w:r>
         <w:rPr>
           <w:rFonts w:ascii="黑体" w:eastAsia="黑体" w:hAnsi="黑体"/>
@@ -12232,7 +12232,7 @@
         <w:pStyle w:val="21"/>
         <w:spacing w:before="280" w:after="120"/>
       </w:pPr>
-      <w:bookmarkStart w:id="11" w:name="_Toc243245771"/>
+      <w:bookmarkStart w:id="11" w:name="_Toc243247294"/>
       <w:r>
         <w:rPr>
           <w:rFonts w:ascii="黑体" w:eastAsia="黑体" w:hAnsi="黑体"/>
@@ -12306,7 +12306,7 @@
         </w:rPr>
         <w:lastRenderedPageBreak/>
         <w:drawing>
-          <wp:inline distT="0" distB="0" distL="0" distR="0" wp14:anchorId="17E7D6F9" wp14:editId="342ECCA6">
+          <wp:inline distT="0" distB="0" distL="0" distR="0" wp14:anchorId="7BB55D23" wp14:editId="77C31507">
             <wp:extent cx="9144000" cy="2728887"/>
             <wp:effectExtent l="0" t="0" r="0" b="0"/>
             <wp:docPr id="2" name="Picture 2"/>
@@ -12469,7 +12469,7 @@
         <w:pStyle w:val="21"/>
         <w:spacing w:before="280" w:after="120"/>
       </w:pPr>
-      <w:bookmarkStart w:id="12" w:name="_Toc243245772"/>
+      <w:bookmarkStart w:id="12" w:name="_Toc243247295"/>
       <w:r>
         <w:rPr>
           <w:rFonts w:ascii="黑体" w:eastAsia="黑体" w:hAnsi="黑体"/>
@@ -13313,7 +13313,7 @@
         <w:pStyle w:val="21"/>
         <w:spacing w:before="280" w:after="120"/>
       </w:pPr>
-      <w:bookmarkStart w:id="13" w:name="_Toc243245773"/>
+      <w:bookmarkStart w:id="13" w:name="_Toc243247296"/>
       <w:r>
         <w:rPr>
           <w:rFonts w:ascii="黑体" w:eastAsia="黑体" w:hAnsi="黑体"/>
@@ -13844,7 +13844,7 @@
         <w:pStyle w:val="21"/>
         <w:spacing w:before="280" w:after="120"/>
       </w:pPr>
-      <w:bookmarkStart w:id="14" w:name="_Toc243245774"/>
+      <w:bookmarkStart w:id="14" w:name="_Toc243247297"/>
       <w:r>
         <w:rPr>
           <w:rFonts w:ascii="黑体" w:eastAsia="黑体" w:hAnsi="黑体"/>
@@ -13986,7 +13986,7 @@
         <w:pStyle w:val="21"/>
         <w:spacing w:before="280" w:after="120"/>
       </w:pPr>
-      <w:bookmarkStart w:id="15" w:name="_Toc243245775"/>
+      <w:bookmarkStart w:id="15" w:name="_Toc243247298"/>
       <w:r>
         <w:rPr>
           <w:rFonts w:ascii="黑体" w:eastAsia="黑体" w:hAnsi="黑体"/>
@@ -14142,7 +14142,7 @@
         <w:pStyle w:val="1"/>
         <w:spacing w:before="400" w:after="200"/>
       </w:pPr>
-      <w:bookmarkStart w:id="16" w:name="_Toc243245776"/>
+      <w:bookmarkStart w:id="16" w:name="_Toc243247299"/>
       <w:r>
         <w:rPr>
           <w:rFonts w:ascii="黑体" w:eastAsia="黑体" w:hAnsi="黑体"/>
@@ -14174,7 +14174,7 @@
         <w:pStyle w:val="21"/>
         <w:spacing w:before="280" w:after="120"/>
       </w:pPr>
-      <w:bookmarkStart w:id="17" w:name="_Toc243245777"/>
+      <w:bookmarkStart w:id="17" w:name="_Toc243247300"/>
       <w:r>
         <w:rPr>
           <w:rFonts w:ascii="黑体" w:eastAsia="黑体" w:hAnsi="黑体"/>
@@ -15364,7 +15364,7 @@
         <w:pStyle w:val="21"/>
         <w:spacing w:before="280" w:after="120"/>
       </w:pPr>
-      <w:bookmarkStart w:id="18" w:name="_Toc243245778"/>
+      <w:bookmarkStart w:id="18" w:name="_Toc243247301"/>
       <w:r>
         <w:rPr>
           <w:rFonts w:ascii="黑体" w:eastAsia="黑体" w:hAnsi="黑体"/>
@@ -15426,7 +15426,7 @@
         </w:rPr>
         <w:lastRenderedPageBreak/>
         <w:drawing>
-          <wp:inline distT="0" distB="0" distL="0" distR="0" wp14:anchorId="026DCD02" wp14:editId="495E6AE4">
+          <wp:inline distT="0" distB="0" distL="0" distR="0" wp14:anchorId="120A9D90" wp14:editId="3C4B6612">
             <wp:extent cx="9144000" cy="3604364"/>
             <wp:effectExtent l="0" t="0" r="0" b="0"/>
             <wp:docPr id="3" name="Picture 3"/>
@@ -15675,7 +15675,7 @@
         <w:pStyle w:val="21"/>
         <w:spacing w:before="280" w:after="120"/>
       </w:pPr>
-      <w:bookmarkStart w:id="19" w:name="_Toc243245779"/>
+      <w:bookmarkStart w:id="19" w:name="_Toc243247302"/>
       <w:r>
         <w:rPr>
           <w:rFonts w:ascii="黑体" w:eastAsia="黑体" w:hAnsi="黑体"/>
@@ -15839,7 +15839,7 @@
         <w:pStyle w:val="21"/>
         <w:spacing w:before="280" w:after="120"/>
       </w:pPr>
-      <w:bookmarkStart w:id="20" w:name="_Toc243245780"/>
+      <w:bookmarkStart w:id="20" w:name="_Toc243247303"/>
       <w:r>
         <w:rPr>
           <w:rFonts w:ascii="黑体" w:eastAsia="黑体" w:hAnsi="黑体"/>
@@ -15925,7 +15925,7 @@
         </w:rPr>
         <w:lastRenderedPageBreak/>
         <w:drawing>
-          <wp:inline distT="0" distB="0" distL="0" distR="0" wp14:anchorId="46378A44" wp14:editId="5BC03096">
+          <wp:inline distT="0" distB="0" distL="0" distR="0" wp14:anchorId="33978254" wp14:editId="566F966C">
             <wp:extent cx="9144000" cy="2573382"/>
             <wp:effectExtent l="0" t="0" r="0" b="0"/>
             <wp:docPr id="4" name="Picture 4"/>
@@ -16249,7 +16249,7 @@
         <w:pStyle w:val="21"/>
         <w:spacing w:before="280" w:after="120"/>
       </w:pPr>
-      <w:bookmarkStart w:id="21" w:name="_Toc243245781"/>
+      <w:bookmarkStart w:id="21" w:name="_Toc243247304"/>
       <w:r>
         <w:rPr>
           <w:rFonts w:ascii="黑体" w:eastAsia="黑体" w:hAnsi="黑体"/>
@@ -16413,7 +16413,7 @@
         <w:pStyle w:val="1"/>
         <w:spacing w:before="400" w:after="200"/>
       </w:pPr>
-      <w:bookmarkStart w:id="22" w:name="_Toc243245782"/>
+      <w:bookmarkStart w:id="22" w:name="_Toc243247305"/>
       <w:r>
         <w:rPr>
           <w:rFonts w:ascii="黑体" w:eastAsia="黑体" w:hAnsi="黑体"/>
@@ -16445,7 +16445,7 @@
         <w:pStyle w:val="21"/>
         <w:spacing w:before="280" w:after="120"/>
       </w:pPr>
-      <w:bookmarkStart w:id="23" w:name="_Toc243245783"/>
+      <w:bookmarkStart w:id="23" w:name="_Toc243247306"/>
       <w:r>
         <w:rPr>
           <w:rFonts w:ascii="黑体" w:eastAsia="黑体" w:hAnsi="黑体"/>
@@ -17432,7 +17432,7 @@
         <w:pStyle w:val="21"/>
         <w:spacing w:before="280" w:after="120"/>
       </w:pPr>
-      <w:bookmarkStart w:id="24" w:name="_Toc243245784"/>
+      <w:bookmarkStart w:id="24" w:name="_Toc243247307"/>
       <w:r>
         <w:rPr>
           <w:rFonts w:ascii="黑体" w:eastAsia="黑体" w:hAnsi="黑体"/>
@@ -17608,7 +17608,7 @@
         <w:pStyle w:val="21"/>
         <w:spacing w:before="280" w:after="120"/>
       </w:pPr>
-      <w:bookmarkStart w:id="25" w:name="_Toc243245785"/>
+      <w:bookmarkStart w:id="25" w:name="_Toc243247308"/>
       <w:r>
         <w:rPr>
           <w:rFonts w:ascii="黑体" w:eastAsia="黑体" w:hAnsi="黑体"/>
@@ -17754,7 +17754,7 @@
         <w:pStyle w:val="21"/>
         <w:spacing w:before="280" w:after="120"/>
       </w:pPr>
-      <w:bookmarkStart w:id="26" w:name="_Toc243245786"/>
+      <w:bookmarkStart w:id="26" w:name="_Toc243247309"/>
       <w:r>
         <w:rPr>
           <w:rFonts w:ascii="黑体" w:eastAsia="黑体" w:hAnsi="黑体"/>
@@ -18458,7 +18458,7 @@
         <w:pStyle w:val="1"/>
         <w:spacing w:before="400" w:after="200"/>
       </w:pPr>
-      <w:bookmarkStart w:id="27" w:name="_Toc243245787"/>
+      <w:bookmarkStart w:id="27" w:name="_Toc243247310"/>
       <w:r>
         <w:rPr>
           <w:rFonts w:ascii="黑体" w:eastAsia="黑体" w:hAnsi="黑体"/>
@@ -18491,7 +18491,7 @@
         <w:pStyle w:val="21"/>
         <w:spacing w:before="280" w:after="120"/>
       </w:pPr>
-      <w:bookmarkStart w:id="28" w:name="_Toc243245788"/>
+      <w:bookmarkStart w:id="28" w:name="_Toc243247311"/>
       <w:r>
         <w:rPr>
           <w:rFonts w:ascii="黑体" w:eastAsia="黑体" w:hAnsi="黑体"/>
@@ -19156,7 +19156,7 @@
         <w:pStyle w:val="21"/>
         <w:spacing w:before="280" w:after="120"/>
       </w:pPr>
-      <w:bookmarkStart w:id="29" w:name="_Toc243245789"/>
+      <w:bookmarkStart w:id="29" w:name="_Toc243247312"/>
       <w:r>
         <w:rPr>
           <w:rFonts w:ascii="黑体" w:eastAsia="黑体" w:hAnsi="黑体"/>
@@ -19242,7 +19242,7 @@
         </w:rPr>
         <w:lastRenderedPageBreak/>
         <w:drawing>
-          <wp:inline distT="0" distB="0" distL="0" distR="0" wp14:anchorId="7714DB2E" wp14:editId="76297B1A">
+          <wp:inline distT="0" distB="0" distL="0" distR="0" wp14:anchorId="11EA9922" wp14:editId="70017667">
             <wp:extent cx="9144000" cy="3604364"/>
             <wp:effectExtent l="0" t="0" r="0" b="0"/>
             <wp:docPr id="5" name="Picture 5"/>
@@ -19383,7 +19383,7 @@
         <w:pStyle w:val="21"/>
         <w:spacing w:before="280" w:after="120"/>
       </w:pPr>
-      <w:bookmarkStart w:id="30" w:name="_Toc243245790"/>
+      <w:bookmarkStart w:id="30" w:name="_Toc243247313"/>
       <w:r>
         <w:rPr>
           <w:rFonts w:ascii="黑体" w:eastAsia="黑体" w:hAnsi="黑体"/>
@@ -19571,7 +19571,7 @@
         <w:pStyle w:val="21"/>
         <w:spacing w:before="280" w:after="120"/>
       </w:pPr>
-      <w:bookmarkStart w:id="31" w:name="_Toc243245791"/>
+      <w:bookmarkStart w:id="31" w:name="_Toc243247314"/>
       <w:r>
         <w:rPr>
           <w:rFonts w:ascii="黑体" w:eastAsia="黑体" w:hAnsi="黑体"/>
@@ -20119,7 +20119,7 @@
         <w:pStyle w:val="21"/>
         <w:spacing w:before="280" w:after="120"/>
       </w:pPr>
-      <w:bookmarkStart w:id="32" w:name="_Toc243245792"/>
+      <w:bookmarkStart w:id="32" w:name="_Toc243247315"/>
       <w:r>
         <w:rPr>
           <w:rFonts w:ascii="黑体" w:eastAsia="黑体" w:hAnsi="黑体"/>
@@ -20193,7 +20193,7 @@
         </w:rPr>
         <w:lastRenderedPageBreak/>
         <w:drawing>
-          <wp:inline distT="0" distB="0" distL="0" distR="0" wp14:anchorId="30649D57" wp14:editId="1EF4E70D">
+          <wp:inline distT="0" distB="0" distL="0" distR="0" wp14:anchorId="03285172" wp14:editId="3CC937FD">
             <wp:extent cx="9144000" cy="4487962"/>
             <wp:effectExtent l="0" t="0" r="0" b="0"/>
             <wp:docPr id="6" name="Picture 6"/>
@@ -20306,7 +20306,7 @@
         <w:pStyle w:val="1"/>
         <w:spacing w:before="400" w:after="200"/>
       </w:pPr>
-      <w:bookmarkStart w:id="33" w:name="_Toc243245793"/>
+      <w:bookmarkStart w:id="33" w:name="_Toc243247316"/>
       <w:r>
         <w:rPr>
           <w:rFonts w:ascii="黑体" w:eastAsia="黑体" w:hAnsi="黑体"/>
@@ -20338,7 +20338,7 @@
         <w:pStyle w:val="21"/>
         <w:spacing w:before="280" w:after="120"/>
       </w:pPr>
-      <w:bookmarkStart w:id="34" w:name="_Toc243245794"/>
+      <w:bookmarkStart w:id="34" w:name="_Toc243247317"/>
       <w:r>
         <w:rPr>
           <w:rFonts w:ascii="黑体" w:eastAsia="黑体" w:hAnsi="黑体"/>
@@ -20400,7 +20400,7 @@
         </w:rPr>
         <w:lastRenderedPageBreak/>
         <w:drawing>
-          <wp:inline distT="0" distB="0" distL="0" distR="0" wp14:anchorId="3450AC66" wp14:editId="15F29442">
+          <wp:inline distT="0" distB="0" distL="0" distR="0" wp14:anchorId="0E75B9E2" wp14:editId="5568DCD4">
             <wp:extent cx="9144000" cy="2863342"/>
             <wp:effectExtent l="0" t="0" r="0" b="0"/>
             <wp:docPr id="7" name="Picture 7"/>
@@ -20575,7 +20575,7 @@
         <w:pStyle w:val="21"/>
         <w:spacing w:before="280" w:after="120"/>
       </w:pPr>
-      <w:bookmarkStart w:id="35" w:name="_Toc243245795"/>
+      <w:bookmarkStart w:id="35" w:name="_Toc243247318"/>
       <w:r>
         <w:rPr>
           <w:rFonts w:ascii="黑体" w:eastAsia="黑体" w:hAnsi="黑体"/>
@@ -20639,7 +20639,7 @@
         <w:pStyle w:val="21"/>
         <w:spacing w:before="280" w:after="120"/>
       </w:pPr>
-      <w:bookmarkStart w:id="36" w:name="_Toc243245796"/>
+      <w:bookmarkStart w:id="36" w:name="_Toc243247319"/>
       <w:r>
         <w:rPr>
           <w:rFonts w:ascii="黑体" w:eastAsia="黑体" w:hAnsi="黑体"/>
@@ -20839,7 +20839,7 @@
         <w:pStyle w:val="1"/>
         <w:spacing w:before="400" w:after="200"/>
       </w:pPr>
-      <w:bookmarkStart w:id="37" w:name="_Toc243245797"/>
+      <w:bookmarkStart w:id="37" w:name="_Toc243247320"/>
       <w:r>
         <w:rPr>
           <w:rFonts w:ascii="黑体" w:eastAsia="黑体" w:hAnsi="黑体"/>
@@ -20871,7 +20871,7 @@
         <w:pStyle w:val="21"/>
         <w:spacing w:before="280" w:after="120"/>
       </w:pPr>
-      <w:bookmarkStart w:id="38" w:name="_Toc243245798"/>
+      <w:bookmarkStart w:id="38" w:name="_Toc243247321"/>
       <w:r>
         <w:rPr>
           <w:rFonts w:ascii="黑体" w:eastAsia="黑体" w:hAnsi="黑体"/>
@@ -21672,7 +21672,7 @@
         <w:pStyle w:val="21"/>
         <w:spacing w:before="280" w:after="120"/>
       </w:pPr>
-      <w:bookmarkStart w:id="39" w:name="_Toc243245799"/>
+      <w:bookmarkStart w:id="39" w:name="_Toc243247322"/>
       <w:r>
         <w:rPr>
           <w:rFonts w:ascii="黑体" w:eastAsia="黑体" w:hAnsi="黑体"/>
@@ -21767,7 +21767,7 @@
         <w:pStyle w:val="21"/>
         <w:spacing w:before="280" w:after="120"/>
       </w:pPr>
-      <w:bookmarkStart w:id="40" w:name="_Toc243245800"/>
+      <w:bookmarkStart w:id="40" w:name="_Toc243247323"/>
       <w:r>
         <w:rPr>
           <w:rFonts w:ascii="黑体" w:eastAsia="黑体" w:hAnsi="黑体"/>
@@ -21931,7 +21931,7 @@
         <w:pStyle w:val="21"/>
         <w:spacing w:before="280" w:after="120"/>
       </w:pPr>
-      <w:bookmarkStart w:id="41" w:name="_Toc243245801"/>
+      <w:bookmarkStart w:id="41" w:name="_Toc243247324"/>
       <w:r>
         <w:rPr>
           <w:rFonts w:ascii="黑体" w:eastAsia="黑体" w:hAnsi="黑体"/>
@@ -22031,7 +22031,7 @@
         <w:pStyle w:val="21"/>
         <w:spacing w:before="280" w:after="120"/>
       </w:pPr>
-      <w:bookmarkStart w:id="42" w:name="_Toc243245802"/>
+      <w:bookmarkStart w:id="42" w:name="_Toc243247325"/>
       <w:r>
         <w:rPr>
           <w:rFonts w:ascii="黑体" w:eastAsia="黑体" w:hAnsi="黑体"/>
@@ -22131,7 +22131,7 @@
         <w:pStyle w:val="1"/>
         <w:spacing w:before="400" w:after="200"/>
       </w:pPr>
-      <w:bookmarkStart w:id="43" w:name="_Toc243245803"/>
+      <w:bookmarkStart w:id="43" w:name="_Toc243247326"/>
       <w:r>
         <w:rPr>
           <w:rFonts w:ascii="黑体" w:eastAsia="黑体" w:hAnsi="黑体"/>
@@ -22163,7 +22163,7 @@
         <w:pStyle w:val="21"/>
         <w:spacing w:before="280" w:after="120"/>
       </w:pPr>
-      <w:bookmarkStart w:id="44" w:name="_Toc243245804"/>
+      <w:bookmarkStart w:id="44" w:name="_Toc243247327"/>
       <w:r>
         <w:rPr>
           <w:rFonts w:ascii="黑体" w:eastAsia="黑体" w:hAnsi="黑体"/>
@@ -22297,7 +22297,7 @@
         </w:rPr>
         <w:lastRenderedPageBreak/>
         <w:drawing>
-          <wp:inline distT="0" distB="0" distL="0" distR="0" wp14:anchorId="162E5B3B" wp14:editId="0B6EA334">
+          <wp:inline distT="0" distB="0" distL="0" distR="0" wp14:anchorId="32ECA707" wp14:editId="3BD0949B">
             <wp:extent cx="4176000" cy="5283207"/>
             <wp:effectExtent l="0" t="0" r="0" b="0"/>
             <wp:docPr id="8" name="Picture 8"/>
@@ -22408,7 +22408,7 @@
         <w:pStyle w:val="21"/>
         <w:spacing w:before="280" w:after="120"/>
       </w:pPr>
-      <w:bookmarkStart w:id="45" w:name="_Toc243245805"/>
+      <w:bookmarkStart w:id="45" w:name="_Toc243247328"/>
       <w:r>
         <w:rPr>
           <w:rFonts w:ascii="黑体" w:eastAsia="黑体" w:hAnsi="黑体"/>
@@ -22590,7 +22590,7 @@
         </w:rPr>
         <w:lastRenderedPageBreak/>
         <w:drawing>
-          <wp:inline distT="0" distB="0" distL="0" distR="0" wp14:anchorId="2E77C148" wp14:editId="433EB442">
+          <wp:inline distT="0" distB="0" distL="0" distR="0" wp14:anchorId="4BE1C8B6" wp14:editId="2FDDD61E">
             <wp:extent cx="9144000" cy="3657600"/>
             <wp:effectExtent l="0" t="0" r="0" b="0"/>
             <wp:docPr id="9" name="Picture 9"/>
@@ -23444,7 +23444,7 @@
         <w:pStyle w:val="21"/>
         <w:spacing w:before="280" w:after="120"/>
       </w:pPr>
-      <w:bookmarkStart w:id="46" w:name="_Toc243245806"/>
+      <w:bookmarkStart w:id="46" w:name="_Toc243247329"/>
       <w:r>
         <w:rPr>
           <w:rFonts w:ascii="黑体" w:eastAsia="黑体" w:hAnsi="黑体"/>
@@ -24505,7 +24505,7 @@
         <w:pStyle w:val="21"/>
         <w:spacing w:before="280" w:after="120"/>
       </w:pPr>
-      <w:bookmarkStart w:id="47" w:name="_Toc243245807"/>
+      <w:bookmarkStart w:id="47" w:name="_Toc243247330"/>
       <w:r>
         <w:rPr>
           <w:rFonts w:ascii="黑体" w:eastAsia="黑体" w:hAnsi="黑体"/>
@@ -25526,7 +25526,7 @@
         <w:pStyle w:val="21"/>
         <w:spacing w:before="280" w:after="120"/>
       </w:pPr>
-      <w:bookmarkStart w:id="48" w:name="_Toc243245808"/>
+      <w:bookmarkStart w:id="48" w:name="_Toc243247331"/>
       <w:r>
         <w:rPr>
           <w:rFonts w:ascii="黑体" w:eastAsia="黑体" w:hAnsi="黑体"/>
@@ -25642,7 +25642,7 @@
         <w:pStyle w:val="1"/>
         <w:spacing w:before="400" w:after="200"/>
       </w:pPr>
-      <w:bookmarkStart w:id="49" w:name="_Toc243245809"/>
+      <w:bookmarkStart w:id="49" w:name="_Toc243247332"/>
       <w:r>
         <w:rPr>
           <w:rFonts w:ascii="黑体" w:eastAsia="黑体" w:hAnsi="黑体"/>
@@ -25690,7 +25690,7 @@
         <w:pStyle w:val="21"/>
         <w:spacing w:before="280" w:after="120"/>
       </w:pPr>
-      <w:bookmarkStart w:id="50" w:name="_Toc243245810"/>
+      <w:bookmarkStart w:id="50" w:name="_Toc243247333"/>
       <w:r>
         <w:rPr>
           <w:rFonts w:ascii="黑体" w:eastAsia="黑体" w:hAnsi="黑体"/>
@@ -25823,7 +25823,7 @@
           <w:noProof/>
         </w:rPr>
         <w:drawing>
-          <wp:inline distT="0" distB="0" distL="0" distR="0" wp14:anchorId="57961E4B" wp14:editId="351506AD">
+          <wp:inline distT="0" distB="0" distL="0" distR="0" wp14:anchorId="6C6C1B3B" wp14:editId="0A5D9A93">
             <wp:extent cx="5400000" cy="3375000"/>
             <wp:effectExtent l="0" t="0" r="0" b="0"/>
             <wp:docPr id="10" name="Picture 10"/>
@@ -25894,7 +25894,7 @@
         <w:pStyle w:val="21"/>
         <w:spacing w:before="280" w:after="120"/>
       </w:pPr>
-      <w:bookmarkStart w:id="51" w:name="_Toc243245811"/>
+      <w:bookmarkStart w:id="51" w:name="_Toc243247334"/>
       <w:r>
         <w:rPr>
           <w:rFonts w:ascii="黑体" w:eastAsia="黑体" w:hAnsi="黑体"/>
@@ -26016,7 +26016,7 @@
           <w:noProof/>
         </w:rPr>
         <w:drawing>
-          <wp:inline distT="0" distB="0" distL="0" distR="0" wp14:anchorId="02ADF61D" wp14:editId="66C77326">
+          <wp:inline distT="0" distB="0" distL="0" distR="0" wp14:anchorId="43FFC1DC" wp14:editId="45BCE133">
             <wp:extent cx="5400000" cy="3375000"/>
             <wp:effectExtent l="0" t="0" r="0" b="0"/>
             <wp:docPr id="11" name="Picture 11"/>
@@ -26087,7 +26087,7 @@
         <w:pStyle w:val="21"/>
         <w:spacing w:before="280" w:after="120"/>
       </w:pPr>
-      <w:bookmarkStart w:id="52" w:name="_Toc243245812"/>
+      <w:bookmarkStart w:id="52" w:name="_Toc243247335"/>
       <w:r>
         <w:rPr>
           <w:rFonts w:ascii="黑体" w:eastAsia="黑体" w:hAnsi="黑体"/>
@@ -26185,7 +26185,7 @@
         </w:rPr>
         <w:lastRenderedPageBreak/>
         <w:drawing>
-          <wp:inline distT="0" distB="0" distL="0" distR="0" wp14:anchorId="0C9976FD" wp14:editId="76768DE4">
+          <wp:inline distT="0" distB="0" distL="0" distR="0" wp14:anchorId="7A1837EB" wp14:editId="0E261CC6">
             <wp:extent cx="5400000" cy="3375000"/>
             <wp:effectExtent l="0" t="0" r="0" b="0"/>
             <wp:docPr id="12" name="Picture 12"/>
@@ -26256,7 +26256,7 @@
         <w:pStyle w:val="21"/>
         <w:spacing w:before="280" w:after="120"/>
       </w:pPr>
-      <w:bookmarkStart w:id="53" w:name="_Toc243245813"/>
+      <w:bookmarkStart w:id="53" w:name="_Toc243247336"/>
       <w:r>
         <w:rPr>
           <w:rFonts w:ascii="黑体" w:eastAsia="黑体" w:hAnsi="黑体"/>
@@ -27048,7 +27048,7 @@
         <w:pStyle w:val="1"/>
         <w:spacing w:before="400" w:after="200"/>
       </w:pPr>
-      <w:bookmarkStart w:id="54" w:name="_Toc243245814"/>
+      <w:bookmarkStart w:id="54" w:name="_Toc243247337"/>
       <w:r>
         <w:rPr>
           <w:rFonts w:ascii="黑体" w:eastAsia="黑体" w:hAnsi="黑体"/>
@@ -27080,7 +27080,7 @@
         <w:pStyle w:val="21"/>
         <w:spacing w:before="280" w:after="120"/>
       </w:pPr>
-      <w:bookmarkStart w:id="55" w:name="_Toc243245815"/>
+      <w:bookmarkStart w:id="55" w:name="_Toc243247338"/>
       <w:r>
         <w:rPr>
           <w:rFonts w:ascii="黑体" w:eastAsia="黑体" w:hAnsi="黑体"/>
@@ -27560,7 +27560,7 @@
         <w:pStyle w:val="21"/>
         <w:spacing w:before="280" w:after="120"/>
       </w:pPr>
-      <w:bookmarkStart w:id="56" w:name="_Toc243245816"/>
+      <w:bookmarkStart w:id="56" w:name="_Toc243247339"/>
       <w:r>
         <w:rPr>
           <w:rFonts w:ascii="黑体" w:eastAsia="黑体" w:hAnsi="黑体"/>
@@ -28122,7 +28122,7 @@
         <w:pStyle w:val="21"/>
         <w:spacing w:before="280" w:after="120"/>
       </w:pPr>
-      <w:bookmarkStart w:id="57" w:name="_Toc243245817"/>
+      <w:bookmarkStart w:id="57" w:name="_Toc243247340"/>
       <w:r>
         <w:rPr>
           <w:rFonts w:ascii="黑体" w:eastAsia="黑体" w:hAnsi="黑体"/>
@@ -28208,7 +28208,7 @@
           <w:color w:val="5A6274"/>
           <w:sz w:val="18"/>
         </w:rPr>
-        <w:t xml:space="preserve">　证据问答评测结果</w:t>
+        <w:t xml:space="preserve">　证据问答评测结果（改造前后对照）</w:t>
       </w:r>
     </w:p>
     <w:tbl>
@@ -28220,10 +28220,10 @@
         <w:tblLook w:val="04A0" w:firstRow="1" w:lastRow="0" w:firstColumn="1" w:lastColumn="0" w:noHBand="0" w:noVBand="1"/>
       </w:tblPr>
       <w:tblGrid>
-        <w:gridCol w:w="1928"/>
-        <w:gridCol w:w="2608"/>
-        <w:gridCol w:w="1928"/>
-        <w:gridCol w:w="2268"/>
+        <w:gridCol w:w="1474"/>
+        <w:gridCol w:w="2494"/>
+        <w:gridCol w:w="2948"/>
+        <w:gridCol w:w="1814"/>
       </w:tblGrid>
       <w:tr>
         <w:trPr>
@@ -28231,7 +28231,7 @@
         </w:trPr>
         <w:tc>
           <w:tcPr>
-            <w:tcW w:w="1928" w:type="dxa"/>
+            <w:tcW w:w="1474" w:type="dxa"/>
             <w:shd w:val="clear" w:color="auto" w:fill="E8F1F0"/>
           </w:tcPr>
           <w:p>
@@ -28254,7 +28254,7 @@
         </w:tc>
         <w:tc>
           <w:tcPr>
-            <w:tcW w:w="2608" w:type="dxa"/>
+            <w:tcW w:w="2494" w:type="dxa"/>
             <w:shd w:val="clear" w:color="auto" w:fill="E8F1F0"/>
           </w:tcPr>
           <w:p>
@@ -28271,13 +28271,13 @@
                 <w:color w:val="1A1F2B"/>
                 <w:sz w:val="18"/>
               </w:rPr>
-              <w:t>结果</w:t>
-            </w:r>
-          </w:p>
-        </w:tc>
-        <w:tc>
-          <w:tcPr>
-            <w:tcW w:w="1928" w:type="dxa"/>
+              <w:t>本地抽取批次</w:t>
+            </w:r>
+          </w:p>
+        </w:tc>
+        <w:tc>
+          <w:tcPr>
+            <w:tcW w:w="2948" w:type="dxa"/>
             <w:shd w:val="clear" w:color="auto" w:fill="E8F1F0"/>
           </w:tcPr>
           <w:p>
@@ -28294,13 +28294,13 @@
                 <w:color w:val="1A1F2B"/>
                 <w:sz w:val="18"/>
               </w:rPr>
-              <w:t>分母</w:t>
-            </w:r>
-          </w:p>
-        </w:tc>
-        <w:tc>
-          <w:tcPr>
-            <w:tcW w:w="2268" w:type="dxa"/>
+              <w:t>启用模型后</w:t>
+            </w:r>
+          </w:p>
+        </w:tc>
+        <w:tc>
+          <w:tcPr>
+            <w:tcW w:w="1814" w:type="dxa"/>
             <w:shd w:val="clear" w:color="auto" w:fill="E8F1F0"/>
           </w:tcPr>
           <w:p>
@@ -28328,7 +28328,7 @@
         </w:trPr>
         <w:tc>
           <w:tcPr>
-            <w:tcW w:w="1928" w:type="dxa"/>
+            <w:tcW w:w="1474" w:type="dxa"/>
           </w:tcPr>
           <w:p>
             <w:pPr>
@@ -28348,7 +28348,7 @@
         </w:tc>
         <w:tc>
           <w:tcPr>
-            <w:tcW w:w="2608" w:type="dxa"/>
+            <w:tcW w:w="2494" w:type="dxa"/>
           </w:tcPr>
           <w:p>
             <w:pPr>
@@ -28364,11 +28364,32 @@
               </w:rPr>
               <w:t>97.22%</w:t>
             </w:r>
-          </w:p>
-        </w:tc>
-        <w:tc>
-          <w:tcPr>
-            <w:tcW w:w="1928" w:type="dxa"/>
+            <w:r>
+              <w:rPr>
+                <w:color w:val="1A1F2B"/>
+                <w:sz w:val="18"/>
+              </w:rPr>
+              <w:t>（</w:t>
+            </w:r>
+            <w:r>
+              <w:rPr>
+                <w:color w:val="1A1F2B"/>
+                <w:sz w:val="18"/>
+              </w:rPr>
+              <w:t>35/36</w:t>
+            </w:r>
+            <w:r>
+              <w:rPr>
+                <w:color w:val="1A1F2B"/>
+                <w:sz w:val="18"/>
+              </w:rPr>
+              <w:t>）</w:t>
+            </w:r>
+          </w:p>
+        </w:tc>
+        <w:tc>
+          <w:tcPr>
+            <w:tcW w:w="2948" w:type="dxa"/>
           </w:tcPr>
           <w:p>
             <w:pPr>
@@ -28382,20 +28403,34 @@
                 <w:color w:val="1A1F2B"/>
                 <w:sz w:val="18"/>
               </w:rPr>
-              <w:t xml:space="preserve">36 </w:t>
-            </w:r>
-            <w:r>
-              <w:rPr>
-                <w:color w:val="1A1F2B"/>
-                <w:sz w:val="18"/>
-              </w:rPr>
-              <w:t>条预期文档</w:t>
-            </w:r>
-          </w:p>
-        </w:tc>
-        <w:tc>
-          <w:tcPr>
-            <w:tcW w:w="2268" w:type="dxa"/>
+              <w:t>97.22%</w:t>
+            </w:r>
+            <w:r>
+              <w:rPr>
+                <w:color w:val="1A1F2B"/>
+                <w:sz w:val="18"/>
+              </w:rPr>
+              <w:t>（</w:t>
+            </w:r>
+            <w:r>
+              <w:rPr>
+                <w:color w:val="1A1F2B"/>
+                <w:sz w:val="18"/>
+              </w:rPr>
+              <w:t>35/36</w:t>
+            </w:r>
+            <w:r>
+              <w:rPr>
+                <w:color w:val="1A1F2B"/>
+                <w:sz w:val="18"/>
+              </w:rPr>
+              <w:t>）</w:t>
+            </w:r>
+          </w:p>
+        </w:tc>
+        <w:tc>
+          <w:tcPr>
+            <w:tcW w:w="1814" w:type="dxa"/>
           </w:tcPr>
           <w:p>
             <w:pPr>
@@ -28409,14 +28444,7 @@
                 <w:color w:val="1A1F2B"/>
                 <w:sz w:val="18"/>
               </w:rPr>
-              <w:t xml:space="preserve">35 </w:t>
-            </w:r>
-            <w:r>
-              <w:rPr>
-                <w:color w:val="1A1F2B"/>
-                <w:sz w:val="18"/>
-              </w:rPr>
-              <w:t>条被正确引用</w:t>
+              <w:t>预期文档是否被引用</w:t>
             </w:r>
           </w:p>
         </w:tc>
@@ -28427,7 +28455,7 @@
         </w:trPr>
         <w:tc>
           <w:tcPr>
-            <w:tcW w:w="1928" w:type="dxa"/>
+            <w:tcW w:w="1474" w:type="dxa"/>
           </w:tcPr>
           <w:p>
             <w:pPr>
@@ -28447,7 +28475,7 @@
         </w:tc>
         <w:tc>
           <w:tcPr>
-            <w:tcW w:w="2608" w:type="dxa"/>
+            <w:tcW w:w="2494" w:type="dxa"/>
           </w:tcPr>
           <w:p>
             <w:pPr>
@@ -28463,11 +28491,32 @@
               </w:rPr>
               <w:t>92.11%</w:t>
             </w:r>
-          </w:p>
-        </w:tc>
-        <w:tc>
-          <w:tcPr>
-            <w:tcW w:w="1928" w:type="dxa"/>
+            <w:r>
+              <w:rPr>
+                <w:color w:val="1A1F2B"/>
+                <w:sz w:val="18"/>
+              </w:rPr>
+              <w:t>（</w:t>
+            </w:r>
+            <w:r>
+              <w:rPr>
+                <w:color w:val="1A1F2B"/>
+                <w:sz w:val="18"/>
+              </w:rPr>
+              <w:t>35/38</w:t>
+            </w:r>
+            <w:r>
+              <w:rPr>
+                <w:color w:val="1A1F2B"/>
+                <w:sz w:val="18"/>
+              </w:rPr>
+              <w:t>）</w:t>
+            </w:r>
+          </w:p>
+        </w:tc>
+        <w:tc>
+          <w:tcPr>
+            <w:tcW w:w="2948" w:type="dxa"/>
           </w:tcPr>
           <w:p>
             <w:pPr>
@@ -28481,20 +28530,34 @@
                 <w:color w:val="1A1F2B"/>
                 <w:sz w:val="18"/>
               </w:rPr>
-              <w:t xml:space="preserve">38 </w:t>
-            </w:r>
-            <w:r>
-              <w:rPr>
-                <w:color w:val="1A1F2B"/>
-                <w:sz w:val="18"/>
-              </w:rPr>
-              <w:t>个预期术语</w:t>
-            </w:r>
-          </w:p>
-        </w:tc>
-        <w:tc>
-          <w:tcPr>
-            <w:tcW w:w="2268" w:type="dxa"/>
+              <w:t>65.79%</w:t>
+            </w:r>
+            <w:r>
+              <w:rPr>
+                <w:color w:val="1A1F2B"/>
+                <w:sz w:val="18"/>
+              </w:rPr>
+              <w:t>（</w:t>
+            </w:r>
+            <w:r>
+              <w:rPr>
+                <w:color w:val="1A1F2B"/>
+                <w:sz w:val="18"/>
+              </w:rPr>
+              <w:t>25/38</w:t>
+            </w:r>
+            <w:r>
+              <w:rPr>
+                <w:color w:val="1A1F2B"/>
+                <w:sz w:val="18"/>
+              </w:rPr>
+              <w:t>）</w:t>
+            </w:r>
+          </w:p>
+        </w:tc>
+        <w:tc>
+          <w:tcPr>
+            <w:tcW w:w="1814" w:type="dxa"/>
           </w:tcPr>
           <w:p>
             <w:pPr>
@@ -28508,14 +28571,7 @@
                 <w:color w:val="1A1F2B"/>
                 <w:sz w:val="18"/>
               </w:rPr>
-              <w:t xml:space="preserve">35 </w:t>
-            </w:r>
-            <w:r>
-              <w:rPr>
-                <w:color w:val="1A1F2B"/>
-                <w:sz w:val="18"/>
-              </w:rPr>
-              <w:t>个在答案中逐字出现</w:t>
+              <w:t>逐字命中；模型改写会降低此项</w:t>
             </w:r>
           </w:p>
         </w:tc>
@@ -28526,7 +28582,7 @@
         </w:trPr>
         <w:tc>
           <w:tcPr>
-            <w:tcW w:w="1928" w:type="dxa"/>
+            <w:tcW w:w="1474" w:type="dxa"/>
           </w:tcPr>
           <w:p>
             <w:pPr>
@@ -28546,7 +28602,7 @@
         </w:tc>
         <w:tc>
           <w:tcPr>
-            <w:tcW w:w="2608" w:type="dxa"/>
+            <w:tcW w:w="2494" w:type="dxa"/>
           </w:tcPr>
           <w:p>
             <w:pPr>
@@ -28562,11 +28618,32 @@
               </w:rPr>
               <w:t>100%</w:t>
             </w:r>
-          </w:p>
-        </w:tc>
-        <w:tc>
-          <w:tcPr>
-            <w:tcW w:w="1928" w:type="dxa"/>
+            <w:r>
+              <w:rPr>
+                <w:color w:val="1A1F2B"/>
+                <w:sz w:val="18"/>
+              </w:rPr>
+              <w:t>（</w:t>
+            </w:r>
+            <w:r>
+              <w:rPr>
+                <w:color w:val="1A1F2B"/>
+                <w:sz w:val="18"/>
+              </w:rPr>
+              <w:t>222/222</w:t>
+            </w:r>
+            <w:r>
+              <w:rPr>
+                <w:color w:val="1A1F2B"/>
+                <w:sz w:val="18"/>
+              </w:rPr>
+              <w:t>）</w:t>
+            </w:r>
+          </w:p>
+        </w:tc>
+        <w:tc>
+          <w:tcPr>
+            <w:tcW w:w="2948" w:type="dxa"/>
           </w:tcPr>
           <w:p>
             <w:pPr>
@@ -28580,20 +28657,34 @@
                 <w:color w:val="1A1F2B"/>
                 <w:sz w:val="18"/>
               </w:rPr>
-              <w:t xml:space="preserve">222 </w:t>
-            </w:r>
-            <w:r>
-              <w:rPr>
-                <w:color w:val="1A1F2B"/>
-                <w:sz w:val="18"/>
-              </w:rPr>
-              <w:t>条引用</w:t>
-            </w:r>
-          </w:p>
-        </w:tc>
-        <w:tc>
-          <w:tcPr>
-            <w:tcW w:w="2268" w:type="dxa"/>
+              <w:t>100%</w:t>
+            </w:r>
+            <w:r>
+              <w:rPr>
+                <w:color w:val="1A1F2B"/>
+                <w:sz w:val="18"/>
+              </w:rPr>
+              <w:t>（</w:t>
+            </w:r>
+            <w:r>
+              <w:rPr>
+                <w:color w:val="1A1F2B"/>
+                <w:sz w:val="18"/>
+              </w:rPr>
+              <w:t>205/205</w:t>
+            </w:r>
+            <w:r>
+              <w:rPr>
+                <w:color w:val="1A1F2B"/>
+                <w:sz w:val="18"/>
+              </w:rPr>
+              <w:t>）</w:t>
+            </w:r>
+          </w:p>
+        </w:tc>
+        <w:tc>
+          <w:tcPr>
+            <w:tcW w:w="1814" w:type="dxa"/>
           </w:tcPr>
           <w:p>
             <w:pPr>
@@ -28607,7 +28698,7 @@
                 <w:color w:val="1A1F2B"/>
                 <w:sz w:val="18"/>
               </w:rPr>
-              <w:t>全部可按</w:t>
+              <w:t>引用能否按</w:t>
             </w:r>
             <w:r>
               <w:rPr>
@@ -28632,7 +28723,7 @@
         </w:trPr>
         <w:tc>
           <w:tcPr>
-            <w:tcW w:w="1928" w:type="dxa"/>
+            <w:tcW w:w="1474" w:type="dxa"/>
           </w:tcPr>
           <w:p>
             <w:pPr>
@@ -28652,7 +28743,7 @@
         </w:tc>
         <w:tc>
           <w:tcPr>
-            <w:tcW w:w="2608" w:type="dxa"/>
+            <w:tcW w:w="2494" w:type="dxa"/>
           </w:tcPr>
           <w:p>
             <w:pPr>
@@ -28668,11 +28759,32 @@
               </w:rPr>
               <w:t>84%</w:t>
             </w:r>
-          </w:p>
-        </w:tc>
-        <w:tc>
-          <w:tcPr>
-            <w:tcW w:w="1928" w:type="dxa"/>
+            <w:r>
+              <w:rPr>
+                <w:color w:val="1A1F2B"/>
+                <w:sz w:val="18"/>
+              </w:rPr>
+              <w:t>（</w:t>
+            </w:r>
+            <w:r>
+              <w:rPr>
+                <w:color w:val="1A1F2B"/>
+                <w:sz w:val="18"/>
+              </w:rPr>
+              <w:t>42/50</w:t>
+            </w:r>
+            <w:r>
+              <w:rPr>
+                <w:color w:val="1A1F2B"/>
+                <w:sz w:val="18"/>
+              </w:rPr>
+              <w:t>）</w:t>
+            </w:r>
+          </w:p>
+        </w:tc>
+        <w:tc>
+          <w:tcPr>
+            <w:tcW w:w="2948" w:type="dxa"/>
           </w:tcPr>
           <w:p>
             <w:pPr>
@@ -28686,20 +28798,34 @@
                 <w:color w:val="1A1F2B"/>
                 <w:sz w:val="18"/>
               </w:rPr>
-              <w:t xml:space="preserve">50 </w:t>
-            </w:r>
-            <w:r>
-              <w:rPr>
-                <w:color w:val="1A1F2B"/>
-                <w:sz w:val="18"/>
-              </w:rPr>
-              <w:t>道题</w:t>
-            </w:r>
-          </w:p>
-        </w:tc>
-        <w:tc>
-          <w:tcPr>
-            <w:tcW w:w="2268" w:type="dxa"/>
+              <w:t>92%</w:t>
+            </w:r>
+            <w:r>
+              <w:rPr>
+                <w:color w:val="1A1F2B"/>
+                <w:sz w:val="18"/>
+              </w:rPr>
+              <w:t>（</w:t>
+            </w:r>
+            <w:r>
+              <w:rPr>
+                <w:color w:val="1A1F2B"/>
+                <w:sz w:val="18"/>
+              </w:rPr>
+              <w:t>46/50</w:t>
+            </w:r>
+            <w:r>
+              <w:rPr>
+                <w:color w:val="1A1F2B"/>
+                <w:sz w:val="18"/>
+              </w:rPr>
+              <w:t>）</w:t>
+            </w:r>
+          </w:p>
+        </w:tc>
+        <w:tc>
+          <w:tcPr>
+            <w:tcW w:w="1814" w:type="dxa"/>
           </w:tcPr>
           <w:p>
             <w:pPr>
@@ -28713,14 +28839,7 @@
                 <w:color w:val="1A1F2B"/>
                 <w:sz w:val="18"/>
               </w:rPr>
-              <w:t xml:space="preserve">42 </w:t>
-            </w:r>
-            <w:r>
-              <w:rPr>
-                <w:color w:val="1A1F2B"/>
-                <w:sz w:val="18"/>
-              </w:rPr>
-              <w:t>道与</w:t>
+              <w:t>与</w:t>
             </w:r>
             <w:r>
               <w:rPr>
@@ -28745,7 +28864,7 @@
         </w:trPr>
         <w:tc>
           <w:tcPr>
-            <w:tcW w:w="1928" w:type="dxa"/>
+            <w:tcW w:w="1474" w:type="dxa"/>
           </w:tcPr>
           <w:p>
             <w:pPr>
@@ -28765,7 +28884,7 @@
         </w:tc>
         <w:tc>
           <w:tcPr>
-            <w:tcW w:w="2608" w:type="dxa"/>
+            <w:tcW w:w="2494" w:type="dxa"/>
           </w:tcPr>
           <w:p>
             <w:pPr>
@@ -28779,13 +28898,13 @@
                 <w:color w:val="1A1F2B"/>
                 <w:sz w:val="18"/>
               </w:rPr>
-              <w:t>P50 459 ms / P95 640 ms</w:t>
-            </w:r>
-          </w:p>
-        </w:tc>
-        <w:tc>
-          <w:tcPr>
-            <w:tcW w:w="1928" w:type="dxa"/>
+              <w:t>P50 459 ms</w:t>
+            </w:r>
+          </w:p>
+        </w:tc>
+        <w:tc>
+          <w:tcPr>
+            <w:tcW w:w="2948" w:type="dxa"/>
           </w:tcPr>
           <w:p>
             <w:pPr>
@@ -28799,6 +28918,26 @@
                 <w:color w:val="1A1F2B"/>
                 <w:sz w:val="18"/>
               </w:rPr>
+              <w:t>P50 1895 ms / P95 2907 ms</w:t>
+            </w:r>
+          </w:p>
+        </w:tc>
+        <w:tc>
+          <w:tcPr>
+            <w:tcW w:w="1814" w:type="dxa"/>
+          </w:tcPr>
+          <w:p>
+            <w:pPr>
+              <w:spacing w:after="40" w:line="288" w:lineRule="auto"/>
+              <w:rPr>
+                <w:rFonts w:hint="eastAsia"/>
+              </w:rPr>
+            </w:pPr>
+            <w:r>
+              <w:rPr>
+                <w:color w:val="1A1F2B"/>
+                <w:sz w:val="18"/>
+              </w:rPr>
               <w:t>同一批</w:t>
             </w:r>
             <w:r>
@@ -28813,27 +28952,7 @@
                 <w:color w:val="1A1F2B"/>
                 <w:sz w:val="18"/>
               </w:rPr>
-              <w:t>题</w:t>
-            </w:r>
-          </w:p>
-        </w:tc>
-        <w:tc>
-          <w:tcPr>
-            <w:tcW w:w="2268" w:type="dxa"/>
-          </w:tcPr>
-          <w:p>
-            <w:pPr>
-              <w:spacing w:after="40" w:line="288" w:lineRule="auto"/>
-              <w:rPr>
-                <w:rFonts w:hint="eastAsia"/>
-              </w:rPr>
-            </w:pPr>
-            <w:r>
-              <w:rPr>
-                <w:color w:val="1A1F2B"/>
-                <w:sz w:val="18"/>
-              </w:rPr>
-              <w:t>本地检索与答案拼装的总耗时</w:t>
+              <w:t>题端到端耗时</w:t>
             </w:r>
           </w:p>
         </w:tc>
@@ -28860,58 +28979,235 @@
         <w:rPr>
           <w:color w:val="1A1F2B"/>
         </w:rPr>
-        <w:t>时延数据说明一件事：整套问答不依赖外部网络，</w:t>
-      </w:r>
-      <w:r>
-        <w:rPr>
-          <w:color w:val="1A1F2B"/>
-        </w:rPr>
-        <w:t xml:space="preserve">P95 </w:t>
-      </w:r>
-      <w:r>
-        <w:rPr>
-          <w:color w:val="1A1F2B"/>
-        </w:rPr>
-        <w:t>仍在</w:t>
-      </w:r>
-      <w:r>
-        <w:rPr>
-          <w:color w:val="1A1F2B"/>
-        </w:rPr>
-        <w:t xml:space="preserve"> 640 </w:t>
-      </w:r>
-      <w:r>
-        <w:rPr>
-          <w:color w:val="1A1F2B"/>
-        </w:rPr>
-        <w:t>毫秒以内，现场演示时不会出现长时间等待。这对答辩场景很重要</w:t>
-      </w:r>
-      <w:r>
-        <w:rPr>
-          <w:color w:val="1A1F2B"/>
-        </w:rPr>
-        <w:t>——</w:t>
-      </w:r>
-      <w:r>
-        <w:rPr>
-          <w:color w:val="1A1F2B"/>
-        </w:rPr>
-        <w:t>评审不会为一个转圈等三十秒。</w:t>
+        <w:t>两张口径必须一起看。</w:t>
+      </w:r>
+      <w:r>
+        <w:rPr>
+          <w:b/>
+          <w:color w:val="1A1F2B"/>
+        </w:rPr>
+        <w:t>逐字要点命中从</w:t>
+      </w:r>
+      <w:r>
+        <w:rPr>
+          <w:b/>
+          <w:color w:val="1A1F2B"/>
+        </w:rPr>
+        <w:t xml:space="preserve"> 92.11% </w:t>
+      </w:r>
+      <w:r>
+        <w:rPr>
+          <w:b/>
+          <w:color w:val="1A1F2B"/>
+        </w:rPr>
+        <w:t>降到</w:t>
+      </w:r>
+      <w:r>
+        <w:rPr>
+          <w:b/>
+          <w:color w:val="1A1F2B"/>
+        </w:rPr>
+        <w:t xml:space="preserve"> 65.79%</w:t>
+      </w:r>
+      <w:r>
+        <w:rPr>
+          <w:b/>
+          <w:color w:val="1A1F2B"/>
+        </w:rPr>
+        <w:t>，不是质量下降</w:t>
+      </w:r>
+      <w:r>
+        <w:rPr>
+          <w:color w:val="1A1F2B"/>
+        </w:rPr>
+        <w:t>：这项只检查预期术语有没有原样出现，而模型会把证据改写成一句通顺的回答，</w:t>
+      </w:r>
+      <w:r>
+        <w:rPr>
+          <w:color w:val="1A1F2B"/>
+        </w:rPr>
+        <w:t>“</w:t>
+      </w:r>
+      <w:r>
+        <w:rPr>
+          <w:color w:val="1A1F2B"/>
+        </w:rPr>
+        <w:t>风险</w:t>
+      </w:r>
+      <w:r>
+        <w:rPr>
+          <w:color w:val="1A1F2B"/>
+        </w:rPr>
+        <w:t>–</w:t>
+      </w:r>
+      <w:r>
+        <w:rPr>
+          <w:color w:val="1A1F2B"/>
+        </w:rPr>
+        <w:t>覆盖曲线下面积</w:t>
+      </w:r>
+      <w:r>
+        <w:rPr>
+          <w:color w:val="1A1F2B"/>
+        </w:rPr>
+        <w:t>”</w:t>
+      </w:r>
+      <w:r>
+        <w:rPr>
+          <w:color w:val="1A1F2B"/>
+        </w:rPr>
+        <w:lastRenderedPageBreak/>
+        <w:t>不会逐字包含原文的</w:t>
+      </w:r>
+      <w:r>
+        <w:rPr>
+          <w:color w:val="1A1F2B"/>
+        </w:rPr>
+        <w:t xml:space="preserve"> `risk–coverage` </w:t>
+      </w:r>
+      <w:r>
+        <w:rPr>
+          <w:color w:val="1A1F2B"/>
+        </w:rPr>
+        <w:t>写法，判定自然落空。真正的质量变化看人工评测：答案正确率从</w:t>
+      </w:r>
+      <w:r>
+        <w:rPr>
+          <w:color w:val="1A1F2B"/>
+        </w:rPr>
+        <w:t xml:space="preserve"> 15.79% </w:t>
+      </w:r>
+      <w:r>
+        <w:rPr>
+          <w:color w:val="1A1F2B"/>
+        </w:rPr>
+        <w:t>升到</w:t>
+      </w:r>
+      <w:r>
+        <w:rPr>
+          <w:color w:val="1A1F2B"/>
+        </w:rPr>
+        <w:t xml:space="preserve"> 71.05%</w:t>
+      </w:r>
+      <w:r>
+        <w:rPr>
+          <w:color w:val="1A1F2B"/>
+        </w:rPr>
+        <w:t>（表</w:t>
+      </w:r>
+      <w:r>
+        <w:rPr>
+          <w:color w:val="1A1F2B"/>
+        </w:rPr>
+        <w:t xml:space="preserve"> 11-5</w:t>
+      </w:r>
+      <w:r>
+        <w:rPr>
+          <w:color w:val="1A1F2B"/>
+        </w:rPr>
+        <w:t>）。</w:t>
       </w:r>
     </w:p>
     <w:p>
       <w:pPr>
+        <w:spacing w:after="120" w:line="348" w:lineRule="auto"/>
+        <w:ind w:firstLine="420"/>
+        <w:jc w:val="both"/>
+        <w:rPr>
+          <w:rFonts w:hint="eastAsia"/>
+        </w:rPr>
+      </w:pPr>
+      <w:r>
+        <w:rPr>
+          <w:color w:val="1A1F2B"/>
+        </w:rPr>
+        <w:t>时延的代价同样要说明：本地抽取</w:t>
+      </w:r>
+      <w:r>
+        <w:rPr>
+          <w:color w:val="1A1F2B"/>
+        </w:rPr>
+        <w:t xml:space="preserve"> P50 459 </w:t>
+      </w:r>
+      <w:r>
+        <w:rPr>
+          <w:color w:val="1A1F2B"/>
+        </w:rPr>
+        <w:t>毫秒，调用模型后</w:t>
+      </w:r>
+      <w:r>
+        <w:rPr>
+          <w:color w:val="1A1F2B"/>
+        </w:rPr>
+        <w:t xml:space="preserve"> P50 1895 </w:t>
+      </w:r>
+      <w:r>
+        <w:rPr>
+          <w:color w:val="1A1F2B"/>
+        </w:rPr>
+        <w:t>毫秒、</w:t>
+      </w:r>
+      <w:r>
+        <w:rPr>
+          <w:color w:val="1A1F2B"/>
+        </w:rPr>
+        <w:t xml:space="preserve">P95 2907 </w:t>
+      </w:r>
+      <w:r>
+        <w:rPr>
+          <w:color w:val="1A1F2B"/>
+        </w:rPr>
+        <w:t>毫秒，仍在赛题</w:t>
+      </w:r>
+      <w:r>
+        <w:rPr>
+          <w:color w:val="1A1F2B"/>
+        </w:rPr>
+        <w:t xml:space="preserve"> 5 </w:t>
+      </w:r>
+      <w:r>
+        <w:rPr>
+          <w:color w:val="1A1F2B"/>
+        </w:rPr>
+        <w:t>秒线以内，但余量比纯本地小。模型不可用时会自动回落到本地档，所以断网不会让演示停摆，只会让答案回到</w:t>
+      </w:r>
+      <w:r>
+        <w:rPr>
+          <w:color w:val="1A1F2B"/>
+        </w:rPr>
+        <w:t>“</w:t>
+      </w:r>
+      <w:r>
+        <w:rPr>
+          <w:color w:val="1A1F2B"/>
+        </w:rPr>
+        <w:t>原文片段</w:t>
+      </w:r>
+      <w:r>
+        <w:rPr>
+          <w:color w:val="1A1F2B"/>
+        </w:rPr>
+        <w:t>”</w:t>
+      </w:r>
+      <w:r>
+        <w:rPr>
+          <w:color w:val="1A1F2B"/>
+        </w:rPr>
+        <w:t>形态。</w:t>
+      </w:r>
+    </w:p>
+    <w:p>
+      <w:pPr>
         <w:pStyle w:val="21"/>
         <w:spacing w:before="280" w:after="120"/>
       </w:pPr>
-      <w:bookmarkStart w:id="58" w:name="_Toc243245818"/>
+      <w:bookmarkStart w:id="58" w:name="_Toc243247341"/>
       <w:r>
         <w:rPr>
           <w:rFonts w:ascii="黑体" w:eastAsia="黑体" w:hAnsi="黑体"/>
           <w:color w:val="0E6E6A"/>
           <w:sz w:val="27"/>
         </w:rPr>
-        <w:lastRenderedPageBreak/>
         <w:t xml:space="preserve">11.4 </w:t>
       </w:r>
       <w:r>
@@ -29407,7 +29703,7 @@
           <w:noProof/>
         </w:rPr>
         <w:drawing>
-          <wp:inline distT="0" distB="0" distL="0" distR="0" wp14:anchorId="3D2E56B2" wp14:editId="35C0AFAD">
+          <wp:inline distT="0" distB="0" distL="0" distR="0" wp14:anchorId="672A88B5" wp14:editId="65CB6B1B">
             <wp:extent cx="5544000" cy="2727290"/>
             <wp:effectExtent l="0" t="0" r="0" b="0"/>
             <wp:docPr id="13" name="Picture 13"/>
@@ -29478,7 +29774,7 @@
         <w:pStyle w:val="21"/>
         <w:spacing w:before="280" w:after="120"/>
       </w:pPr>
-      <w:bookmarkStart w:id="59" w:name="_Toc243245819"/>
+      <w:bookmarkStart w:id="59" w:name="_Toc243247342"/>
       <w:r>
         <w:rPr>
           <w:rFonts w:ascii="黑体" w:eastAsia="黑体" w:hAnsi="黑体"/>
@@ -29725,6 +30021,7 @@
                 <w:color w:val="1A1F2B"/>
                 <w:sz w:val="18"/>
               </w:rPr>
+              <w:lastRenderedPageBreak/>
               <w:t>指标</w:t>
             </w:r>
           </w:p>
@@ -30167,7 +30464,6 @@
         <w:rPr>
           <w:color w:val="1A1F2B"/>
         </w:rPr>
-        <w:lastRenderedPageBreak/>
         <w:t>提升来自三处改造，而不是调低判定尺度：列举题改为列出实际命中的文档与</w:t>
       </w:r>
       <w:r>
@@ -30285,7 +30581,7 @@
         <w:pStyle w:val="21"/>
         <w:spacing w:before="280" w:after="120"/>
       </w:pPr>
-      <w:bookmarkStart w:id="60" w:name="_Toc243245820"/>
+      <w:bookmarkStart w:id="60" w:name="_Toc243247343"/>
       <w:r>
         <w:rPr>
           <w:rFonts w:ascii="黑体" w:eastAsia="黑体" w:hAnsi="黑体"/>
@@ -30860,7 +31156,7 @@
         <w:pStyle w:val="21"/>
         <w:spacing w:before="280" w:after="120"/>
       </w:pPr>
-      <w:bookmarkStart w:id="61" w:name="_Toc243245821"/>
+      <w:bookmarkStart w:id="61" w:name="_Toc243247344"/>
       <w:r>
         <w:rPr>
           <w:rFonts w:ascii="黑体" w:eastAsia="黑体" w:hAnsi="黑体"/>
@@ -31044,13 +31340,14 @@
         <w:pStyle w:val="1"/>
         <w:spacing w:before="400" w:after="200"/>
       </w:pPr>
-      <w:bookmarkStart w:id="62" w:name="_Toc243245822"/>
+      <w:bookmarkStart w:id="62" w:name="_Toc243247345"/>
       <w:r>
         <w:rPr>
           <w:rFonts w:ascii="黑体" w:eastAsia="黑体" w:hAnsi="黑体"/>
           <w:color w:val="1A1F2B"/>
           <w:sz w:val="34"/>
         </w:rPr>
+        <w:lastRenderedPageBreak/>
         <w:t>第</w:t>
       </w:r>
       <w:r>
@@ -31076,7 +31373,7 @@
         <w:pStyle w:val="21"/>
         <w:spacing w:before="280" w:after="120"/>
       </w:pPr>
-      <w:bookmarkStart w:id="63" w:name="_Toc243245823"/>
+      <w:bookmarkStart w:id="63" w:name="_Toc243247346"/>
       <w:r>
         <w:rPr>
           <w:rFonts w:ascii="黑体" w:eastAsia="黑体" w:hAnsi="黑体"/>
@@ -31228,7 +31525,6 @@
           <w:b/>
           <w:color w:val="1A1F2B"/>
         </w:rPr>
-        <w:lastRenderedPageBreak/>
         <w:t>可审计的处置闭环</w:t>
       </w:r>
       <w:r>
@@ -31289,7 +31585,7 @@
         <w:pStyle w:val="21"/>
         <w:spacing w:before="280" w:after="120"/>
       </w:pPr>
-      <w:bookmarkStart w:id="64" w:name="_Toc243245824"/>
+      <w:bookmarkStart w:id="64" w:name="_Toc243247347"/>
       <w:r>
         <w:rPr>
           <w:rFonts w:ascii="黑体" w:eastAsia="黑体" w:hAnsi="黑体"/>
@@ -31465,7 +31761,7 @@
         <w:pStyle w:val="21"/>
         <w:spacing w:before="280" w:after="120"/>
       </w:pPr>
-      <w:bookmarkStart w:id="65" w:name="_Toc243245825"/>
+      <w:bookmarkStart w:id="65" w:name="_Toc243247348"/>
       <w:r>
         <w:rPr>
           <w:rFonts w:ascii="黑体" w:eastAsia="黑体" w:hAnsi="黑体"/>
@@ -31593,7 +31889,7 @@
         <w:pStyle w:val="1"/>
         <w:spacing w:before="400" w:after="200"/>
       </w:pPr>
-      <w:bookmarkStart w:id="66" w:name="_Toc243245826"/>
+      <w:bookmarkStart w:id="66" w:name="_Toc243247349"/>
       <w:r>
         <w:rPr>
           <w:rFonts w:ascii="黑体" w:eastAsia="黑体" w:hAnsi="黑体"/>
@@ -31649,6 +31945,7 @@
           <w:color w:val="5A6274"/>
           <w:sz w:val="18"/>
         </w:rPr>
+        <w:lastRenderedPageBreak/>
         <w:t>表</w:t>
       </w:r>
       <w:r>
@@ -32349,7 +32646,6 @@
                 <w:color w:val="1A1F2B"/>
                 <w:sz w:val="18"/>
               </w:rPr>
-              <w:lastRenderedPageBreak/>
               <w:t>闭环率</w:t>
             </w:r>
           </w:p>
@@ -32509,7 +32805,7 @@
         <w:pStyle w:val="1"/>
         <w:spacing w:before="400" w:after="200"/>
       </w:pPr>
-      <w:bookmarkStart w:id="67" w:name="_Toc243245827"/>
+      <w:bookmarkStart w:id="67" w:name="_Toc243247350"/>
       <w:r>
         <w:rPr>
           <w:rFonts w:ascii="黑体" w:eastAsia="黑体" w:hAnsi="黑体"/>
@@ -33605,31 +33901,31 @@
       </w:rPr>
     </w:lvl>
   </w:abstractNum>
-  <w:num w:numId="1" w16cid:durableId="501816612">
+  <w:num w:numId="1" w16cid:durableId="687100834">
     <w:abstractNumId w:val="8"/>
   </w:num>
-  <w:num w:numId="2" w16cid:durableId="2115241745">
+  <w:num w:numId="2" w16cid:durableId="2001883753">
     <w:abstractNumId w:val="6"/>
   </w:num>
-  <w:num w:numId="3" w16cid:durableId="318198712">
+  <w:num w:numId="3" w16cid:durableId="205798134">
     <w:abstractNumId w:val="5"/>
   </w:num>
-  <w:num w:numId="4" w16cid:durableId="268585736">
+  <w:num w:numId="4" w16cid:durableId="1490290493">
     <w:abstractNumId w:val="4"/>
   </w:num>
-  <w:num w:numId="5" w16cid:durableId="649479878">
+  <w:num w:numId="5" w16cid:durableId="809638595">
     <w:abstractNumId w:val="7"/>
   </w:num>
-  <w:num w:numId="6" w16cid:durableId="1578663261">
+  <w:num w:numId="6" w16cid:durableId="1686857646">
     <w:abstractNumId w:val="3"/>
   </w:num>
-  <w:num w:numId="7" w16cid:durableId="1957519740">
+  <w:num w:numId="7" w16cid:durableId="2116904385">
     <w:abstractNumId w:val="2"/>
   </w:num>
-  <w:num w:numId="8" w16cid:durableId="705763637">
+  <w:num w:numId="8" w16cid:durableId="1387873856">
     <w:abstractNumId w:val="1"/>
   </w:num>
-  <w:num w:numId="9" w16cid:durableId="2143768957">
+  <w:num w:numId="9" w16cid:durableId="551424600">
     <w:abstractNumId w:val="0"/>
   </w:num>
 </w:numbering>
@@ -45026,7 +45322,7 @@
     <w:autoRedefine/>
     <w:uiPriority w:val="39"/>
     <w:unhideWhenUsed/>
-    <w:rsid w:val="00166E64"/>
+    <w:rsid w:val="00D86D8B"/>
   </w:style>
   <w:style w:type="paragraph" w:styleId="TOC2">
     <w:name w:val="toc 2"/>
@@ -45035,7 +45331,7 @@
     <w:autoRedefine/>
     <w:uiPriority w:val="39"/>
     <w:unhideWhenUsed/>
-    <w:rsid w:val="00166E64"/>
+    <w:rsid w:val="00D86D8B"/>
     <w:pPr>
       <w:ind w:leftChars="200" w:left="420"/>
     </w:pPr>
@@ -45045,7 +45341,7 @@
     <w:basedOn w:val="a2"/>
     <w:uiPriority w:val="99"/>
     <w:unhideWhenUsed/>
-    <w:rsid w:val="00166E64"/>
+    <w:rsid w:val="00D86D8B"/>
     <w:rPr>
       <w:color w:val="0000FF" w:themeColor="hyperlink"/>
       <w:u w:val="single"/>

</xml_diff>